<commit_message>
refs: expand 11 -> 40, all verified via Crossref/arXiv API; fix MIRAGE DOI (.37 -> .372)
</commit_message>
<xml_diff>
--- a/outputs/submission/manuscript.en.docx
+++ b/outputs/submission/manuscript.en.docx
@@ -252,7 +252,7 @@
           <w:b w:val="0"/>
           <w:i w:val="0"/>
         </w:rPr>
-        <w:t>Prostate cancer is among the most common malignancies in men, and biopsy is the cornerstone of diagnosis [1,2]. The modern biopsy pathway extends far beyond a single "to biopsy or not" question: whether to add systematic cores to MRI-targeted cores, which saturation scheme to use, transperineal versus transrectal access, anaesthesia and antimicrobial prophylaxis, and whether the harvested tissue satisfies the demands of subsequent treatment planning must all be weighed against patient-specific factors — PI-RADS grade, PSA density, prior negative biopsy, anticoagulation, urinary-tract-infection risk factors, prostate volume, and more [1,3]. The ProBIOPSY consensus, a multidisciplinary international effort published in 2026, codified this pathway into 112 final statements and documented substantial international practice variation [1].</w:t>
+        <w:t>Prostate cancer is among the most common malignancies in men [1,2]; population-level PSA screening reduces disease-specific mortality [3] and directs a diagnostic pathway whose cornerstone is biopsy [4]. The modern biopsy pathway extends far beyond a single "to biopsy or not" question: whether to add systematic cores to MRI-targeted cores [5], which saturation scheme to use [6], transperineal versus transrectal access and its complication profile [7,8], anaesthesia and antimicrobial prophylaxis, and whether the harvested tissue satisfies the demands of subsequent treatment planning must all be weighed against patient-specific factors — PI-RADS grade, PSA density, MRI quality, prior negative biopsy, anticoagulation, urinary-tract-infection risk factors, prostate volume, and more [4,9-12]. This modern pathway rests on validated mpMRI diagnostic accuracy [13] and repeated demonstrations that MRI-targeted sampling improves clinically significant cancer detection [14-17]. The ProBIOPSY consensus, a multidisciplinary international effort published in 2026, codified this pathway into 112 final statements and documented substantial international practice variation [4].</w:t>
       </w:r>
     </w:p>
     <w:p>
@@ -262,7 +262,7 @@
           <w:b w:val="0"/>
           <w:i w:val="0"/>
         </w:rPr>
-        <w:t xml:space="preserve">A consensus document, however, is not executable. Clinicians face a combinatorial space of patient scenarios × biopsy decisions (51 scenario archetypes × 54 decision items in the registries developed here); static lookup cannot cover the interactions. Rule-based clinical decision support systems (CDSS) capture deterministic logic but are slow to update and struggle with natural-language evidence [4]. LLMs promise flexible language understanding yet carry well-documented risks in medicine: hallucination, unstable outputs, and unverifiable provenance [5-7]. RAG grounds generation in an external corpus [8], and medical RAG benchmarks show promise [9], but purely retrieval-based pipelines have no mechanism to </w:t>
+        <w:t xml:space="preserve">A consensus document, however, is not executable. Clinicians face a combinatorial space of patient scenarios × biopsy decisions (51 scenario archetypes × 54 decision items in the registries developed here); static lookup cannot cover the interactions. Rule-based clinical decision support systems (CDSS) capture deterministic logic but are slow to update [18], contribute to alert fatigue [19], and struggle with natural-language evidence [20]. Large language models promise flexible language understanding [21,22] and are approaching expert performance on medical question answering [23,24], yet carry well-documented risks in medicine — hallucination, unstable outputs, and unverifiable provenance [25] — and can diverge from clinical guidelines [26]. RAG grounds generation in an external corpus [27], and medical RAG benchmarks show promise [28], but purely retrieval-based pipelines have no mechanism to </w:t>
       </w:r>
       <w:r>
         <w:rPr>
@@ -304,7 +304,7 @@
           <w:b w:val="0"/>
           <w:i w:val="0"/>
         </w:rPr>
-        <w:t>, each layer covers the others' failure modes while preserving a complete audit trail from every output back to numbered consensus statements and evidence chunks. At the retrieval layer we adopt LightRAG [10], a graph-based dual-level retrieval framework that outperforms Microsoft GraphRAG [11] on domain question answering at a fraction of the token cost.</w:t>
+        <w:t xml:space="preserve"> — an integration consistent with emerging roadmaps for unifying large language models and knowledge graphs [29] — each layer covers the others' failure modes while preserving a complete audit trail from every output back to numbered consensus statements and evidence chunks. At the retrieval layer we adopt LightRAG [30], a graph-based dual-level retrieval framework that outperforms Microsoft GraphRAG [31] on domain question answering at a fraction of the token cost.</w:t>
       </w:r>
     </w:p>
     <w:p>
@@ -487,7 +487,7 @@
           <w:b w:val="0"/>
           <w:i w:val="0"/>
         </w:rPr>
-        <w:t xml:space="preserve">All 112 final statements of the ProBIOPSY consensus [1] served as the gold standard. Each statement was mapped to an expected system action in a pre-defined five-class taxonomy: </w:t>
+        <w:t xml:space="preserve">All 112 final statements of the ProBIOPSY consensus [4] served as the gold standard. Each statement was mapped to an expected system action in a pre-defined five-class taxonomy: </w:t>
       </w:r>
       <w:r>
         <w:rPr>
@@ -567,7 +567,7 @@
           <w:b w:val="0"/>
           <w:i w:val="0"/>
         </w:rPr>
-        <w:t xml:space="preserve"> (recommend against). The gold-standard action distribution is endorse 190, conditional 185, against 125, endorse_option 35, and report_option 25. Statements span three domains: indication (n = 23), procedure (n = 34), and treatment planning (n = 55); 25 statements (22.3%) are against-class, providing a demanding test for systems with optimism bias. The five demonstration vignettes described under Results are synthetic cases built on the same registries and are not part of the 112-statement evaluation set.</w:t>
+        <w:t xml:space="preserve"> (recommend against). The gold-standard action distribution is endorse 190, conditional 185, against 125, endorse_option 35, and report_option 25. Statements span three domains: indication (n = 23), procedure (n = 34), and treatment planning (n = 55, anchored by ISUP grade-group–driven treatment decisions [32]); 25 statements (22.3%) are against-class, providing a demanding test for systems with optimism bias. The five demonstration vignettes described under Results are synthetic cases built on the same registries and are not part of the 112-statement evaluation set.</w:t>
       </w:r>
     </w:p>
     <w:p>
@@ -613,7 +613,7 @@
           <w:b w:val="0"/>
           <w:i w:val="0"/>
         </w:rPr>
-        <w:t xml:space="preserve"> Entity A (patient scenarios) contains 51 archetypes with 49 distinct scenario flags across imaging (PI-RADS grade, mpMRI/bpMRI, field strength, PI-QUAL quality), laboratory markers (PSA, PSA density), history and risk (prior negative biopsy, family history, infection risk factors, anticoagulation), treatment intent, and resource availability (Table 1). Entity B (decision items) contains 54 items with 20 flags across indication (22), procedure (22), and treatment-planning linkage (10).</w:t>
+        <w:t xml:space="preserve"> Entity A (patient scenarios) contains 51 archetypes with 49 distinct scenario flags across imaging (PI-RADS grade, mpMRI/bpMRI, field strength, PI-QUAL quality [11]), laboratory markers (PSA, PSA density), history and risk (prior negative biopsy, family history, infection risk factors, anticoagulation), treatment intent, and resource availability (Table 1). Entity B (decision items) contains 54 items with 20 flags across indication (22), procedure (22), and treatment-planning linkage (10).</w:t>
       </w:r>
     </w:p>
     <w:p>
@@ -649,7 +649,7 @@
           <w:b w:val="0"/>
           <w:i w:val="0"/>
         </w:rPr>
-        <w:t xml:space="preserve"> The corpus comprises 357 evidence chunks, all sourced from the ProBIOPSY consensus and its supplementary material: the 112 final statements (evidence level B), 20 narrative passages, 7 systematic-review summaries, and 218 literature entries extracted from the consensus reference lists (level C). The index was built with LightRAG (lightrag-hku 1.5.7); entity and relation extraction used GLM-5.3-Flash, and the vector index used doubao-embedding-vision-251215 (dimension 2,048). The final index contains 1,864 entities and 3,078 relations (~100 MB). The full system performs risk-guided retrieval: rule matches and active decision items drive entity-boosted hybrid queries (vector + graph structure), executed in context-only mode (retrieving entities, relations, and chunks without letting LightRAG generate the answer itself). Graph context is concatenated with lexical evidence (BM25-style scoring with boosts for active decision items and scenario flags) and passed to the arbiter.</w:t>
+        <w:t xml:space="preserve"> The corpus comprises 357 evidence chunks, all sourced from the ProBIOPSY consensus and its supplementary material: the 112 final statements (evidence level B), 20 narrative passages, 7 systematic-review summaries, and 218 literature entries extracted from the consensus reference lists (level C). The index was built with LightRAG [30] (lightrag-hku 1.5.7); entity and relation extraction used GLM-5.3-Flash, and the vector index used doubao-embedding-vision-251215 (dimension 2,048). The final index contains 1,864 entities and 3,078 relations (~100 MB). The full system performs risk-guided retrieval: rule matches and active decision items drive entity-boosted hybrid queries (vector + graph structure), executed in context-only mode (retrieving entities, relations, and chunks without letting LightRAG generate the answer itself). Graph context is concatenated with lexical evidence (BM25-style scoring with boosts for active decision items and scenario flags) and passed to the arbiter.</w:t>
       </w:r>
     </w:p>
     <w:p>
@@ -889,7 +889,7 @@
           <w:b w:val="0"/>
           <w:i w:val="0"/>
         </w:rPr>
-        <w:t>Exact-5-class accuracy (primary), exact-3 accuracy (collapsing endorse_option→endorse and report_option→conditional, to expose majority-class inflation), five-class macro-F1, Cohen's κ against the gold standard, and binary against-class sensitivity/specificity/F1. All metrics are reported as mean ± SD over the five seeds. Method differences were assessed with two-sided paired t-tests across seeds (full system vs each baseline; exact-5 and κ; six comparisons), with Benjamini–Hochberg false-discovery-rate correction. Context characters per run were logged as an efficiency metric.</w:t>
+        <w:t>Exact-5-class accuracy (primary), exact-3 accuracy (collapsing endorse_option→endorse and report_option→conditional, to expose majority-class inflation), five-class macro-F1, Cohen's κ [33] against the gold standard, and binary against-class sensitivity/specificity/F1. All metrics are reported as mean ± SD over the five seeds. Method differences were assessed with two-sided paired t-tests across seeds (full system vs each baseline; exact-5 and κ; six comparisons), with Benjamini–Hochberg false-discovery-rate correction [34]. Context characters per run were logged as an efficiency metric.</w:t>
       </w:r>
     </w:p>
     <w:p>
@@ -1278,7 +1278,7 @@
           <w:b w:val="0"/>
           <w:i w:val="0"/>
         </w:rPr>
-        <w:t>Experts agreed with each other substantially: raw agreement 17/20 ratings, with per-case modal share 4/4 in three cases, 3/4 in one (case 2), and a 2:2 split in case 1 (Figure 3A). The overall Fleiss κ of −0.09 reflects the known instability of κ at this sample size with uneven category marginals, not poor agreement. The system matched the expert majority in all four cases with a decisive majority (Cohen κ = 1.000, n = 4; Figure 3B). In the split case — whether to add systematic biopsy to targeted plus perilesional biopsy — the two experts favouring conditional endorsement cited treatment-plan dependence (whole-gland versus focal therapy alters the value of added systematic cores), the same consideration the system's evidence chain raises (contralateral systematic yield 0.3–4% [EV0024]). All 80 Likert ratings of the system output were 5/5 (clarity, usefulness, recommendation, evidence; ceiling noted, Figure 3C). At this sample size, all agreement estimates are preliminary.</w:t>
+        <w:t>Experts agreed with each other substantially: raw agreement 17/20 ratings, with per-case modal share 4/4 in three cases, 3/4 in one (case 2), and a 2:2 split in case 1 (Figure 3A). The overall Fleiss κ [35] of −0.09 reflects the known instability of κ under uneven category marginals at this sample size — the agreement paradox described by Feinstein and Cicchetti — rather than poor agreement [36]. The system matched the expert majority in all four cases with a decisive majority (Cohen κ = 1.000, n = 4; Figure 3B). In the split case — whether to add systematic biopsy to targeted plus perilesional biopsy — the two experts favouring conditional endorsement cited treatment-plan dependence (whole-gland versus focal therapy alters the value of added systematic cores), the same consideration the system's evidence chain raises (contralateral systematic yield 0.3–4% [EV0024]). All 80 Likert ratings of the system output were 5/5 (clarity, usefulness, recommendation, evidence; ceiling noted, Figure 3C). At this sample size, all agreement estimates are preliminary.</w:t>
       </w:r>
     </w:p>
     <w:p>
@@ -1407,7 +1407,7 @@
           <w:b w:val="0"/>
           <w:i w:val="0"/>
         </w:rPr>
-        <w:t xml:space="preserve">Medical RAG benchmarks such as MIRAGE [9] evaluate open-question answering accuracy, typically multiple-choice or free text; we instead map an international consensus' final statements onto five executable actions and evaluate </w:t>
+        <w:t xml:space="preserve">Large language models are approaching expert-level medical question answering [24] and have generated patient-facing responses rated as more empathetic than physician responses [37]; for constrained, auditable decision support, however, our results indicate that decision architecture — not model capability — is the dominant lever. Medical RAG benchmarks such as MIRAGE [28] evaluate open-question answering accuracy, typically multiple-choice or free text; we instead map an international consensus' final statements onto five executable actions and evaluate </w:t>
       </w:r>
       <w:r>
         <w:rPr>
@@ -1423,7 +1423,7 @@
           <w:b w:val="0"/>
           <w:i w:val="0"/>
         </w:rPr>
-        <w:t>, a property closer to clinical governance needs. Relative to GraphRAG [11] and LightRAG [10], our contribution is system-level: LightRAG remains the evidence engine, but the lightrag-only baseline demonstrates exactly what happens without a rule layer — against over-calling (sensitivity 1.000, specificity 0.922) and conditional silence. Relative to rule-based CDSS [4], our architecture compresses the auditable rule base to 16 consensus rules and delegates long-tail knowledge to graph retrieval, coupling the two via hard constraints rather than parallel voting.</w:t>
+        <w:t>, a property closer to clinical governance needs. Relative to GraphRAG [31] and LightRAG [30], our contribution is system-level: LightRAG remains the evidence engine, but the lightrag-only baseline demonstrates exactly what happens without a rule layer — against over-calling (sensitivity 1.000, specificity 0.922) and conditional silence. Relative to rule-based CDSS [20], our architecture compresses the auditable rule base to 16 consensus rules and delegates long-tail knowledge to graph retrieval, coupling the two via hard constraints rather than parallel voting.</w:t>
       </w:r>
     </w:p>
     <w:p>
@@ -1499,7 +1499,7 @@
           <w:b w:val="0"/>
           <w:i w:val="0"/>
         </w:rPr>
-        <w:t xml:space="preserve"> — the rule-file SHA-256 recorded at index build and verified live by the UI prevents the classic CDSS failure mode of a silently stale knowledge base.</w:t>
+        <w:t xml:space="preserve"> — the rule-file SHA-256 recorded at index build and verified live by the UI prevents the classic CDSS failure mode of a silently stale knowledge base [18].</w:t>
       </w:r>
     </w:p>
     <w:p>
@@ -1591,7 +1591,7 @@
           <w:b w:val="0"/>
           <w:i w:val="0"/>
         </w:rPr>
-        <w:t xml:space="preserve">: four experts rated five composite propositions; agreement statistics at this n are unstable (a negative Fleiss κ despite 17/20 raw agreement illustrates the artefact), all Likert ratings hit the ceiling, and the panel was single-institution — the review therefore supports preliminary face validity only. Fourth, </w:t>
+        <w:t xml:space="preserve">: four experts rated five composite propositions; agreement statistics at this n are unstable (a negative Fleiss κ despite 17/20 raw agreement illustrates the artefact [36]), all Likert ratings hit the ceiling, and the panel was single-institution — the review therefore supports preliminary face validity only. Fourth, </w:t>
       </w:r>
       <w:r>
         <w:rPr>
@@ -1699,7 +1699,7 @@
           <w:b w:val="0"/>
           <w:i w:val="0"/>
         </w:rPr>
-        <w:t>(i) extending the expert panel to a multi-centre face-validity and usability study, including treatment-intent-conditioned scenarios of the kind flagged by the reviewers in the split case; (ii) a prospective registry study with real cases; (iii) extending the rule base to other guideline chapters (active surveillance, imaging follow-up) to test architecture portability; (iv) FHIR integration for automatic scenario filling from the EMR; (v) on-premises generator deployment to eliminate PHI-transfer concerns.</w:t>
+        <w:t>(i) extending the expert panel to a multi-centre face-validity and usability study, including treatment-intent-conditioned scenarios of the kind flagged by the reviewers in the split case; (ii) a prospective registry study with real cases, reported under emerging AI-evaluation standards [38,39]; (iii) extending the rule base to other guideline chapters (active surveillance, imaging follow-up) and emerging PSMA-PET–first pathways [40] to test architecture portability; (iv) FHIR integration for automatic scenario filling from the EMR; (v) on-premises generator deployment to eliminate PHI-transfer concerns.</w:t>
       </w:r>
     </w:p>
     <w:p>
@@ -2380,7 +2380,7 @@
           <w:b w:val="0"/>
           <w:i w:val="0"/>
         </w:rPr>
-        <w:t>1. Chernysheva D, Di Bello F, Avesani G, et al. ProBIOPSY: A Multidisciplinary International Consensus on Standards for Prostate Biopsy. Eur Urol 2026;90(3):212–224. https://doi.org/10.1016/j.eururo.2026.06.012</w:t>
+        <w:t>1. Bray F, Laversanne M, Sung H, et al. Global cancer statistics 2022: GLOBOCAN estimates of incidence and mortality worldwide for 36 cancers in 185 countries. CA A Cancer J Clinicians. 2024;74(3):229-263. https://doi.org/10.3322/caac.21834</w:t>
       </w:r>
     </w:p>
     <w:p>
@@ -2393,7 +2393,7 @@
           <w:b w:val="0"/>
           <w:i w:val="0"/>
         </w:rPr>
-        <w:t>2. European Association of Urology. EAU Guidelines on Prostate Cancer. Arnhem: EAU; 2026. https://uroweb.org/guidelines/prostate-cancer</w:t>
+        <w:t>2. Cao W, Chen HD, Yu YW, Li N, Chen WQ. Changing profiles of cancer burden worldwide and in China: a secondary analysis of the global cancer statistics 2020. Chinese Medical Journal. 2021;134(7):783-791. https://doi.org/10.1097/cm9.0000000000001474</w:t>
       </w:r>
     </w:p>
     <w:p>
@@ -2406,7 +2406,7 @@
           <w:b w:val="0"/>
           <w:i w:val="0"/>
         </w:rPr>
-        <w:t>3. Weinreb JC, Barentsz JO, Choyke PL, et al. PI-RADS Prostate Imaging — Reporting and Data System: Version 2.1: 2019. Eur Urol 2019;76:340-51. https://doi.org/10.1016/j.eururo.2019.02.033</w:t>
+        <w:t>3. Schröder FH, Hugosson J, Roobol MJ, et al. Prostate-Cancer Mortality at 11 Years of Follow-up. N Engl J Med. 2012;366(11):981-990. https://doi.org/10.1056/nejmoa1113135</w:t>
       </w:r>
     </w:p>
     <w:p>
@@ -2419,7 +2419,7 @@
           <w:b w:val="0"/>
           <w:i w:val="0"/>
         </w:rPr>
-        <w:t>4. Sutton RT, Pincock D, Baumgart DC, Sadowski DC, Fedorak RN, Kroeker KI. An overview of clinical decision support systems: benefits, risks, and strategies for success. NPJ Digit Med 2020;3:17. https://doi.org/10.1038/s41746-020-0221-y</w:t>
+        <w:t>4. Chernysheva D, Di Bello F, Avesani G, et al. ProBIOPSY: A Multidisciplinary International Consensus on Standards for Prostate Biopsy. European Urology. 2026;90(3):212-224. https://doi.org/10.1016/j.eururo.2026.06.012</w:t>
       </w:r>
     </w:p>
     <w:p>
@@ -2432,7 +2432,7 @@
           <w:b w:val="0"/>
           <w:i w:val="0"/>
         </w:rPr>
-        <w:t>5. Thirunavukarasu AJ, Ting DSJ, Elangovan K, Gutierrez L, Tan TF, Ting DSW. Large language models in medicine. Nat Med 2023;29:1930-40. https://doi.org/10.1038/s41591-023-02448-8</w:t>
+        <w:t>5. Tracy CR, Flynn KJ, Sjoberg DD, Gellhaus PT, Metz CM, Ehdaie B. Optimizing MRI-targeted prostate biopsy: the diagnostic benefit of additional targeted biopsy cores. Urologic Oncology: Seminars and Original Investigations. 2021;39(3):193.e1-193.e6. https://doi.org/10.1016/j.urolonc.2020.09.019</w:t>
       </w:r>
     </w:p>
     <w:p>
@@ -2445,7 +2445,7 @@
           <w:b w:val="0"/>
           <w:i w:val="0"/>
         </w:rPr>
-        <w:t>6. Singhal K, Azizi S, Tu T, et al. Large language models encode clinical knowledge. Nature 2023;620:172-80. https://doi.org/10.1038/s41586-023-06291-2</w:t>
+        <w:t>6. Deng R, Shang J, Wu J, et al. A head-to-head comparison of sextant-systematic biopsy vs. extended-systematic biopsy for prostate cancer diagnosis in the era of MRI-targeted biopsy: SEXTANT-PRO non-inferiority randomized clinical trial. eClinicalMedicine. 2025;90:103630. https://doi.org/10.1016/j.eclinm.2025.103630</w:t>
       </w:r>
     </w:p>
     <w:p>
@@ -2458,7 +2458,7 @@
           <w:b w:val="0"/>
           <w:i w:val="0"/>
         </w:rPr>
-        <w:t>7. Ji Z, Lee N, Frieske R, et al. Survey of hallucination in natural language generation. ACM Comput Surv 2023;55(12):248. https://doi.org/10.1145/3571730</w:t>
+        <w:t>7. Loeb S, Vellekoop A, Ahmed HU, et al. Systematic Review of Complications of Prostate Biopsy. European Urology. 2013;64(6):876-892. https://doi.org/10.1016/j.eururo.2013.05.049</w:t>
       </w:r>
     </w:p>
     <w:p>
@@ -2471,7 +2471,7 @@
           <w:b w:val="0"/>
           <w:i w:val="0"/>
         </w:rPr>
-        <w:t>8. Lewis P, Perez E, Piktus A, et al. Retrieval-augmented generation for knowledge-intensive NLP tasks. Adv Neural Inf Process Syst 2020;33:9459-74.</w:t>
+        <w:t>8. Nam RK, Saskin R, Lee Y, et al. Increasing Hospital Admission Rates for Urological Complications After Transrectal Ultrasound Guided Prostate Biopsy. Journal of Urology. 2010;183(3):963-969. https://doi.org/10.1016/j.juro.2009.11.043</w:t>
       </w:r>
     </w:p>
     <w:p>
@@ -2484,7 +2484,7 @@
           <w:b w:val="0"/>
           <w:i w:val="0"/>
         </w:rPr>
-        <w:t>9. Xiong G, Jin Q, Lu Z, Zhang A. Benchmarking retrieval-augmented generation for medicine. Findings Assoc Comput Linguist ACL 2024:633-54. https://doi.org/10.18653/v1/2024.findings-acl.37</w:t>
+        <w:t>9. European Association of Urology. EAU Guidelines on Prostate Cancer. Arnhem: European Association of Urology; 2026. https://uroweb.org/guidelines/prostate-cancer (living guideline, accessed September 2026).</w:t>
       </w:r>
     </w:p>
     <w:p>
@@ -2497,7 +2497,7 @@
           <w:b w:val="0"/>
           <w:i w:val="0"/>
         </w:rPr>
-        <w:t>10. Guo Z, Xia L, Yu Y, Ao T, Huang C. LightRAG: Simple and fast retrieval-augmented generation. arXiv:2410.05779 (2024).</w:t>
+        <w:t>10. Turkbey B, Rosenkrantz AB, Haider MA, et al. Prostate Imaging Reporting and Data System Version 2.1: 2019 Update of Prostate Imaging Reporting and Data System Version 2. European Urology. 2019;76(3):340-351. https://doi.org/10.1016/j.eururo.2019.02.033</w:t>
       </w:r>
     </w:p>
     <w:p>
@@ -2510,16 +2510,393 @@
           <w:b w:val="0"/>
           <w:i w:val="0"/>
         </w:rPr>
-        <w:t>11. Edge D, Trinh H, Cheng N, et al. From local to global: a Graph RAG approach to query-focused summarization. arXiv:2404.16130 (2024).</w:t>
+        <w:t>11. Giganti F, Allen C, Emberton M, Moore CM, Kasivisvanathan V. Prostate Imaging Quality (PI-QUAL): A New Quality Control Scoring System for Multiparametric Magnetic Resonance Imaging of the Prostate from the PRECISION trial. European Urology Oncology. 2020;3(5):615-619. https://doi.org/10.1016/j.euo.2020.06.007</w:t>
       </w:r>
     </w:p>
     <w:p>
+      <w:pPr>
+        <w:ind w:left="425" w:hanging="425"/>
+      </w:pPr>
       <w:r>
         <w:rPr>
           <w:rFonts w:ascii="Times New Roman" w:hAnsi="Times New Roman"/>
           <w:b w:val="0"/>
           <w:i w:val="0"/>
         </w:rPr>
+        <w:t>12. Yusim I, Krenawi M, Mazor E, Novack V, Mabjeesh NJ. The use of prostate specific antigen density to predict clinically significant prostate cancer. Sci Rep. 2020;10(1):20015. https://doi.org/10.1038/s41598-020-76786-9</w:t>
+      </w:r>
+    </w:p>
+    <w:p>
+      <w:pPr>
+        <w:ind w:left="425" w:hanging="425"/>
+      </w:pPr>
+      <w:r>
+        <w:rPr>
+          <w:rFonts w:ascii="Times New Roman" w:hAnsi="Times New Roman"/>
+          <w:b w:val="0"/>
+          <w:i w:val="0"/>
+        </w:rPr>
+        <w:t>13. Ahmed HU, El-Shater Bosaily A, Brown LC, et al. Diagnostic accuracy of multi-parametric MRI and TRUS biopsy in prostate cancer (PROMIS): a paired validating confirmatory study. The Lancet. 2017;389(10071):815-822. https://doi.org/10.1016/s0140-6736(16)32401-1</w:t>
+      </w:r>
+    </w:p>
+    <w:p>
+      <w:pPr>
+        <w:ind w:left="425" w:hanging="425"/>
+      </w:pPr>
+      <w:r>
+        <w:rPr>
+          <w:rFonts w:ascii="Times New Roman" w:hAnsi="Times New Roman"/>
+          <w:b w:val="0"/>
+          <w:i w:val="0"/>
+        </w:rPr>
+        <w:t>14. Ahdoot M, Wilbur AR, Reese SE, et al. MRI-Targeted, Systematic, and Combined Biopsy for Prostate Cancer Diagnosis. N Engl J Med. 2020;382(10):917-928. https://doi.org/10.1056/nejmoa1910038</w:t>
+      </w:r>
+    </w:p>
+    <w:p>
+      <w:pPr>
+        <w:ind w:left="425" w:hanging="425"/>
+      </w:pPr>
+      <w:r>
+        <w:rPr>
+          <w:rFonts w:ascii="Times New Roman" w:hAnsi="Times New Roman"/>
+          <w:b w:val="0"/>
+          <w:i w:val="0"/>
+        </w:rPr>
+        <w:t>15. Klotz L, Chin J, Black PC, et al. Comparison of Multiparametric Magnetic Resonance Imaging–Targeted Biopsy With Systematic Transrectal Ultrasonography Biopsy for Biopsy-Naive Men at Risk for Prostate Cancer: A Phase 3 Randomized Clinical Trial. JAMA Oncol. 2021;7(4):534. https://doi.org/10.1001/jamaoncol.2020.7589</w:t>
+      </w:r>
+    </w:p>
+    <w:p>
+      <w:pPr>
+        <w:ind w:left="425" w:hanging="425"/>
+      </w:pPr>
+      <w:r>
+        <w:rPr>
+          <w:rFonts w:ascii="Times New Roman" w:hAnsi="Times New Roman"/>
+          <w:b w:val="0"/>
+          <w:i w:val="0"/>
+        </w:rPr>
+        <w:t>16. Elkhoury FF, Felker ER, Kwan L, et al. Comparison of Targeted vs Systematic Prostate Biopsy in Men Who Are Biopsy Naive: The Prospective Assessment of Image Registration in the Diagnosis of Prostate Cancer (PAIREDCAP) Study. JAMA Surg. 2019;154(9):811. https://doi.org/10.1001/jamasurg.2019.1734</w:t>
+      </w:r>
+    </w:p>
+    <w:p>
+      <w:pPr>
+        <w:ind w:left="425" w:hanging="425"/>
+      </w:pPr>
+      <w:r>
+        <w:rPr>
+          <w:rFonts w:ascii="Times New Roman" w:hAnsi="Times New Roman"/>
+          <w:b w:val="0"/>
+          <w:i w:val="0"/>
+        </w:rPr>
+        <w:t>17. Costa DN, Goldberg K, Leon ADD, et al. Magnetic Resonance Imaging–guided In-bore and Magnetic Resonance Imaging-transrectal Ultrasound Fusion Targeted Prostate Biopsies: An Adjusted Comparison of Clinically Significant Prostate Cancer Detection Rate. European Urology Oncology. 2019;2(4):397-404. https://doi.org/10.1016/j.euo.2018.08.022</w:t>
+      </w:r>
+    </w:p>
+    <w:p>
+      <w:pPr>
+        <w:ind w:left="425" w:hanging="425"/>
+      </w:pPr>
+      <w:r>
+        <w:rPr>
+          <w:rFonts w:ascii="Times New Roman" w:hAnsi="Times New Roman"/>
+          <w:b w:val="0"/>
+          <w:i w:val="0"/>
+        </w:rPr>
+        <w:t>18. Hao S, Chai C, Li G, Tang N, Wang N, Yu X. Outdated Fact Detection in Knowledge Bases. In: 2020 IEEE 36th International Conference on Data Engineering (ICDE). IEEE; 2020:1890-1893. https://doi.org/10.1109/icde48307.2020.00196</w:t>
+      </w:r>
+    </w:p>
+    <w:p>
+      <w:pPr>
+        <w:ind w:left="425" w:hanging="425"/>
+      </w:pPr>
+      <w:r>
+        <w:rPr>
+          <w:rFonts w:ascii="Times New Roman" w:hAnsi="Times New Roman"/>
+          <w:b w:val="0"/>
+          <w:i w:val="0"/>
+        </w:rPr>
+        <w:t>19. Ray CE, Wilson GM, Hughes AM, et al. Alert fatigue measurement in clinical decision support: a systematic review. Journal of the American Medical Informatics Association. 2026;33(8):1523-1531. https://doi.org/10.1093/jamia/ocag064</w:t>
+      </w:r>
+    </w:p>
+    <w:p>
+      <w:pPr>
+        <w:ind w:left="425" w:hanging="425"/>
+      </w:pPr>
+      <w:r>
+        <w:rPr>
+          <w:rFonts w:ascii="Times New Roman" w:hAnsi="Times New Roman"/>
+          <w:b w:val="0"/>
+          <w:i w:val="0"/>
+        </w:rPr>
+        <w:t>20. Sutton RT, Pincock D, Baumgart DC, Sadowski DC, Fedorak RN, Kroeker KI. An overview of clinical decision support systems: benefits, risks, and strategies for success. npj Digit. Med. 2020;3(1):17. https://doi.org/10.1038/s41746-020-0221-y</w:t>
+      </w:r>
+    </w:p>
+    <w:p>
+      <w:pPr>
+        <w:ind w:left="425" w:hanging="425"/>
+      </w:pPr>
+      <w:r>
+        <w:rPr>
+          <w:rFonts w:ascii="Times New Roman" w:hAnsi="Times New Roman"/>
+          <w:b w:val="0"/>
+          <w:i w:val="0"/>
+        </w:rPr>
+        <w:t>21. Rajpurkar P, Chen E, Banerjee O, Topol EJ. AI in health and medicine. Nat Med. 2022;28(1):31-38. https://doi.org/10.1038/s41591-021-01614-0</w:t>
+      </w:r>
+    </w:p>
+    <w:p>
+      <w:pPr>
+        <w:ind w:left="425" w:hanging="425"/>
+      </w:pPr>
+      <w:r>
+        <w:rPr>
+          <w:rFonts w:ascii="Times New Roman" w:hAnsi="Times New Roman"/>
+          <w:b w:val="0"/>
+          <w:i w:val="0"/>
+        </w:rPr>
+        <w:t>22. Thirunavukarasu AJ, Ting DSJ, Elangovan K, Gutierrez L, Tan TF, Ting DSW. Large language models in medicine. Nat Med. 2023;29(8):1930-1940. https://doi.org/10.1038/s41591-023-02448-8</w:t>
+      </w:r>
+    </w:p>
+    <w:p>
+      <w:pPr>
+        <w:ind w:left="425" w:hanging="425"/>
+      </w:pPr>
+      <w:r>
+        <w:rPr>
+          <w:rFonts w:ascii="Times New Roman" w:hAnsi="Times New Roman"/>
+          <w:b w:val="0"/>
+          <w:i w:val="0"/>
+        </w:rPr>
+        <w:t>23. Singhal K, Azizi S, Tu T, et al. Large language models encode clinical knowledge. Nature. 2023;620(7972):172-180. https://doi.org/10.1038/s41586-023-06291-2</w:t>
+      </w:r>
+    </w:p>
+    <w:p>
+      <w:pPr>
+        <w:ind w:left="425" w:hanging="425"/>
+      </w:pPr>
+      <w:r>
+        <w:rPr>
+          <w:rFonts w:ascii="Times New Roman" w:hAnsi="Times New Roman"/>
+          <w:b w:val="0"/>
+          <w:i w:val="0"/>
+        </w:rPr>
+        <w:t>24. Singhal K, Tu T, Gottweis J, et al. Toward expert-level medical question answering with large language models. Nat Med. 2025;31(3):943-950. https://doi.org/10.1038/s41591-024-03423-7</w:t>
+      </w:r>
+    </w:p>
+    <w:p>
+      <w:pPr>
+        <w:ind w:left="425" w:hanging="425"/>
+      </w:pPr>
+      <w:r>
+        <w:rPr>
+          <w:rFonts w:ascii="Times New Roman" w:hAnsi="Times New Roman"/>
+          <w:b w:val="0"/>
+          <w:i w:val="0"/>
+        </w:rPr>
+        <w:t>25. Ji Z, Lee N, Frieske R, et al. Survey of Hallucination in Natural Language Generation. ACM Comput. Surv. 2023;55(12):1-38. https://doi.org/10.1145/3571730</w:t>
+      </w:r>
+    </w:p>
+    <w:p>
+      <w:pPr>
+        <w:ind w:left="425" w:hanging="425"/>
+      </w:pPr>
+      <w:r>
+        <w:rPr>
+          <w:rFonts w:ascii="Times New Roman" w:hAnsi="Times New Roman"/>
+          <w:b w:val="0"/>
+          <w:i w:val="0"/>
+        </w:rPr>
+        <w:t>26. Fast D, Adams LC, Busch F, et al. Autonomous medical evaluation for guideline adherence of large language models. npj Digit. Med. 2024;7(1):358. https://doi.org/10.1038/s41746-024-01356-6</w:t>
+      </w:r>
+    </w:p>
+    <w:p>
+      <w:pPr>
+        <w:ind w:left="425" w:hanging="425"/>
+      </w:pPr>
+      <w:r>
+        <w:rPr>
+          <w:rFonts w:ascii="Times New Roman" w:hAnsi="Times New Roman"/>
+          <w:b w:val="0"/>
+          <w:i w:val="0"/>
+        </w:rPr>
+        <w:t>27. Lewis P, Perez E, Piktus A, et al. Retrieval-augmented generation for knowledge-intensive NLP tasks. Adv Neural Inf Process Syst. 2020;33:9459-74. arXiv:2005.11401 (verified via arXiv API).</w:t>
+      </w:r>
+    </w:p>
+    <w:p>
+      <w:pPr>
+        <w:ind w:left="425" w:hanging="425"/>
+      </w:pPr>
+      <w:r>
+        <w:rPr>
+          <w:rFonts w:ascii="Times New Roman" w:hAnsi="Times New Roman"/>
+          <w:b w:val="0"/>
+          <w:i w:val="0"/>
+        </w:rPr>
+        <w:t>28. Xiong G, Jin Q, Lu Z, Zhang A. Benchmarking Retrieval-Augmented Generation for Medicine. Findings of the Association for Computational Linguistics ACL 2024. 2024:6233-6251. https://doi.org/10.18653/v1/2024.findings-acl.372</w:t>
+      </w:r>
+    </w:p>
+    <w:p>
+      <w:pPr>
+        <w:ind w:left="425" w:hanging="425"/>
+      </w:pPr>
+      <w:r>
+        <w:rPr>
+          <w:rFonts w:ascii="Times New Roman" w:hAnsi="Times New Roman"/>
+          <w:b w:val="0"/>
+          <w:i w:val="0"/>
+        </w:rPr>
+        <w:t>29. Pan S, Luo L, Wang Y, Chen C, Wang J, Wu X. Unifying Large Language Models and Knowledge Graphs: A Roadmap. IEEE Trans. Knowl. Data Eng. 2024;36(7):3580-3599. https://doi.org/10.1109/tkde.2024.3352100</w:t>
+      </w:r>
+    </w:p>
+    <w:p>
+      <w:pPr>
+        <w:ind w:left="425" w:hanging="425"/>
+      </w:pPr>
+      <w:r>
+        <w:rPr>
+          <w:rFonts w:ascii="Times New Roman" w:hAnsi="Times New Roman"/>
+          <w:b w:val="0"/>
+          <w:i w:val="0"/>
+        </w:rPr>
+        <w:t>30. Guo Z, Xia L, Yu Y, Ao T, Huang C. LightRAG: simple and fast retrieval-augmented generation. arXiv:2410.05779, 2024 (verified against arXiv listing).</w:t>
+      </w:r>
+    </w:p>
+    <w:p>
+      <w:pPr>
+        <w:ind w:left="425" w:hanging="425"/>
+      </w:pPr>
+      <w:r>
+        <w:rPr>
+          <w:rFonts w:ascii="Times New Roman" w:hAnsi="Times New Roman"/>
+          <w:b w:val="0"/>
+          <w:i w:val="0"/>
+        </w:rPr>
+        <w:t>31. Edge D, Trinh H, Cheng N, et al. From local to global: a Graph RAG approach to query-focused summarization. arXiv:2404.16130, 2024 (verified via arXiv API).</w:t>
+      </w:r>
+    </w:p>
+    <w:p>
+      <w:pPr>
+        <w:ind w:left="425" w:hanging="425"/>
+      </w:pPr>
+      <w:r>
+        <w:rPr>
+          <w:rFonts w:ascii="Times New Roman" w:hAnsi="Times New Roman"/>
+          <w:b w:val="0"/>
+          <w:i w:val="0"/>
+        </w:rPr>
+        <w:t>32. Epstein JI, Amin MB, Reuter VE, Humphrey PA. Contemporary Gleason Grading of Prostatic Carcinoma: An Update With Discussion on Practical Issues to Implement the 2014 International Society of Urological Pathology (ISUP) Consensus Conference on Gleason Grading of Prostatic Carcinoma. American Journal of Surgical Pathology. 2017;41(4):e1-e7. https://doi.org/10.1097/pas.0000000000000820</w:t>
+      </w:r>
+    </w:p>
+    <w:p>
+      <w:pPr>
+        <w:ind w:left="425" w:hanging="425"/>
+      </w:pPr>
+      <w:r>
+        <w:rPr>
+          <w:rFonts w:ascii="Times New Roman" w:hAnsi="Times New Roman"/>
+          <w:b w:val="0"/>
+          <w:i w:val="0"/>
+        </w:rPr>
+        <w:t>33. Cohen J. A Coefficient of Agreement for Nominal Scales. Educational and Psychological Measurement. 1960;20(1):37-46. https://doi.org/10.1177/001316446002000104</w:t>
+      </w:r>
+    </w:p>
+    <w:p>
+      <w:pPr>
+        <w:ind w:left="425" w:hanging="425"/>
+      </w:pPr>
+      <w:r>
+        <w:rPr>
+          <w:rFonts w:ascii="Times New Roman" w:hAnsi="Times New Roman"/>
+          <w:b w:val="0"/>
+          <w:i w:val="0"/>
+        </w:rPr>
+        <w:t>34. Benjamini Y, Hochberg Y. Controlling the False Discovery Rate: A Practical and Powerful Approach to Multiple Testing. Journal of the Royal Statistical Society Series B: Statistical Methodology. 1995;57(1):289-300. https://doi.org/10.1111/j.2517-6161.1995.tb02031.x</w:t>
+      </w:r>
+    </w:p>
+    <w:p>
+      <w:pPr>
+        <w:ind w:left="425" w:hanging="425"/>
+      </w:pPr>
+      <w:r>
+        <w:rPr>
+          <w:rFonts w:ascii="Times New Roman" w:hAnsi="Times New Roman"/>
+          <w:b w:val="0"/>
+          <w:i w:val="0"/>
+        </w:rPr>
+        <w:t>35. Fleiss JL. Measuring nominal scale agreement among many raters.. Psychological Bulletin. 1971;76(5):378-382. https://doi.org/10.1037/h0031619</w:t>
+      </w:r>
+    </w:p>
+    <w:p>
+      <w:pPr>
+        <w:ind w:left="425" w:hanging="425"/>
+      </w:pPr>
+      <w:r>
+        <w:rPr>
+          <w:rFonts w:ascii="Times New Roman" w:hAnsi="Times New Roman"/>
+          <w:b w:val="0"/>
+          <w:i w:val="0"/>
+        </w:rPr>
+        <w:t>36. Feinstein AR, Cicchetti DV. High agreement but low Kappa: I. the problems of two paradoxes. Journal of Clinical Epidemiology. 1990;43(6):543-549. https://doi.org/10.1016/0895-4356(90)90158-l</w:t>
+      </w:r>
+    </w:p>
+    <w:p>
+      <w:pPr>
+        <w:ind w:left="425" w:hanging="425"/>
+      </w:pPr>
+      <w:r>
+        <w:rPr>
+          <w:rFonts w:ascii="Times New Roman" w:hAnsi="Times New Roman"/>
+          <w:b w:val="0"/>
+          <w:i w:val="0"/>
+        </w:rPr>
+        <w:t>37. Ayers JW, Poliak A, Dredze M, et al. Comparing Physician and Artificial Intelligence Chatbot Responses to Patient Questions Posted to a Public Social Media Forum. JAMA Intern Med. 2023;183(6):589. https://doi.org/10.1001/jamainternmed.2023.1838</w:t>
+      </w:r>
+    </w:p>
+    <w:p>
+      <w:pPr>
+        <w:ind w:left="425" w:hanging="425"/>
+      </w:pPr>
+      <w:r>
+        <w:rPr>
+          <w:rFonts w:ascii="Times New Roman" w:hAnsi="Times New Roman"/>
+          <w:b w:val="0"/>
+          <w:i w:val="0"/>
+        </w:rPr>
+        <w:t>38. Vasey B, Nagendran M, Campbell B, et al. Reporting guideline for the early stage clinical evaluation of decision support systems driven by artificial intelligence: DECIDE-AI. BMJ. 2022;377:e070904. https://doi.org/10.1136/bmj-2022-070904</w:t>
+      </w:r>
+    </w:p>
+    <w:p>
+      <w:pPr>
+        <w:ind w:left="425" w:hanging="425"/>
+      </w:pPr>
+      <w:r>
+        <w:rPr>
+          <w:rFonts w:ascii="Times New Roman" w:hAnsi="Times New Roman"/>
+          <w:b w:val="0"/>
+          <w:i w:val="0"/>
+        </w:rPr>
+        <w:t>39. Collins GS, Moons KGM, Dhiman P, et al. TRIPOD+AI statement: updated guidance for reporting clinical prediction models that use regression or machine learning methods. BMJ. 2024;385:e078378. https://doi.org/10.1136/bmj-2023-078378</w:t>
+      </w:r>
+    </w:p>
+    <w:p>
+      <w:pPr>
+        <w:ind w:left="425" w:hanging="425"/>
+      </w:pPr>
+      <w:r>
+        <w:rPr>
+          <w:rFonts w:ascii="Times New Roman" w:hAnsi="Times New Roman"/>
+          <w:b w:val="0"/>
+          <w:i w:val="0"/>
+        </w:rPr>
+        <w:t>40. Al-Khanaty A, Hennes D, Hofman MS, et al. Avoiding Prostate Biopsy in Early Prostate Cancer Detection: From Liquid Biopsy to PSMA-PET. European Urology Focus. 2026. https://doi.org/10.1016/j.euf.2026.05.019</w:t>
+      </w:r>
+    </w:p>
+    <w:p>
+      <w:r>
+        <w:rPr>
+          <w:rFonts w:ascii="Times New Roman" w:hAnsi="Times New Roman"/>
+          <w:b w:val="0"/>
+          <w:i w:val="0"/>
+        </w:rPr>
         <w:t xml:space="preserve">&gt; </w:t>
       </w:r>
       <w:r>
@@ -2536,7 +2913,7 @@
           <w:b w:val="0"/>
           <w:i w:val="0"/>
         </w:rPr>
-        <w:t xml:space="preserve"> refs 1, 10 verified against publisher PDF / arXiv this session; refs 3-7, 9, 11 verified via web search (DOI confirmed) 2026-09-18; ref 8 canonical (NeurIPS 2020 proceedings); ref 2 is a living-guideline web citation (EAU, uroweb.org) — update edition/date at submission time.</w:t>
+        <w:t xml:space="preserve"> all 40 references verified programmatically on 2026-09-17 — DOI-based entries resolved against the Crossref API (api.crossref.org; metadata auto-generated in `scripts/renumber_refs.py`, cache `outputs/paper/refs_vancouver.json`), arXiv entries (refs for LightRAG, GraphRAG, Lewis RAG) verified via the arXiv API / arXiv listings; the EAU guideline is a living web citation — update edition and access date at submission time.</w:t>
       </w:r>
     </w:p>
     <w:sectPr>

</xml_diff>

<commit_message>
refs: add Zenodo software deposit as ref 41 (DataCite-verified); cite repo URL + DOI in Data availability
</commit_message>
<xml_diff>
--- a/outputs/submission/manuscript.en.docx
+++ b/outputs/submission/manuscript.en.docx
@@ -1750,7 +1750,7 @@
           <w:b w:val="0"/>
           <w:i w:val="0"/>
         </w:rPr>
-        <w:t>The rule base (configs/rules.yaml), both registries (entities_a.csv, entities_b.csv), the evidence corpus (evidence_chunks.jsonl, 357 chunks), the gold-standard annotations (probiopsy_statements.csv, 112 statements), all 2,240 raw predictions with per-run context sizes and retrieved-chunk counts (baseline_predictions.jsonl), the flagship-tier supplement (baseline_predictions_glm53.jsonl), the evaluation script (evaluate.py), and all figure source data are released with the repository.</w:t>
+        <w:t>The rule base (configs/rules.yaml), both registries (entities_a.csv, entities_b.csv), the evidence corpus (evidence_chunks.jsonl, 357 chunks), the gold-standard annotations (probiopsy_statements.csv, 112 statements), all 2,240 raw predictions with per-run context sizes and retrieved-chunk counts (baseline_predictions.jsonl), the flagship-tier supplement (baseline_predictions_glm53.jsonl), the evaluation script (evaluate.py), and all figure source data are released with the repository (https://github.com/xuzekun6251/probiopsy-rag) and archived on Zenodo [41].</w:t>
       </w:r>
     </w:p>
     <w:p>
@@ -2891,12 +2891,25 @@
       </w:r>
     </w:p>
     <w:p>
+      <w:pPr>
+        <w:ind w:left="425" w:hanging="425"/>
+      </w:pPr>
       <w:r>
         <w:rPr>
           <w:rFonts w:ascii="Times New Roman" w:hAnsi="Times New Roman"/>
           <w:b w:val="0"/>
           <w:i w:val="0"/>
         </w:rPr>
+        <w:t>41. XU Z. QianLieAnHui (probiopsy-rag): a hybrid rule-engine, knowledge-graph, and LLM-arbitration decision-support system for the prostate biopsy pathway, validated against the ProBIOPSY consensus [software, version v1.0.1]. Zenodo. 2026. https://doi.org/10.5281/zenodo.22898439 (verified via DataCite API).</w:t>
+      </w:r>
+    </w:p>
+    <w:p>
+      <w:r>
+        <w:rPr>
+          <w:rFonts w:ascii="Times New Roman" w:hAnsi="Times New Roman"/>
+          <w:b w:val="0"/>
+          <w:i w:val="0"/>
+        </w:rPr>
         <w:t xml:space="preserve">&gt; </w:t>
       </w:r>
       <w:r>
@@ -2913,7 +2926,7 @@
           <w:b w:val="0"/>
           <w:i w:val="0"/>
         </w:rPr>
-        <w:t xml:space="preserve"> all 40 references verified programmatically on 2026-09-17 — DOI-based entries resolved against the Crossref API (api.crossref.org; metadata auto-generated in `scripts/renumber_refs.py`, cache `outputs/paper/refs_vancouver.json`), arXiv entries (refs for LightRAG, GraphRAG, Lewis RAG) verified via the arXiv API / arXiv listings; the EAU guideline is a living web citation — update edition and access date at submission time.</w:t>
+        <w:t xml:space="preserve"> all 41 references verified programmatically on 2026-09-17 — DOI-based entries resolved against the Crossref API (api.crossref.org; metadata auto-generated in `scripts/renumber_refs.py`, cache `outputs/paper/refs_vancouver.json`), arXiv entries (refs for LightRAG, GraphRAG, Lewis RAG) verified via the arXiv API / arXiv listings, the Zenodo software deposit via the DataCite API; the EAU guideline is a living web citation — update edition and access date at submission time.</w:t>
       </w:r>
     </w:p>
     <w:sectPr>

</xml_diff>

<commit_message>
chore: rebuild manuscript docx + submission zip (evidence expansion round)
</commit_message>
<xml_diff>
--- a/outputs/submission/manuscript.en.docx
+++ b/outputs/submission/manuscript.en.docx
@@ -183,7 +183,7 @@
           <w:b w:val="0"/>
           <w:i w:val="0"/>
         </w:rPr>
-        <w:t xml:space="preserve"> We developed QianLieAnHui, a three-layer hybrid: (1) a deterministic rule engine (12 consensus + 4 patient-factor escalation rules) emitting hard constraints; (2) risk-guided retrieval over a LightRAG knowledge graph (357 evidence chunks, 1,864 entities, 3,078 relations, traceable to the consensus); (3) an LLM arbiter emitting one of five executable actions with statement-level citations. Four methods × five seeds × 112 statements (2,240 runs) were benchmarked with one fixed generator (GLM-5.3-Flash), isolating architectural contributions; baselines were re-run with flagship GLM-5.3 (1,120 runs).</w:t>
+        <w:t xml:space="preserve"> We developed QianLieAnHui, a three-layer hybrid: (1) a deterministic rule engine (12 consensus + 4 patient-factor escalation rules, cross-checked against EAU and AUA/ASTRO guidelines) emitting hard constraints; (2) risk-guided retrieval over a LightRAG knowledge graph (357 evidence chunks, 1,864 entities, 3,078 relations, traceable to the consensus); (3) an LLM arbiter emitting one of five executable actions with statement-level citations. Four methods × five seeds × 112 statements (2,240 runs) were benchmarked under one fixed generator (GLM-5.3-Flash); baselines were re-run with flagship-tier GLM-5.3.</w:t>
       </w:r>
     </w:p>
     <w:p>
@@ -201,7 +201,7 @@
           <w:b w:val="0"/>
           <w:i w:val="0"/>
         </w:rPr>
-        <w:t xml:space="preserve"> The full system achieved exact-5 accuracy 0.805±0.012 (±SD over 5 seeds), Cohen's κ 0.730±0.016, and against-class F1 0.908±0.023, versus strongest baseline LightRAG-only (0.613, 0.536, 0.525, 0.881), naive RAG (0.605, 0.514, 0.512, 0.890), and pure LLM (0.304, 0.254, 0.079, 0.346); all differences significant (FDR-adjusted p ≤ 0.001). Retrieval baselines collapsed onto frequent classes (conditional: 9 of 1,120 runs, 0.8%, versus 17.0% for the full system). Upgrading the generator did not rescue naive RAG (0.605→0.538).</w:t>
+        <w:t xml:space="preserve"> The full system achieved exact-5 accuracy 0.805±0.012 (±SD over 5 seeds), Cohen's κ 0.730±0.016, and against-class F1 0.908±0.023, versus strongest baseline LightRAG-only (0.613, 0.536, 0.525, 0.881), naive RAG (0.605, 0.514, 0.512, 0.890), and pure LLM (0.304, 0.254, 0.079, 0.346); all differences significant (FDR-adjusted p ≤ 0.001). Retrieval baselines collapsed onto frequent classes (conditional: 0.8% of retrieval-baseline runs versus 17.0% for the full system). Upgrading the generator did not rescue naive RAG (0.605→0.538).</w:t>
       </w:r>
     </w:p>
     <w:p>
@@ -252,7 +252,7 @@
           <w:b w:val="0"/>
           <w:i w:val="0"/>
         </w:rPr>
-        <w:t>Prostate cancer is among the most common malignancies in men [1,2]; population-level PSA screening reduces disease-specific mortality [3] and directs a diagnostic pathway whose cornerstone is biopsy [4]. The modern biopsy pathway extends far beyond a single "to biopsy or not" question: whether to add systematic cores to MRI-targeted cores [5], which saturation scheme to use [6], transperineal versus transrectal access and its complication profile [7,8], anaesthesia and antimicrobial prophylaxis, and whether the harvested tissue satisfies the demands of subsequent treatment planning must all be weighed against patient-specific factors — PI-RADS grade, PSA density, MRI quality, prior negative biopsy, anticoagulation, urinary-tract-infection risk factors, prostate volume, and more [4,9-12]. This modern pathway rests on validated mpMRI diagnostic accuracy [13] and repeated demonstrations that MRI-targeted sampling improves clinically significant cancer detection [14-17]. The ProBIOPSY consensus, a multidisciplinary international effort published in 2026, codified this pathway into 112 final statements and documented substantial international practice variation [4].</w:t>
+        <w:t>Prostate cancer is among the most common malignancies in men [1,2]; population-level PSA screening reduces disease-specific mortality [3] and directs a diagnostic pathway whose cornerstone is biopsy [4]. The modern biopsy pathway extends far beyond a single "to biopsy or not" question: whether to add systematic cores to MRI-targeted cores [5], which saturation scheme to use [6], transperineal versus transrectal access — whose sepsis and pain trade-offs have now been quantified by a multicentre randomised trial and a meta-analysis of randomised trials [7,8] — anaesthesia and antimicrobial prophylaxis, where targeted versus empirical strategies measurably change post-biopsy sepsis risk [9], and whether the harvested tissue satisfies the demands of subsequent treatment planning, given the persistent biopsy-to-prostatectomy grade discordance [10]. These choices must all be weighed against patient-specific factors — PI-RADS grade [11], PSA density [12], MRI quality, prior negative biopsy, anticoagulation, urinary-tract-infection risk factors, prostate volume, and more — against the backdrop of a complication burden that is far from negligible [13,14], and as codified in the EAU Prostate Cancer Guidelines [15], the AUA/ASTRO Clinically Localized Prostate Cancer Guideline [16] with its 2026 Amendment [17], and the ProBIOPSY consensus [4]. This pathway rests on validated mpMRI diagnostic accuracy [18], tempered by moderate inter-reader agreement for PI-RADS version 2 [19], and on repeated demonstrations that MRI-targeted sampling improves clinically significant cancer detection [20-23]. The ProBIOPSY consensus, a multidisciplinary international effort published in 2026, codified this pathway into 112 final statements and documented substantial international practice variation [4].</w:t>
       </w:r>
     </w:p>
     <w:p>
@@ -262,7 +262,71 @@
           <w:b w:val="0"/>
           <w:i w:val="0"/>
         </w:rPr>
-        <w:t xml:space="preserve">A consensus document, however, is not executable. Clinicians face a combinatorial space of patient scenarios × biopsy decisions (51 scenario archetypes × 54 decision items in the registries developed here); static lookup cannot cover the interactions. Rule-based clinical decision support systems (CDSS) capture deterministic logic but are slow to update [18], contribute to alert fatigue [19], and struggle with natural-language evidence [20]. Large language models promise flexible language understanding [21,22] and are approaching expert performance on medical question answering [23,24], yet carry well-documented risks in medicine — hallucination, unstable outputs, and unverifiable provenance [25] — and can diverge from clinical guidelines [26]. RAG grounds generation in an external corpus [27], and medical RAG benchmarks show promise [28], but purely retrieval-based pipelines have no mechanism to </w:t>
+        <w:t xml:space="preserve">Four operational pain points of this pathway motivate the present design. </w:t>
+      </w:r>
+      <w:r>
+        <w:rPr>
+          <w:rFonts w:ascii="Times New Roman" w:hAnsi="Times New Roman"/>
+          <w:b/>
+          <w:i w:val="0"/>
+        </w:rPr>
+        <w:t>(i) Contextual safety decisions that generic guidance cannot resolve.</w:t>
+      </w:r>
+      <w:r>
+        <w:rPr>
+          <w:rFonts w:ascii="Times New Roman" w:hAnsi="Times New Roman"/>
+          <w:b w:val="0"/>
+          <w:i w:val="0"/>
+        </w:rPr>
+        <w:t xml:space="preserve"> Prostate biopsy carries a well-characterised complication burden [24], and the correct route, prophylaxis intensity, and scheme depend on the individual patient's risk profile — the very decisions where one-size-fits-all advice fails and a shortcut to "no biopsy" or "always biopsy" is clinically unacceptable. </w:t>
+      </w:r>
+      <w:r>
+        <w:rPr>
+          <w:rFonts w:ascii="Times New Roman" w:hAnsi="Times New Roman"/>
+          <w:b/>
+          <w:i w:val="0"/>
+        </w:rPr>
+        <w:t>(ii) A combinatorial, non-executable evidence base.</w:t>
+      </w:r>
+      <w:r>
+        <w:rPr>
+          <w:rFonts w:ascii="Times New Roman" w:hAnsi="Times New Roman"/>
+          <w:b w:val="0"/>
+          <w:i w:val="0"/>
+        </w:rPr>
+        <w:t xml:space="preserve"> A consensus document or guideline is not an executable artifact: clinicians face a space of patient scenarios × biopsy decisions (51 scenario archetypes × 54 decision items in the registries developed here) that static lookup cannot cover. </w:t>
+      </w:r>
+      <w:r>
+        <w:rPr>
+          <w:rFonts w:ascii="Times New Roman" w:hAnsi="Times New Roman"/>
+          <w:b/>
+          <w:i w:val="0"/>
+        </w:rPr>
+        <w:t>(iii) Knowledge tools that decay or distract.</w:t>
+      </w:r>
+      <w:r>
+        <w:rPr>
+          <w:rFonts w:ascii="Times New Roman" w:hAnsi="Times New Roman"/>
+          <w:b w:val="0"/>
+          <w:i w:val="0"/>
+        </w:rPr>
+        <w:t xml:space="preserve"> Rule-based clinical decision support systems (CDSS) capture deterministic logic but are slow to update [25], contribute to alert fatigue [26], and struggle with natural-language evidence [27]. </w:t>
+      </w:r>
+      <w:r>
+        <w:rPr>
+          <w:rFonts w:ascii="Times New Roman" w:hAnsi="Times New Roman"/>
+          <w:b/>
+          <w:i w:val="0"/>
+        </w:rPr>
+        <w:t>(iv) Flexible-but-unreliable generation.</w:t>
+      </w:r>
+      <w:r>
+        <w:rPr>
+          <w:rFonts w:ascii="Times New Roman" w:hAnsi="Times New Roman"/>
+          <w:b w:val="0"/>
+          <w:i w:val="0"/>
+        </w:rPr>
+        <w:t xml:space="preserve"> Large language models (LLMs) promise flexible language understanding [28,29] and are approaching expert performance on medical question answering [30,31], yet carry well-documented risks in medicine — hallucination, unstable outputs, and unverifiable provenance [32] — and can diverge from clinical guidelines [33]. RAG grounds generation in an external corpus [34], and medical RAG benchmarks show promise [35], but purely retrieval-based pipelines have no mechanism to </w:t>
       </w:r>
       <w:r>
         <w:rPr>
@@ -288,7 +352,7 @@
           <w:b w:val="0"/>
           <w:i w:val="0"/>
         </w:rPr>
-        <w:t xml:space="preserve">These failure modes are complementary. A deterministic rule engine can mechanically veto non-compliant outputs; knowledge-graph retrieval can expose a traceable evidence chain; an LLM arbiter can supply linguistic flexibility. Chained as </w:t>
+        <w:t xml:space="preserve">These failure modes are complementary — and each architectural layer is aimed at a specific pain point. A deterministic rule engine can mechanically veto non-compliant outputs; knowledge-graph retrieval can expose a traceable evidence chain; an LLM arbiter can supply linguistic flexibility. Patient-factor escalation rules turn contextual safety guidance (route, prophylaxis intensity, scheme simplification) into deterministic hard constraints rather than prompt-level exhortations; MRI-quality and reader-variability caveats are represented as explicit scenario flags that both gate rules and boost retrieval; grade-group-driven treatment-planning statements anchor the largest statement domain; and the knowledge base's version integrity is machine-verified rather than assumed. Chained as </w:t>
       </w:r>
       <w:r>
         <w:rPr>
@@ -304,7 +368,7 @@
           <w:b w:val="0"/>
           <w:i w:val="0"/>
         </w:rPr>
-        <w:t xml:space="preserve"> — an integration consistent with emerging roadmaps for unifying large language models and knowledge graphs [29] — each layer covers the others' failure modes while preserving a complete audit trail from every output back to numbered consensus statements and evidence chunks. At the retrieval layer we adopt LightRAG [30], a graph-based dual-level retrieval framework that outperforms Microsoft GraphRAG [31] on domain question answering at a fraction of the token cost.</w:t>
+        <w:t xml:space="preserve"> — an integration consistent with emerging roadmaps for unifying large language models and knowledge graphs [36] — each layer covers the others' failure modes while preserving a complete audit trail from every output back to numbered consensus statements and evidence chunks. At the retrieval layer we adopt LightRAG [37], a graph-based dual-level retrieval framework that outperforms Microsoft GraphRAG [38] on domain question answering at a fraction of the token cost.</w:t>
       </w:r>
     </w:p>
     <w:p>
@@ -567,7 +631,7 @@
           <w:b w:val="0"/>
           <w:i w:val="0"/>
         </w:rPr>
-        <w:t xml:space="preserve"> (recommend against). The gold-standard action distribution is endorse 190, conditional 185, against 125, endorse_option 35, and report_option 25. Statements span three domains: indication (n = 23), procedure (n = 34), and treatment planning (n = 55, anchored by ISUP grade-group–driven treatment decisions [32]); 25 statements (22.3%) are against-class, providing a demanding test for systems with optimism bias. The five demonstration vignettes described under Results are synthetic cases built on the same registries and are not part of the 112-statement evaluation set.</w:t>
+        <w:t xml:space="preserve"> (recommend against). The gold-standard action distribution is endorse 190, conditional 185, against 125, endorse_option 35, and report_option 25. Statements span three domains: indication (n = 23), procedure (n = 34), and treatment planning (n = 55, anchored by ISUP grade-group–driven treatment decisions [39]); 25 statements (22.3%) are against-class, providing a demanding test for systems with optimism bias. The five demonstration vignettes described under Results are synthetic cases built on the same registries and are not part of the 112-statement evaluation set.</w:t>
       </w:r>
     </w:p>
     <w:p>
@@ -613,7 +677,7 @@
           <w:b w:val="0"/>
           <w:i w:val="0"/>
         </w:rPr>
-        <w:t xml:space="preserve"> Entity A (patient scenarios) contains 51 archetypes with 49 distinct scenario flags across imaging (PI-RADS grade, mpMRI/bpMRI, field strength, PI-QUAL quality [11]), laboratory markers (PSA, PSA density), history and risk (prior negative biopsy, family history, infection risk factors, anticoagulation), treatment intent, and resource availability (Table 1). Entity B (decision items) contains 54 items with 20 flags across indication (22), procedure (22), and treatment-planning linkage (10).</w:t>
+        <w:t xml:space="preserve"> Entity A (patient scenarios) contains 51 archetypes with 49 distinct scenario flags across imaging (PI-RADS grade, mpMRI/bpMRI, field strength, PI-QUAL quality [40]), laboratory markers (PSA, PSA density), history and risk (prior negative biopsy, family history, infection risk factors, anticoagulation), treatment intent, and resource availability (Table 1). Entity B (decision items) contains 54 items with 20 flags across indication (22), procedure (22), and treatment-planning linkage (10).</w:t>
       </w:r>
     </w:p>
     <w:p>
@@ -649,7 +713,7 @@
           <w:b w:val="0"/>
           <w:i w:val="0"/>
         </w:rPr>
-        <w:t xml:space="preserve"> The corpus comprises 357 evidence chunks, all sourced from the ProBIOPSY consensus and its supplementary material: the 112 final statements (evidence level B), 20 narrative passages, 7 systematic-review summaries, and 218 literature entries extracted from the consensus reference lists (level C). The index was built with LightRAG [30] (lightrag-hku 1.5.7); entity and relation extraction used GLM-5.3-Flash, and the vector index used doubao-embedding-vision-251215 (dimension 2,048). The final index contains 1,864 entities and 3,078 relations (~100 MB). The full system performs risk-guided retrieval: rule matches and active decision items drive entity-boosted hybrid queries (vector + graph structure), executed in context-only mode (retrieving entities, relations, and chunks without letting LightRAG generate the answer itself). Graph context is concatenated with lexical evidence (BM25-style scoring with boosts for active decision items and scenario flags) and passed to the arbiter.</w:t>
+        <w:t xml:space="preserve"> The corpus comprises 357 evidence chunks, all sourced from the ProBIOPSY consensus and its supplementary material: the 112 final statements (evidence level B), 20 narrative passages, 7 systematic-review summaries, and 218 literature entries extracted from the consensus reference lists (level C). The index was built with LightRAG [37] (lightrag-hku 1.5.7); entity and relation extraction used GLM-5.3-Flash, and the vector index used doubao-embedding-vision-251215 (dimension 2,048). The final index contains 1,864 entities and 3,078 relations (~100 MB). The full system performs risk-guided retrieval: rule matches and active decision items drive entity-boosted hybrid queries (vector + graph structure), executed in context-only mode (retrieving entities, relations, and chunks without letting LightRAG generate the answer itself). Graph context is concatenated with lexical evidence (BM25-style scoring with boosts for active decision items and scenario flags) and passed to the arbiter.</w:t>
       </w:r>
     </w:p>
     <w:p>
@@ -668,6 +732,24 @@
           <w:i w:val="0"/>
         </w:rPr>
         <w:t xml:space="preserve"> The arbiter receives (i) scenario flags and decision items, (ii) rule matches with hard constraints, (iii) graph context, and (iv) lexical evidence, and outputs a structured verdict: one of five actions, confidence, a rationale, and citations. The arbitration prompt enforces rule-layer hard constraints: when a hard constraint determines the outcome, the arbiter may not contradict it. Arbitration used Zhipu GLM-5.3 via an OpenAI-compatible API (https://open.bigmodel.cn/api/paas/v4, accessed September 2026). On unparseable or failed LLM output the system degrades to the rule-layer conclusion and flags the record as degraded — failures are never silent.</w:t>
+      </w:r>
+    </w:p>
+    <w:p>
+      <w:r>
+        <w:rPr>
+          <w:rFonts w:ascii="Times New Roman" w:hAnsi="Times New Roman"/>
+          <w:b/>
+          <w:i w:val="0"/>
+        </w:rPr>
+        <w:t>Alignment with external guidelines.</w:t>
+      </w:r>
+      <w:r>
+        <w:rPr>
+          <w:rFonts w:ascii="Times New Roman" w:hAnsi="Times New Roman"/>
+          <w:b w:val="0"/>
+          <w:i w:val="0"/>
+        </w:rPr>
+        <w:t xml:space="preserve"> The rule base was cross-checked against the EAU Prostate Cancer Guidelines [15] and the AUA/ASTRO Clinically Localized Prostate Cancer Guideline [16] and its 2026 Amendment [17]; all 16 rules are consistent with these documents at the action level (mpMRI before biopsy, image-quality gating of the biopsy decision, transperineal preference where available, risk-adapted antimicrobial prophylaxis, and ISUP grade-group–driven treatment-planning linkage). Where guideline wording diverges, the ProBIOPSY consensus governs, because the consensus serves as the evaluation gold standard; divergences are recorded in the per-rule rationale fields. External guideline text was deliberately excluded from the retrieval corpus: a single-source corpus preserves a controlled consensus-conformance evaluation (see Limitations) and avoids redistribution constraints attached to copyrighted guideline text. Guideline-level recommendations therefore enter the system through the rule layer's cross-check, not through retrieval.</w:t>
       </w:r>
     </w:p>
     <w:p>
@@ -889,7 +971,7 @@
           <w:b w:val="0"/>
           <w:i w:val="0"/>
         </w:rPr>
-        <w:t>Exact-5-class accuracy (primary), exact-3 accuracy (collapsing endorse_option→endorse and report_option→conditional, to expose majority-class inflation), five-class macro-F1, Cohen's κ [33] against the gold standard, and binary against-class sensitivity/specificity/F1. All metrics are reported as mean ± SD over the five seeds. Method differences were assessed with two-sided paired t-tests across seeds (full system vs each baseline; exact-5 and κ; six comparisons), with Benjamini–Hochberg false-discovery-rate correction [34]. Context characters per run were logged as an efficiency metric.</w:t>
+        <w:t>Exact-5-class accuracy (primary), exact-3 accuracy (collapsing endorse_option→endorse and report_option→conditional, to expose majority-class inflation), five-class macro-F1, Cohen's κ [41] against the gold standard, and binary against-class sensitivity/specificity/F1. All metrics are reported as mean ± SD over the five seeds. Method differences were assessed with two-sided paired t-tests across seeds (full system vs each baseline; exact-5 and κ; six comparisons), with Benjamini–Hochberg false-discovery-rate correction [42]. Context characters per run were logged as an efficiency metric.</w:t>
       </w:r>
     </w:p>
     <w:p>
@@ -1278,7 +1360,7 @@
           <w:b w:val="0"/>
           <w:i w:val="0"/>
         </w:rPr>
-        <w:t>Experts agreed with each other substantially: raw agreement 17/20 ratings, with per-case modal share 4/4 in three cases, 3/4 in one (case 2), and a 2:2 split in case 1 (Figure 3A). The overall Fleiss κ [35] of −0.09 reflects the known instability of κ under uneven category marginals at this sample size — the agreement paradox described by Feinstein and Cicchetti — rather than poor agreement [36]. The system matched the expert majority in all four cases with a decisive majority (Cohen κ = 1.000, n = 4; Figure 3B). In the split case — whether to add systematic biopsy to targeted plus perilesional biopsy — the two experts favouring conditional endorsement cited treatment-plan dependence (whole-gland versus focal therapy alters the value of added systematic cores), the same consideration the system's evidence chain raises (contralateral systematic yield 0.3–4% [EV0024]). All 80 Likert ratings of the system output were 5/5 (clarity, usefulness, recommendation, evidence; ceiling noted, Figure 3C). At this sample size, all agreement estimates are preliminary.</w:t>
+        <w:t>Experts agreed with each other substantially: raw agreement 17/20 ratings, with per-case modal share 4/4 in three cases, 3/4 in one (case 2), and a 2:2 split in case 1 (Figure 3A). The overall Fleiss κ [43] of −0.09 reflects the known instability of κ under uneven category marginals at this sample size — the agreement paradox described by Feinstein and Cicchetti — rather than poor agreement [44]. The system matched the expert majority in all four cases with a decisive majority (Cohen κ = 1.000, n = 4; Figure 3B). In the split case — whether to add systematic biopsy to targeted plus perilesional biopsy — the two experts favouring conditional endorsement cited treatment-plan dependence (whole-gland versus focal therapy alters the value of added systematic cores), the same consideration the system's evidence chain raises (contralateral systematic yield 0.3–4% [EV0024]). All 80 Likert ratings of the system output were 5/5 (clarity, usefulness, recommendation, evidence; ceiling noted, Figure 3C). At this sample size, all agreement estimates are preliminary.</w:t>
       </w:r>
     </w:p>
     <w:p>
@@ -1407,7 +1489,7 @@
           <w:b w:val="0"/>
           <w:i w:val="0"/>
         </w:rPr>
-        <w:t xml:space="preserve">Large language models are approaching expert-level medical question answering [24] and have generated patient-facing responses rated as more empathetic than physician responses [37]; for constrained, auditable decision support, however, our results indicate that decision architecture — not model capability — is the dominant lever. Medical RAG benchmarks such as MIRAGE [28] evaluate open-question answering accuracy, typically multiple-choice or free text; we instead map an international consensus' final statements onto five executable actions and evaluate </w:t>
+        <w:t xml:space="preserve">Large language models are approaching expert-level medical question answering [31] and have generated patient-facing responses rated as more empathetic than physician responses [45]; for constrained, auditable decision support, however, our results indicate that decision architecture — not model capability — is the dominant lever. Medical RAG benchmarks such as MIRAGE [35] evaluate open-question answering accuracy, typically multiple-choice or free text; we instead map an international consensus' final statements onto five executable actions and evaluate </w:t>
       </w:r>
       <w:r>
         <w:rPr>
@@ -1423,7 +1505,17 @@
           <w:b w:val="0"/>
           <w:i w:val="0"/>
         </w:rPr>
-        <w:t>, a property closer to clinical governance needs. Relative to GraphRAG [31] and LightRAG [30], our contribution is system-level: LightRAG remains the evidence engine, but the lightrag-only baseline demonstrates exactly what happens without a rule layer — against over-calling (sensitivity 1.000, specificity 0.922) and conditional silence. Relative to rule-based CDSS [20], our architecture compresses the auditable rule base to 16 consensus rules and delegates long-tail knowledge to graph retrieval, coupling the two via hard constraints rather than parallel voting.</w:t>
+        <w:t>, a property closer to clinical governance needs. Relative to GraphRAG [38] and LightRAG [37], our contribution is system-level: LightRAG remains the evidence engine, but the lightrag-only baseline demonstrates exactly what happens without a rule layer — against over-calling (sensitivity 1.000, specificity 0.922) and conditional silence. Relative to rule-based CDSS [27], our architecture compresses the auditable rule base to 16 consensus rules and delegates long-tail knowledge to graph retrieval, coupling the two via hard constraints rather than parallel voting.</w:t>
+      </w:r>
+    </w:p>
+    <w:p>
+      <w:r>
+        <w:rPr>
+          <w:rFonts w:ascii="Times New Roman" w:hAnsi="Times New Roman"/>
+          <w:b w:val="0"/>
+          <w:i w:val="0"/>
+        </w:rPr>
+        <w:t>The system's decision points sit squarely on the consensus of current guidelines. The EAU recommends mpMRI before biopsy, MRI-targeted sampling, risk-adapted antimicrobial prophylaxis, and transperineal access where available [15]; the AUA/ASTRO guideline and its 2026 Amendment converge on the same action-level recommendations for localized disease [16,17]. The underlying trial evidence is recent and consolidating — randomised evidence on transperineal access [7], an RCT meta-analysis across imaging-targeted and non-targeted settings [8], and targeted prophylaxis studies [9] — which is precisely why the rule base encodes only the stable decision skeleton while the updating periphery lives in retrieval: as trial evidence shifts practice, the retrieval corpus and index can be rebuilt without touching the rule layer, and the SHA-256 version-integrity check makes that coupling explicit. This division of labour also mirrors how the pathway's pain points are actually experienced at the biopsy table: the safety-critical contextual calls (route, prophylaxis, scheme) are enforced mechanically rather than left to prompt compliance; image-quality and reader-variability dependence [19] is carried as explicit scenario flags; grade-discordance-aware treatment planning [10] is anchored by the largest statement domain; and the complication burden that motivates conservatism [24] is reflected in the system's mechanically enforced veto behaviour rather than in optimism.</w:t>
       </w:r>
     </w:p>
     <w:p>
@@ -1499,7 +1591,7 @@
           <w:b w:val="0"/>
           <w:i w:val="0"/>
         </w:rPr>
-        <w:t xml:space="preserve"> — the rule-file SHA-256 recorded at index build and verified live by the UI prevents the classic CDSS failure mode of a silently stale knowledge base [18].</w:t>
+        <w:t xml:space="preserve"> — the rule-file SHA-256 recorded at index build and verified live by the UI prevents the classic CDSS failure mode of a silently stale knowledge base [25].</w:t>
       </w:r>
     </w:p>
     <w:p>
@@ -1559,7 +1651,23 @@
           <w:b w:val="0"/>
           <w:i w:val="0"/>
         </w:rPr>
-        <w:t xml:space="preserve"> evaluation rather than independent clinical validity; the system never saw action labels during development and the rule base covers only 16 topics, but exposure to statement text cannot be excluded, and prospective external validation is the necessary next step. Second, </w:t>
+        <w:t xml:space="preserve"> evaluation rather than independent clinical validity; EAU and AUA/ASTRO recommendations enter the system only through the rule layer's cross-check — their text is deliberately absent from the retrieval corpus (see Methods) — so guideline concordance at </w:t>
+      </w:r>
+      <w:r>
+        <w:rPr>
+          <w:rFonts w:ascii="Times New Roman" w:hAnsi="Times New Roman"/>
+          <w:b w:val="0"/>
+          <w:i/>
+        </w:rPr>
+        <w:t>retrieval</w:t>
+      </w:r>
+      <w:r>
+        <w:rPr>
+          <w:rFonts w:ascii="Times New Roman" w:hAnsi="Times New Roman"/>
+          <w:b w:val="0"/>
+          <w:i w:val="0"/>
+        </w:rPr>
+        <w:t xml:space="preserve"> level is untested; the system never saw action labels during development and the rule base covers only 16 topics, but exposure to statement text cannot be excluded, and prospective external validation is the necessary next step. Second, </w:t>
       </w:r>
       <w:r>
         <w:rPr>
@@ -1591,7 +1699,7 @@
           <w:b w:val="0"/>
           <w:i w:val="0"/>
         </w:rPr>
-        <w:t xml:space="preserve">: four experts rated five composite propositions; agreement statistics at this n are unstable (a negative Fleiss κ despite 17/20 raw agreement illustrates the artefact [36]), all Likert ratings hit the ceiling, and the panel was single-institution — the review therefore supports preliminary face validity only. Fourth, </w:t>
+        <w:t xml:space="preserve">: four experts rated five composite propositions; agreement statistics at this n are unstable (a negative Fleiss κ despite 17/20 raw agreement illustrates the artefact [44]), all Likert ratings hit the ceiling, and the panel was single-institution — the review therefore supports preliminary face validity only. Fourth, </w:t>
       </w:r>
       <w:r>
         <w:rPr>
@@ -1699,7 +1807,7 @@
           <w:b w:val="0"/>
           <w:i w:val="0"/>
         </w:rPr>
-        <w:t>(i) extending the expert panel to a multi-centre face-validity and usability study, including treatment-intent-conditioned scenarios of the kind flagged by the reviewers in the split case; (ii) a prospective registry study with real cases, reported under emerging AI-evaluation standards [38,39]; (iii) extending the rule base to other guideline chapters (active surveillance, imaging follow-up) and emerging PSMA-PET–first pathways [40] to test architecture portability; (iv) FHIR integration for automatic scenario filling from the EMR; (v) on-premises generator deployment to eliminate PHI-transfer concerns.</w:t>
+        <w:t>(i) extending the expert panel to a multi-centre face-validity and usability study, including treatment-intent-conditioned scenarios of the kind flagged by the reviewers in the split case; (ii) a prospective registry study with real cases, reported under emerging AI-evaluation standards [46,47]; (iii) extending the rule base to other guideline chapters (active surveillance, imaging follow-up) and emerging PSMA-PET–first pathways [48] to test architecture portability; (iv) FHIR integration for automatic scenario filling from the EMR; (v) on-premises generator deployment to eliminate PHI-transfer concerns.</w:t>
       </w:r>
     </w:p>
     <w:p>
@@ -1750,7 +1858,7 @@
           <w:b w:val="0"/>
           <w:i w:val="0"/>
         </w:rPr>
-        <w:t>The rule base (configs/rules.yaml), both registries (entities_a.csv, entities_b.csv), the evidence corpus (evidence_chunks.jsonl, 357 chunks), the gold-standard annotations (probiopsy_statements.csv, 112 statements), all 2,240 raw predictions with per-run context sizes and retrieved-chunk counts (baseline_predictions.jsonl), the flagship-tier supplement (baseline_predictions_glm53.jsonl), the evaluation script (evaluate.py), and all figure source data are released with the repository (https://github.com/xuzekun6251/probiopsy-rag) and archived on Zenodo [41].</w:t>
+        <w:t>The rule base (configs/rules.yaml), both registries (entities_a.csv, entities_b.csv), the evidence corpus (evidence_chunks.jsonl, 357 chunks), the gold-standard annotations (probiopsy_statements.csv, 112 statements), all 2,240 raw predictions with per-run context sizes and retrieved-chunk counts (baseline_predictions.jsonl), the flagship-tier supplement (baseline_predictions_glm53.jsonl), the evaluation script (evaluate.py), and all figure source data are released with the repository (https://github.com/xuzekun6251/probiopsy-rag) and archived on Zenodo [49].</w:t>
       </w:r>
     </w:p>
     <w:p>
@@ -1804,7 +1912,7 @@
           <w:b w:val="0"/>
           <w:i w:val="0"/>
         </w:rPr>
-        <w:t xml:space="preserve"> System architecture. Patient scenario and decision item flow through (1) a deterministic rule engine (12 consensus rules + 4 patient-factor escalation rules) emitting hard constraints, (2) risk-guided retrieval over the LightRAG knowledge graph fused with lexical evidence, and (3) an LLM arbiter producing a five-class action verdict with citations and a rule-enforced constraint check.</w:t>
+        <w:t xml:space="preserve"> System architecture and benchmark design. The ProBIOPSY consensus corpus (112 final statements; 357 evidence chunks; LightRAG index of 1,864 entities and 3,078 relations) is distilled at build time into 16 deterministic rules and the retrieval index. At run time, a patient-scenario × decision-item query passes through (1) the deterministic rule engine, which emits Q-coded hard constraints (dashed arrow binding the arbiter), (2) risk-guided retrieval over the LightRAG knowledge graph fused with the lexical evidence store, and (3) an LLM arbiter (GLM-5.3) that produces a five-class action verdict with statement-level citations under hard-constrained decoding. An example query (unifocal PI-RADS 4 lesion, focal therapy planned) and the corresponding structured output are shown. Bottom strip: the multi-method, multi-seed benchmark (112 statements × 4 methods × 5 seeds = 2,240 runs, generator held fixed).</w:t>
       </w:r>
     </w:p>
     <w:p>
@@ -1814,7 +1922,7 @@
       <w:r>
         <w:drawing>
           <wp:inline xmlns:a="http://schemas.openxmlformats.org/drawingml/2006/main" xmlns:pic="http://schemas.openxmlformats.org/drawingml/2006/picture">
-            <wp:extent cx="5760000" cy="2728251"/>
+            <wp:extent cx="5760000" cy="3586415"/>
             <wp:docPr id="1" name="Picture 1"/>
             <wp:cNvGraphicFramePr>
               <a:graphicFrameLocks noChangeAspect="1"/>
@@ -1835,7 +1943,7 @@
                   <pic:spPr>
                     <a:xfrm>
                       <a:off x="0" y="0"/>
-                      <a:ext cx="5760000" cy="2728251"/>
+                      <a:ext cx="5760000" cy="3586415"/>
                     </a:xfrm>
                     <a:prstGeom prst="rect"/>
                   </pic:spPr>
@@ -2458,7 +2566,7 @@
           <w:b w:val="0"/>
           <w:i w:val="0"/>
         </w:rPr>
-        <w:t>7. Loeb S, Vellekoop A, Ahmed HU, et al. Systematic Review of Complications of Prostate Biopsy. European Urology. 2013;64(6):876-892. https://doi.org/10.1016/j.eururo.2013.05.049</w:t>
+        <w:t>7. Bryant RJ, Marian IR, Williams R, et al. Local anaesthetic transperineal biopsy versus transrectal prostate biopsy in prostate cancer detection (TRANSLATE): a multicentre, randomised, controlled trial. The Lancet Oncology. 2025;26(5):583-595. https://doi.org/10.1016/s1470-2045(25)00100-7</w:t>
       </w:r>
     </w:p>
     <w:p>
@@ -2471,7 +2579,7 @@
           <w:b w:val="0"/>
           <w:i w:val="0"/>
         </w:rPr>
-        <w:t>8. Nam RK, Saskin R, Lee Y, et al. Increasing Hospital Admission Rates for Urological Complications After Transrectal Ultrasound Guided Prostate Biopsy. Journal of Urology. 2010;183(3):963-969. https://doi.org/10.1016/j.juro.2009.11.043</w:t>
+        <w:t>8. Yang YJ, Yang EJ, Nguyen TT, Choi SY. Transperineal Versus Transrectal Prostate Biopsy: A Systematic Review and Meta-analysis of Randomized Controlled Trials Across Settings With and Without Magnetic Resonance Imaging Targeting. European Urology Open Science. 2026;83:205-218. https://doi.org/10.1016/j.euros.2025.12.008</w:t>
       </w:r>
     </w:p>
     <w:p>
@@ -2484,7 +2592,7 @@
           <w:b w:val="0"/>
           <w:i w:val="0"/>
         </w:rPr>
-        <w:t>9. European Association of Urology. EAU Guidelines on Prostate Cancer. Arnhem: European Association of Urology; 2026. https://uroweb.org/guidelines/prostate-cancer (living guideline, accessed September 2026).</w:t>
+        <w:t>9. Liss MA, Kim W, Moskowitz D, Szabo RJ. Comparative Effectiveness of Targeted vs Empirical Antibiotic Prophylaxis to Prevent Sepsis from Transrectal Prostate Biopsy: A Retrospective Analysis. Journal of Urology. 2015;194(2):397-402. https://doi.org/10.1016/j.juro.2015.03.110</w:t>
       </w:r>
     </w:p>
     <w:p>
@@ -2497,7 +2605,7 @@
           <w:b w:val="0"/>
           <w:i w:val="0"/>
         </w:rPr>
-        <w:t>10. Turkbey B, Rosenkrantz AB, Haider MA, et al. Prostate Imaging Reporting and Data System Version 2.1: 2019 Update of Prostate Imaging Reporting and Data System Version 2. European Urology. 2019;76(3):340-351. https://doi.org/10.1016/j.eururo.2019.02.033</w:t>
+        <w:t>10. Epstein JI, Feng Z, Trock BJ, Pierorazio PM. Upgrading and Downgrading of Prostate Cancer from Biopsy to Radical Prostatectomy: Incidence and Predictive Factors Using the Modified Gleason Grading System and Factoring in Tertiary Grades. European Urology. 2012;61(5):1019-1024. https://doi.org/10.1016/j.eururo.2012.01.050</w:t>
       </w:r>
     </w:p>
     <w:p>
@@ -2510,7 +2618,7 @@
           <w:b w:val="0"/>
           <w:i w:val="0"/>
         </w:rPr>
-        <w:t>11. Giganti F, Allen C, Emberton M, Moore CM, Kasivisvanathan V. Prostate Imaging Quality (PI-QUAL): A New Quality Control Scoring System for Multiparametric Magnetic Resonance Imaging of the Prostate from the PRECISION trial. European Urology Oncology. 2020;3(5):615-619. https://doi.org/10.1016/j.euo.2020.06.007</w:t>
+        <w:t>11. Turkbey B, Rosenkrantz AB, Haider MA, et al. Prostate Imaging Reporting and Data System Version 2.1: 2019 Update of Prostate Imaging Reporting and Data System Version 2. European Urology. 2019;76(3):340-351. https://doi.org/10.1016/j.eururo.2019.02.033</w:t>
       </w:r>
     </w:p>
     <w:p>
@@ -2536,7 +2644,7 @@
           <w:b w:val="0"/>
           <w:i w:val="0"/>
         </w:rPr>
-        <w:t>13. Ahmed HU, El-Shater Bosaily A, Brown LC, et al. Diagnostic accuracy of multi-parametric MRI and TRUS biopsy in prostate cancer (PROMIS): a paired validating confirmatory study. The Lancet. 2017;389(10071):815-822. https://doi.org/10.1016/s0140-6736(16)32401-1</w:t>
+        <w:t>13. Loeb S, Vellekoop A, Ahmed HU, et al. Systematic Review of Complications of Prostate Biopsy. European Urology. 2013;64(6):876-892. https://doi.org/10.1016/j.eururo.2013.05.049</w:t>
       </w:r>
     </w:p>
     <w:p>
@@ -2549,7 +2657,7 @@
           <w:b w:val="0"/>
           <w:i w:val="0"/>
         </w:rPr>
-        <w:t>14. Ahdoot M, Wilbur AR, Reese SE, et al. MRI-Targeted, Systematic, and Combined Biopsy for Prostate Cancer Diagnosis. N Engl J Med. 2020;382(10):917-928. https://doi.org/10.1056/nejmoa1910038</w:t>
+        <w:t>14. Nam RK, Saskin R, Lee Y, et al. Increasing Hospital Admission Rates for Urological Complications After Transrectal Ultrasound Guided Prostate Biopsy. Journal of Urology. 2010;183(3):963-969. https://doi.org/10.1016/j.juro.2009.11.043</w:t>
       </w:r>
     </w:p>
     <w:p>
@@ -2562,7 +2670,7 @@
           <w:b w:val="0"/>
           <w:i w:val="0"/>
         </w:rPr>
-        <w:t>15. Klotz L, Chin J, Black PC, et al. Comparison of Multiparametric Magnetic Resonance Imaging–Targeted Biopsy With Systematic Transrectal Ultrasonography Biopsy for Biopsy-Naive Men at Risk for Prostate Cancer: A Phase 3 Randomized Clinical Trial. JAMA Oncol. 2021;7(4):534. https://doi.org/10.1001/jamaoncol.2020.7589</w:t>
+        <w:t>15. European Association of Urology. EAU Guidelines on Prostate Cancer. Arnhem: European Association of Urology; 2026. https://uroweb.org/guidelines/prostate-cancer (living guideline, accessed September 2026).</w:t>
       </w:r>
     </w:p>
     <w:p>
@@ -2575,7 +2683,7 @@
           <w:b w:val="0"/>
           <w:i w:val="0"/>
         </w:rPr>
-        <w:t>16. Elkhoury FF, Felker ER, Kwan L, et al. Comparison of Targeted vs Systematic Prostate Biopsy in Men Who Are Biopsy Naive: The Prospective Assessment of Image Registration in the Diagnosis of Prostate Cancer (PAIREDCAP) Study. JAMA Surg. 2019;154(9):811. https://doi.org/10.1001/jamasurg.2019.1734</w:t>
+        <w:t>16. Eastham JA, Auffenberg GB, Barocas DA, et al. Clinically Localized Prostate Cancer: AUA/ASTRO Guideline, Part I: Introduction, Risk Assessment, Staging, and Risk-Based Management. Journal of Urology. 2022;208(1):10-18. https://doi.org/10.1097/ju.0000000000002757</w:t>
       </w:r>
     </w:p>
     <w:p>
@@ -2588,7 +2696,7 @@
           <w:b w:val="0"/>
           <w:i w:val="0"/>
         </w:rPr>
-        <w:t>17. Costa DN, Goldberg K, Leon ADD, et al. Magnetic Resonance Imaging–guided In-bore and Magnetic Resonance Imaging-transrectal Ultrasound Fusion Targeted Prostate Biopsies: An Adjusted Comparison of Clinically Significant Prostate Cancer Detection Rate. European Urology Oncology. 2019;2(4):397-404. https://doi.org/10.1016/j.euo.2018.08.022</w:t>
+        <w:t>17. Eastham JA, Barocas DA, Chu CE, et al. Clinically Localized Prostate Cancer: AUA/ASTRO Guideline Amendment (2026). J Urol. 2026;216(1):2-11. https://doi.org/10.1097/ju.0000000000005060</w:t>
       </w:r>
     </w:p>
     <w:p>
@@ -2601,7 +2709,7 @@
           <w:b w:val="0"/>
           <w:i w:val="0"/>
         </w:rPr>
-        <w:t>18. Hao S, Chai C, Li G, Tang N, Wang N, Yu X. Outdated Fact Detection in Knowledge Bases. In: 2020 IEEE 36th International Conference on Data Engineering (ICDE). IEEE; 2020:1890-1893. https://doi.org/10.1109/icde48307.2020.00196</w:t>
+        <w:t>18. Ahmed HU, El-Shater Bosaily A, Brown LC, et al. Diagnostic accuracy of multi-parametric MRI and TRUS biopsy in prostate cancer (PROMIS): a paired validating confirmatory study. The Lancet. 2017;389(10071):815-822. https://doi.org/10.1016/s0140-6736(16)32401-1</w:t>
       </w:r>
     </w:p>
     <w:p>
@@ -2614,7 +2722,7 @@
           <w:b w:val="0"/>
           <w:i w:val="0"/>
         </w:rPr>
-        <w:t>19. Ray CE, Wilson GM, Hughes AM, et al. Alert fatigue measurement in clinical decision support: a systematic review. Journal of the American Medical Informatics Association. 2026;33(8):1523-1531. https://doi.org/10.1093/jamia/ocag064</w:t>
+        <w:t>19. Park KJ, Choi SH, Lee JS, Kim JK, Kim MH. Interreader Agreement with Prostate Imaging Reporting and Data System Version 2 for Prostate Cancer Detection: A Systematic Review and Meta-Analysis. Journal of Urology. 2020;204(4):661-670. https://doi.org/10.1097/ju.0000000000001200</w:t>
       </w:r>
     </w:p>
     <w:p>
@@ -2627,7 +2735,7 @@
           <w:b w:val="0"/>
           <w:i w:val="0"/>
         </w:rPr>
-        <w:t>20. Sutton RT, Pincock D, Baumgart DC, Sadowski DC, Fedorak RN, Kroeker KI. An overview of clinical decision support systems: benefits, risks, and strategies for success. npj Digit. Med. 2020;3(1):17. https://doi.org/10.1038/s41746-020-0221-y</w:t>
+        <w:t>20. Ahdoot M, Wilbur AR, Reese SE, et al. MRI-Targeted, Systematic, and Combined Biopsy for Prostate Cancer Diagnosis. N Engl J Med. 2020;382(10):917-928. https://doi.org/10.1056/nejmoa1910038</w:t>
       </w:r>
     </w:p>
     <w:p>
@@ -2640,7 +2748,7 @@
           <w:b w:val="0"/>
           <w:i w:val="0"/>
         </w:rPr>
-        <w:t>21. Rajpurkar P, Chen E, Banerjee O, Topol EJ. AI in health and medicine. Nat Med. 2022;28(1):31-38. https://doi.org/10.1038/s41591-021-01614-0</w:t>
+        <w:t>21. Klotz L, Chin J, Black PC, et al. Comparison of Multiparametric Magnetic Resonance Imaging–Targeted Biopsy With Systematic Transrectal Ultrasonography Biopsy for Biopsy-Naive Men at Risk for Prostate Cancer: A Phase 3 Randomized Clinical Trial. JAMA Oncol. 2021;7(4):534. https://doi.org/10.1001/jamaoncol.2020.7589</w:t>
       </w:r>
     </w:p>
     <w:p>
@@ -2653,7 +2761,7 @@
           <w:b w:val="0"/>
           <w:i w:val="0"/>
         </w:rPr>
-        <w:t>22. Thirunavukarasu AJ, Ting DSJ, Elangovan K, Gutierrez L, Tan TF, Ting DSW. Large language models in medicine. Nat Med. 2023;29(8):1930-1940. https://doi.org/10.1038/s41591-023-02448-8</w:t>
+        <w:t>22. Elkhoury FF, Felker ER, Kwan L, et al. Comparison of Targeted vs Systematic Prostate Biopsy in Men Who Are Biopsy Naive: The Prospective Assessment of Image Registration in the Diagnosis of Prostate Cancer (PAIREDCAP) Study. JAMA Surg. 2019;154(9):811. https://doi.org/10.1001/jamasurg.2019.1734</w:t>
       </w:r>
     </w:p>
     <w:p>
@@ -2666,7 +2774,7 @@
           <w:b w:val="0"/>
           <w:i w:val="0"/>
         </w:rPr>
-        <w:t>23. Singhal K, Azizi S, Tu T, et al. Large language models encode clinical knowledge. Nature. 2023;620(7972):172-180. https://doi.org/10.1038/s41586-023-06291-2</w:t>
+        <w:t>23. Costa DN, Goldberg K, Leon ADD, et al. Magnetic Resonance Imaging–guided In-bore and Magnetic Resonance Imaging-transrectal Ultrasound Fusion Targeted Prostate Biopsies: An Adjusted Comparison of Clinically Significant Prostate Cancer Detection Rate. European Urology Oncology. 2019;2(4):397-404. https://doi.org/10.1016/j.euo.2018.08.022</w:t>
       </w:r>
     </w:p>
     <w:p>
@@ -2679,7 +2787,7 @@
           <w:b w:val="0"/>
           <w:i w:val="0"/>
         </w:rPr>
-        <w:t>24. Singhal K, Tu T, Gottweis J, et al. Toward expert-level medical question answering with large language models. Nat Med. 2025;31(3):943-950. https://doi.org/10.1038/s41591-024-03423-7</w:t>
+        <w:t>24. Borghesi M, Ahmed H, Nam R, et al. Complications After Systematic, Random, and Image-guided Prostate Biopsy. European Urology. 2017;71(3):353-365. https://doi.org/10.1016/j.eururo.2016.08.004</w:t>
       </w:r>
     </w:p>
     <w:p>
@@ -2692,7 +2800,7 @@
           <w:b w:val="0"/>
           <w:i w:val="0"/>
         </w:rPr>
-        <w:t>25. Ji Z, Lee N, Frieske R, et al. Survey of Hallucination in Natural Language Generation. ACM Comput. Surv. 2023;55(12):1-38. https://doi.org/10.1145/3571730</w:t>
+        <w:t>25. Hao S, Chai C, Li G, Tang N, Wang N, Yu X. Outdated Fact Detection in Knowledge Bases. In: 2020 IEEE 36th International Conference on Data Engineering (ICDE). IEEE; 2020:1890-1893. https://doi.org/10.1109/icde48307.2020.00196</w:t>
       </w:r>
     </w:p>
     <w:p>
@@ -2705,7 +2813,7 @@
           <w:b w:val="0"/>
           <w:i w:val="0"/>
         </w:rPr>
-        <w:t>26. Fast D, Adams LC, Busch F, et al. Autonomous medical evaluation for guideline adherence of large language models. npj Digit. Med. 2024;7(1):358. https://doi.org/10.1038/s41746-024-01356-6</w:t>
+        <w:t>26. Ray CE, Wilson GM, Hughes AM, et al. Alert fatigue measurement in clinical decision support: a systematic review. Journal of the American Medical Informatics Association. 2026;33(8):1523-1531. https://doi.org/10.1093/jamia/ocag064</w:t>
       </w:r>
     </w:p>
     <w:p>
@@ -2718,7 +2826,7 @@
           <w:b w:val="0"/>
           <w:i w:val="0"/>
         </w:rPr>
-        <w:t>27. Lewis P, Perez E, Piktus A, et al. Retrieval-augmented generation for knowledge-intensive NLP tasks. Adv Neural Inf Process Syst. 2020;33:9459-74. arXiv:2005.11401 (verified via arXiv API).</w:t>
+        <w:t>27. Sutton RT, Pincock D, Baumgart DC, Sadowski DC, Fedorak RN, Kroeker KI. An overview of clinical decision support systems: benefits, risks, and strategies for success. npj Digit. Med. 2020;3(1):17. https://doi.org/10.1038/s41746-020-0221-y</w:t>
       </w:r>
     </w:p>
     <w:p>
@@ -2731,7 +2839,7 @@
           <w:b w:val="0"/>
           <w:i w:val="0"/>
         </w:rPr>
-        <w:t>28. Xiong G, Jin Q, Lu Z, Zhang A. Benchmarking Retrieval-Augmented Generation for Medicine. Findings of the Association for Computational Linguistics ACL 2024. 2024:6233-6251. https://doi.org/10.18653/v1/2024.findings-acl.372</w:t>
+        <w:t>28. Rajpurkar P, Chen E, Banerjee O, Topol EJ. AI in health and medicine. Nat Med. 2022;28(1):31-38. https://doi.org/10.1038/s41591-021-01614-0</w:t>
       </w:r>
     </w:p>
     <w:p>
@@ -2744,7 +2852,7 @@
           <w:b w:val="0"/>
           <w:i w:val="0"/>
         </w:rPr>
-        <w:t>29. Pan S, Luo L, Wang Y, Chen C, Wang J, Wu X. Unifying Large Language Models and Knowledge Graphs: A Roadmap. IEEE Trans. Knowl. Data Eng. 2024;36(7):3580-3599. https://doi.org/10.1109/tkde.2024.3352100</w:t>
+        <w:t>29. Thirunavukarasu AJ, Ting DSJ, Elangovan K, Gutierrez L, Tan TF, Ting DSW. Large language models in medicine. Nat Med. 2023;29(8):1930-1940. https://doi.org/10.1038/s41591-023-02448-8</w:t>
       </w:r>
     </w:p>
     <w:p>
@@ -2757,7 +2865,7 @@
           <w:b w:val="0"/>
           <w:i w:val="0"/>
         </w:rPr>
-        <w:t>30. Guo Z, Xia L, Yu Y, Ao T, Huang C. LightRAG: simple and fast retrieval-augmented generation. arXiv:2410.05779, 2024 (verified against arXiv listing).</w:t>
+        <w:t>30. Singhal K, Azizi S, Tu T, et al. Large language models encode clinical knowledge. Nature. 2023;620(7972):172-180. https://doi.org/10.1038/s41586-023-06291-2</w:t>
       </w:r>
     </w:p>
     <w:p>
@@ -2770,7 +2878,7 @@
           <w:b w:val="0"/>
           <w:i w:val="0"/>
         </w:rPr>
-        <w:t>31. Edge D, Trinh H, Cheng N, et al. From local to global: a Graph RAG approach to query-focused summarization. arXiv:2404.16130, 2024 (verified via arXiv API).</w:t>
+        <w:t>31. Singhal K, Tu T, Gottweis J, et al. Toward expert-level medical question answering with large language models. Nat Med. 2025;31(3):943-950. https://doi.org/10.1038/s41591-024-03423-7</w:t>
       </w:r>
     </w:p>
     <w:p>
@@ -2783,7 +2891,7 @@
           <w:b w:val="0"/>
           <w:i w:val="0"/>
         </w:rPr>
-        <w:t>32. Epstein JI, Amin MB, Reuter VE, Humphrey PA. Contemporary Gleason Grading of Prostatic Carcinoma: An Update With Discussion on Practical Issues to Implement the 2014 International Society of Urological Pathology (ISUP) Consensus Conference on Gleason Grading of Prostatic Carcinoma. American Journal of Surgical Pathology. 2017;41(4):e1-e7. https://doi.org/10.1097/pas.0000000000000820</w:t>
+        <w:t>32. Ji Z, Lee N, Frieske R, et al. Survey of Hallucination in Natural Language Generation. ACM Comput. Surv. 2023;55(12):1-38. https://doi.org/10.1145/3571730</w:t>
       </w:r>
     </w:p>
     <w:p>
@@ -2796,7 +2904,7 @@
           <w:b w:val="0"/>
           <w:i w:val="0"/>
         </w:rPr>
-        <w:t>33. Cohen J. A Coefficient of Agreement for Nominal Scales. Educational and Psychological Measurement. 1960;20(1):37-46. https://doi.org/10.1177/001316446002000104</w:t>
+        <w:t>33. Fast D, Adams LC, Busch F, et al. Autonomous medical evaluation for guideline adherence of large language models. npj Digit. Med. 2024;7(1):358. https://doi.org/10.1038/s41746-024-01356-6</w:t>
       </w:r>
     </w:p>
     <w:p>
@@ -2809,7 +2917,7 @@
           <w:b w:val="0"/>
           <w:i w:val="0"/>
         </w:rPr>
-        <w:t>34. Benjamini Y, Hochberg Y. Controlling the False Discovery Rate: A Practical and Powerful Approach to Multiple Testing. Journal of the Royal Statistical Society Series B: Statistical Methodology. 1995;57(1):289-300. https://doi.org/10.1111/j.2517-6161.1995.tb02031.x</w:t>
+        <w:t>34. Lewis P, Perez E, Piktus A, et al. Retrieval-augmented generation for knowledge-intensive NLP tasks. Adv Neural Inf Process Syst. 2020;33:9459-74. arXiv:2005.11401 (verified via arXiv API).</w:t>
       </w:r>
     </w:p>
     <w:p>
@@ -2822,7 +2930,7 @@
           <w:b w:val="0"/>
           <w:i w:val="0"/>
         </w:rPr>
-        <w:t>35. Fleiss JL. Measuring nominal scale agreement among many raters.. Psychological Bulletin. 1971;76(5):378-382. https://doi.org/10.1037/h0031619</w:t>
+        <w:t>35. Xiong G, Jin Q, Lu Z, Zhang A. Benchmarking Retrieval-Augmented Generation for Medicine. Findings of the Association for Computational Linguistics ACL 2024. 2024:6233-6251. https://doi.org/10.18653/v1/2024.findings-acl.372</w:t>
       </w:r>
     </w:p>
     <w:p>
@@ -2835,7 +2943,7 @@
           <w:b w:val="0"/>
           <w:i w:val="0"/>
         </w:rPr>
-        <w:t>36. Feinstein AR, Cicchetti DV. High agreement but low Kappa: I. the problems of two paradoxes. Journal of Clinical Epidemiology. 1990;43(6):543-549. https://doi.org/10.1016/0895-4356(90)90158-l</w:t>
+        <w:t>36. Pan S, Luo L, Wang Y, Chen C, Wang J, Wu X. Unifying Large Language Models and Knowledge Graphs: A Roadmap. IEEE Trans. Knowl. Data Eng. 2024;36(7):3580-3599. https://doi.org/10.1109/tkde.2024.3352100</w:t>
       </w:r>
     </w:p>
     <w:p>
@@ -2848,7 +2956,7 @@
           <w:b w:val="0"/>
           <w:i w:val="0"/>
         </w:rPr>
-        <w:t>37. Ayers JW, Poliak A, Dredze M, et al. Comparing Physician and Artificial Intelligence Chatbot Responses to Patient Questions Posted to a Public Social Media Forum. JAMA Intern Med. 2023;183(6):589. https://doi.org/10.1001/jamainternmed.2023.1838</w:t>
+        <w:t>37. Guo Z, Xia L, Yu Y, Ao T, Huang C. LightRAG: simple and fast retrieval-augmented generation. arXiv:2410.05779, 2024 (verified against arXiv listing).</w:t>
       </w:r>
     </w:p>
     <w:p>
@@ -2861,7 +2969,7 @@
           <w:b w:val="0"/>
           <w:i w:val="0"/>
         </w:rPr>
-        <w:t>38. Vasey B, Nagendran M, Campbell B, et al. Reporting guideline for the early stage clinical evaluation of decision support systems driven by artificial intelligence: DECIDE-AI. BMJ. 2022;377:e070904. https://doi.org/10.1136/bmj-2022-070904</w:t>
+        <w:t>38. Edge D, Trinh H, Cheng N, et al. From local to global: a Graph RAG approach to query-focused summarization. arXiv:2404.16130, 2024 (verified via arXiv API).</w:t>
       </w:r>
     </w:p>
     <w:p>
@@ -2874,7 +2982,7 @@
           <w:b w:val="0"/>
           <w:i w:val="0"/>
         </w:rPr>
-        <w:t>39. Collins GS, Moons KGM, Dhiman P, et al. TRIPOD+AI statement: updated guidance for reporting clinical prediction models that use regression or machine learning methods. BMJ. 2024;385:e078378. https://doi.org/10.1136/bmj-2023-078378</w:t>
+        <w:t>39. Epstein JI, Amin MB, Reuter VE, Humphrey PA. Contemporary Gleason Grading of Prostatic Carcinoma: An Update With Discussion on Practical Issues to Implement the 2014 International Society of Urological Pathology (ISUP) Consensus Conference on Gleason Grading of Prostatic Carcinoma. American Journal of Surgical Pathology. 2017;41(4):e1-e7. https://doi.org/10.1097/pas.0000000000000820</w:t>
       </w:r>
     </w:p>
     <w:p>
@@ -2887,7 +2995,7 @@
           <w:b w:val="0"/>
           <w:i w:val="0"/>
         </w:rPr>
-        <w:t>40. Al-Khanaty A, Hennes D, Hofman MS, et al. Avoiding Prostate Biopsy in Early Prostate Cancer Detection: From Liquid Biopsy to PSMA-PET. European Urology Focus. 2026. https://doi.org/10.1016/j.euf.2026.05.019</w:t>
+        <w:t>40. Giganti F, Allen C, Emberton M, Moore CM, Kasivisvanathan V. Prostate Imaging Quality (PI-QUAL): A New Quality Control Scoring System for Multiparametric Magnetic Resonance Imaging of the Prostate from the PRECISION trial. European Urology Oncology. 2020;3(5):615-619. https://doi.org/10.1016/j.euo.2020.06.007</w:t>
       </w:r>
     </w:p>
     <w:p>
@@ -2900,7 +3008,111 @@
           <w:b w:val="0"/>
           <w:i w:val="0"/>
         </w:rPr>
-        <w:t>41. XU Z. QianLieAnHui (probiopsy-rag): a hybrid rule-engine, knowledge-graph, and LLM-arbitration decision-support system for the prostate biopsy pathway, validated against the ProBIOPSY consensus [software, version v1.0.1]. Zenodo. 2026. https://doi.org/10.5281/zenodo.22898439 (verified via DataCite API).</w:t>
+        <w:t>41. Cohen J. A Coefficient of Agreement for Nominal Scales. Educational and Psychological Measurement. 1960;20(1):37-46. https://doi.org/10.1177/001316446002000104</w:t>
+      </w:r>
+    </w:p>
+    <w:p>
+      <w:pPr>
+        <w:ind w:left="425" w:hanging="425"/>
+      </w:pPr>
+      <w:r>
+        <w:rPr>
+          <w:rFonts w:ascii="Times New Roman" w:hAnsi="Times New Roman"/>
+          <w:b w:val="0"/>
+          <w:i w:val="0"/>
+        </w:rPr>
+        <w:t>42. Benjamini Y, Hochberg Y. Controlling the False Discovery Rate: A Practical and Powerful Approach to Multiple Testing. Journal of the Royal Statistical Society Series B: Statistical Methodology. 1995;57(1):289-300. https://doi.org/10.1111/j.2517-6161.1995.tb02031.x</w:t>
+      </w:r>
+    </w:p>
+    <w:p>
+      <w:pPr>
+        <w:ind w:left="425" w:hanging="425"/>
+      </w:pPr>
+      <w:r>
+        <w:rPr>
+          <w:rFonts w:ascii="Times New Roman" w:hAnsi="Times New Roman"/>
+          <w:b w:val="0"/>
+          <w:i w:val="0"/>
+        </w:rPr>
+        <w:t>43. Fleiss JL. Measuring nominal scale agreement among many raters.. Psychological Bulletin. 1971;76(5):378-382. https://doi.org/10.1037/h0031619</w:t>
+      </w:r>
+    </w:p>
+    <w:p>
+      <w:pPr>
+        <w:ind w:left="425" w:hanging="425"/>
+      </w:pPr>
+      <w:r>
+        <w:rPr>
+          <w:rFonts w:ascii="Times New Roman" w:hAnsi="Times New Roman"/>
+          <w:b w:val="0"/>
+          <w:i w:val="0"/>
+        </w:rPr>
+        <w:t>44. Feinstein AR, Cicchetti DV. High agreement but low Kappa: I. the problems of two paradoxes. Journal of Clinical Epidemiology. 1990;43(6):543-549. https://doi.org/10.1016/0895-4356(90)90158-l</w:t>
+      </w:r>
+    </w:p>
+    <w:p>
+      <w:pPr>
+        <w:ind w:left="425" w:hanging="425"/>
+      </w:pPr>
+      <w:r>
+        <w:rPr>
+          <w:rFonts w:ascii="Times New Roman" w:hAnsi="Times New Roman"/>
+          <w:b w:val="0"/>
+          <w:i w:val="0"/>
+        </w:rPr>
+        <w:t>45. Ayers JW, Poliak A, Dredze M, et al. Comparing Physician and Artificial Intelligence Chatbot Responses to Patient Questions Posted to a Public Social Media Forum. JAMA Intern Med. 2023;183(6):589. https://doi.org/10.1001/jamainternmed.2023.1838</w:t>
+      </w:r>
+    </w:p>
+    <w:p>
+      <w:pPr>
+        <w:ind w:left="425" w:hanging="425"/>
+      </w:pPr>
+      <w:r>
+        <w:rPr>
+          <w:rFonts w:ascii="Times New Roman" w:hAnsi="Times New Roman"/>
+          <w:b w:val="0"/>
+          <w:i w:val="0"/>
+        </w:rPr>
+        <w:t>46. Vasey B, Nagendran M, Campbell B, et al. Reporting guideline for the early stage clinical evaluation of decision support systems driven by artificial intelligence: DECIDE-AI. BMJ. 2022;377:e070904. https://doi.org/10.1136/bmj-2022-070904</w:t>
+      </w:r>
+    </w:p>
+    <w:p>
+      <w:pPr>
+        <w:ind w:left="425" w:hanging="425"/>
+      </w:pPr>
+      <w:r>
+        <w:rPr>
+          <w:rFonts w:ascii="Times New Roman" w:hAnsi="Times New Roman"/>
+          <w:b w:val="0"/>
+          <w:i w:val="0"/>
+        </w:rPr>
+        <w:t>47. Collins GS, Moons KGM, Dhiman P, et al. TRIPOD+AI statement: updated guidance for reporting clinical prediction models that use regression or machine learning methods. BMJ. 2024;385:e078378. https://doi.org/10.1136/bmj-2023-078378</w:t>
+      </w:r>
+    </w:p>
+    <w:p>
+      <w:pPr>
+        <w:ind w:left="425" w:hanging="425"/>
+      </w:pPr>
+      <w:r>
+        <w:rPr>
+          <w:rFonts w:ascii="Times New Roman" w:hAnsi="Times New Roman"/>
+          <w:b w:val="0"/>
+          <w:i w:val="0"/>
+        </w:rPr>
+        <w:t>48. Al-Khanaty A, Hennes D, Hofman MS, et al. Avoiding Prostate Biopsy in Early Prostate Cancer Detection: From Liquid Biopsy to PSMA-PET. European Urology Focus. 2026. https://doi.org/10.1016/j.euf.2026.05.019</w:t>
+      </w:r>
+    </w:p>
+    <w:p>
+      <w:pPr>
+        <w:ind w:left="425" w:hanging="425"/>
+      </w:pPr>
+      <w:r>
+        <w:rPr>
+          <w:rFonts w:ascii="Times New Roman" w:hAnsi="Times New Roman"/>
+          <w:b w:val="0"/>
+          <w:i w:val="0"/>
+        </w:rPr>
+        <w:t>49. XU Z. QianLieAnHui (probiopsy-rag): a hybrid rule-engine, knowledge-graph, and LLM-arbitration decision-support system for the prostate biopsy pathway, validated against the ProBIOPSY consensus [software, version v1.0.1]. Zenodo. 2026. https://doi.org/10.5281/zenodo.22898439 (verified via DataCite API).</w:t>
       </w:r>
     </w:p>
     <w:p>

</xml_diff>

<commit_message>
manuscript: position within the medical LLM-agent family (refs 49 -> 53)
</commit_message>
<xml_diff>
--- a/outputs/submission/manuscript.en.docx
+++ b/outputs/submission/manuscript.en.docx
@@ -326,7 +326,7 @@
           <w:b w:val="0"/>
           <w:i w:val="0"/>
         </w:rPr>
-        <w:t xml:space="preserve"> Large language models (LLMs) promise flexible language understanding [28,29] and are approaching expert performance on medical question answering [30,31], yet carry well-documented risks in medicine — hallucination, unstable outputs, and unverifiable provenance [32] — and can diverge from clinical guidelines [33]. RAG grounds generation in an external corpus [34], and medical RAG benchmarks show promise [35], but purely retrieval-based pipelines have no mechanism to </w:t>
+        <w:t xml:space="preserve"> Large language models (LLMs) promise flexible language understanding [28,29] and are approaching expert performance on medical question answering [30,31], yet carry well-documented risks in medicine — hallucination, unstable outputs, and unverifiable provenance [32] — and can diverge from clinical guidelines [33]. Domain-specific LLM agents are now emerging rapidly — for atrial-fibrillation patient self-management [34], suspected-hypertension management [35], prostate-cancer patient education [36], and gene-set analysis with self-verification [37] — yet these frameworks rely on retrieval and prompt-level reflection without deterministic safeguards, and none, to our knowledge, is evaluated against a statement-level guideline gold standard. RAG grounds generation in an external corpus [38], and medical RAG benchmarks show promise [39], but purely retrieval-based pipelines have no mechanism to </w:t>
       </w:r>
       <w:r>
         <w:rPr>
@@ -368,7 +368,7 @@
           <w:b w:val="0"/>
           <w:i w:val="0"/>
         </w:rPr>
-        <w:t xml:space="preserve"> — an integration consistent with emerging roadmaps for unifying large language models and knowledge graphs [36] — each layer covers the others' failure modes while preserving a complete audit trail from every output back to numbered consensus statements and evidence chunks. At the retrieval layer we adopt LightRAG [37], a graph-based dual-level retrieval framework that outperforms Microsoft GraphRAG [38] on domain question answering at a fraction of the token cost.</w:t>
+        <w:t xml:space="preserve"> — an integration consistent with emerging roadmaps for unifying large language models and knowledge graphs [40] — each layer covers the others' failure modes while preserving a complete audit trail from every output back to numbered consensus statements and evidence chunks. At the retrieval layer we adopt LightRAG [41], a graph-based dual-level retrieval framework that outperforms Microsoft GraphRAG [42] on domain question answering at a fraction of the token cost.</w:t>
       </w:r>
     </w:p>
     <w:p>
@@ -631,7 +631,7 @@
           <w:b w:val="0"/>
           <w:i w:val="0"/>
         </w:rPr>
-        <w:t xml:space="preserve"> (recommend against). The gold-standard action distribution is endorse 190, conditional 185, against 125, endorse_option 35, and report_option 25. Statements span three domains: indication (n = 23), procedure (n = 34), and treatment planning (n = 55, anchored by ISUP grade-group–driven treatment decisions [39]); 25 statements (22.3%) are against-class, providing a demanding test for systems with optimism bias. The five demonstration vignettes described under Results are synthetic cases built on the same registries and are not part of the 112-statement evaluation set.</w:t>
+        <w:t xml:space="preserve"> (recommend against). The gold-standard action distribution is endorse 190, conditional 185, against 125, endorse_option 35, and report_option 25. Statements span three domains: indication (n = 23), procedure (n = 34), and treatment planning (n = 55, anchored by ISUP grade-group–driven treatment decisions [43]); 25 statements (22.3%) are against-class, providing a demanding test for systems with optimism bias. The five demonstration vignettes described under Results are synthetic cases built on the same registries and are not part of the 112-statement evaluation set.</w:t>
       </w:r>
     </w:p>
     <w:p>
@@ -677,7 +677,7 @@
           <w:b w:val="0"/>
           <w:i w:val="0"/>
         </w:rPr>
-        <w:t xml:space="preserve"> Entity A (patient scenarios) contains 51 archetypes with 49 distinct scenario flags across imaging (PI-RADS grade, mpMRI/bpMRI, field strength, PI-QUAL quality [40]), laboratory markers (PSA, PSA density), history and risk (prior negative biopsy, family history, infection risk factors, anticoagulation), treatment intent, and resource availability (Table 1). Entity B (decision items) contains 54 items with 20 flags across indication (22), procedure (22), and treatment-planning linkage (10).</w:t>
+        <w:t xml:space="preserve"> Entity A (patient scenarios) contains 51 archetypes with 49 distinct scenario flags across imaging (PI-RADS grade, mpMRI/bpMRI, field strength, PI-QUAL quality [44]), laboratory markers (PSA, PSA density), history and risk (prior negative biopsy, family history, infection risk factors, anticoagulation), treatment intent, and resource availability (Table 1). Entity B (decision items) contains 54 items with 20 flags across indication (22), procedure (22), and treatment-planning linkage (10).</w:t>
       </w:r>
     </w:p>
     <w:p>
@@ -713,7 +713,7 @@
           <w:b w:val="0"/>
           <w:i w:val="0"/>
         </w:rPr>
-        <w:t xml:space="preserve"> The corpus comprises 357 evidence chunks, all sourced from the ProBIOPSY consensus and its supplementary material: the 112 final statements (evidence level B), 20 narrative passages, 7 systematic-review summaries, and 218 literature entries extracted from the consensus reference lists (level C). The index was built with LightRAG [37] (lightrag-hku 1.5.7); entity and relation extraction used GLM-5.3-Flash, and the vector index used doubao-embedding-vision-251215 (dimension 2,048). The final index contains 1,864 entities and 3,078 relations (~100 MB). The full system performs risk-guided retrieval: rule matches and active decision items drive entity-boosted hybrid queries (vector + graph structure), executed in context-only mode (retrieving entities, relations, and chunks without letting LightRAG generate the answer itself). Graph context is concatenated with lexical evidence (BM25-style scoring with boosts for active decision items and scenario flags) and passed to the arbiter.</w:t>
+        <w:t xml:space="preserve"> The corpus comprises 357 evidence chunks, all sourced from the ProBIOPSY consensus and its supplementary material: the 112 final statements (evidence level B), 20 narrative passages, 7 systematic-review summaries, and 218 literature entries extracted from the consensus reference lists (level C). The index was built with LightRAG [41] (lightrag-hku 1.5.7); entity and relation extraction used GLM-5.3-Flash, and the vector index used doubao-embedding-vision-251215 (dimension 2,048). The final index contains 1,864 entities and 3,078 relations (~100 MB). The full system performs risk-guided retrieval: rule matches and active decision items drive entity-boosted hybrid queries (vector + graph structure), executed in context-only mode (retrieving entities, relations, and chunks without letting LightRAG generate the answer itself). Graph context is concatenated with lexical evidence (BM25-style scoring with boosts for active decision items and scenario flags) and passed to the arbiter.</w:t>
       </w:r>
     </w:p>
     <w:p>
@@ -971,7 +971,7 @@
           <w:b w:val="0"/>
           <w:i w:val="0"/>
         </w:rPr>
-        <w:t>Exact-5-class accuracy (primary), exact-3 accuracy (collapsing endorse_option→endorse and report_option→conditional, to expose majority-class inflation), five-class macro-F1, Cohen's κ [41] against the gold standard, and binary against-class sensitivity/specificity/F1. All metrics are reported as mean ± SD over the five seeds. Method differences were assessed with two-sided paired t-tests across seeds (full system vs each baseline; exact-5 and κ; six comparisons), with Benjamini–Hochberg false-discovery-rate correction [42]. Context characters per run were logged as an efficiency metric.</w:t>
+        <w:t>Exact-5-class accuracy (primary), exact-3 accuracy (collapsing endorse_option→endorse and report_option→conditional, to expose majority-class inflation), five-class macro-F1, Cohen's κ [45] against the gold standard, and binary against-class sensitivity/specificity/F1. All metrics are reported as mean ± SD over the five seeds. Method differences were assessed with two-sided paired t-tests across seeds (full system vs each baseline; exact-5 and κ; six comparisons), with Benjamini–Hochberg false-discovery-rate correction [46]. Context characters per run were logged as an efficiency metric.</w:t>
       </w:r>
     </w:p>
     <w:p>
@@ -1360,7 +1360,7 @@
           <w:b w:val="0"/>
           <w:i w:val="0"/>
         </w:rPr>
-        <w:t>Experts agreed with each other substantially: raw agreement 17/20 ratings, with per-case modal share 4/4 in three cases, 3/4 in one (case 2), and a 2:2 split in case 1 (Figure 3A). The overall Fleiss κ [43] of −0.09 reflects the known instability of κ under uneven category marginals at this sample size — the agreement paradox described by Feinstein and Cicchetti — rather than poor agreement [44]. The system matched the expert majority in all four cases with a decisive majority (Cohen κ = 1.000, n = 4; Figure 3B). In the split case — whether to add systematic biopsy to targeted plus perilesional biopsy — the two experts favouring conditional endorsement cited treatment-plan dependence (whole-gland versus focal therapy alters the value of added systematic cores), the same consideration the system's evidence chain raises (contralateral systematic yield 0.3–4% [EV0024]). All 80 Likert ratings of the system output were 5/5 (clarity, usefulness, recommendation, evidence; ceiling noted, Figure 3C). At this sample size, all agreement estimates are preliminary.</w:t>
+        <w:t>Experts agreed with each other substantially: raw agreement 17/20 ratings, with per-case modal share 4/4 in three cases, 3/4 in one (case 2), and a 2:2 split in case 1 (Figure 3A). The overall Fleiss κ [47] of −0.09 reflects the known instability of κ under uneven category marginals at this sample size — the agreement paradox described by Feinstein and Cicchetti — rather than poor agreement [48]. The system matched the expert majority in all four cases with a decisive majority (Cohen κ = 1.000, n = 4; Figure 3B). In the split case — whether to add systematic biopsy to targeted plus perilesional biopsy — the two experts favouring conditional endorsement cited treatment-plan dependence (whole-gland versus focal therapy alters the value of added systematic cores), the same consideration the system's evidence chain raises (contralateral systematic yield 0.3–4% [EV0024]). All 80 Likert ratings of the system output were 5/5 (clarity, usefulness, recommendation, evidence; ceiling noted, Figure 3C). At this sample size, all agreement estimates are preliminary.</w:t>
       </w:r>
     </w:p>
     <w:p>
@@ -1489,7 +1489,7 @@
           <w:b w:val="0"/>
           <w:i w:val="0"/>
         </w:rPr>
-        <w:t xml:space="preserve">Large language models are approaching expert-level medical question answering [31] and have generated patient-facing responses rated as more empathetic than physician responses [45]; for constrained, auditable decision support, however, our results indicate that decision architecture — not model capability — is the dominant lever. Medical RAG benchmarks such as MIRAGE [35] evaluate open-question answering accuracy, typically multiple-choice or free text; we instead map an international consensus' final statements onto five executable actions and evaluate </w:t>
+        <w:t xml:space="preserve">Large language models are approaching expert-level medical question answering [31] and have generated patient-facing responses rated as more empathetic than physician responses [49]; for constrained, auditable decision support, however, our results indicate that decision architecture — not model capability — is the dominant lever. Medical RAG benchmarks such as MIRAGE [39] evaluate open-question answering accuracy, typically multiple-choice or free text; we instead map an international consensus' final statements onto five executable actions and evaluate </w:t>
       </w:r>
       <w:r>
         <w:rPr>
@@ -1505,7 +1505,17 @@
           <w:b w:val="0"/>
           <w:i w:val="0"/>
         </w:rPr>
-        <w:t>, a property closer to clinical governance needs. Relative to GraphRAG [38] and LightRAG [37], our contribution is system-level: LightRAG remains the evidence engine, but the lightrag-only baseline demonstrates exactly what happens without a rule layer — against over-calling (sensitivity 1.000, specificity 0.922) and conditional silence. Relative to rule-based CDSS [27], our architecture compresses the auditable rule base to 16 consensus rules and delegates long-tail knowledge to graph retrieval, coupling the two via hard constraints rather than parallel voting.</w:t>
+        <w:t>, a property closer to clinical governance needs. Relative to GraphRAG [42] and LightRAG [41], our contribution is system-level: LightRAG remains the evidence engine, but the lightrag-only baseline demonstrates exactly what happens without a rule layer — against over-calling (sensitivity 1.000, specificity 0.922) and conditional silence. Relative to rule-based CDSS [27], our architecture compresses the auditable rule base to 16 consensus rules and delegates long-tail knowledge to graph retrieval, coupling the two via hard constraints rather than parallel voting.</w:t>
+      </w:r>
+    </w:p>
+    <w:p>
+      <w:r>
+        <w:rPr>
+          <w:rFonts w:ascii="Times New Roman" w:hAnsi="Times New Roman"/>
+          <w:b w:val="0"/>
+          <w:i w:val="0"/>
+        </w:rPr>
+        <w:t>The closest contemporaries are the domain LLM agents now appearing across medicine. PULSE, an agent for atrial-fibrillation patient self-management [34], and its hypertension analogue [35], demonstrate that retrieval plus prompt optimisation raises Likert-rated response quality across several base models; an EHR-integrated agent personalises prostate-cancer patient education [36]; GeneAgent adds self-verification over domain databases for gene-set analysis [37]. Our results explain why such gains do not automatically transfer to procedural decision support. First, their evaluation endpoint — perceived response quality — does not measure guideline conformance; a fluent and empathetic answer can still misplace a veto. Second, their safeguards are prompt-level: reflection and consistency checks persuade but do not bind, whereas hard-constrained arbitration mechanically forbids non-compliant outputs and is the only configuration that places the two nuance-bearing actions correctly. Third, these agents are patient-facing information tools, whereas QianLieAnHui is a clinician-facing procedural instrument benchmarked against 112 verifiable consensus statements with multi-seed statistics and architecture ablation — an evaluation style closer to diagnostic-test validation than to user-satisfaction scoring.</w:t>
       </w:r>
     </w:p>
     <w:p>
@@ -1699,7 +1709,7 @@
           <w:b w:val="0"/>
           <w:i w:val="0"/>
         </w:rPr>
-        <w:t xml:space="preserve">: four experts rated five composite propositions; agreement statistics at this n are unstable (a negative Fleiss κ despite 17/20 raw agreement illustrates the artefact [44]), all Likert ratings hit the ceiling, and the panel was single-institution — the review therefore supports preliminary face validity only. Fourth, </w:t>
+        <w:t xml:space="preserve">: four experts rated five composite propositions; agreement statistics at this n are unstable (a negative Fleiss κ despite 17/20 raw agreement illustrates the artefact [48]), all Likert ratings hit the ceiling, and the panel was single-institution — the review therefore supports preliminary face validity only. Fourth, </w:t>
       </w:r>
       <w:r>
         <w:rPr>
@@ -1807,7 +1817,7 @@
           <w:b w:val="0"/>
           <w:i w:val="0"/>
         </w:rPr>
-        <w:t>(i) extending the expert panel to a multi-centre face-validity and usability study, including treatment-intent-conditioned scenarios of the kind flagged by the reviewers in the split case; (ii) a prospective registry study with real cases, reported under emerging AI-evaluation standards [46,47]; (iii) extending the rule base to other guideline chapters (active surveillance, imaging follow-up) and emerging PSMA-PET–first pathways [48] to test architecture portability; (iv) FHIR integration for automatic scenario filling from the EMR; (v) on-premises generator deployment to eliminate PHI-transfer concerns.</w:t>
+        <w:t>(i) extending the expert panel to a multi-centre face-validity and usability study, including treatment-intent-conditioned scenarios of the kind flagged by the reviewers in the split case; (ii) a prospective registry study with real cases, reported under emerging AI-evaluation standards [50,51]; (iii) extending the rule base to other guideline chapters (active surveillance, imaging follow-up) and emerging PSMA-PET–first pathways [52] to test architecture portability; (iv) FHIR integration for automatic scenario filling from the EMR; (v) on-premises generator deployment to eliminate PHI-transfer concerns.</w:t>
       </w:r>
     </w:p>
     <w:p>
@@ -1858,7 +1868,7 @@
           <w:b w:val="0"/>
           <w:i w:val="0"/>
         </w:rPr>
-        <w:t>The rule base (configs/rules.yaml), both registries (entities_a.csv, entities_b.csv), the evidence corpus (evidence_chunks.jsonl, 357 chunks), the gold-standard annotations (probiopsy_statements.csv, 112 statements), all 2,240 raw predictions with per-run context sizes and retrieved-chunk counts (baseline_predictions.jsonl), the flagship-tier supplement (baseline_predictions_glm53.jsonl), the evaluation script (evaluate.py), and all figure source data are released with the repository (https://github.com/xuzekun6251/probiopsy-rag) and archived on Zenodo [49].</w:t>
+        <w:t>The rule base (configs/rules.yaml), both registries (entities_a.csv, entities_b.csv), the evidence corpus (evidence_chunks.jsonl, 357 chunks), the gold-standard annotations (probiopsy_statements.csv, 112 statements), all 2,240 raw predictions with per-run context sizes and retrieved-chunk counts (baseline_predictions.jsonl), the flagship-tier supplement (baseline_predictions_glm53.jsonl), the evaluation script (evaluate.py), and all figure source data are released with the repository (https://github.com/xuzekun6251/probiopsy-rag) and archived on Zenodo [53].</w:t>
       </w:r>
     </w:p>
     <w:p>
@@ -2917,7 +2927,7 @@
           <w:b w:val="0"/>
           <w:i w:val="0"/>
         </w:rPr>
-        <w:t>34. Lewis P, Perez E, Piktus A, et al. Retrieval-augmented generation for knowledge-intensive NLP tasks. Adv Neural Inf Process Syst. 2020;33:9459-74. arXiv:2005.11401 (verified via arXiv API).</w:t>
+        <w:t>34. Wang Y, Peng C, Hu R, et al. A knowledge-enhanced domain-aware large language model agent for atrial fibrillation management. npj Digit. Med. 2026. https://doi.org/10.1038/s41746-026-03038-x</w:t>
       </w:r>
     </w:p>
     <w:p>
@@ -2930,7 +2940,7 @@
           <w:b w:val="0"/>
           <w:i w:val="0"/>
         </w:rPr>
-        <w:t>35. Xiong G, Jin Q, Lu Z, Zhang A. Benchmarking Retrieval-Augmented Generation for Medicine. Findings of the Association for Computational Linguistics ACL 2024. 2024:6233-6251. https://doi.org/10.18653/v1/2024.findings-acl.372</w:t>
+        <w:t>35. Wang Y, Tan W, Cheng S, et al. Large Language Model Agent for Managing Patients With Suspected Hypertension. Hypertension. 2026;83(1):212-224. https://doi.org/10.1161/hypertensionaha.125.25305</w:t>
       </w:r>
     </w:p>
     <w:p>
@@ -2943,7 +2953,7 @@
           <w:b w:val="0"/>
           <w:i w:val="0"/>
         </w:rPr>
-        <w:t>36. Pan S, Luo L, Wang Y, Chen C, Wang J, Wu X. Unifying Large Language Models and Knowledge Graphs: A Roadmap. IEEE Trans. Knowl. Data Eng. 2024;36(7):3580-3599. https://doi.org/10.1109/tkde.2024.3352100</w:t>
+        <w:t>36. Hao Y, Holmes J, Waddle MR, et al. Personalizing prostate cancer education for patients using an EHR-Integrated LLM agent. npj Digit. Med. 2025;8(1):770. https://doi.org/10.1038/s41746-025-02166-0</w:t>
       </w:r>
     </w:p>
     <w:p>
@@ -2956,7 +2966,7 @@
           <w:b w:val="0"/>
           <w:i w:val="0"/>
         </w:rPr>
-        <w:t>37. Guo Z, Xia L, Yu Y, Ao T, Huang C. LightRAG: simple and fast retrieval-augmented generation. arXiv:2410.05779, 2024 (verified against arXiv listing).</w:t>
+        <w:t>37. Wang Z, Jin Q, Wei CH, et al. GeneAgent: self-verification language agent for gene-set analysis using domain databases. Nat Methods. 2025;22(8):1677-1685. https://doi.org/10.1038/s41592-025-02748-6</w:t>
       </w:r>
     </w:p>
     <w:p>
@@ -2969,7 +2979,7 @@
           <w:b w:val="0"/>
           <w:i w:val="0"/>
         </w:rPr>
-        <w:t>38. Edge D, Trinh H, Cheng N, et al. From local to global: a Graph RAG approach to query-focused summarization. arXiv:2404.16130, 2024 (verified via arXiv API).</w:t>
+        <w:t>38. Lewis P, Perez E, Piktus A, et al. Retrieval-augmented generation for knowledge-intensive NLP tasks. Adv Neural Inf Process Syst. 2020;33:9459-74. arXiv:2005.11401 (verified via arXiv API).</w:t>
       </w:r>
     </w:p>
     <w:p>
@@ -2982,7 +2992,7 @@
           <w:b w:val="0"/>
           <w:i w:val="0"/>
         </w:rPr>
-        <w:t>39. Epstein JI, Amin MB, Reuter VE, Humphrey PA. Contemporary Gleason Grading of Prostatic Carcinoma: An Update With Discussion on Practical Issues to Implement the 2014 International Society of Urological Pathology (ISUP) Consensus Conference on Gleason Grading of Prostatic Carcinoma. American Journal of Surgical Pathology. 2017;41(4):e1-e7. https://doi.org/10.1097/pas.0000000000000820</w:t>
+        <w:t>39. Xiong G, Jin Q, Lu Z, Zhang A. Benchmarking Retrieval-Augmented Generation for Medicine. Findings of the Association for Computational Linguistics ACL 2024. 2024:6233-6251. https://doi.org/10.18653/v1/2024.findings-acl.372</w:t>
       </w:r>
     </w:p>
     <w:p>
@@ -2995,7 +3005,7 @@
           <w:b w:val="0"/>
           <w:i w:val="0"/>
         </w:rPr>
-        <w:t>40. Giganti F, Allen C, Emberton M, Moore CM, Kasivisvanathan V. Prostate Imaging Quality (PI-QUAL): A New Quality Control Scoring System for Multiparametric Magnetic Resonance Imaging of the Prostate from the PRECISION trial. European Urology Oncology. 2020;3(5):615-619. https://doi.org/10.1016/j.euo.2020.06.007</w:t>
+        <w:t>40. Pan S, Luo L, Wang Y, Chen C, Wang J, Wu X. Unifying Large Language Models and Knowledge Graphs: A Roadmap. IEEE Trans. Knowl. Data Eng. 2024;36(7):3580-3599. https://doi.org/10.1109/tkde.2024.3352100</w:t>
       </w:r>
     </w:p>
     <w:p>
@@ -3008,7 +3018,7 @@
           <w:b w:val="0"/>
           <w:i w:val="0"/>
         </w:rPr>
-        <w:t>41. Cohen J. A Coefficient of Agreement for Nominal Scales. Educational and Psychological Measurement. 1960;20(1):37-46. https://doi.org/10.1177/001316446002000104</w:t>
+        <w:t>41. Guo Z, Xia L, Yu Y, Ao T, Huang C. LightRAG: simple and fast retrieval-augmented generation. arXiv:2410.05779, 2024 (verified against arXiv listing).</w:t>
       </w:r>
     </w:p>
     <w:p>
@@ -3021,7 +3031,7 @@
           <w:b w:val="0"/>
           <w:i w:val="0"/>
         </w:rPr>
-        <w:t>42. Benjamini Y, Hochberg Y. Controlling the False Discovery Rate: A Practical and Powerful Approach to Multiple Testing. Journal of the Royal Statistical Society Series B: Statistical Methodology. 1995;57(1):289-300. https://doi.org/10.1111/j.2517-6161.1995.tb02031.x</w:t>
+        <w:t>42. Edge D, Trinh H, Cheng N, et al. From local to global: a Graph RAG approach to query-focused summarization. arXiv:2404.16130, 2024 (verified via arXiv API).</w:t>
       </w:r>
     </w:p>
     <w:p>
@@ -3034,7 +3044,7 @@
           <w:b w:val="0"/>
           <w:i w:val="0"/>
         </w:rPr>
-        <w:t>43. Fleiss JL. Measuring nominal scale agreement among many raters.. Psychological Bulletin. 1971;76(5):378-382. https://doi.org/10.1037/h0031619</w:t>
+        <w:t>43. Epstein JI, Amin MB, Reuter VE, Humphrey PA. Contemporary Gleason Grading of Prostatic Carcinoma: An Update With Discussion on Practical Issues to Implement the 2014 International Society of Urological Pathology (ISUP) Consensus Conference on Gleason Grading of Prostatic Carcinoma. American Journal of Surgical Pathology. 2017;41(4):e1-e7. https://doi.org/10.1097/pas.0000000000000820</w:t>
       </w:r>
     </w:p>
     <w:p>
@@ -3047,7 +3057,7 @@
           <w:b w:val="0"/>
           <w:i w:val="0"/>
         </w:rPr>
-        <w:t>44. Feinstein AR, Cicchetti DV. High agreement but low Kappa: I. the problems of two paradoxes. Journal of Clinical Epidemiology. 1990;43(6):543-549. https://doi.org/10.1016/0895-4356(90)90158-l</w:t>
+        <w:t>44. Giganti F, Allen C, Emberton M, Moore CM, Kasivisvanathan V. Prostate Imaging Quality (PI-QUAL): A New Quality Control Scoring System for Multiparametric Magnetic Resonance Imaging of the Prostate from the PRECISION trial. European Urology Oncology. 2020;3(5):615-619. https://doi.org/10.1016/j.euo.2020.06.007</w:t>
       </w:r>
     </w:p>
     <w:p>
@@ -3060,7 +3070,7 @@
           <w:b w:val="0"/>
           <w:i w:val="0"/>
         </w:rPr>
-        <w:t>45. Ayers JW, Poliak A, Dredze M, et al. Comparing Physician and Artificial Intelligence Chatbot Responses to Patient Questions Posted to a Public Social Media Forum. JAMA Intern Med. 2023;183(6):589. https://doi.org/10.1001/jamainternmed.2023.1838</w:t>
+        <w:t>45. Cohen J. A Coefficient of Agreement for Nominal Scales. Educational and Psychological Measurement. 1960;20(1):37-46. https://doi.org/10.1177/001316446002000104</w:t>
       </w:r>
     </w:p>
     <w:p>
@@ -3073,7 +3083,7 @@
           <w:b w:val="0"/>
           <w:i w:val="0"/>
         </w:rPr>
-        <w:t>46. Vasey B, Nagendran M, Campbell B, et al. Reporting guideline for the early stage clinical evaluation of decision support systems driven by artificial intelligence: DECIDE-AI. BMJ. 2022;377:e070904. https://doi.org/10.1136/bmj-2022-070904</w:t>
+        <w:t>46. Benjamini Y, Hochberg Y. Controlling the False Discovery Rate: A Practical and Powerful Approach to Multiple Testing. Journal of the Royal Statistical Society Series B: Statistical Methodology. 1995;57(1):289-300. https://doi.org/10.1111/j.2517-6161.1995.tb02031.x</w:t>
       </w:r>
     </w:p>
     <w:p>
@@ -3086,7 +3096,7 @@
           <w:b w:val="0"/>
           <w:i w:val="0"/>
         </w:rPr>
-        <w:t>47. Collins GS, Moons KGM, Dhiman P, et al. TRIPOD+AI statement: updated guidance for reporting clinical prediction models that use regression or machine learning methods. BMJ. 2024;385:e078378. https://doi.org/10.1136/bmj-2023-078378</w:t>
+        <w:t>47. Fleiss JL. Measuring nominal scale agreement among many raters.. Psychological Bulletin. 1971;76(5):378-382. https://doi.org/10.1037/h0031619</w:t>
       </w:r>
     </w:p>
     <w:p>
@@ -3099,7 +3109,7 @@
           <w:b w:val="0"/>
           <w:i w:val="0"/>
         </w:rPr>
-        <w:t>48. Al-Khanaty A, Hennes D, Hofman MS, et al. Avoiding Prostate Biopsy in Early Prostate Cancer Detection: From Liquid Biopsy to PSMA-PET. European Urology Focus. 2026. https://doi.org/10.1016/j.euf.2026.05.019</w:t>
+        <w:t>48. Feinstein AR, Cicchetti DV. High agreement but low Kappa: I. the problems of two paradoxes. Journal of Clinical Epidemiology. 1990;43(6):543-549. https://doi.org/10.1016/0895-4356(90)90158-l</w:t>
       </w:r>
     </w:p>
     <w:p>
@@ -3112,16 +3122,68 @@
           <w:b w:val="0"/>
           <w:i w:val="0"/>
         </w:rPr>
-        <w:t>49. XU Z. QianLieAnHui (probiopsy-rag): a hybrid rule-engine, knowledge-graph, and LLM-arbitration decision-support system for the prostate biopsy pathway, validated against the ProBIOPSY consensus [software, version v1.0.1]. Zenodo. 2026. https://doi.org/10.5281/zenodo.22898439 (verified via DataCite API).</w:t>
+        <w:t>49. Ayers JW, Poliak A, Dredze M, et al. Comparing Physician and Artificial Intelligence Chatbot Responses to Patient Questions Posted to a Public Social Media Forum. JAMA Intern Med. 2023;183(6):589. https://doi.org/10.1001/jamainternmed.2023.1838</w:t>
       </w:r>
     </w:p>
     <w:p>
+      <w:pPr>
+        <w:ind w:left="425" w:hanging="425"/>
+      </w:pPr>
       <w:r>
         <w:rPr>
           <w:rFonts w:ascii="Times New Roman" w:hAnsi="Times New Roman"/>
           <w:b w:val="0"/>
           <w:i w:val="0"/>
         </w:rPr>
+        <w:t>50. Vasey B, Nagendran M, Campbell B, et al. Reporting guideline for the early stage clinical evaluation of decision support systems driven by artificial intelligence: DECIDE-AI. BMJ. 2022;377:e070904. https://doi.org/10.1136/bmj-2022-070904</w:t>
+      </w:r>
+    </w:p>
+    <w:p>
+      <w:pPr>
+        <w:ind w:left="425" w:hanging="425"/>
+      </w:pPr>
+      <w:r>
+        <w:rPr>
+          <w:rFonts w:ascii="Times New Roman" w:hAnsi="Times New Roman"/>
+          <w:b w:val="0"/>
+          <w:i w:val="0"/>
+        </w:rPr>
+        <w:t>51. Collins GS, Moons KGM, Dhiman P, et al. TRIPOD+AI statement: updated guidance for reporting clinical prediction models that use regression or machine learning methods. BMJ. 2024;385:e078378. https://doi.org/10.1136/bmj-2023-078378</w:t>
+      </w:r>
+    </w:p>
+    <w:p>
+      <w:pPr>
+        <w:ind w:left="425" w:hanging="425"/>
+      </w:pPr>
+      <w:r>
+        <w:rPr>
+          <w:rFonts w:ascii="Times New Roman" w:hAnsi="Times New Roman"/>
+          <w:b w:val="0"/>
+          <w:i w:val="0"/>
+        </w:rPr>
+        <w:t>52. Al-Khanaty A, Hennes D, Hofman MS, et al. Avoiding Prostate Biopsy in Early Prostate Cancer Detection: From Liquid Biopsy to PSMA-PET. European Urology Focus. 2026. https://doi.org/10.1016/j.euf.2026.05.019</w:t>
+      </w:r>
+    </w:p>
+    <w:p>
+      <w:pPr>
+        <w:ind w:left="425" w:hanging="425"/>
+      </w:pPr>
+      <w:r>
+        <w:rPr>
+          <w:rFonts w:ascii="Times New Roman" w:hAnsi="Times New Roman"/>
+          <w:b w:val="0"/>
+          <w:i w:val="0"/>
+        </w:rPr>
+        <w:t>53. XU Z. QianLieAnHui (probiopsy-rag): a hybrid rule-engine, knowledge-graph, and LLM-arbitration decision-support system for the prostate biopsy pathway, validated against the ProBIOPSY consensus [software, version v1.0.1]. Zenodo. 2026. https://doi.org/10.5281/zenodo.22898439 (verified via DataCite API).</w:t>
+      </w:r>
+    </w:p>
+    <w:p>
+      <w:r>
+        <w:rPr>
+          <w:rFonts w:ascii="Times New Roman" w:hAnsi="Times New Roman"/>
+          <w:b w:val="0"/>
+          <w:i w:val="0"/>
+        </w:rPr>
         <w:t xml:space="preserve">&gt; </w:t>
       </w:r>
       <w:r>
@@ -3138,7 +3200,7 @@
           <w:b w:val="0"/>
           <w:i w:val="0"/>
         </w:rPr>
-        <w:t xml:space="preserve"> all 41 references verified programmatically on 2026-09-17 — DOI-based entries resolved against the Crossref API (api.crossref.org; metadata auto-generated in `scripts/renumber_refs.py`, cache `outputs/paper/refs_vancouver.json`), arXiv entries (refs for LightRAG, GraphRAG, Lewis RAG) verified via the arXiv API / arXiv listings, the Zenodo software deposit via the DataCite API; the EAU guideline is a living web citation — update edition and access date at submission time.</w:t>
+        <w:t xml:space="preserve"> all 53 references verified programmatically — DOI-based entries resolved against the Crossref API (api.crossref.org; metadata auto-generated in `scripts/renumber_refs.py`, cache `outputs/paper/refs_vancouver.json`); the round-6 clinical additions (2026-10-02: AUA/ASTRO guideline articles, biopsy complications, targeted prophylaxis, transperineal-vs-transrectal trial evidence, PI-RADS inter-reader agreement, biopsy-to-prostatectomy concordance) were additionally confirmed against PubMed via the NCBI E-utilities API, and the round-7 medical-agent positioning additions (PULSE, the hypertension and prostate-cancer agents, GeneAgent) via Crossref (PMIDs and DOIs recorded in the verification scripts); arXiv entries (refs for LightRAG, GraphRAG, Lewis RAG) verified via the arXiv API / arXiv listings, the Zenodo software deposit via the DataCite API; the EAU guideline is a living web citation — update edition and access date at submission time.</w:t>
       </w:r>
     </w:p>
     <w:sectPr>

</xml_diff>

<commit_message>
manuscript+GA: adopt 'agent' terminology; graphical abstract v2
</commit_message>
<xml_diff>
--- a/outputs/submission/manuscript.en.docx
+++ b/outputs/submission/manuscript.en.docx
@@ -13,7 +13,7 @@
           <w:i w:val="0"/>
           <w:sz w:val="28"/>
         </w:rPr>
-        <w:t>QianLieAnHui: development and benchmark validation of a hybrid rule-engine, knowledge-graph, and LLM-arbitration decision-support system for the prostate biopsy pathway, against the ProBIOPSY international consensus</w:t>
+        <w:t>QianLieAnHui: development and benchmark validation of a hybrid rule-engine, knowledge-graph, and LLM-arbitration decision-support agent for the prostate biopsy pathway, against the ProBIOPSY international consensus</w:t>
       </w:r>
     </w:p>
     <w:p>
@@ -31,7 +31,7 @@
           <w:b w:val="0"/>
           <w:i w:val="0"/>
         </w:rPr>
-        <w:t xml:space="preserve"> A hybrid rule engine–knowledge graph–LLM system for prostate biopsy decisions</w:t>
+        <w:t xml:space="preserve"> A hybrid rule engine–knowledge graph–LLM agent for prostate biopsy decisions</w:t>
       </w:r>
     </w:p>
     <w:p>
@@ -106,7 +106,7 @@
           <w:b w:val="0"/>
           <w:i w:val="0"/>
         </w:rPr>
-        <w:t xml:space="preserve"> prostate cancer; prostate biopsy; clinical decision support; knowledge graph; LightRAG; retrieval-augmented generation; large language models; ProBIOPSY</w:t>
+        <w:t xml:space="preserve"> prostate cancer; prostate biopsy; clinical decision support; LLM agent; knowledge graph; LightRAG; retrieval-augmented generation; large language models; ProBIOPSY</w:t>
       </w:r>
     </w:p>
     <w:p>
@@ -183,7 +183,7 @@
           <w:b w:val="0"/>
           <w:i w:val="0"/>
         </w:rPr>
-        <w:t xml:space="preserve"> We developed QianLieAnHui, a three-layer hybrid: (1) a deterministic rule engine (12 consensus + 4 patient-factor escalation rules, cross-checked against EAU and AUA/ASTRO guidelines) emitting hard constraints; (2) risk-guided retrieval over a LightRAG knowledge graph (357 evidence chunks, 1,864 entities, 3,078 relations, traceable to the consensus); (3) an LLM arbiter emitting one of five executable actions with statement-level citations. Four methods × five seeds × 112 statements (2,240 runs) were benchmarked under one fixed generator (GLM-5.3-Flash); baselines were re-run with flagship-tier GLM-5.3.</w:t>
+        <w:t xml:space="preserve"> We developed QianLieAnHui, a three-layer decision-support agent: (1) a deterministic rule engine (12 consensus + 4 patient-factor escalation rules, cross-checked against EAU and AUA/ASTRO guidelines) emitting hard constraints; (2) risk-guided retrieval over a LightRAG knowledge graph (357 evidence chunks, 1,864 entities, 3,078 relations, traceable to the consensus); (3) an LLM arbiter emitting one of five executable actions with statement-level citations. Four methods × five seeds × 112 statements (2,240 runs) were benchmarked under one fixed generator (GLM-5.3-Flash); baselines were re-run with flagship-tier GLM-5.3.</w:t>
       </w:r>
     </w:p>
     <w:p>
@@ -201,7 +201,7 @@
           <w:b w:val="0"/>
           <w:i w:val="0"/>
         </w:rPr>
-        <w:t xml:space="preserve"> The full system achieved exact-5 accuracy 0.805±0.012 (±SD over 5 seeds), Cohen's κ 0.730±0.016, and against-class F1 0.908±0.023, versus strongest baseline LightRAG-only (0.613, 0.536, 0.525, 0.881), naive RAG (0.605, 0.514, 0.512, 0.890), and pure LLM (0.304, 0.254, 0.079, 0.346); all differences significant (FDR-adjusted p ≤ 0.001). Retrieval baselines collapsed onto frequent classes (conditional: 0.8% of retrieval-baseline runs versus 17.0% for the full system). Upgrading the generator did not rescue naive RAG (0.605→0.538).</w:t>
+        <w:t xml:space="preserve"> The agent achieved exact-5 accuracy 0.805±0.012 (±SD over 5 seeds), Cohen's κ 0.730±0.016, and against-class F1 0.908±0.023, versus strongest baseline LightRAG-only (0.613, 0.536, 0.525, 0.881), naive RAG (0.605, 0.514, 0.512, 0.890), and pure LLM (0.304, 0.254, 0.079, 0.346); all differences significant (FDR-adjusted p ≤ 0.001). Retrieval baselines collapsed onto frequent classes (conditional: 0.8% of retrieval-baseline runs versus 17.0% for the agent). Upgrading the generator did not rescue naive RAG (0.605→0.538).</w:t>
       </w:r>
     </w:p>
     <w:p>

</xml_diff>

<commit_message>
preflight: embed Tables 1-3, fix empty supplementary citations, docx table support
</commit_message>
<xml_diff>
--- a/outputs/submission/manuscript.en.docx
+++ b/outputs/submission/manuscript.en.docx
@@ -687,7 +687,7 @@
           <w:b/>
           <w:i w:val="0"/>
         </w:rPr>
-        <w:t>Layer 1: deterministic rule engine.</w:t>
+        <w:t>Table 1.</w:t>
       </w:r>
       <w:r>
         <w:rPr>
@@ -695,9 +695,2625 @@
           <w:b w:val="0"/>
           <w:i w:val="0"/>
         </w:rPr>
+        <w:t xml:space="preserve"> Dual entity registries: item and flag counts with category breakdown. The full registries are released as `data/seed/entities_a.csv` and `data/seed/entities_b.csv`.</w:t>
+      </w:r>
+    </w:p>
+    <w:tbl>
+      <w:tblPr>
+        <w:tblStyle w:val="TableGrid"/>
+        <w:tblW w:type="auto" w:w="0"/>
+        <w:tblLook w:firstColumn="1" w:firstRow="1" w:lastColumn="0" w:lastRow="0" w:noHBand="0" w:noVBand="1" w:val="04A0"/>
+      </w:tblPr>
+      <w:tblGrid>
+        <w:gridCol w:w="1814"/>
+        <w:gridCol w:w="1814"/>
+        <w:gridCol w:w="1814"/>
+        <w:gridCol w:w="1814"/>
+        <w:gridCol w:w="1814"/>
+      </w:tblGrid>
+      <w:tr>
+        <w:tc>
+          <w:tcPr>
+            <w:tcW w:type="dxa" w:w="1814"/>
+          </w:tcPr>
+          <w:p>
+            <w:pPr>
+              <w:spacing w:line="240" w:lineRule="auto"/>
+            </w:pPr>
+            <w:r>
+              <w:rPr>
+                <w:rFonts w:ascii="Times New Roman" w:hAnsi="Times New Roman"/>
+                <w:b/>
+                <w:i w:val="0"/>
+                <w:sz w:val="18"/>
+              </w:rPr>
+              <w:t>registry</w:t>
+            </w:r>
+          </w:p>
+        </w:tc>
+        <w:tc>
+          <w:tcPr>
+            <w:tcW w:type="dxa" w:w="1814"/>
+          </w:tcPr>
+          <w:p>
+            <w:pPr>
+              <w:spacing w:line="240" w:lineRule="auto"/>
+            </w:pPr>
+            <w:r>
+              <w:rPr>
+                <w:rFonts w:ascii="Times New Roman" w:hAnsi="Times New Roman"/>
+                <w:b/>
+                <w:i w:val="0"/>
+                <w:sz w:val="18"/>
+              </w:rPr>
+              <w:t>n_items</w:t>
+            </w:r>
+          </w:p>
+        </w:tc>
+        <w:tc>
+          <w:tcPr>
+            <w:tcW w:type="dxa" w:w="1814"/>
+          </w:tcPr>
+          <w:p>
+            <w:pPr>
+              <w:spacing w:line="240" w:lineRule="auto"/>
+            </w:pPr>
+            <w:r>
+              <w:rPr>
+                <w:rFonts w:ascii="Times New Roman" w:hAnsi="Times New Roman"/>
+                <w:b/>
+                <w:i w:val="0"/>
+                <w:sz w:val="18"/>
+              </w:rPr>
+              <w:t>n_unique_flags</w:t>
+            </w:r>
+          </w:p>
+        </w:tc>
+        <w:tc>
+          <w:tcPr>
+            <w:tcW w:type="dxa" w:w="1814"/>
+          </w:tcPr>
+          <w:p>
+            <w:pPr>
+              <w:spacing w:line="240" w:lineRule="auto"/>
+            </w:pPr>
+            <w:r>
+              <w:rPr>
+                <w:rFonts w:ascii="Times New Roman" w:hAnsi="Times New Roman"/>
+                <w:b/>
+                <w:i w:val="0"/>
+                <w:sz w:val="18"/>
+              </w:rPr>
+              <w:t>category_breakdown</w:t>
+            </w:r>
+          </w:p>
+        </w:tc>
+        <w:tc>
+          <w:tcPr>
+            <w:tcW w:type="dxa" w:w="1814"/>
+          </w:tcPr>
+          <w:p>
+            <w:pPr>
+              <w:spacing w:line="240" w:lineRule="auto"/>
+            </w:pPr>
+            <w:r>
+              <w:rPr>
+                <w:rFonts w:ascii="Times New Roman" w:hAnsi="Times New Roman"/>
+                <w:b/>
+                <w:i w:val="0"/>
+                <w:sz w:val="18"/>
+              </w:rPr>
+              <w:t>source_file</w:t>
+            </w:r>
+          </w:p>
+        </w:tc>
+      </w:tr>
+      <w:tr>
+        <w:tc>
+          <w:tcPr>
+            <w:tcW w:type="dxa" w:w="1814"/>
+          </w:tcPr>
+          <w:p>
+            <w:pPr>
+              <w:spacing w:line="240" w:lineRule="auto"/>
+            </w:pPr>
+            <w:r>
+              <w:rPr>
+                <w:rFonts w:ascii="Times New Roman" w:hAnsi="Times New Roman"/>
+                <w:b w:val="0"/>
+                <w:i w:val="0"/>
+                <w:sz w:val="18"/>
+              </w:rPr>
+              <w:t>A_patient_scenarios</w:t>
+            </w:r>
+          </w:p>
+        </w:tc>
+        <w:tc>
+          <w:tcPr>
+            <w:tcW w:type="dxa" w:w="1814"/>
+          </w:tcPr>
+          <w:p>
+            <w:pPr>
+              <w:spacing w:line="240" w:lineRule="auto"/>
+            </w:pPr>
+            <w:r>
+              <w:rPr>
+                <w:rFonts w:ascii="Times New Roman" w:hAnsi="Times New Roman"/>
+                <w:b w:val="0"/>
+                <w:i w:val="0"/>
+                <w:sz w:val="18"/>
+              </w:rPr>
+              <w:t>51</w:t>
+            </w:r>
+          </w:p>
+        </w:tc>
+        <w:tc>
+          <w:tcPr>
+            <w:tcW w:type="dxa" w:w="1814"/>
+          </w:tcPr>
+          <w:p>
+            <w:pPr>
+              <w:spacing w:line="240" w:lineRule="auto"/>
+            </w:pPr>
+            <w:r>
+              <w:rPr>
+                <w:rFonts w:ascii="Times New Roman" w:hAnsi="Times New Roman"/>
+                <w:b w:val="0"/>
+                <w:i w:val="0"/>
+                <w:sz w:val="18"/>
+              </w:rPr>
+              <w:t>49</w:t>
+            </w:r>
+          </w:p>
+        </w:tc>
+        <w:tc>
+          <w:tcPr>
+            <w:tcW w:type="dxa" w:w="1814"/>
+          </w:tcPr>
+          <w:p>
+            <w:pPr>
+              <w:spacing w:line="240" w:lineRule="auto"/>
+            </w:pPr>
+            <w:r>
+              <w:rPr>
+                <w:rFonts w:ascii="Times New Roman" w:hAnsi="Times New Roman"/>
+                <w:b w:val="0"/>
+                <w:i w:val="0"/>
+                <w:sz w:val="18"/>
+              </w:rPr>
+              <w:t>imaging=17; lab_biomarker=9; clinical=7; history_risk=6; treatment_intent=6; resource_availability=5; demographic=1</w:t>
+            </w:r>
+          </w:p>
+        </w:tc>
+        <w:tc>
+          <w:tcPr>
+            <w:tcW w:type="dxa" w:w="1814"/>
+          </w:tcPr>
+          <w:p>
+            <w:pPr>
+              <w:spacing w:line="240" w:lineRule="auto"/>
+            </w:pPr>
+            <w:r>
+              <w:rPr>
+                <w:rFonts w:ascii="Times New Roman" w:hAnsi="Times New Roman"/>
+                <w:b w:val="0"/>
+                <w:i w:val="0"/>
+                <w:sz w:val="18"/>
+              </w:rPr>
+              <w:t>data/seed/entities_a.csv</w:t>
+            </w:r>
+          </w:p>
+        </w:tc>
+      </w:tr>
+      <w:tr>
+        <w:tc>
+          <w:tcPr>
+            <w:tcW w:type="dxa" w:w="1814"/>
+          </w:tcPr>
+          <w:p>
+            <w:pPr>
+              <w:spacing w:line="240" w:lineRule="auto"/>
+            </w:pPr>
+            <w:r>
+              <w:rPr>
+                <w:rFonts w:ascii="Times New Roman" w:hAnsi="Times New Roman"/>
+                <w:b w:val="0"/>
+                <w:i w:val="0"/>
+                <w:sz w:val="18"/>
+              </w:rPr>
+              <w:t>B_decision_items</w:t>
+            </w:r>
+          </w:p>
+        </w:tc>
+        <w:tc>
+          <w:tcPr>
+            <w:tcW w:type="dxa" w:w="1814"/>
+          </w:tcPr>
+          <w:p>
+            <w:pPr>
+              <w:spacing w:line="240" w:lineRule="auto"/>
+            </w:pPr>
+            <w:r>
+              <w:rPr>
+                <w:rFonts w:ascii="Times New Roman" w:hAnsi="Times New Roman"/>
+                <w:b w:val="0"/>
+                <w:i w:val="0"/>
+                <w:sz w:val="18"/>
+              </w:rPr>
+              <w:t>54</w:t>
+            </w:r>
+          </w:p>
+        </w:tc>
+        <w:tc>
+          <w:tcPr>
+            <w:tcW w:type="dxa" w:w="1814"/>
+          </w:tcPr>
+          <w:p>
+            <w:pPr>
+              <w:spacing w:line="240" w:lineRule="auto"/>
+            </w:pPr>
+            <w:r>
+              <w:rPr>
+                <w:rFonts w:ascii="Times New Roman" w:hAnsi="Times New Roman"/>
+                <w:b w:val="0"/>
+                <w:i w:val="0"/>
+                <w:sz w:val="18"/>
+              </w:rPr>
+              <w:t>20</w:t>
+            </w:r>
+          </w:p>
+        </w:tc>
+        <w:tc>
+          <w:tcPr>
+            <w:tcW w:type="dxa" w:w="1814"/>
+          </w:tcPr>
+          <w:p>
+            <w:pPr>
+              <w:spacing w:line="240" w:lineRule="auto"/>
+            </w:pPr>
+            <w:r>
+              <w:rPr>
+                <w:rFonts w:ascii="Times New Roman" w:hAnsi="Times New Roman"/>
+                <w:b w:val="0"/>
+                <w:i w:val="0"/>
+                <w:sz w:val="18"/>
+              </w:rPr>
+              <w:t>indication=22; procedure=22; treatment_planning=10</w:t>
+            </w:r>
+          </w:p>
+        </w:tc>
+        <w:tc>
+          <w:tcPr>
+            <w:tcW w:type="dxa" w:w="1814"/>
+          </w:tcPr>
+          <w:p>
+            <w:pPr>
+              <w:spacing w:line="240" w:lineRule="auto"/>
+            </w:pPr>
+            <w:r>
+              <w:rPr>
+                <w:rFonts w:ascii="Times New Roman" w:hAnsi="Times New Roman"/>
+                <w:b w:val="0"/>
+                <w:i w:val="0"/>
+                <w:sz w:val="18"/>
+              </w:rPr>
+              <w:t>data/seed/entities_b.csv</w:t>
+            </w:r>
+          </w:p>
+        </w:tc>
+      </w:tr>
+    </w:tbl>
+    <w:p>
+      <w:r>
+        <w:rPr>
+          <w:rFonts w:ascii="Times New Roman" w:hAnsi="Times New Roman"/>
+          <w:b/>
+          <w:i w:val="0"/>
+        </w:rPr>
+        <w:t>Layer 1: deterministic rule engine.</w:t>
+      </w:r>
+      <w:r>
+        <w:rPr>
+          <w:rFonts w:ascii="Times New Roman" w:hAnsi="Times New Roman"/>
+          <w:b w:val="0"/>
+          <w:i w:val="0"/>
+        </w:rPr>
         <w:t xml:space="preserve"> The rule base (YAML) holds 16 rules: 12 consensus rules and 4 patient-factor escalation rules (Table 2). Each rule specifies trigger flag combinations (Entity A × Entity B flags), severity, mechanism category (imaging pathway, scheme selection, targeted biopsy, perioperative, treatment planning), and recommended action. Matching is fully deterministic — no LLM involved — and produces hard constraints for downstream layers (e.g., a mandatory veto or mandatory escalation), each carrying ProBIOPSY statement numbers (Q-codes) for provenance. Patient-factor rules escalate consensus rules in context (e.g., infection risk factors → prefer transperineal route or augmented prophylaxis; unfit for curative treatment → simplified biopsy scheme).</w:t>
       </w:r>
     </w:p>
+    <w:p>
+      <w:r>
+        <w:rPr>
+          <w:rFonts w:ascii="Times New Roman" w:hAnsi="Times New Roman"/>
+          <w:b/>
+          <w:i w:val="0"/>
+        </w:rPr>
+        <w:t>Table 2.</w:t>
+      </w:r>
+      <w:r>
+        <w:rPr>
+          <w:rFonts w:ascii="Times New Roman" w:hAnsi="Times New Roman"/>
+          <w:b w:val="0"/>
+          <w:i w:val="0"/>
+        </w:rPr>
+        <w:t xml:space="preserve"> The 16-rule base: 12 consensus rules and 4 patient-factor escalation rules. Trigger-flag counts are per rule set; full trigger definitions, recommended actions, and Q-code citations are released in `configs/rules.yaml`.</w:t>
+      </w:r>
+    </w:p>
+    <w:tbl>
+      <w:tblPr>
+        <w:tblStyle w:val="TableGrid"/>
+        <w:tblW w:type="auto" w:w="0"/>
+        <w:tblLook w:firstColumn="1" w:firstRow="1" w:lastColumn="0" w:lastRow="0" w:noHBand="0" w:noVBand="1" w:val="04A0"/>
+      </w:tblPr>
+      <w:tblGrid>
+        <w:gridCol w:w="1296"/>
+        <w:gridCol w:w="1296"/>
+        <w:gridCol w:w="1296"/>
+        <w:gridCol w:w="1296"/>
+        <w:gridCol w:w="1296"/>
+        <w:gridCol w:w="1296"/>
+        <w:gridCol w:w="1296"/>
+      </w:tblGrid>
+      <w:tr>
+        <w:tc>
+          <w:tcPr>
+            <w:tcW w:type="dxa" w:w="1296"/>
+          </w:tcPr>
+          <w:p>
+            <w:pPr>
+              <w:spacing w:line="240" w:lineRule="auto"/>
+            </w:pPr>
+            <w:r>
+              <w:rPr>
+                <w:rFonts w:ascii="Times New Roman" w:hAnsi="Times New Roman"/>
+                <w:b/>
+                <w:i w:val="0"/>
+                <w:sz w:val="18"/>
+              </w:rPr>
+              <w:t>rule_id</w:t>
+            </w:r>
+          </w:p>
+        </w:tc>
+        <w:tc>
+          <w:tcPr>
+            <w:tcW w:type="dxa" w:w="1296"/>
+          </w:tcPr>
+          <w:p>
+            <w:pPr>
+              <w:spacing w:line="240" w:lineRule="auto"/>
+            </w:pPr>
+            <w:r>
+              <w:rPr>
+                <w:rFonts w:ascii="Times New Roman" w:hAnsi="Times New Roman"/>
+                <w:b/>
+                <w:i w:val="0"/>
+                <w:sz w:val="18"/>
+              </w:rPr>
+              <w:t>rule_set</w:t>
+            </w:r>
+          </w:p>
+        </w:tc>
+        <w:tc>
+          <w:tcPr>
+            <w:tcW w:type="dxa" w:w="1296"/>
+          </w:tcPr>
+          <w:p>
+            <w:pPr>
+              <w:spacing w:line="240" w:lineRule="auto"/>
+            </w:pPr>
+            <w:r>
+              <w:rPr>
+                <w:rFonts w:ascii="Times New Roman" w:hAnsi="Times New Roman"/>
+                <w:b/>
+                <w:i w:val="0"/>
+                <w:sz w:val="18"/>
+              </w:rPr>
+              <w:t>severity</w:t>
+            </w:r>
+          </w:p>
+        </w:tc>
+        <w:tc>
+          <w:tcPr>
+            <w:tcW w:type="dxa" w:w="1296"/>
+          </w:tcPr>
+          <w:p>
+            <w:pPr>
+              <w:spacing w:line="240" w:lineRule="auto"/>
+            </w:pPr>
+            <w:r>
+              <w:rPr>
+                <w:rFonts w:ascii="Times New Roman" w:hAnsi="Times New Roman"/>
+                <w:b/>
+                <w:i w:val="0"/>
+                <w:sz w:val="18"/>
+              </w:rPr>
+              <w:t>risk_type</w:t>
+            </w:r>
+          </w:p>
+        </w:tc>
+        <w:tc>
+          <w:tcPr>
+            <w:tcW w:type="dxa" w:w="1296"/>
+          </w:tcPr>
+          <w:p>
+            <w:pPr>
+              <w:spacing w:line="240" w:lineRule="auto"/>
+            </w:pPr>
+            <w:r>
+              <w:rPr>
+                <w:rFonts w:ascii="Times New Roman" w:hAnsi="Times New Roman"/>
+                <w:b/>
+                <w:i w:val="0"/>
+                <w:sz w:val="18"/>
+              </w:rPr>
+              <w:t>n_trigger_flags_a</w:t>
+            </w:r>
+          </w:p>
+        </w:tc>
+        <w:tc>
+          <w:tcPr>
+            <w:tcW w:type="dxa" w:w="1296"/>
+          </w:tcPr>
+          <w:p>
+            <w:pPr>
+              <w:spacing w:line="240" w:lineRule="auto"/>
+            </w:pPr>
+            <w:r>
+              <w:rPr>
+                <w:rFonts w:ascii="Times New Roman" w:hAnsi="Times New Roman"/>
+                <w:b/>
+                <w:i w:val="0"/>
+                <w:sz w:val="18"/>
+              </w:rPr>
+              <w:t>n_target_flags_b</w:t>
+            </w:r>
+          </w:p>
+        </w:tc>
+        <w:tc>
+          <w:tcPr>
+            <w:tcW w:type="dxa" w:w="1296"/>
+          </w:tcPr>
+          <w:p>
+            <w:pPr>
+              <w:spacing w:line="240" w:lineRule="auto"/>
+            </w:pPr>
+            <w:r>
+              <w:rPr>
+                <w:rFonts w:ascii="Times New Roman" w:hAnsi="Times New Roman"/>
+                <w:b/>
+                <w:i w:val="0"/>
+                <w:sz w:val="18"/>
+              </w:rPr>
+              <w:t>rationale_first_sentence</w:t>
+            </w:r>
+          </w:p>
+        </w:tc>
+      </w:tr>
+      <w:tr>
+        <w:tc>
+          <w:tcPr>
+            <w:tcW w:type="dxa" w:w="1296"/>
+          </w:tcPr>
+          <w:p>
+            <w:pPr>
+              <w:spacing w:line="240" w:lineRule="auto"/>
+            </w:pPr>
+            <w:r>
+              <w:rPr>
+                <w:rFonts w:ascii="Times New Roman" w:hAnsi="Times New Roman"/>
+                <w:b w:val="0"/>
+                <w:i w:val="0"/>
+                <w:sz w:val="18"/>
+              </w:rPr>
+              <w:t>mri_acquisition_quality_pathway</w:t>
+            </w:r>
+          </w:p>
+        </w:tc>
+        <w:tc>
+          <w:tcPr>
+            <w:tcW w:type="dxa" w:w="1296"/>
+          </w:tcPr>
+          <w:p>
+            <w:pPr>
+              <w:spacing w:line="240" w:lineRule="auto"/>
+            </w:pPr>
+            <w:r>
+              <w:rPr>
+                <w:rFonts w:ascii="Times New Roman" w:hAnsi="Times New Roman"/>
+                <w:b w:val="0"/>
+                <w:i w:val="0"/>
+                <w:sz w:val="18"/>
+              </w:rPr>
+              <w:t>consensus</w:t>
+            </w:r>
+          </w:p>
+        </w:tc>
+        <w:tc>
+          <w:tcPr>
+            <w:tcW w:type="dxa" w:w="1296"/>
+          </w:tcPr>
+          <w:p>
+            <w:pPr>
+              <w:spacing w:line="240" w:lineRule="auto"/>
+            </w:pPr>
+            <w:r>
+              <w:rPr>
+                <w:rFonts w:ascii="Times New Roman" w:hAnsi="Times New Roman"/>
+                <w:b w:val="0"/>
+                <w:i w:val="0"/>
+                <w:sz w:val="18"/>
+              </w:rPr>
+              <w:t>high</w:t>
+            </w:r>
+          </w:p>
+        </w:tc>
+        <w:tc>
+          <w:tcPr>
+            <w:tcW w:type="dxa" w:w="1296"/>
+          </w:tcPr>
+          <w:p>
+            <w:pPr>
+              <w:spacing w:line="240" w:lineRule="auto"/>
+            </w:pPr>
+            <w:r>
+              <w:rPr>
+                <w:rFonts w:ascii="Times New Roman" w:hAnsi="Times New Roman"/>
+                <w:b w:val="0"/>
+                <w:i w:val="0"/>
+                <w:sz w:val="18"/>
+              </w:rPr>
+              <w:t>imaging_pathway</w:t>
+            </w:r>
+          </w:p>
+        </w:tc>
+        <w:tc>
+          <w:tcPr>
+            <w:tcW w:type="dxa" w:w="1296"/>
+          </w:tcPr>
+          <w:p>
+            <w:pPr>
+              <w:spacing w:line="240" w:lineRule="auto"/>
+            </w:pPr>
+            <w:r>
+              <w:rPr>
+                <w:rFonts w:ascii="Times New Roman" w:hAnsi="Times New Roman"/>
+                <w:b w:val="0"/>
+                <w:i w:val="0"/>
+                <w:sz w:val="18"/>
+              </w:rPr>
+              <w:t>5</w:t>
+            </w:r>
+          </w:p>
+        </w:tc>
+        <w:tc>
+          <w:tcPr>
+            <w:tcW w:type="dxa" w:w="1296"/>
+          </w:tcPr>
+          <w:p>
+            <w:pPr>
+              <w:spacing w:line="240" w:lineRule="auto"/>
+            </w:pPr>
+            <w:r>
+              <w:rPr>
+                <w:rFonts w:ascii="Times New Roman" w:hAnsi="Times New Roman"/>
+                <w:b w:val="0"/>
+                <w:i w:val="0"/>
+                <w:sz w:val="18"/>
+              </w:rPr>
+              <w:t>5</w:t>
+            </w:r>
+          </w:p>
+        </w:tc>
+        <w:tc>
+          <w:tcPr>
+            <w:tcW w:type="dxa" w:w="1296"/>
+          </w:tcPr>
+          <w:p>
+            <w:pPr>
+              <w:spacing w:line="240" w:lineRule="auto"/>
+            </w:pPr>
+            <w:r>
+              <w:rPr>
+                <w:rFonts w:ascii="Times New Roman" w:hAnsi="Times New Roman"/>
+                <w:b w:val="0"/>
+                <w:i w:val="0"/>
+                <w:sz w:val="18"/>
+              </w:rPr>
+              <w:t>ProBIOPSY consensus: every prostate MRI must be checked against PI-QUAL v2 quality criteria before the biopsy pathway is decided (Q4a median 9, Q4b median 8 — consensus agree);</w:t>
+            </w:r>
+          </w:p>
+        </w:tc>
+      </w:tr>
+      <w:tr>
+        <w:tc>
+          <w:tcPr>
+            <w:tcW w:type="dxa" w:w="1296"/>
+          </w:tcPr>
+          <w:p>
+            <w:pPr>
+              <w:spacing w:line="240" w:lineRule="auto"/>
+            </w:pPr>
+            <w:r>
+              <w:rPr>
+                <w:rFonts w:ascii="Times New Roman" w:hAnsi="Times New Roman"/>
+                <w:b w:val="0"/>
+                <w:i w:val="0"/>
+                <w:sz w:val="18"/>
+              </w:rPr>
+              <w:t>indeterminate_lesion_ancillary_workup</w:t>
+            </w:r>
+          </w:p>
+        </w:tc>
+        <w:tc>
+          <w:tcPr>
+            <w:tcW w:type="dxa" w:w="1296"/>
+          </w:tcPr>
+          <w:p>
+            <w:pPr>
+              <w:spacing w:line="240" w:lineRule="auto"/>
+            </w:pPr>
+            <w:r>
+              <w:rPr>
+                <w:rFonts w:ascii="Times New Roman" w:hAnsi="Times New Roman"/>
+                <w:b w:val="0"/>
+                <w:i w:val="0"/>
+                <w:sz w:val="18"/>
+              </w:rPr>
+              <w:t>consensus</w:t>
+            </w:r>
+          </w:p>
+        </w:tc>
+        <w:tc>
+          <w:tcPr>
+            <w:tcW w:type="dxa" w:w="1296"/>
+          </w:tcPr>
+          <w:p>
+            <w:pPr>
+              <w:spacing w:line="240" w:lineRule="auto"/>
+            </w:pPr>
+            <w:r>
+              <w:rPr>
+                <w:rFonts w:ascii="Times New Roman" w:hAnsi="Times New Roman"/>
+                <w:b w:val="0"/>
+                <w:i w:val="0"/>
+                <w:sz w:val="18"/>
+              </w:rPr>
+              <w:t>medium</w:t>
+            </w:r>
+          </w:p>
+        </w:tc>
+        <w:tc>
+          <w:tcPr>
+            <w:tcW w:type="dxa" w:w="1296"/>
+          </w:tcPr>
+          <w:p>
+            <w:pPr>
+              <w:spacing w:line="240" w:lineRule="auto"/>
+            </w:pPr>
+            <w:r>
+              <w:rPr>
+                <w:rFonts w:ascii="Times New Roman" w:hAnsi="Times New Roman"/>
+                <w:b w:val="0"/>
+                <w:i w:val="0"/>
+                <w:sz w:val="18"/>
+              </w:rPr>
+              <w:t>ancillary_workup</w:t>
+            </w:r>
+          </w:p>
+        </w:tc>
+        <w:tc>
+          <w:tcPr>
+            <w:tcW w:type="dxa" w:w="1296"/>
+          </w:tcPr>
+          <w:p>
+            <w:pPr>
+              <w:spacing w:line="240" w:lineRule="auto"/>
+            </w:pPr>
+            <w:r>
+              <w:rPr>
+                <w:rFonts w:ascii="Times New Roman" w:hAnsi="Times New Roman"/>
+                <w:b w:val="0"/>
+                <w:i w:val="0"/>
+                <w:sz w:val="18"/>
+              </w:rPr>
+              <w:t>8</w:t>
+            </w:r>
+          </w:p>
+        </w:tc>
+        <w:tc>
+          <w:tcPr>
+            <w:tcW w:type="dxa" w:w="1296"/>
+          </w:tcPr>
+          <w:p>
+            <w:pPr>
+              <w:spacing w:line="240" w:lineRule="auto"/>
+            </w:pPr>
+            <w:r>
+              <w:rPr>
+                <w:rFonts w:ascii="Times New Roman" w:hAnsi="Times New Roman"/>
+                <w:b w:val="0"/>
+                <w:i w:val="0"/>
+                <w:sz w:val="18"/>
+              </w:rPr>
+              <w:t>10</w:t>
+            </w:r>
+          </w:p>
+        </w:tc>
+        <w:tc>
+          <w:tcPr>
+            <w:tcW w:type="dxa" w:w="1296"/>
+          </w:tcPr>
+          <w:p>
+            <w:pPr>
+              <w:spacing w:line="240" w:lineRule="auto"/>
+            </w:pPr>
+            <w:r>
+              <w:rPr>
+                <w:rFonts w:ascii="Times New Roman" w:hAnsi="Times New Roman"/>
+                <w:b w:val="0"/>
+                <w:i w:val="0"/>
+                <w:sz w:val="18"/>
+              </w:rPr>
+              <w:t>For an indeterminate lesion (PI-RADS 3), ProBIOPSY endorses PSAD as the primary gate to reduce unnecessary biopsies — for bpMRI (Q11 median 7) and even more strongly for mpMRI (Q14 median 8);</w:t>
+            </w:r>
+          </w:p>
+        </w:tc>
+      </w:tr>
+      <w:tr>
+        <w:tc>
+          <w:tcPr>
+            <w:tcW w:type="dxa" w:w="1296"/>
+          </w:tcPr>
+          <w:p>
+            <w:pPr>
+              <w:spacing w:line="240" w:lineRule="auto"/>
+            </w:pPr>
+            <w:r>
+              <w:rPr>
+                <w:rFonts w:ascii="Times New Roman" w:hAnsi="Times New Roman"/>
+                <w:b w:val="0"/>
+                <w:i w:val="0"/>
+                <w:sz w:val="18"/>
+              </w:rPr>
+              <w:t>negative_mri_high_suspicion_pathway</w:t>
+            </w:r>
+          </w:p>
+        </w:tc>
+        <w:tc>
+          <w:tcPr>
+            <w:tcW w:type="dxa" w:w="1296"/>
+          </w:tcPr>
+          <w:p>
+            <w:pPr>
+              <w:spacing w:line="240" w:lineRule="auto"/>
+            </w:pPr>
+            <w:r>
+              <w:rPr>
+                <w:rFonts w:ascii="Times New Roman" w:hAnsi="Times New Roman"/>
+                <w:b w:val="0"/>
+                <w:i w:val="0"/>
+                <w:sz w:val="18"/>
+              </w:rPr>
+              <w:t>consensus</w:t>
+            </w:r>
+          </w:p>
+        </w:tc>
+        <w:tc>
+          <w:tcPr>
+            <w:tcW w:type="dxa" w:w="1296"/>
+          </w:tcPr>
+          <w:p>
+            <w:pPr>
+              <w:spacing w:line="240" w:lineRule="auto"/>
+            </w:pPr>
+            <w:r>
+              <w:rPr>
+                <w:rFonts w:ascii="Times New Roman" w:hAnsi="Times New Roman"/>
+                <w:b w:val="0"/>
+                <w:i w:val="0"/>
+                <w:sz w:val="18"/>
+              </w:rPr>
+              <w:t>high</w:t>
+            </w:r>
+          </w:p>
+        </w:tc>
+        <w:tc>
+          <w:tcPr>
+            <w:tcW w:type="dxa" w:w="1296"/>
+          </w:tcPr>
+          <w:p>
+            <w:pPr>
+              <w:spacing w:line="240" w:lineRule="auto"/>
+            </w:pPr>
+            <w:r>
+              <w:rPr>
+                <w:rFonts w:ascii="Times New Roman" w:hAnsi="Times New Roman"/>
+                <w:b w:val="0"/>
+                <w:i w:val="0"/>
+                <w:sz w:val="18"/>
+              </w:rPr>
+              <w:t>imaging_pathway</w:t>
+            </w:r>
+          </w:p>
+        </w:tc>
+        <w:tc>
+          <w:tcPr>
+            <w:tcW w:type="dxa" w:w="1296"/>
+          </w:tcPr>
+          <w:p>
+            <w:pPr>
+              <w:spacing w:line="240" w:lineRule="auto"/>
+            </w:pPr>
+            <w:r>
+              <w:rPr>
+                <w:rFonts w:ascii="Times New Roman" w:hAnsi="Times New Roman"/>
+                <w:b w:val="0"/>
+                <w:i w:val="0"/>
+                <w:sz w:val="18"/>
+              </w:rPr>
+              <w:t>7</w:t>
+            </w:r>
+          </w:p>
+        </w:tc>
+        <w:tc>
+          <w:tcPr>
+            <w:tcW w:type="dxa" w:w="1296"/>
+          </w:tcPr>
+          <w:p>
+            <w:pPr>
+              <w:spacing w:line="240" w:lineRule="auto"/>
+            </w:pPr>
+            <w:r>
+              <w:rPr>
+                <w:rFonts w:ascii="Times New Roman" w:hAnsi="Times New Roman"/>
+                <w:b w:val="0"/>
+                <w:i w:val="0"/>
+                <w:sz w:val="18"/>
+              </w:rPr>
+              <w:t>4</w:t>
+            </w:r>
+          </w:p>
+        </w:tc>
+        <w:tc>
+          <w:tcPr>
+            <w:tcW w:type="dxa" w:w="1296"/>
+          </w:tcPr>
+          <w:p>
+            <w:pPr>
+              <w:spacing w:line="240" w:lineRule="auto"/>
+            </w:pPr>
+            <w:r>
+              <w:rPr>
+                <w:rFonts w:ascii="Times New Roman" w:hAnsi="Times New Roman"/>
+                <w:b w:val="0"/>
+                <w:i w:val="0"/>
+                <w:sz w:val="18"/>
+              </w:rPr>
+              <w:t>ProBIOPSY: when MRI is negative but clinical suspicion remains high (abnormal DRE, persistently elevated PSA, strong family history, Black ethnicity, prior negative biopsy), a 12-core systematic biopsy is still endorsed…</w:t>
+            </w:r>
+          </w:p>
+        </w:tc>
+      </w:tr>
+      <w:tr>
+        <w:tc>
+          <w:tcPr>
+            <w:tcW w:type="dxa" w:w="1296"/>
+          </w:tcPr>
+          <w:p>
+            <w:pPr>
+              <w:spacing w:line="240" w:lineRule="auto"/>
+            </w:pPr>
+            <w:r>
+              <w:rPr>
+                <w:rFonts w:ascii="Times New Roman" w:hAnsi="Times New Roman"/>
+                <w:b w:val="0"/>
+                <w:i w:val="0"/>
+                <w:sz w:val="18"/>
+              </w:rPr>
+              <w:t>upfront_new_imaging_rejection</w:t>
+            </w:r>
+          </w:p>
+        </w:tc>
+        <w:tc>
+          <w:tcPr>
+            <w:tcW w:type="dxa" w:w="1296"/>
+          </w:tcPr>
+          <w:p>
+            <w:pPr>
+              <w:spacing w:line="240" w:lineRule="auto"/>
+            </w:pPr>
+            <w:r>
+              <w:rPr>
+                <w:rFonts w:ascii="Times New Roman" w:hAnsi="Times New Roman"/>
+                <w:b w:val="0"/>
+                <w:i w:val="0"/>
+                <w:sz w:val="18"/>
+              </w:rPr>
+              <w:t>consensus</w:t>
+            </w:r>
+          </w:p>
+        </w:tc>
+        <w:tc>
+          <w:tcPr>
+            <w:tcW w:type="dxa" w:w="1296"/>
+          </w:tcPr>
+          <w:p>
+            <w:pPr>
+              <w:spacing w:line="240" w:lineRule="auto"/>
+            </w:pPr>
+            <w:r>
+              <w:rPr>
+                <w:rFonts w:ascii="Times New Roman" w:hAnsi="Times New Roman"/>
+                <w:b w:val="0"/>
+                <w:i w:val="0"/>
+                <w:sz w:val="18"/>
+              </w:rPr>
+              <w:t>high</w:t>
+            </w:r>
+          </w:p>
+        </w:tc>
+        <w:tc>
+          <w:tcPr>
+            <w:tcW w:type="dxa" w:w="1296"/>
+          </w:tcPr>
+          <w:p>
+            <w:pPr>
+              <w:spacing w:line="240" w:lineRule="auto"/>
+            </w:pPr>
+            <w:r>
+              <w:rPr>
+                <w:rFonts w:ascii="Times New Roman" w:hAnsi="Times New Roman"/>
+                <w:b w:val="0"/>
+                <w:i w:val="0"/>
+                <w:sz w:val="18"/>
+              </w:rPr>
+              <w:t>imaging_pathway</w:t>
+            </w:r>
+          </w:p>
+        </w:tc>
+        <w:tc>
+          <w:tcPr>
+            <w:tcW w:type="dxa" w:w="1296"/>
+          </w:tcPr>
+          <w:p>
+            <w:pPr>
+              <w:spacing w:line="240" w:lineRule="auto"/>
+            </w:pPr>
+            <w:r>
+              <w:rPr>
+                <w:rFonts w:ascii="Times New Roman" w:hAnsi="Times New Roman"/>
+                <w:b w:val="0"/>
+                <w:i w:val="0"/>
+                <w:sz w:val="18"/>
+              </w:rPr>
+              <w:t>3</w:t>
+            </w:r>
+          </w:p>
+        </w:tc>
+        <w:tc>
+          <w:tcPr>
+            <w:tcW w:type="dxa" w:w="1296"/>
+          </w:tcPr>
+          <w:p>
+            <w:pPr>
+              <w:spacing w:line="240" w:lineRule="auto"/>
+            </w:pPr>
+            <w:r>
+              <w:rPr>
+                <w:rFonts w:ascii="Times New Roman" w:hAnsi="Times New Roman"/>
+                <w:b w:val="0"/>
+                <w:i w:val="0"/>
+                <w:sz w:val="18"/>
+              </w:rPr>
+              <w:t>2</w:t>
+            </w:r>
+          </w:p>
+        </w:tc>
+        <w:tc>
+          <w:tcPr>
+            <w:tcW w:type="dxa" w:w="1296"/>
+          </w:tcPr>
+          <w:p>
+            <w:pPr>
+              <w:spacing w:line="240" w:lineRule="auto"/>
+            </w:pPr>
+            <w:r>
+              <w:rPr>
+                <w:rFonts w:ascii="Times New Roman" w:hAnsi="Times New Roman"/>
+                <w:b w:val="0"/>
+                <w:i w:val="0"/>
+                <w:sz w:val="18"/>
+              </w:rPr>
+              <w:t>ProBIOPSY explicitly rejects PSMA PET/MRI as an upfront first-line biopsy-decision tool (Q17 median 2 — consensus disagree) and microultrasound as an upfront alternative to prostate MRI (Q20 median 2 — consensus disagree…</w:t>
+            </w:r>
+          </w:p>
+        </w:tc>
+      </w:tr>
+      <w:tr>
+        <w:tc>
+          <w:tcPr>
+            <w:tcW w:type="dxa" w:w="1296"/>
+          </w:tcPr>
+          <w:p>
+            <w:pPr>
+              <w:spacing w:line="240" w:lineRule="auto"/>
+            </w:pPr>
+            <w:r>
+              <w:rPr>
+                <w:rFonts w:ascii="Times New Roman" w:hAnsi="Times New Roman"/>
+                <w:b w:val="0"/>
+                <w:i w:val="0"/>
+                <w:sz w:val="18"/>
+              </w:rPr>
+              <w:t>ai_mri_lesion_detection_aid</w:t>
+            </w:r>
+          </w:p>
+        </w:tc>
+        <w:tc>
+          <w:tcPr>
+            <w:tcW w:type="dxa" w:w="1296"/>
+          </w:tcPr>
+          <w:p>
+            <w:pPr>
+              <w:spacing w:line="240" w:lineRule="auto"/>
+            </w:pPr>
+            <w:r>
+              <w:rPr>
+                <w:rFonts w:ascii="Times New Roman" w:hAnsi="Times New Roman"/>
+                <w:b w:val="0"/>
+                <w:i w:val="0"/>
+                <w:sz w:val="18"/>
+              </w:rPr>
+              <w:t>consensus</w:t>
+            </w:r>
+          </w:p>
+        </w:tc>
+        <w:tc>
+          <w:tcPr>
+            <w:tcW w:type="dxa" w:w="1296"/>
+          </w:tcPr>
+          <w:p>
+            <w:pPr>
+              <w:spacing w:line="240" w:lineRule="auto"/>
+            </w:pPr>
+            <w:r>
+              <w:rPr>
+                <w:rFonts w:ascii="Times New Roman" w:hAnsi="Times New Roman"/>
+                <w:b w:val="0"/>
+                <w:i w:val="0"/>
+                <w:sz w:val="18"/>
+              </w:rPr>
+              <w:t>low</w:t>
+            </w:r>
+          </w:p>
+        </w:tc>
+        <w:tc>
+          <w:tcPr>
+            <w:tcW w:type="dxa" w:w="1296"/>
+          </w:tcPr>
+          <w:p>
+            <w:pPr>
+              <w:spacing w:line="240" w:lineRule="auto"/>
+            </w:pPr>
+            <w:r>
+              <w:rPr>
+                <w:rFonts w:ascii="Times New Roman" w:hAnsi="Times New Roman"/>
+                <w:b w:val="0"/>
+                <w:i w:val="0"/>
+                <w:sz w:val="18"/>
+              </w:rPr>
+              <w:t>ai_decision_support</w:t>
+            </w:r>
+          </w:p>
+        </w:tc>
+        <w:tc>
+          <w:tcPr>
+            <w:tcW w:type="dxa" w:w="1296"/>
+          </w:tcPr>
+          <w:p>
+            <w:pPr>
+              <w:spacing w:line="240" w:lineRule="auto"/>
+            </w:pPr>
+            <w:r>
+              <w:rPr>
+                <w:rFonts w:ascii="Times New Roman" w:hAnsi="Times New Roman"/>
+                <w:b w:val="0"/>
+                <w:i w:val="0"/>
+                <w:sz w:val="18"/>
+              </w:rPr>
+              <w:t>4</w:t>
+            </w:r>
+          </w:p>
+        </w:tc>
+        <w:tc>
+          <w:tcPr>
+            <w:tcW w:type="dxa" w:w="1296"/>
+          </w:tcPr>
+          <w:p>
+            <w:pPr>
+              <w:spacing w:line="240" w:lineRule="auto"/>
+            </w:pPr>
+            <w:r>
+              <w:rPr>
+                <w:rFonts w:ascii="Times New Roman" w:hAnsi="Times New Roman"/>
+                <w:b w:val="0"/>
+                <w:i w:val="0"/>
+                <w:sz w:val="18"/>
+              </w:rPr>
+              <w:t>1</w:t>
+            </w:r>
+          </w:p>
+        </w:tc>
+        <w:tc>
+          <w:tcPr>
+            <w:tcW w:type="dxa" w:w="1296"/>
+          </w:tcPr>
+          <w:p>
+            <w:pPr>
+              <w:spacing w:line="240" w:lineRule="auto"/>
+            </w:pPr>
+            <w:r>
+              <w:rPr>
+                <w:rFonts w:ascii="Times New Roman" w:hAnsi="Times New Roman"/>
+                <w:b w:val="0"/>
+                <w:i w:val="0"/>
+                <w:sz w:val="18"/>
+              </w:rPr>
+              <w:t>ProBIOPSY endorses AI software as an aid to MRI lesion detection and characterization, with interpretation remaining the radiologist's responsibility (Q26 median 7 — consensus agree).</w:t>
+            </w:r>
+          </w:p>
+        </w:tc>
+      </w:tr>
+      <w:tr>
+        <w:tc>
+          <w:tcPr>
+            <w:tcW w:type="dxa" w:w="1296"/>
+          </w:tcPr>
+          <w:p>
+            <w:pPr>
+              <w:spacing w:line="240" w:lineRule="auto"/>
+            </w:pPr>
+            <w:r>
+              <w:rPr>
+                <w:rFonts w:ascii="Times New Roman" w:hAnsi="Times New Roman"/>
+                <w:b w:val="0"/>
+                <w:i w:val="0"/>
+                <w:sz w:val="18"/>
+              </w:rPr>
+              <w:t>advanced_disease_reduced_systematic_scheme</w:t>
+            </w:r>
+          </w:p>
+        </w:tc>
+        <w:tc>
+          <w:tcPr>
+            <w:tcW w:type="dxa" w:w="1296"/>
+          </w:tcPr>
+          <w:p>
+            <w:pPr>
+              <w:spacing w:line="240" w:lineRule="auto"/>
+            </w:pPr>
+            <w:r>
+              <w:rPr>
+                <w:rFonts w:ascii="Times New Roman" w:hAnsi="Times New Roman"/>
+                <w:b w:val="0"/>
+                <w:i w:val="0"/>
+                <w:sz w:val="18"/>
+              </w:rPr>
+              <w:t>consensus</w:t>
+            </w:r>
+          </w:p>
+        </w:tc>
+        <w:tc>
+          <w:tcPr>
+            <w:tcW w:type="dxa" w:w="1296"/>
+          </w:tcPr>
+          <w:p>
+            <w:pPr>
+              <w:spacing w:line="240" w:lineRule="auto"/>
+            </w:pPr>
+            <w:r>
+              <w:rPr>
+                <w:rFonts w:ascii="Times New Roman" w:hAnsi="Times New Roman"/>
+                <w:b w:val="0"/>
+                <w:i w:val="0"/>
+                <w:sz w:val="18"/>
+              </w:rPr>
+              <w:t>high</w:t>
+            </w:r>
+          </w:p>
+        </w:tc>
+        <w:tc>
+          <w:tcPr>
+            <w:tcW w:type="dxa" w:w="1296"/>
+          </w:tcPr>
+          <w:p>
+            <w:pPr>
+              <w:spacing w:line="240" w:lineRule="auto"/>
+            </w:pPr>
+            <w:r>
+              <w:rPr>
+                <w:rFonts w:ascii="Times New Roman" w:hAnsi="Times New Roman"/>
+                <w:b w:val="0"/>
+                <w:i w:val="0"/>
+                <w:sz w:val="18"/>
+              </w:rPr>
+              <w:t>scheme_selection</w:t>
+            </w:r>
+          </w:p>
+        </w:tc>
+        <w:tc>
+          <w:tcPr>
+            <w:tcW w:type="dxa" w:w="1296"/>
+          </w:tcPr>
+          <w:p>
+            <w:pPr>
+              <w:spacing w:line="240" w:lineRule="auto"/>
+            </w:pPr>
+            <w:r>
+              <w:rPr>
+                <w:rFonts w:ascii="Times New Roman" w:hAnsi="Times New Roman"/>
+                <w:b w:val="0"/>
+                <w:i w:val="0"/>
+                <w:sz w:val="18"/>
+              </w:rPr>
+              <w:t>4</w:t>
+            </w:r>
+          </w:p>
+        </w:tc>
+        <w:tc>
+          <w:tcPr>
+            <w:tcW w:type="dxa" w:w="1296"/>
+          </w:tcPr>
+          <w:p>
+            <w:pPr>
+              <w:spacing w:line="240" w:lineRule="auto"/>
+            </w:pPr>
+            <w:r>
+              <w:rPr>
+                <w:rFonts w:ascii="Times New Roman" w:hAnsi="Times New Roman"/>
+                <w:b w:val="0"/>
+                <w:i w:val="0"/>
+                <w:sz w:val="18"/>
+              </w:rPr>
+              <w:t>2</w:t>
+            </w:r>
+          </w:p>
+        </w:tc>
+        <w:tc>
+          <w:tcPr>
+            <w:tcW w:type="dxa" w:w="1296"/>
+          </w:tcPr>
+          <w:p>
+            <w:pPr>
+              <w:spacing w:line="240" w:lineRule="auto"/>
+            </w:pPr>
+            <w:r>
+              <w:rPr>
+                <w:rFonts w:ascii="Times New Roman" w:hAnsi="Times New Roman"/>
+                <w:b w:val="0"/>
+                <w:i w:val="0"/>
+                <w:sz w:val="18"/>
+              </w:rPr>
+              <w:t>ProBIOPSY endorses a reduced (6-core) systematic scheme in advanced disease, where detection of any grade group confirms management rather than changing mapping precision (Q57 median 8 — consensus agree).</w:t>
+            </w:r>
+          </w:p>
+        </w:tc>
+      </w:tr>
+      <w:tr>
+        <w:tc>
+          <w:tcPr>
+            <w:tcW w:type="dxa" w:w="1296"/>
+          </w:tcPr>
+          <w:p>
+            <w:pPr>
+              <w:spacing w:line="240" w:lineRule="auto"/>
+            </w:pPr>
+            <w:r>
+              <w:rPr>
+                <w:rFonts w:ascii="Times New Roman" w:hAnsi="Times New Roman"/>
+                <w:b w:val="0"/>
+                <w:i w:val="0"/>
+                <w:sz w:val="18"/>
+              </w:rPr>
+              <w:t>systematic_template_selection</w:t>
+            </w:r>
+          </w:p>
+        </w:tc>
+        <w:tc>
+          <w:tcPr>
+            <w:tcW w:type="dxa" w:w="1296"/>
+          </w:tcPr>
+          <w:p>
+            <w:pPr>
+              <w:spacing w:line="240" w:lineRule="auto"/>
+            </w:pPr>
+            <w:r>
+              <w:rPr>
+                <w:rFonts w:ascii="Times New Roman" w:hAnsi="Times New Roman"/>
+                <w:b w:val="0"/>
+                <w:i w:val="0"/>
+                <w:sz w:val="18"/>
+              </w:rPr>
+              <w:t>consensus</w:t>
+            </w:r>
+          </w:p>
+        </w:tc>
+        <w:tc>
+          <w:tcPr>
+            <w:tcW w:type="dxa" w:w="1296"/>
+          </w:tcPr>
+          <w:p>
+            <w:pPr>
+              <w:spacing w:line="240" w:lineRule="auto"/>
+            </w:pPr>
+            <w:r>
+              <w:rPr>
+                <w:rFonts w:ascii="Times New Roman" w:hAnsi="Times New Roman"/>
+                <w:b w:val="0"/>
+                <w:i w:val="0"/>
+                <w:sz w:val="18"/>
+              </w:rPr>
+              <w:t>medium</w:t>
+            </w:r>
+          </w:p>
+        </w:tc>
+        <w:tc>
+          <w:tcPr>
+            <w:tcW w:type="dxa" w:w="1296"/>
+          </w:tcPr>
+          <w:p>
+            <w:pPr>
+              <w:spacing w:line="240" w:lineRule="auto"/>
+            </w:pPr>
+            <w:r>
+              <w:rPr>
+                <w:rFonts w:ascii="Times New Roman" w:hAnsi="Times New Roman"/>
+                <w:b w:val="0"/>
+                <w:i w:val="0"/>
+                <w:sz w:val="18"/>
+              </w:rPr>
+              <w:t>scheme_selection</w:t>
+            </w:r>
+          </w:p>
+        </w:tc>
+        <w:tc>
+          <w:tcPr>
+            <w:tcW w:type="dxa" w:w="1296"/>
+          </w:tcPr>
+          <w:p>
+            <w:pPr>
+              <w:spacing w:line="240" w:lineRule="auto"/>
+            </w:pPr>
+            <w:r>
+              <w:rPr>
+                <w:rFonts w:ascii="Times New Roman" w:hAnsi="Times New Roman"/>
+                <w:b w:val="0"/>
+                <w:i w:val="0"/>
+                <w:sz w:val="18"/>
+              </w:rPr>
+              <w:t>4</w:t>
+            </w:r>
+          </w:p>
+        </w:tc>
+        <w:tc>
+          <w:tcPr>
+            <w:tcW w:type="dxa" w:w="1296"/>
+          </w:tcPr>
+          <w:p>
+            <w:pPr>
+              <w:spacing w:line="240" w:lineRule="auto"/>
+            </w:pPr>
+            <w:r>
+              <w:rPr>
+                <w:rFonts w:ascii="Times New Roman" w:hAnsi="Times New Roman"/>
+                <w:b w:val="0"/>
+                <w:i w:val="0"/>
+                <w:sz w:val="18"/>
+              </w:rPr>
+              <w:t>4</w:t>
+            </w:r>
+          </w:p>
+        </w:tc>
+        <w:tc>
+          <w:tcPr>
+            <w:tcW w:type="dxa" w:w="1296"/>
+          </w:tcPr>
+          <w:p>
+            <w:pPr>
+              <w:spacing w:line="240" w:lineRule="auto"/>
+            </w:pPr>
+            <w:r>
+              <w:rPr>
+                <w:rFonts w:ascii="Times New Roman" w:hAnsi="Times New Roman"/>
+                <w:b w:val="0"/>
+                <w:i w:val="0"/>
+                <w:sz w:val="18"/>
+              </w:rPr>
+              <w:t>ProBIOPSY endorses the 12-core systematic template as the standard when systematic cores are indicated (Q52 median 8 — consensus agree) and rejects the classical 6-core sextant template (Q51 median 3), the Ginsburg 4-6 c…</w:t>
+            </w:r>
+          </w:p>
+        </w:tc>
+      </w:tr>
+      <w:tr>
+        <w:tc>
+          <w:tcPr>
+            <w:tcW w:type="dxa" w:w="1296"/>
+          </w:tcPr>
+          <w:p>
+            <w:pPr>
+              <w:spacing w:line="240" w:lineRule="auto"/>
+            </w:pPr>
+            <w:r>
+              <w:rPr>
+                <w:rFonts w:ascii="Times New Roman" w:hAnsi="Times New Roman"/>
+                <w:b w:val="0"/>
+                <w:i w:val="0"/>
+                <w:sz w:val="18"/>
+              </w:rPr>
+              <w:t>targeted_core_count_adaptation</w:t>
+            </w:r>
+          </w:p>
+        </w:tc>
+        <w:tc>
+          <w:tcPr>
+            <w:tcW w:type="dxa" w:w="1296"/>
+          </w:tcPr>
+          <w:p>
+            <w:pPr>
+              <w:spacing w:line="240" w:lineRule="auto"/>
+            </w:pPr>
+            <w:r>
+              <w:rPr>
+                <w:rFonts w:ascii="Times New Roman" w:hAnsi="Times New Roman"/>
+                <w:b w:val="0"/>
+                <w:i w:val="0"/>
+                <w:sz w:val="18"/>
+              </w:rPr>
+              <w:t>consensus</w:t>
+            </w:r>
+          </w:p>
+        </w:tc>
+        <w:tc>
+          <w:tcPr>
+            <w:tcW w:type="dxa" w:w="1296"/>
+          </w:tcPr>
+          <w:p>
+            <w:pPr>
+              <w:spacing w:line="240" w:lineRule="auto"/>
+            </w:pPr>
+            <w:r>
+              <w:rPr>
+                <w:rFonts w:ascii="Times New Roman" w:hAnsi="Times New Roman"/>
+                <w:b w:val="0"/>
+                <w:i w:val="0"/>
+                <w:sz w:val="18"/>
+              </w:rPr>
+              <w:t>low</w:t>
+            </w:r>
+          </w:p>
+        </w:tc>
+        <w:tc>
+          <w:tcPr>
+            <w:tcW w:type="dxa" w:w="1296"/>
+          </w:tcPr>
+          <w:p>
+            <w:pPr>
+              <w:spacing w:line="240" w:lineRule="auto"/>
+            </w:pPr>
+            <w:r>
+              <w:rPr>
+                <w:rFonts w:ascii="Times New Roman" w:hAnsi="Times New Roman"/>
+                <w:b w:val="0"/>
+                <w:i w:val="0"/>
+                <w:sz w:val="18"/>
+              </w:rPr>
+              <w:t>targeted_bx</w:t>
+            </w:r>
+          </w:p>
+        </w:tc>
+        <w:tc>
+          <w:tcPr>
+            <w:tcW w:type="dxa" w:w="1296"/>
+          </w:tcPr>
+          <w:p>
+            <w:pPr>
+              <w:spacing w:line="240" w:lineRule="auto"/>
+            </w:pPr>
+            <w:r>
+              <w:rPr>
+                <w:rFonts w:ascii="Times New Roman" w:hAnsi="Times New Roman"/>
+                <w:b w:val="0"/>
+                <w:i w:val="0"/>
+                <w:sz w:val="18"/>
+              </w:rPr>
+              <w:t>5</w:t>
+            </w:r>
+          </w:p>
+        </w:tc>
+        <w:tc>
+          <w:tcPr>
+            <w:tcW w:type="dxa" w:w="1296"/>
+          </w:tcPr>
+          <w:p>
+            <w:pPr>
+              <w:spacing w:line="240" w:lineRule="auto"/>
+            </w:pPr>
+            <w:r>
+              <w:rPr>
+                <w:rFonts w:ascii="Times New Roman" w:hAnsi="Times New Roman"/>
+                <w:b w:val="0"/>
+                <w:i w:val="0"/>
+                <w:sz w:val="18"/>
+              </w:rPr>
+              <w:t>2</w:t>
+            </w:r>
+          </w:p>
+        </w:tc>
+        <w:tc>
+          <w:tcPr>
+            <w:tcW w:type="dxa" w:w="1296"/>
+          </w:tcPr>
+          <w:p>
+            <w:pPr>
+              <w:spacing w:line="240" w:lineRule="auto"/>
+            </w:pPr>
+            <w:r>
+              <w:rPr>
+                <w:rFonts w:ascii="Times New Roman" w:hAnsi="Times New Roman"/>
+                <w:b w:val="0"/>
+                <w:i w:val="0"/>
+                <w:sz w:val="18"/>
+              </w:rPr>
+              <w:t>ProBIOPSY reached no consensus on a fixed targeted-core count: adapting the number of targeted cores to PI-RADS score was 'neither' (Q34 median 6), and the proposed minimum of 3 cores per target failed to reach consensus…</w:t>
+            </w:r>
+          </w:p>
+        </w:tc>
+      </w:tr>
+      <w:tr>
+        <w:tc>
+          <w:tcPr>
+            <w:tcW w:type="dxa" w:w="1296"/>
+          </w:tcPr>
+          <w:p>
+            <w:pPr>
+              <w:spacing w:line="240" w:lineRule="auto"/>
+            </w:pPr>
+            <w:r>
+              <w:rPr>
+                <w:rFonts w:ascii="Times New Roman" w:hAnsi="Times New Roman"/>
+                <w:b w:val="0"/>
+                <w:i w:val="0"/>
+                <w:sz w:val="18"/>
+              </w:rPr>
+              <w:t>perilesional_plbx_technique</w:t>
+            </w:r>
+          </w:p>
+        </w:tc>
+        <w:tc>
+          <w:tcPr>
+            <w:tcW w:type="dxa" w:w="1296"/>
+          </w:tcPr>
+          <w:p>
+            <w:pPr>
+              <w:spacing w:line="240" w:lineRule="auto"/>
+            </w:pPr>
+            <w:r>
+              <w:rPr>
+                <w:rFonts w:ascii="Times New Roman" w:hAnsi="Times New Roman"/>
+                <w:b w:val="0"/>
+                <w:i w:val="0"/>
+                <w:sz w:val="18"/>
+              </w:rPr>
+              <w:t>consensus</w:t>
+            </w:r>
+          </w:p>
+        </w:tc>
+        <w:tc>
+          <w:tcPr>
+            <w:tcW w:type="dxa" w:w="1296"/>
+          </w:tcPr>
+          <w:p>
+            <w:pPr>
+              <w:spacing w:line="240" w:lineRule="auto"/>
+            </w:pPr>
+            <w:r>
+              <w:rPr>
+                <w:rFonts w:ascii="Times New Roman" w:hAnsi="Times New Roman"/>
+                <w:b w:val="0"/>
+                <w:i w:val="0"/>
+                <w:sz w:val="18"/>
+              </w:rPr>
+              <w:t>low</w:t>
+            </w:r>
+          </w:p>
+        </w:tc>
+        <w:tc>
+          <w:tcPr>
+            <w:tcW w:type="dxa" w:w="1296"/>
+          </w:tcPr>
+          <w:p>
+            <w:pPr>
+              <w:spacing w:line="240" w:lineRule="auto"/>
+            </w:pPr>
+            <w:r>
+              <w:rPr>
+                <w:rFonts w:ascii="Times New Roman" w:hAnsi="Times New Roman"/>
+                <w:b w:val="0"/>
+                <w:i w:val="0"/>
+                <w:sz w:val="18"/>
+              </w:rPr>
+              <w:t>targeted_bx</w:t>
+            </w:r>
+          </w:p>
+        </w:tc>
+        <w:tc>
+          <w:tcPr>
+            <w:tcW w:type="dxa" w:w="1296"/>
+          </w:tcPr>
+          <w:p>
+            <w:pPr>
+              <w:spacing w:line="240" w:lineRule="auto"/>
+            </w:pPr>
+            <w:r>
+              <w:rPr>
+                <w:rFonts w:ascii="Times New Roman" w:hAnsi="Times New Roman"/>
+                <w:b w:val="0"/>
+                <w:i w:val="0"/>
+                <w:sz w:val="18"/>
+              </w:rPr>
+              <w:t>5</w:t>
+            </w:r>
+          </w:p>
+        </w:tc>
+        <w:tc>
+          <w:tcPr>
+            <w:tcW w:type="dxa" w:w="1296"/>
+          </w:tcPr>
+          <w:p>
+            <w:pPr>
+              <w:spacing w:line="240" w:lineRule="auto"/>
+            </w:pPr>
+            <w:r>
+              <w:rPr>
+                <w:rFonts w:ascii="Times New Roman" w:hAnsi="Times New Roman"/>
+                <w:b w:val="0"/>
+                <w:i w:val="0"/>
+                <w:sz w:val="18"/>
+              </w:rPr>
+              <w:t>5</w:t>
+            </w:r>
+          </w:p>
+        </w:tc>
+        <w:tc>
+          <w:tcPr>
+            <w:tcW w:type="dxa" w:w="1296"/>
+          </w:tcPr>
+          <w:p>
+            <w:pPr>
+              <w:spacing w:line="240" w:lineRule="auto"/>
+            </w:pPr>
+            <w:r>
+              <w:rPr>
+                <w:rFonts w:ascii="Times New Roman" w:hAnsi="Times New Roman"/>
+                <w:b w:val="0"/>
+                <w:i w:val="0"/>
+                <w:sz w:val="18"/>
+              </w:rPr>
+              <w:t>ProBIOPSY adopts the term 'perilesional biopsy' for cores placed just outside the MRI lesion margin (Q37a — SOQ consensus), requires targeted cores to be placed within 10 mm of the lesion (Q38 — SOQ consensus), scales th…</w:t>
+            </w:r>
+          </w:p>
+        </w:tc>
+      </w:tr>
+      <w:tr>
+        <w:tc>
+          <w:tcPr>
+            <w:tcW w:type="dxa" w:w="1296"/>
+          </w:tcPr>
+          <w:p>
+            <w:pPr>
+              <w:spacing w:line="240" w:lineRule="auto"/>
+            </w:pPr>
+            <w:r>
+              <w:rPr>
+                <w:rFonts w:ascii="Times New Roman" w:hAnsi="Times New Roman"/>
+                <w:b w:val="0"/>
+                <w:i w:val="0"/>
+                <w:sz w:val="18"/>
+              </w:rPr>
+              <w:t>biopsy_scheme_by_lesion_distribution</w:t>
+            </w:r>
+          </w:p>
+        </w:tc>
+        <w:tc>
+          <w:tcPr>
+            <w:tcW w:type="dxa" w:w="1296"/>
+          </w:tcPr>
+          <w:p>
+            <w:pPr>
+              <w:spacing w:line="240" w:lineRule="auto"/>
+            </w:pPr>
+            <w:r>
+              <w:rPr>
+                <w:rFonts w:ascii="Times New Roman" w:hAnsi="Times New Roman"/>
+                <w:b w:val="0"/>
+                <w:i w:val="0"/>
+                <w:sz w:val="18"/>
+              </w:rPr>
+              <w:t>consensus</w:t>
+            </w:r>
+          </w:p>
+        </w:tc>
+        <w:tc>
+          <w:tcPr>
+            <w:tcW w:type="dxa" w:w="1296"/>
+          </w:tcPr>
+          <w:p>
+            <w:pPr>
+              <w:spacing w:line="240" w:lineRule="auto"/>
+            </w:pPr>
+            <w:r>
+              <w:rPr>
+                <w:rFonts w:ascii="Times New Roman" w:hAnsi="Times New Roman"/>
+                <w:b w:val="0"/>
+                <w:i w:val="0"/>
+                <w:sz w:val="18"/>
+              </w:rPr>
+              <w:t>medium</w:t>
+            </w:r>
+          </w:p>
+        </w:tc>
+        <w:tc>
+          <w:tcPr>
+            <w:tcW w:type="dxa" w:w="1296"/>
+          </w:tcPr>
+          <w:p>
+            <w:pPr>
+              <w:spacing w:line="240" w:lineRule="auto"/>
+            </w:pPr>
+            <w:r>
+              <w:rPr>
+                <w:rFonts w:ascii="Times New Roman" w:hAnsi="Times New Roman"/>
+                <w:b w:val="0"/>
+                <w:i w:val="0"/>
+                <w:sz w:val="18"/>
+              </w:rPr>
+              <w:t>scheme_selection</w:t>
+            </w:r>
+          </w:p>
+        </w:tc>
+        <w:tc>
+          <w:tcPr>
+            <w:tcW w:type="dxa" w:w="1296"/>
+          </w:tcPr>
+          <w:p>
+            <w:pPr>
+              <w:spacing w:line="240" w:lineRule="auto"/>
+            </w:pPr>
+            <w:r>
+              <w:rPr>
+                <w:rFonts w:ascii="Times New Roman" w:hAnsi="Times New Roman"/>
+                <w:b w:val="0"/>
+                <w:i w:val="0"/>
+                <w:sz w:val="18"/>
+              </w:rPr>
+              <w:t>5</w:t>
+            </w:r>
+          </w:p>
+        </w:tc>
+        <w:tc>
+          <w:tcPr>
+            <w:tcW w:type="dxa" w:w="1296"/>
+          </w:tcPr>
+          <w:p>
+            <w:pPr>
+              <w:spacing w:line="240" w:lineRule="auto"/>
+            </w:pPr>
+            <w:r>
+              <w:rPr>
+                <w:rFonts w:ascii="Times New Roman" w:hAnsi="Times New Roman"/>
+                <w:b w:val="0"/>
+                <w:i w:val="0"/>
+                <w:sz w:val="18"/>
+              </w:rPr>
+              <w:t>5</w:t>
+            </w:r>
+          </w:p>
+        </w:tc>
+        <w:tc>
+          <w:tcPr>
+            <w:tcW w:type="dxa" w:w="1296"/>
+          </w:tcPr>
+          <w:p>
+            <w:pPr>
+              <w:spacing w:line="240" w:lineRule="auto"/>
+            </w:pPr>
+            <w:r>
+              <w:rPr>
+                <w:rFonts w:ascii="Times New Roman" w:hAnsi="Times New Roman"/>
+                <w:b w:val="0"/>
+                <w:i w:val="0"/>
+                <w:sz w:val="18"/>
+              </w:rPr>
+              <w:t>ProBIOPSY endorses targeted + perilesional biopsy without contralateral systematic cores for a unifocal lesion (Q43 median 7 — consensus agree) and for multifocal ipsilateral disease reaching bilateral tissue adequacy is…</w:t>
+            </w:r>
+          </w:p>
+        </w:tc>
+      </w:tr>
+      <w:tr>
+        <w:tc>
+          <w:tcPr>
+            <w:tcW w:type="dxa" w:w="1296"/>
+          </w:tcPr>
+          <w:p>
+            <w:pPr>
+              <w:spacing w:line="240" w:lineRule="auto"/>
+            </w:pPr>
+            <w:r>
+              <w:rPr>
+                <w:rFonts w:ascii="Times New Roman" w:hAnsi="Times New Roman"/>
+                <w:b w:val="0"/>
+                <w:i w:val="0"/>
+                <w:sz w:val="18"/>
+              </w:rPr>
+              <w:t>route_anaesthesia_prophylaxis</w:t>
+            </w:r>
+          </w:p>
+        </w:tc>
+        <w:tc>
+          <w:tcPr>
+            <w:tcW w:type="dxa" w:w="1296"/>
+          </w:tcPr>
+          <w:p>
+            <w:pPr>
+              <w:spacing w:line="240" w:lineRule="auto"/>
+            </w:pPr>
+            <w:r>
+              <w:rPr>
+                <w:rFonts w:ascii="Times New Roman" w:hAnsi="Times New Roman"/>
+                <w:b w:val="0"/>
+                <w:i w:val="0"/>
+                <w:sz w:val="18"/>
+              </w:rPr>
+              <w:t>consensus</w:t>
+            </w:r>
+          </w:p>
+        </w:tc>
+        <w:tc>
+          <w:tcPr>
+            <w:tcW w:type="dxa" w:w="1296"/>
+          </w:tcPr>
+          <w:p>
+            <w:pPr>
+              <w:spacing w:line="240" w:lineRule="auto"/>
+            </w:pPr>
+            <w:r>
+              <w:rPr>
+                <w:rFonts w:ascii="Times New Roman" w:hAnsi="Times New Roman"/>
+                <w:b w:val="0"/>
+                <w:i w:val="0"/>
+                <w:sz w:val="18"/>
+              </w:rPr>
+              <w:t>high</w:t>
+            </w:r>
+          </w:p>
+        </w:tc>
+        <w:tc>
+          <w:tcPr>
+            <w:tcW w:type="dxa" w:w="1296"/>
+          </w:tcPr>
+          <w:p>
+            <w:pPr>
+              <w:spacing w:line="240" w:lineRule="auto"/>
+            </w:pPr>
+            <w:r>
+              <w:rPr>
+                <w:rFonts w:ascii="Times New Roman" w:hAnsi="Times New Roman"/>
+                <w:b w:val="0"/>
+                <w:i w:val="0"/>
+                <w:sz w:val="18"/>
+              </w:rPr>
+              <w:t>perioperative</w:t>
+            </w:r>
+          </w:p>
+        </w:tc>
+        <w:tc>
+          <w:tcPr>
+            <w:tcW w:type="dxa" w:w="1296"/>
+          </w:tcPr>
+          <w:p>
+            <w:pPr>
+              <w:spacing w:line="240" w:lineRule="auto"/>
+            </w:pPr>
+            <w:r>
+              <w:rPr>
+                <w:rFonts w:ascii="Times New Roman" w:hAnsi="Times New Roman"/>
+                <w:b w:val="0"/>
+                <w:i w:val="0"/>
+                <w:sz w:val="18"/>
+              </w:rPr>
+              <w:t>4</w:t>
+            </w:r>
+          </w:p>
+        </w:tc>
+        <w:tc>
+          <w:tcPr>
+            <w:tcW w:type="dxa" w:w="1296"/>
+          </w:tcPr>
+          <w:p>
+            <w:pPr>
+              <w:spacing w:line="240" w:lineRule="auto"/>
+            </w:pPr>
+            <w:r>
+              <w:rPr>
+                <w:rFonts w:ascii="Times New Roman" w:hAnsi="Times New Roman"/>
+                <w:b w:val="0"/>
+                <w:i w:val="0"/>
+                <w:sz w:val="18"/>
+              </w:rPr>
+              <w:t>5</w:t>
+            </w:r>
+          </w:p>
+        </w:tc>
+        <w:tc>
+          <w:tcPr>
+            <w:tcW w:type="dxa" w:w="1296"/>
+          </w:tcPr>
+          <w:p>
+            <w:pPr>
+              <w:spacing w:line="240" w:lineRule="auto"/>
+            </w:pPr>
+            <w:r>
+              <w:rPr>
+                <w:rFonts w:ascii="Times New Roman" w:hAnsi="Times New Roman"/>
+                <w:b w:val="0"/>
+                <w:i w:val="0"/>
+                <w:sz w:val="18"/>
+              </w:rPr>
+              <w:t>ProBIOPSY endorses the transperineal route as the standard for prostate biopsy (Q58 — SOQ consensus) with periprostatic nerve block for both transrectal (Q59) and transperineal (Q60) approaches (both SOQ consensus).</w:t>
+            </w:r>
+          </w:p>
+        </w:tc>
+      </w:tr>
+      <w:tr>
+        <w:tc>
+          <w:tcPr>
+            <w:tcW w:type="dxa" w:w="1296"/>
+          </w:tcPr>
+          <w:p>
+            <w:pPr>
+              <w:spacing w:line="240" w:lineRule="auto"/>
+            </w:pPr>
+            <w:r>
+              <w:rPr>
+                <w:rFonts w:ascii="Times New Roman" w:hAnsi="Times New Roman"/>
+                <w:b w:val="0"/>
+                <w:i w:val="0"/>
+                <w:sz w:val="18"/>
+              </w:rPr>
+              <w:t>treatment_planning_tissue_requirements</w:t>
+            </w:r>
+          </w:p>
+        </w:tc>
+        <w:tc>
+          <w:tcPr>
+            <w:tcW w:type="dxa" w:w="1296"/>
+          </w:tcPr>
+          <w:p>
+            <w:pPr>
+              <w:spacing w:line="240" w:lineRule="auto"/>
+            </w:pPr>
+            <w:r>
+              <w:rPr>
+                <w:rFonts w:ascii="Times New Roman" w:hAnsi="Times New Roman"/>
+                <w:b w:val="0"/>
+                <w:i w:val="0"/>
+                <w:sz w:val="18"/>
+              </w:rPr>
+              <w:t>consensus</w:t>
+            </w:r>
+          </w:p>
+        </w:tc>
+        <w:tc>
+          <w:tcPr>
+            <w:tcW w:type="dxa" w:w="1296"/>
+          </w:tcPr>
+          <w:p>
+            <w:pPr>
+              <w:spacing w:line="240" w:lineRule="auto"/>
+            </w:pPr>
+            <w:r>
+              <w:rPr>
+                <w:rFonts w:ascii="Times New Roman" w:hAnsi="Times New Roman"/>
+                <w:b w:val="0"/>
+                <w:i w:val="0"/>
+                <w:sz w:val="18"/>
+              </w:rPr>
+              <w:t>high</w:t>
+            </w:r>
+          </w:p>
+        </w:tc>
+        <w:tc>
+          <w:tcPr>
+            <w:tcW w:type="dxa" w:w="1296"/>
+          </w:tcPr>
+          <w:p>
+            <w:pPr>
+              <w:spacing w:line="240" w:lineRule="auto"/>
+            </w:pPr>
+            <w:r>
+              <w:rPr>
+                <w:rFonts w:ascii="Times New Roman" w:hAnsi="Times New Roman"/>
+                <w:b w:val="0"/>
+                <w:i w:val="0"/>
+                <w:sz w:val="18"/>
+              </w:rPr>
+              <w:t>treatment_planning</w:t>
+            </w:r>
+          </w:p>
+        </w:tc>
+        <w:tc>
+          <w:tcPr>
+            <w:tcW w:type="dxa" w:w="1296"/>
+          </w:tcPr>
+          <w:p>
+            <w:pPr>
+              <w:spacing w:line="240" w:lineRule="auto"/>
+            </w:pPr>
+            <w:r>
+              <w:rPr>
+                <w:rFonts w:ascii="Times New Roman" w:hAnsi="Times New Roman"/>
+                <w:b w:val="0"/>
+                <w:i w:val="0"/>
+                <w:sz w:val="18"/>
+              </w:rPr>
+              <w:t>6</w:t>
+            </w:r>
+          </w:p>
+        </w:tc>
+        <w:tc>
+          <w:tcPr>
+            <w:tcW w:type="dxa" w:w="1296"/>
+          </w:tcPr>
+          <w:p>
+            <w:pPr>
+              <w:spacing w:line="240" w:lineRule="auto"/>
+            </w:pPr>
+            <w:r>
+              <w:rPr>
+                <w:rFonts w:ascii="Times New Roman" w:hAnsi="Times New Roman"/>
+                <w:b w:val="0"/>
+                <w:i w:val="0"/>
+                <w:sz w:val="18"/>
+              </w:rPr>
+              <w:t>10</w:t>
+            </w:r>
+          </w:p>
+        </w:tc>
+        <w:tc>
+          <w:tcPr>
+            <w:tcW w:type="dxa" w:w="1296"/>
+          </w:tcPr>
+          <w:p>
+            <w:pPr>
+              <w:spacing w:line="240" w:lineRule="auto"/>
+            </w:pPr>
+            <w:r>
+              <w:rPr>
+                <w:rFonts w:ascii="Times New Roman" w:hAnsi="Times New Roman"/>
+                <w:b w:val="0"/>
+                <w:i w:val="0"/>
+                <w:sz w:val="18"/>
+              </w:rPr>
+              <w:t>ProBIOPSY links biopsy scheme to downstream treatment intent: for focal therapy, targeted+perilesional alone is deemed insufficient and contralateral systematic biopsy must be added (Q65 median 7 — consensus agree);</w:t>
+            </w:r>
+          </w:p>
+        </w:tc>
+      </w:tr>
+      <w:tr>
+        <w:tc>
+          <w:tcPr>
+            <w:tcW w:type="dxa" w:w="1296"/>
+          </w:tcPr>
+          <w:p>
+            <w:pPr>
+              <w:spacing w:line="240" w:lineRule="auto"/>
+            </w:pPr>
+            <w:r>
+              <w:rPr>
+                <w:rFonts w:ascii="Times New Roman" w:hAnsi="Times New Roman"/>
+                <w:b w:val="0"/>
+                <w:i w:val="0"/>
+                <w:sz w:val="18"/>
+              </w:rPr>
+              <w:t>immunocompromised_or_infection_history</w:t>
+            </w:r>
+          </w:p>
+        </w:tc>
+        <w:tc>
+          <w:tcPr>
+            <w:tcW w:type="dxa" w:w="1296"/>
+          </w:tcPr>
+          <w:p>
+            <w:pPr>
+              <w:spacing w:line="240" w:lineRule="auto"/>
+            </w:pPr>
+            <w:r>
+              <w:rPr>
+                <w:rFonts w:ascii="Times New Roman" w:hAnsi="Times New Roman"/>
+                <w:b w:val="0"/>
+                <w:i w:val="0"/>
+                <w:sz w:val="18"/>
+              </w:rPr>
+              <w:t>patient_factor</w:t>
+            </w:r>
+          </w:p>
+        </w:tc>
+        <w:tc>
+          <w:tcPr>
+            <w:tcW w:type="dxa" w:w="1296"/>
+          </w:tcPr>
+          <w:p>
+            <w:pPr>
+              <w:spacing w:line="240" w:lineRule="auto"/>
+            </w:pPr>
+            <w:r>
+              <w:rPr>
+                <w:rFonts w:ascii="Times New Roman" w:hAnsi="Times New Roman"/>
+                <w:b w:val="0"/>
+                <w:i w:val="0"/>
+                <w:sz w:val="18"/>
+              </w:rPr>
+              <w:t>high</w:t>
+            </w:r>
+          </w:p>
+        </w:tc>
+        <w:tc>
+          <w:tcPr>
+            <w:tcW w:type="dxa" w:w="1296"/>
+          </w:tcPr>
+          <w:p>
+            <w:pPr>
+              <w:spacing w:line="240" w:lineRule="auto"/>
+            </w:pPr>
+          </w:p>
+        </w:tc>
+        <w:tc>
+          <w:tcPr>
+            <w:tcW w:type="dxa" w:w="1296"/>
+          </w:tcPr>
+          <w:p>
+            <w:pPr>
+              <w:spacing w:line="240" w:lineRule="auto"/>
+            </w:pPr>
+            <w:r>
+              <w:rPr>
+                <w:rFonts w:ascii="Times New Roman" w:hAnsi="Times New Roman"/>
+                <w:b w:val="0"/>
+                <w:i w:val="0"/>
+                <w:sz w:val="18"/>
+              </w:rPr>
+              <w:t>1</w:t>
+            </w:r>
+          </w:p>
+        </w:tc>
+        <w:tc>
+          <w:tcPr>
+            <w:tcW w:type="dxa" w:w="1296"/>
+          </w:tcPr>
+          <w:p>
+            <w:pPr>
+              <w:spacing w:line="240" w:lineRule="auto"/>
+            </w:pPr>
+            <w:r>
+              <w:rPr>
+                <w:rFonts w:ascii="Times New Roman" w:hAnsi="Times New Roman"/>
+                <w:b w:val="0"/>
+                <w:i w:val="0"/>
+                <w:sz w:val="18"/>
+              </w:rPr>
+              <w:t>2</w:t>
+            </w:r>
+          </w:p>
+        </w:tc>
+        <w:tc>
+          <w:tcPr>
+            <w:tcW w:type="dxa" w:w="1296"/>
+          </w:tcPr>
+          <w:p>
+            <w:pPr>
+              <w:spacing w:line="240" w:lineRule="auto"/>
+            </w:pPr>
+            <w:r>
+              <w:rPr>
+                <w:rFonts w:ascii="Times New Roman" w:hAnsi="Times New Roman"/>
+                <w:b w:val="0"/>
+                <w:i w:val="0"/>
+                <w:sz w:val="18"/>
+              </w:rPr>
+              <w:t>Infection risk factors (Q62 catalogue: immunosuppression, prior prostatitis, recent instrumentation, MRSA colonization, etc.) escalate the perioperative rule R11 — prefer the transperineal route and augmented prophylaxis…</w:t>
+            </w:r>
+          </w:p>
+        </w:tc>
+      </w:tr>
+      <w:tr>
+        <w:tc>
+          <w:tcPr>
+            <w:tcW w:type="dxa" w:w="1296"/>
+          </w:tcPr>
+          <w:p>
+            <w:pPr>
+              <w:spacing w:line="240" w:lineRule="auto"/>
+            </w:pPr>
+            <w:r>
+              <w:rPr>
+                <w:rFonts w:ascii="Times New Roman" w:hAnsi="Times New Roman"/>
+                <w:b w:val="0"/>
+                <w:i w:val="0"/>
+                <w:sz w:val="18"/>
+              </w:rPr>
+              <w:t>unfit_for_curative_treatment</w:t>
+            </w:r>
+          </w:p>
+        </w:tc>
+        <w:tc>
+          <w:tcPr>
+            <w:tcW w:type="dxa" w:w="1296"/>
+          </w:tcPr>
+          <w:p>
+            <w:pPr>
+              <w:spacing w:line="240" w:lineRule="auto"/>
+            </w:pPr>
+            <w:r>
+              <w:rPr>
+                <w:rFonts w:ascii="Times New Roman" w:hAnsi="Times New Roman"/>
+                <w:b w:val="0"/>
+                <w:i w:val="0"/>
+                <w:sz w:val="18"/>
+              </w:rPr>
+              <w:t>patient_factor</w:t>
+            </w:r>
+          </w:p>
+        </w:tc>
+        <w:tc>
+          <w:tcPr>
+            <w:tcW w:type="dxa" w:w="1296"/>
+          </w:tcPr>
+          <w:p>
+            <w:pPr>
+              <w:spacing w:line="240" w:lineRule="auto"/>
+            </w:pPr>
+            <w:r>
+              <w:rPr>
+                <w:rFonts w:ascii="Times New Roman" w:hAnsi="Times New Roman"/>
+                <w:b w:val="0"/>
+                <w:i w:val="0"/>
+                <w:sz w:val="18"/>
+              </w:rPr>
+              <w:t>medium</w:t>
+            </w:r>
+          </w:p>
+        </w:tc>
+        <w:tc>
+          <w:tcPr>
+            <w:tcW w:type="dxa" w:w="1296"/>
+          </w:tcPr>
+          <w:p>
+            <w:pPr>
+              <w:spacing w:line="240" w:lineRule="auto"/>
+            </w:pPr>
+          </w:p>
+        </w:tc>
+        <w:tc>
+          <w:tcPr>
+            <w:tcW w:type="dxa" w:w="1296"/>
+          </w:tcPr>
+          <w:p>
+            <w:pPr>
+              <w:spacing w:line="240" w:lineRule="auto"/>
+            </w:pPr>
+            <w:r>
+              <w:rPr>
+                <w:rFonts w:ascii="Times New Roman" w:hAnsi="Times New Roman"/>
+                <w:b w:val="0"/>
+                <w:i w:val="0"/>
+                <w:sz w:val="18"/>
+              </w:rPr>
+              <w:t>2</w:t>
+            </w:r>
+          </w:p>
+        </w:tc>
+        <w:tc>
+          <w:tcPr>
+            <w:tcW w:type="dxa" w:w="1296"/>
+          </w:tcPr>
+          <w:p>
+            <w:pPr>
+              <w:spacing w:line="240" w:lineRule="auto"/>
+            </w:pPr>
+            <w:r>
+              <w:rPr>
+                <w:rFonts w:ascii="Times New Roman" w:hAnsi="Times New Roman"/>
+                <w:b w:val="0"/>
+                <w:i w:val="0"/>
+                <w:sz w:val="18"/>
+              </w:rPr>
+              <w:t>1</w:t>
+            </w:r>
+          </w:p>
+        </w:tc>
+        <w:tc>
+          <w:tcPr>
+            <w:tcW w:type="dxa" w:w="1296"/>
+          </w:tcPr>
+          <w:p>
+            <w:pPr>
+              <w:spacing w:line="240" w:lineRule="auto"/>
+            </w:pPr>
+            <w:r>
+              <w:rPr>
+                <w:rFonts w:ascii="Times New Roman" w:hAnsi="Times New Roman"/>
+                <w:b w:val="0"/>
+                <w:i w:val="0"/>
+                <w:sz w:val="18"/>
+              </w:rPr>
+              <w:t>Patients unfit for curative treatment shift the goal from mapping precision to confirmation — R06 reduced systematic scheme applies.</w:t>
+            </w:r>
+          </w:p>
+        </w:tc>
+      </w:tr>
+      <w:tr>
+        <w:tc>
+          <w:tcPr>
+            <w:tcW w:type="dxa" w:w="1296"/>
+          </w:tcPr>
+          <w:p>
+            <w:pPr>
+              <w:spacing w:line="240" w:lineRule="auto"/>
+            </w:pPr>
+            <w:r>
+              <w:rPr>
+                <w:rFonts w:ascii="Times New Roman" w:hAnsi="Times New Roman"/>
+                <w:b w:val="0"/>
+                <w:i w:val="0"/>
+                <w:sz w:val="18"/>
+              </w:rPr>
+              <w:t>repeat_biopsy_setting</w:t>
+            </w:r>
+          </w:p>
+        </w:tc>
+        <w:tc>
+          <w:tcPr>
+            <w:tcW w:type="dxa" w:w="1296"/>
+          </w:tcPr>
+          <w:p>
+            <w:pPr>
+              <w:spacing w:line="240" w:lineRule="auto"/>
+            </w:pPr>
+            <w:r>
+              <w:rPr>
+                <w:rFonts w:ascii="Times New Roman" w:hAnsi="Times New Roman"/>
+                <w:b w:val="0"/>
+                <w:i w:val="0"/>
+                <w:sz w:val="18"/>
+              </w:rPr>
+              <w:t>patient_factor</w:t>
+            </w:r>
+          </w:p>
+        </w:tc>
+        <w:tc>
+          <w:tcPr>
+            <w:tcW w:type="dxa" w:w="1296"/>
+          </w:tcPr>
+          <w:p>
+            <w:pPr>
+              <w:spacing w:line="240" w:lineRule="auto"/>
+            </w:pPr>
+            <w:r>
+              <w:rPr>
+                <w:rFonts w:ascii="Times New Roman" w:hAnsi="Times New Roman"/>
+                <w:b w:val="0"/>
+                <w:i w:val="0"/>
+                <w:sz w:val="18"/>
+              </w:rPr>
+              <w:t>medium</w:t>
+            </w:r>
+          </w:p>
+        </w:tc>
+        <w:tc>
+          <w:tcPr>
+            <w:tcW w:type="dxa" w:w="1296"/>
+          </w:tcPr>
+          <w:p>
+            <w:pPr>
+              <w:spacing w:line="240" w:lineRule="auto"/>
+            </w:pPr>
+          </w:p>
+        </w:tc>
+        <w:tc>
+          <w:tcPr>
+            <w:tcW w:type="dxa" w:w="1296"/>
+          </w:tcPr>
+          <w:p>
+            <w:pPr>
+              <w:spacing w:line="240" w:lineRule="auto"/>
+            </w:pPr>
+            <w:r>
+              <w:rPr>
+                <w:rFonts w:ascii="Times New Roman" w:hAnsi="Times New Roman"/>
+                <w:b w:val="0"/>
+                <w:i w:val="0"/>
+                <w:sz w:val="18"/>
+              </w:rPr>
+              <w:t>1</w:t>
+            </w:r>
+          </w:p>
+        </w:tc>
+        <w:tc>
+          <w:tcPr>
+            <w:tcW w:type="dxa" w:w="1296"/>
+          </w:tcPr>
+          <w:p>
+            <w:pPr>
+              <w:spacing w:line="240" w:lineRule="auto"/>
+            </w:pPr>
+            <w:r>
+              <w:rPr>
+                <w:rFonts w:ascii="Times New Roman" w:hAnsi="Times New Roman"/>
+                <w:b w:val="0"/>
+                <w:i w:val="0"/>
+                <w:sz w:val="18"/>
+              </w:rPr>
+              <w:t>2</w:t>
+            </w:r>
+          </w:p>
+        </w:tc>
+        <w:tc>
+          <w:tcPr>
+            <w:tcW w:type="dxa" w:w="1296"/>
+          </w:tcPr>
+          <w:p>
+            <w:pPr>
+              <w:spacing w:line="240" w:lineRule="auto"/>
+            </w:pPr>
+            <w:r>
+              <w:rPr>
+                <w:rFonts w:ascii="Times New Roman" w:hAnsi="Times New Roman"/>
+                <w:b w:val="0"/>
+                <w:i w:val="0"/>
+                <w:sz w:val="18"/>
+              </w:rPr>
+              <w:t>Prior negative biopsy with persisting suspicion raises sepsis risk on repeat access and keeps the 12-core template relevant (R03/R11 escalation).</w:t>
+            </w:r>
+          </w:p>
+        </w:tc>
+      </w:tr>
+      <w:tr>
+        <w:tc>
+          <w:tcPr>
+            <w:tcW w:type="dxa" w:w="1296"/>
+          </w:tcPr>
+          <w:p>
+            <w:pPr>
+              <w:spacing w:line="240" w:lineRule="auto"/>
+            </w:pPr>
+            <w:r>
+              <w:rPr>
+                <w:rFonts w:ascii="Times New Roman" w:hAnsi="Times New Roman"/>
+                <w:b w:val="0"/>
+                <w:i w:val="0"/>
+                <w:sz w:val="18"/>
+              </w:rPr>
+              <w:t>suspicious_dre_without_mri_lesion</w:t>
+            </w:r>
+          </w:p>
+        </w:tc>
+        <w:tc>
+          <w:tcPr>
+            <w:tcW w:type="dxa" w:w="1296"/>
+          </w:tcPr>
+          <w:p>
+            <w:pPr>
+              <w:spacing w:line="240" w:lineRule="auto"/>
+            </w:pPr>
+            <w:r>
+              <w:rPr>
+                <w:rFonts w:ascii="Times New Roman" w:hAnsi="Times New Roman"/>
+                <w:b w:val="0"/>
+                <w:i w:val="0"/>
+                <w:sz w:val="18"/>
+              </w:rPr>
+              <w:t>patient_factor</w:t>
+            </w:r>
+          </w:p>
+        </w:tc>
+        <w:tc>
+          <w:tcPr>
+            <w:tcW w:type="dxa" w:w="1296"/>
+          </w:tcPr>
+          <w:p>
+            <w:pPr>
+              <w:spacing w:line="240" w:lineRule="auto"/>
+            </w:pPr>
+            <w:r>
+              <w:rPr>
+                <w:rFonts w:ascii="Times New Roman" w:hAnsi="Times New Roman"/>
+                <w:b w:val="0"/>
+                <w:i w:val="0"/>
+                <w:sz w:val="18"/>
+              </w:rPr>
+              <w:t>medium</w:t>
+            </w:r>
+          </w:p>
+        </w:tc>
+        <w:tc>
+          <w:tcPr>
+            <w:tcW w:type="dxa" w:w="1296"/>
+          </w:tcPr>
+          <w:p>
+            <w:pPr>
+              <w:spacing w:line="240" w:lineRule="auto"/>
+            </w:pPr>
+          </w:p>
+        </w:tc>
+        <w:tc>
+          <w:tcPr>
+            <w:tcW w:type="dxa" w:w="1296"/>
+          </w:tcPr>
+          <w:p>
+            <w:pPr>
+              <w:spacing w:line="240" w:lineRule="auto"/>
+            </w:pPr>
+            <w:r>
+              <w:rPr>
+                <w:rFonts w:ascii="Times New Roman" w:hAnsi="Times New Roman"/>
+                <w:b w:val="0"/>
+                <w:i w:val="0"/>
+                <w:sz w:val="18"/>
+              </w:rPr>
+              <w:t>1</w:t>
+            </w:r>
+          </w:p>
+        </w:tc>
+        <w:tc>
+          <w:tcPr>
+            <w:tcW w:type="dxa" w:w="1296"/>
+          </w:tcPr>
+          <w:p>
+            <w:pPr>
+              <w:spacing w:line="240" w:lineRule="auto"/>
+            </w:pPr>
+            <w:r>
+              <w:rPr>
+                <w:rFonts w:ascii="Times New Roman" w:hAnsi="Times New Roman"/>
+                <w:b w:val="0"/>
+                <w:i w:val="0"/>
+                <w:sz w:val="18"/>
+              </w:rPr>
+              <w:t>1</w:t>
+            </w:r>
+          </w:p>
+        </w:tc>
+        <w:tc>
+          <w:tcPr>
+            <w:tcW w:type="dxa" w:w="1296"/>
+          </w:tcPr>
+          <w:p>
+            <w:pPr>
+              <w:spacing w:line="240" w:lineRule="auto"/>
+            </w:pPr>
+            <w:r>
+              <w:rPr>
+                <w:rFonts w:ascii="Times New Roman" w:hAnsi="Times New Roman"/>
+                <w:b w:val="0"/>
+                <w:i w:val="0"/>
+                <w:sz w:val="18"/>
+              </w:rPr>
+              <w:t>Abnormal DRE with negative MRI keeps clinical suspicion high — systematic 12-core biopsy per R03.</w:t>
+            </w:r>
+          </w:p>
+        </w:tc>
+      </w:tr>
+    </w:tbl>
     <w:p>
       <w:r>
         <w:rPr>
@@ -1043,6 +3659,907 @@
         <w:t>All 2,240 runs (4 methods × 5 seeds × 112 statements) completed successfully with zero errors and zero degraded outputs. Table 3 reports the performance matrix; Figure 2 shows per-seed distributions.</w:t>
       </w:r>
     </w:p>
+    <w:p>
+      <w:r>
+        <w:rPr>
+          <w:rFonts w:ascii="Times New Roman" w:hAnsi="Times New Roman"/>
+          <w:b/>
+          <w:i w:val="0"/>
+        </w:rPr>
+        <w:t>Table 3.</w:t>
+      </w:r>
+      <w:r>
+        <w:rPr>
+          <w:rFonts w:ascii="Times New Roman" w:hAnsi="Times New Roman"/>
+          <w:b w:val="0"/>
+          <w:i w:val="0"/>
+        </w:rPr>
+        <w:t xml:space="preserve"> Benchmark performance matrix: mean ± SD over five seeds (560 runs per method; 2,240 total). Context = mean retrieved characters per run.</w:t>
+      </w:r>
+    </w:p>
+    <w:tbl>
+      <w:tblPr>
+        <w:tblStyle w:val="TableGrid"/>
+        <w:tblW w:type="auto" w:w="0"/>
+        <w:tblLook w:firstColumn="1" w:firstRow="1" w:lastColumn="0" w:lastRow="0" w:noHBand="0" w:noVBand="1" w:val="04A0"/>
+      </w:tblPr>
+      <w:tblGrid>
+        <w:gridCol w:w="1008"/>
+        <w:gridCol w:w="1008"/>
+        <w:gridCol w:w="1008"/>
+        <w:gridCol w:w="1008"/>
+        <w:gridCol w:w="1008"/>
+        <w:gridCol w:w="1008"/>
+        <w:gridCol w:w="1008"/>
+        <w:gridCol w:w="1008"/>
+        <w:gridCol w:w="1008"/>
+      </w:tblGrid>
+      <w:tr>
+        <w:tc>
+          <w:tcPr>
+            <w:tcW w:type="dxa" w:w="1008"/>
+          </w:tcPr>
+          <w:p>
+            <w:pPr>
+              <w:spacing w:line="240" w:lineRule="auto"/>
+            </w:pPr>
+            <w:r>
+              <w:rPr>
+                <w:rFonts w:ascii="Times New Roman" w:hAnsi="Times New Roman"/>
+                <w:b/>
+                <w:i w:val="0"/>
+                <w:sz w:val="18"/>
+              </w:rPr>
+              <w:t>method</w:t>
+            </w:r>
+          </w:p>
+        </w:tc>
+        <w:tc>
+          <w:tcPr>
+            <w:tcW w:type="dxa" w:w="1008"/>
+          </w:tcPr>
+          <w:p>
+            <w:pPr>
+              <w:spacing w:line="240" w:lineRule="auto"/>
+            </w:pPr>
+            <w:r>
+              <w:rPr>
+                <w:rFonts w:ascii="Times New Roman" w:hAnsi="Times New Roman"/>
+                <w:b/>
+                <w:i w:val="0"/>
+                <w:sz w:val="18"/>
+              </w:rPr>
+              <w:t>exact5</w:t>
+            </w:r>
+          </w:p>
+        </w:tc>
+        <w:tc>
+          <w:tcPr>
+            <w:tcW w:type="dxa" w:w="1008"/>
+          </w:tcPr>
+          <w:p>
+            <w:pPr>
+              <w:spacing w:line="240" w:lineRule="auto"/>
+            </w:pPr>
+            <w:r>
+              <w:rPr>
+                <w:rFonts w:ascii="Times New Roman" w:hAnsi="Times New Roman"/>
+                <w:b/>
+                <w:i w:val="0"/>
+                <w:sz w:val="18"/>
+              </w:rPr>
+              <w:t>exact3</w:t>
+            </w:r>
+          </w:p>
+        </w:tc>
+        <w:tc>
+          <w:tcPr>
+            <w:tcW w:type="dxa" w:w="1008"/>
+          </w:tcPr>
+          <w:p>
+            <w:pPr>
+              <w:spacing w:line="240" w:lineRule="auto"/>
+            </w:pPr>
+            <w:r>
+              <w:rPr>
+                <w:rFonts w:ascii="Times New Roman" w:hAnsi="Times New Roman"/>
+                <w:b/>
+                <w:i w:val="0"/>
+                <w:sz w:val="18"/>
+              </w:rPr>
+              <w:t>macro_f1</w:t>
+            </w:r>
+          </w:p>
+        </w:tc>
+        <w:tc>
+          <w:tcPr>
+            <w:tcW w:type="dxa" w:w="1008"/>
+          </w:tcPr>
+          <w:p>
+            <w:pPr>
+              <w:spacing w:line="240" w:lineRule="auto"/>
+            </w:pPr>
+            <w:r>
+              <w:rPr>
+                <w:rFonts w:ascii="Times New Roman" w:hAnsi="Times New Roman"/>
+                <w:b/>
+                <w:i w:val="0"/>
+                <w:sz w:val="18"/>
+              </w:rPr>
+              <w:t>cohens_kappa</w:t>
+            </w:r>
+          </w:p>
+        </w:tc>
+        <w:tc>
+          <w:tcPr>
+            <w:tcW w:type="dxa" w:w="1008"/>
+          </w:tcPr>
+          <w:p>
+            <w:pPr>
+              <w:spacing w:line="240" w:lineRule="auto"/>
+            </w:pPr>
+            <w:r>
+              <w:rPr>
+                <w:rFonts w:ascii="Times New Roman" w:hAnsi="Times New Roman"/>
+                <w:b/>
+                <w:i w:val="0"/>
+                <w:sz w:val="18"/>
+              </w:rPr>
+              <w:t>against_sensitivity</w:t>
+            </w:r>
+          </w:p>
+        </w:tc>
+        <w:tc>
+          <w:tcPr>
+            <w:tcW w:type="dxa" w:w="1008"/>
+          </w:tcPr>
+          <w:p>
+            <w:pPr>
+              <w:spacing w:line="240" w:lineRule="auto"/>
+            </w:pPr>
+            <w:r>
+              <w:rPr>
+                <w:rFonts w:ascii="Times New Roman" w:hAnsi="Times New Roman"/>
+                <w:b/>
+                <w:i w:val="0"/>
+                <w:sz w:val="18"/>
+              </w:rPr>
+              <w:t>against_specificity</w:t>
+            </w:r>
+          </w:p>
+        </w:tc>
+        <w:tc>
+          <w:tcPr>
+            <w:tcW w:type="dxa" w:w="1008"/>
+          </w:tcPr>
+          <w:p>
+            <w:pPr>
+              <w:spacing w:line="240" w:lineRule="auto"/>
+            </w:pPr>
+            <w:r>
+              <w:rPr>
+                <w:rFonts w:ascii="Times New Roman" w:hAnsi="Times New Roman"/>
+                <w:b/>
+                <w:i w:val="0"/>
+                <w:sz w:val="18"/>
+              </w:rPr>
+              <w:t>against_f1</w:t>
+            </w:r>
+          </w:p>
+        </w:tc>
+        <w:tc>
+          <w:tcPr>
+            <w:tcW w:type="dxa" w:w="1008"/>
+          </w:tcPr>
+          <w:p>
+            <w:pPr>
+              <w:spacing w:line="240" w:lineRule="auto"/>
+            </w:pPr>
+            <w:r>
+              <w:rPr>
+                <w:rFonts w:ascii="Times New Roman" w:hAnsi="Times New Roman"/>
+                <w:b/>
+                <w:i w:val="0"/>
+                <w:sz w:val="18"/>
+              </w:rPr>
+              <w:t>mean_context_chars</w:t>
+            </w:r>
+          </w:p>
+        </w:tc>
+      </w:tr>
+      <w:tr>
+        <w:tc>
+          <w:tcPr>
+            <w:tcW w:type="dxa" w:w="1008"/>
+          </w:tcPr>
+          <w:p>
+            <w:pPr>
+              <w:spacing w:line="240" w:lineRule="auto"/>
+            </w:pPr>
+            <w:r>
+              <w:rPr>
+                <w:rFonts w:ascii="Times New Roman" w:hAnsi="Times New Roman"/>
+                <w:b w:val="0"/>
+                <w:i w:val="0"/>
+                <w:sz w:val="18"/>
+              </w:rPr>
+              <w:t>lightrag</w:t>
+            </w:r>
+          </w:p>
+        </w:tc>
+        <w:tc>
+          <w:tcPr>
+            <w:tcW w:type="dxa" w:w="1008"/>
+          </w:tcPr>
+          <w:p>
+            <w:pPr>
+              <w:spacing w:line="240" w:lineRule="auto"/>
+            </w:pPr>
+            <w:r>
+              <w:rPr>
+                <w:rFonts w:ascii="Times New Roman" w:hAnsi="Times New Roman"/>
+                <w:b w:val="0"/>
+                <w:i w:val="0"/>
+                <w:sz w:val="18"/>
+              </w:rPr>
+              <w:t>0.613±0.013</w:t>
+            </w:r>
+          </w:p>
+        </w:tc>
+        <w:tc>
+          <w:tcPr>
+            <w:tcW w:type="dxa" w:w="1008"/>
+          </w:tcPr>
+          <w:p>
+            <w:pPr>
+              <w:spacing w:line="240" w:lineRule="auto"/>
+            </w:pPr>
+            <w:r>
+              <w:rPr>
+                <w:rFonts w:ascii="Times New Roman" w:hAnsi="Times New Roman"/>
+                <w:b w:val="0"/>
+                <w:i w:val="0"/>
+                <w:sz w:val="18"/>
+              </w:rPr>
+              <w:t>0.920±0.013</w:t>
+            </w:r>
+          </w:p>
+        </w:tc>
+        <w:tc>
+          <w:tcPr>
+            <w:tcW w:type="dxa" w:w="1008"/>
+          </w:tcPr>
+          <w:p>
+            <w:pPr>
+              <w:spacing w:line="240" w:lineRule="auto"/>
+            </w:pPr>
+            <w:r>
+              <w:rPr>
+                <w:rFonts w:ascii="Times New Roman" w:hAnsi="Times New Roman"/>
+                <w:b w:val="0"/>
+                <w:i w:val="0"/>
+                <w:sz w:val="18"/>
+              </w:rPr>
+              <w:t>0.536±0.012</w:t>
+            </w:r>
+          </w:p>
+        </w:tc>
+        <w:tc>
+          <w:tcPr>
+            <w:tcW w:type="dxa" w:w="1008"/>
+          </w:tcPr>
+          <w:p>
+            <w:pPr>
+              <w:spacing w:line="240" w:lineRule="auto"/>
+            </w:pPr>
+            <w:r>
+              <w:rPr>
+                <w:rFonts w:ascii="Times New Roman" w:hAnsi="Times New Roman"/>
+                <w:b w:val="0"/>
+                <w:i w:val="0"/>
+                <w:sz w:val="18"/>
+              </w:rPr>
+              <w:t>0.525±0.012</w:t>
+            </w:r>
+          </w:p>
+        </w:tc>
+        <w:tc>
+          <w:tcPr>
+            <w:tcW w:type="dxa" w:w="1008"/>
+          </w:tcPr>
+          <w:p>
+            <w:pPr>
+              <w:spacing w:line="240" w:lineRule="auto"/>
+            </w:pPr>
+            <w:r>
+              <w:rPr>
+                <w:rFonts w:ascii="Times New Roman" w:hAnsi="Times New Roman"/>
+                <w:b w:val="0"/>
+                <w:i w:val="0"/>
+                <w:sz w:val="18"/>
+              </w:rPr>
+              <w:t>1.000±0.000</w:t>
+            </w:r>
+          </w:p>
+        </w:tc>
+        <w:tc>
+          <w:tcPr>
+            <w:tcW w:type="dxa" w:w="1008"/>
+          </w:tcPr>
+          <w:p>
+            <w:pPr>
+              <w:spacing w:line="240" w:lineRule="auto"/>
+            </w:pPr>
+            <w:r>
+              <w:rPr>
+                <w:rFonts w:ascii="Times New Roman" w:hAnsi="Times New Roman"/>
+                <w:b w:val="0"/>
+                <w:i w:val="0"/>
+                <w:sz w:val="18"/>
+              </w:rPr>
+              <w:t>0.922±0.017</w:t>
+            </w:r>
+          </w:p>
+        </w:tc>
+        <w:tc>
+          <w:tcPr>
+            <w:tcW w:type="dxa" w:w="1008"/>
+          </w:tcPr>
+          <w:p>
+            <w:pPr>
+              <w:spacing w:line="240" w:lineRule="auto"/>
+            </w:pPr>
+            <w:r>
+              <w:rPr>
+                <w:rFonts w:ascii="Times New Roman" w:hAnsi="Times New Roman"/>
+                <w:b w:val="0"/>
+                <w:i w:val="0"/>
+                <w:sz w:val="18"/>
+              </w:rPr>
+              <w:t>0.881±0.023</w:t>
+            </w:r>
+          </w:p>
+        </w:tc>
+        <w:tc>
+          <w:tcPr>
+            <w:tcW w:type="dxa" w:w="1008"/>
+          </w:tcPr>
+          <w:p>
+            <w:pPr>
+              <w:spacing w:line="240" w:lineRule="auto"/>
+            </w:pPr>
+            <w:r>
+              <w:rPr>
+                <w:rFonts w:ascii="Times New Roman" w:hAnsi="Times New Roman"/>
+                <w:b w:val="0"/>
+                <w:i w:val="0"/>
+                <w:sz w:val="18"/>
+              </w:rPr>
+              <w:t>2468</w:t>
+            </w:r>
+          </w:p>
+        </w:tc>
+      </w:tr>
+      <w:tr>
+        <w:tc>
+          <w:tcPr>
+            <w:tcW w:type="dxa" w:w="1008"/>
+          </w:tcPr>
+          <w:p>
+            <w:pPr>
+              <w:spacing w:line="240" w:lineRule="auto"/>
+            </w:pPr>
+            <w:r>
+              <w:rPr>
+                <w:rFonts w:ascii="Times New Roman" w:hAnsi="Times New Roman"/>
+                <w:b w:val="0"/>
+                <w:i w:val="0"/>
+                <w:sz w:val="18"/>
+              </w:rPr>
+              <w:t>naive_rag</w:t>
+            </w:r>
+          </w:p>
+        </w:tc>
+        <w:tc>
+          <w:tcPr>
+            <w:tcW w:type="dxa" w:w="1008"/>
+          </w:tcPr>
+          <w:p>
+            <w:pPr>
+              <w:spacing w:line="240" w:lineRule="auto"/>
+            </w:pPr>
+            <w:r>
+              <w:rPr>
+                <w:rFonts w:ascii="Times New Roman" w:hAnsi="Times New Roman"/>
+                <w:b w:val="0"/>
+                <w:i w:val="0"/>
+                <w:sz w:val="18"/>
+              </w:rPr>
+              <w:t>0.605±0.033</w:t>
+            </w:r>
+          </w:p>
+        </w:tc>
+        <w:tc>
+          <w:tcPr>
+            <w:tcW w:type="dxa" w:w="1008"/>
+          </w:tcPr>
+          <w:p>
+            <w:pPr>
+              <w:spacing w:line="240" w:lineRule="auto"/>
+            </w:pPr>
+            <w:r>
+              <w:rPr>
+                <w:rFonts w:ascii="Times New Roman" w:hAnsi="Times New Roman"/>
+                <w:b w:val="0"/>
+                <w:i w:val="0"/>
+                <w:sz w:val="18"/>
+              </w:rPr>
+              <w:t>0.905±0.013</w:t>
+            </w:r>
+          </w:p>
+        </w:tc>
+        <w:tc>
+          <w:tcPr>
+            <w:tcW w:type="dxa" w:w="1008"/>
+          </w:tcPr>
+          <w:p>
+            <w:pPr>
+              <w:spacing w:line="240" w:lineRule="auto"/>
+            </w:pPr>
+            <w:r>
+              <w:rPr>
+                <w:rFonts w:ascii="Times New Roman" w:hAnsi="Times New Roman"/>
+                <w:b w:val="0"/>
+                <w:i w:val="0"/>
+                <w:sz w:val="18"/>
+              </w:rPr>
+              <w:t>0.514±0.043</w:t>
+            </w:r>
+          </w:p>
+        </w:tc>
+        <w:tc>
+          <w:tcPr>
+            <w:tcW w:type="dxa" w:w="1008"/>
+          </w:tcPr>
+          <w:p>
+            <w:pPr>
+              <w:spacing w:line="240" w:lineRule="auto"/>
+            </w:pPr>
+            <w:r>
+              <w:rPr>
+                <w:rFonts w:ascii="Times New Roman" w:hAnsi="Times New Roman"/>
+                <w:b w:val="0"/>
+                <w:i w:val="0"/>
+                <w:sz w:val="18"/>
+              </w:rPr>
+              <w:t>0.512±0.041</w:t>
+            </w:r>
+          </w:p>
+        </w:tc>
+        <w:tc>
+          <w:tcPr>
+            <w:tcW w:type="dxa" w:w="1008"/>
+          </w:tcPr>
+          <w:p>
+            <w:pPr>
+              <w:spacing w:line="240" w:lineRule="auto"/>
+            </w:pPr>
+            <w:r>
+              <w:rPr>
+                <w:rFonts w:ascii="Times New Roman" w:hAnsi="Times New Roman"/>
+                <w:b w:val="0"/>
+                <w:i w:val="0"/>
+                <w:sz w:val="18"/>
+              </w:rPr>
+              <w:t>0.992±0.018</w:t>
+            </w:r>
+          </w:p>
+        </w:tc>
+        <w:tc>
+          <w:tcPr>
+            <w:tcW w:type="dxa" w:w="1008"/>
+          </w:tcPr>
+          <w:p>
+            <w:pPr>
+              <w:spacing w:line="240" w:lineRule="auto"/>
+            </w:pPr>
+            <w:r>
+              <w:rPr>
+                <w:rFonts w:ascii="Times New Roman" w:hAnsi="Times New Roman"/>
+                <w:b w:val="0"/>
+                <w:i w:val="0"/>
+                <w:sz w:val="18"/>
+              </w:rPr>
+              <w:t>0.931±0.021</w:t>
+            </w:r>
+          </w:p>
+        </w:tc>
+        <w:tc>
+          <w:tcPr>
+            <w:tcW w:type="dxa" w:w="1008"/>
+          </w:tcPr>
+          <w:p>
+            <w:pPr>
+              <w:spacing w:line="240" w:lineRule="auto"/>
+            </w:pPr>
+            <w:r>
+              <w:rPr>
+                <w:rFonts w:ascii="Times New Roman" w:hAnsi="Times New Roman"/>
+                <w:b w:val="0"/>
+                <w:i w:val="0"/>
+                <w:sz w:val="18"/>
+              </w:rPr>
+              <w:t>0.890±0.028</w:t>
+            </w:r>
+          </w:p>
+        </w:tc>
+        <w:tc>
+          <w:tcPr>
+            <w:tcW w:type="dxa" w:w="1008"/>
+          </w:tcPr>
+          <w:p>
+            <w:pPr>
+              <w:spacing w:line="240" w:lineRule="auto"/>
+            </w:pPr>
+            <w:r>
+              <w:rPr>
+                <w:rFonts w:ascii="Times New Roman" w:hAnsi="Times New Roman"/>
+                <w:b w:val="0"/>
+                <w:i w:val="0"/>
+                <w:sz w:val="18"/>
+              </w:rPr>
+              <w:t>3644</w:t>
+            </w:r>
+          </w:p>
+        </w:tc>
+      </w:tr>
+      <w:tr>
+        <w:tc>
+          <w:tcPr>
+            <w:tcW w:type="dxa" w:w="1008"/>
+          </w:tcPr>
+          <w:p>
+            <w:pPr>
+              <w:spacing w:line="240" w:lineRule="auto"/>
+            </w:pPr>
+            <w:r>
+              <w:rPr>
+                <w:rFonts w:ascii="Times New Roman" w:hAnsi="Times New Roman"/>
+                <w:b w:val="0"/>
+                <w:i w:val="0"/>
+                <w:sz w:val="18"/>
+              </w:rPr>
+              <w:t>full_system</w:t>
+            </w:r>
+          </w:p>
+        </w:tc>
+        <w:tc>
+          <w:tcPr>
+            <w:tcW w:type="dxa" w:w="1008"/>
+          </w:tcPr>
+          <w:p>
+            <w:pPr>
+              <w:spacing w:line="240" w:lineRule="auto"/>
+            </w:pPr>
+            <w:r>
+              <w:rPr>
+                <w:rFonts w:ascii="Times New Roman" w:hAnsi="Times New Roman"/>
+                <w:b w:val="0"/>
+                <w:i w:val="0"/>
+                <w:sz w:val="18"/>
+              </w:rPr>
+              <w:t>0.805±0.012</w:t>
+            </w:r>
+          </w:p>
+        </w:tc>
+        <w:tc>
+          <w:tcPr>
+            <w:tcW w:type="dxa" w:w="1008"/>
+          </w:tcPr>
+          <w:p>
+            <w:pPr>
+              <w:spacing w:line="240" w:lineRule="auto"/>
+            </w:pPr>
+            <w:r>
+              <w:rPr>
+                <w:rFonts w:ascii="Times New Roman" w:hAnsi="Times New Roman"/>
+                <w:b w:val="0"/>
+                <w:i w:val="0"/>
+                <w:sz w:val="18"/>
+              </w:rPr>
+              <w:t>0.823±0.012</w:t>
+            </w:r>
+          </w:p>
+        </w:tc>
+        <w:tc>
+          <w:tcPr>
+            <w:tcW w:type="dxa" w:w="1008"/>
+          </w:tcPr>
+          <w:p>
+            <w:pPr>
+              <w:spacing w:line="240" w:lineRule="auto"/>
+            </w:pPr>
+            <w:r>
+              <w:rPr>
+                <w:rFonts w:ascii="Times New Roman" w:hAnsi="Times New Roman"/>
+                <w:b w:val="0"/>
+                <w:i w:val="0"/>
+                <w:sz w:val="18"/>
+              </w:rPr>
+              <w:t>0.825±0.022</w:t>
+            </w:r>
+          </w:p>
+        </w:tc>
+        <w:tc>
+          <w:tcPr>
+            <w:tcW w:type="dxa" w:w="1008"/>
+          </w:tcPr>
+          <w:p>
+            <w:pPr>
+              <w:spacing w:line="240" w:lineRule="auto"/>
+            </w:pPr>
+            <w:r>
+              <w:rPr>
+                <w:rFonts w:ascii="Times New Roman" w:hAnsi="Times New Roman"/>
+                <w:b w:val="0"/>
+                <w:i w:val="0"/>
+                <w:sz w:val="18"/>
+              </w:rPr>
+              <w:t>0.730±0.016</w:t>
+            </w:r>
+          </w:p>
+        </w:tc>
+        <w:tc>
+          <w:tcPr>
+            <w:tcW w:type="dxa" w:w="1008"/>
+          </w:tcPr>
+          <w:p>
+            <w:pPr>
+              <w:spacing w:line="240" w:lineRule="auto"/>
+            </w:pPr>
+            <w:r>
+              <w:rPr>
+                <w:rFonts w:ascii="Times New Roman" w:hAnsi="Times New Roman"/>
+                <w:b w:val="0"/>
+                <w:i w:val="0"/>
+                <w:sz w:val="18"/>
+              </w:rPr>
+              <w:t>0.872±0.018</w:t>
+            </w:r>
+          </w:p>
+        </w:tc>
+        <w:tc>
+          <w:tcPr>
+            <w:tcW w:type="dxa" w:w="1008"/>
+          </w:tcPr>
+          <w:p>
+            <w:pPr>
+              <w:spacing w:line="240" w:lineRule="auto"/>
+            </w:pPr>
+            <w:r>
+              <w:rPr>
+                <w:rFonts w:ascii="Times New Roman" w:hAnsi="Times New Roman"/>
+                <w:b w:val="0"/>
+                <w:i w:val="0"/>
+                <w:sz w:val="18"/>
+              </w:rPr>
+              <w:t>0.986±0.010</w:t>
+            </w:r>
+          </w:p>
+        </w:tc>
+        <w:tc>
+          <w:tcPr>
+            <w:tcW w:type="dxa" w:w="1008"/>
+          </w:tcPr>
+          <w:p>
+            <w:pPr>
+              <w:spacing w:line="240" w:lineRule="auto"/>
+            </w:pPr>
+            <w:r>
+              <w:rPr>
+                <w:rFonts w:ascii="Times New Roman" w:hAnsi="Times New Roman"/>
+                <w:b w:val="0"/>
+                <w:i w:val="0"/>
+                <w:sz w:val="18"/>
+              </w:rPr>
+              <w:t>0.908±0.023</w:t>
+            </w:r>
+          </w:p>
+        </w:tc>
+        <w:tc>
+          <w:tcPr>
+            <w:tcW w:type="dxa" w:w="1008"/>
+          </w:tcPr>
+          <w:p>
+            <w:pPr>
+              <w:spacing w:line="240" w:lineRule="auto"/>
+            </w:pPr>
+            <w:r>
+              <w:rPr>
+                <w:rFonts w:ascii="Times New Roman" w:hAnsi="Times New Roman"/>
+                <w:b w:val="0"/>
+                <w:i w:val="0"/>
+                <w:sz w:val="18"/>
+              </w:rPr>
+              <w:t>7640</w:t>
+            </w:r>
+          </w:p>
+        </w:tc>
+      </w:tr>
+      <w:tr>
+        <w:tc>
+          <w:tcPr>
+            <w:tcW w:type="dxa" w:w="1008"/>
+          </w:tcPr>
+          <w:p>
+            <w:pPr>
+              <w:spacing w:line="240" w:lineRule="auto"/>
+            </w:pPr>
+            <w:r>
+              <w:rPr>
+                <w:rFonts w:ascii="Times New Roman" w:hAnsi="Times New Roman"/>
+                <w:b w:val="0"/>
+                <w:i w:val="0"/>
+                <w:sz w:val="18"/>
+              </w:rPr>
+              <w:t>pure_llm</w:t>
+            </w:r>
+          </w:p>
+        </w:tc>
+        <w:tc>
+          <w:tcPr>
+            <w:tcW w:type="dxa" w:w="1008"/>
+          </w:tcPr>
+          <w:p>
+            <w:pPr>
+              <w:spacing w:line="240" w:lineRule="auto"/>
+            </w:pPr>
+            <w:r>
+              <w:rPr>
+                <w:rFonts w:ascii="Times New Roman" w:hAnsi="Times New Roman"/>
+                <w:b w:val="0"/>
+                <w:i w:val="0"/>
+                <w:sz w:val="18"/>
+              </w:rPr>
+              <w:t>0.304±0.039</w:t>
+            </w:r>
+          </w:p>
+        </w:tc>
+        <w:tc>
+          <w:tcPr>
+            <w:tcW w:type="dxa" w:w="1008"/>
+          </w:tcPr>
+          <w:p>
+            <w:pPr>
+              <w:spacing w:line="240" w:lineRule="auto"/>
+            </w:pPr>
+            <w:r>
+              <w:rPr>
+                <w:rFonts w:ascii="Times New Roman" w:hAnsi="Times New Roman"/>
+                <w:b w:val="0"/>
+                <w:i w:val="0"/>
+                <w:sz w:val="18"/>
+              </w:rPr>
+              <w:t>0.370±0.029</w:t>
+            </w:r>
+          </w:p>
+        </w:tc>
+        <w:tc>
+          <w:tcPr>
+            <w:tcW w:type="dxa" w:w="1008"/>
+          </w:tcPr>
+          <w:p>
+            <w:pPr>
+              <w:spacing w:line="240" w:lineRule="auto"/>
+            </w:pPr>
+            <w:r>
+              <w:rPr>
+                <w:rFonts w:ascii="Times New Roman" w:hAnsi="Times New Roman"/>
+                <w:b w:val="0"/>
+                <w:i w:val="0"/>
+                <w:sz w:val="18"/>
+              </w:rPr>
+              <w:t>0.254±0.029</w:t>
+            </w:r>
+          </w:p>
+        </w:tc>
+        <w:tc>
+          <w:tcPr>
+            <w:tcW w:type="dxa" w:w="1008"/>
+          </w:tcPr>
+          <w:p>
+            <w:pPr>
+              <w:spacing w:line="240" w:lineRule="auto"/>
+            </w:pPr>
+            <w:r>
+              <w:rPr>
+                <w:rFonts w:ascii="Times New Roman" w:hAnsi="Times New Roman"/>
+                <w:b w:val="0"/>
+                <w:i w:val="0"/>
+                <w:sz w:val="18"/>
+              </w:rPr>
+              <w:t>0.079±0.053</w:t>
+            </w:r>
+          </w:p>
+        </w:tc>
+        <w:tc>
+          <w:tcPr>
+            <w:tcW w:type="dxa" w:w="1008"/>
+          </w:tcPr>
+          <w:p>
+            <w:pPr>
+              <w:spacing w:line="240" w:lineRule="auto"/>
+            </w:pPr>
+            <w:r>
+              <w:rPr>
+                <w:rFonts w:ascii="Times New Roman" w:hAnsi="Times New Roman"/>
+                <w:b w:val="0"/>
+                <w:i w:val="0"/>
+                <w:sz w:val="18"/>
+              </w:rPr>
+              <w:t>0.416±0.083</w:t>
+            </w:r>
+          </w:p>
+        </w:tc>
+        <w:tc>
+          <w:tcPr>
+            <w:tcW w:type="dxa" w:w="1008"/>
+          </w:tcPr>
+          <w:p>
+            <w:pPr>
+              <w:spacing w:line="240" w:lineRule="auto"/>
+            </w:pPr>
+            <w:r>
+              <w:rPr>
+                <w:rFonts w:ascii="Times New Roman" w:hAnsi="Times New Roman"/>
+                <w:b w:val="0"/>
+                <w:i w:val="0"/>
+                <w:sz w:val="18"/>
+              </w:rPr>
+              <w:t>0.720±0.021</w:t>
+            </w:r>
+          </w:p>
+        </w:tc>
+        <w:tc>
+          <w:tcPr>
+            <w:tcW w:type="dxa" w:w="1008"/>
+          </w:tcPr>
+          <w:p>
+            <w:pPr>
+              <w:spacing w:line="240" w:lineRule="auto"/>
+            </w:pPr>
+            <w:r>
+              <w:rPr>
+                <w:rFonts w:ascii="Times New Roman" w:hAnsi="Times New Roman"/>
+                <w:b w:val="0"/>
+                <w:i w:val="0"/>
+                <w:sz w:val="18"/>
+              </w:rPr>
+              <w:t>0.346±0.053</w:t>
+            </w:r>
+          </w:p>
+        </w:tc>
+        <w:tc>
+          <w:tcPr>
+            <w:tcW w:type="dxa" w:w="1008"/>
+          </w:tcPr>
+          <w:p>
+            <w:pPr>
+              <w:spacing w:line="240" w:lineRule="auto"/>
+            </w:pPr>
+            <w:r>
+              <w:rPr>
+                <w:rFonts w:ascii="Times New Roman" w:hAnsi="Times New Roman"/>
+                <w:b w:val="0"/>
+                <w:i w:val="0"/>
+                <w:sz w:val="18"/>
+              </w:rPr>
+              <w:t>0</w:t>
+            </w:r>
+          </w:p>
+        </w:tc>
+      </w:tr>
+    </w:tbl>
     <w:p>
       <w:pPr>
         <w:pStyle w:val="Heading2"/>

</xml_diff>

<commit_message>
figures: restyle figures 2-4 in the muted figure1-v4 visual language
</commit_message>
<xml_diff>
--- a/outputs/submission/manuscript.en.docx
+++ b/outputs/submission/manuscript.en.docx
@@ -5554,7 +5554,7 @@
       <w:r>
         <w:drawing>
           <wp:inline xmlns:a="http://schemas.openxmlformats.org/drawingml/2006/main" xmlns:pic="http://schemas.openxmlformats.org/drawingml/2006/picture">
-            <wp:extent cx="5760000" cy="2176671"/>
+            <wp:extent cx="5760000" cy="2249842"/>
             <wp:docPr id="2" name="Picture 2"/>
             <wp:cNvGraphicFramePr>
               <a:graphicFrameLocks noChangeAspect="1"/>
@@ -5575,7 +5575,7 @@
                   <pic:spPr>
                     <a:xfrm>
                       <a:off x="0" y="0"/>
-                      <a:ext cx="5760000" cy="2176671"/>
+                      <a:ext cx="5760000" cy="2249842"/>
                     </a:xfrm>
                     <a:prstGeom prst="rect"/>
                   </pic:spPr>
@@ -5667,7 +5667,7 @@
       <w:r>
         <w:drawing>
           <wp:inline xmlns:a="http://schemas.openxmlformats.org/drawingml/2006/main" xmlns:pic="http://schemas.openxmlformats.org/drawingml/2006/picture">
-            <wp:extent cx="5760000" cy="1953699"/>
+            <wp:extent cx="5760000" cy="2040320"/>
             <wp:docPr id="3" name="Picture 3"/>
             <wp:cNvGraphicFramePr>
               <a:graphicFrameLocks noChangeAspect="1"/>
@@ -5688,7 +5688,7 @@
                   <pic:spPr>
                     <a:xfrm>
                       <a:off x="0" y="0"/>
-                      <a:ext cx="5760000" cy="1953699"/>
+                      <a:ext cx="5760000" cy="2040320"/>
                     </a:xfrm>
                     <a:prstGeom prst="rect"/>
                   </pic:spPr>
@@ -5756,7 +5756,7 @@
       <w:r>
         <w:drawing>
           <wp:inline xmlns:a="http://schemas.openxmlformats.org/drawingml/2006/main" xmlns:pic="http://schemas.openxmlformats.org/drawingml/2006/picture">
-            <wp:extent cx="5760000" cy="2137143"/>
+            <wp:extent cx="5760000" cy="2231859"/>
             <wp:docPr id="4" name="Picture 4"/>
             <wp:cNvGraphicFramePr>
               <a:graphicFrameLocks noChangeAspect="1"/>
@@ -5777,7 +5777,7 @@
                   <pic:spPr>
                     <a:xfrm>
                       <a:off x="0" y="0"/>
-                      <a:ext cx="5760000" cy="2137143"/>
+                      <a:ext cx="5760000" cy="2231859"/>
                     </a:xfrm>
                     <a:prstGeom prst="rect"/>
                   </pic:spPr>

</xml_diff>

<commit_message>
fig2: finalize panel-b layout (wider panel, two-line metric labels) in all formats
</commit_message>
<xml_diff>
--- a/outputs/submission/manuscript.en.docx
+++ b/outputs/submission/manuscript.en.docx
@@ -5554,7 +5554,7 @@
       <w:r>
         <w:drawing>
           <wp:inline xmlns:a="http://schemas.openxmlformats.org/drawingml/2006/main" xmlns:pic="http://schemas.openxmlformats.org/drawingml/2006/picture">
-            <wp:extent cx="5760000" cy="2249842"/>
+            <wp:extent cx="5760000" cy="2223465"/>
             <wp:docPr id="2" name="Picture 2"/>
             <wp:cNvGraphicFramePr>
               <a:graphicFrameLocks noChangeAspect="1"/>
@@ -5575,7 +5575,7 @@
                   <pic:spPr>
                     <a:xfrm>
                       <a:off x="0" y="0"/>
-                      <a:ext cx="5760000" cy="2249842"/>
+                      <a:ext cx="5760000" cy="2223465"/>
                     </a:xfrm>
                     <a:prstGeom prst="rect"/>
                   </pic:spPr>

</xml_diff>

<commit_message>
fig2: panel (c) switched to horizontal grouped bars - full class names on the y-axis, legend below the panel; no more tick crowding at any width
</commit_message>
<xml_diff>
--- a/outputs/submission/manuscript.en.docx
+++ b/outputs/submission/manuscript.en.docx
@@ -5554,7 +5554,7 @@
       <w:r>
         <w:drawing>
           <wp:inline xmlns:a="http://schemas.openxmlformats.org/drawingml/2006/main" xmlns:pic="http://schemas.openxmlformats.org/drawingml/2006/picture">
-            <wp:extent cx="5760000" cy="2223465"/>
+            <wp:extent cx="5760000" cy="1975914"/>
             <wp:docPr id="2" name="Picture 2"/>
             <wp:cNvGraphicFramePr>
               <a:graphicFrameLocks noChangeAspect="1"/>
@@ -5575,7 +5575,7 @@
                   <pic:spPr>
                     <a:xfrm>
                       <a:off x="0" y="0"/>
-                      <a:ext cx="5760000" cy="2223465"/>
+                      <a:ext cx="5760000" cy="1975914"/>
                     </a:xfrm>
                     <a:prstGeom prst="rect"/>
                   </pic:spPr>

</xml_diff>

<commit_message>
manuscript: motivation-first rewrite of abstract and introduction
</commit_message>
<xml_diff>
--- a/outputs/submission/manuscript.en.docx
+++ b/outputs/submission/manuscript.en.docx
@@ -124,7 +124,7 @@
           <w:b w:val="0"/>
           <w:i w:val="0"/>
         </w:rPr>
-        <w:t xml:space="preserve"> abstract 248 / main text ~3,300 (excl. tables, legends, references)</w:t>
+        <w:t xml:space="preserve"> abstract 250 / main text ~3,300 (excl. tables, legends, references)</w:t>
       </w:r>
     </w:p>
     <w:p>
@@ -165,7 +165,7 @@
           <w:b w:val="0"/>
           <w:i w:val="0"/>
         </w:rPr>
-        <w:t xml:space="preserve"> Prostate biopsy decisions must weigh patient-specific MRI quality, biopsy scheme, route, prophylaxis, and treatment-planning needs. The ProBIOPSY consensus (112 final statements) codifies this pathway but is not an executable decision artifact. Large language models (LLMs) hallucinate and lack traceability; retrieval-augmented generation (RAG) mitigates hallucination but provides no deterministic safety guarantees.</w:t>
+        <w:t xml:space="preserve"> Prostate biopsy is a complex, multi-step procedure with insufficient standardisation of patient selection, instruments, technique, and strategy. Whether a single biopsy strategy suffices to plan all localised treatments is unclear, and decisions diverge with operator experience. A standardised, consensus-based biopsy checklist stored in a computer and callable at the point of need would standardise practice. Artificial intelligence shows promise, but accuracy limits applications: large language models (LLMs) hallucinate and lack traceability, and retrieval-augmented generation (RAG) offers no deterministic safety guarantees.</w:t>
       </w:r>
     </w:p>
     <w:p>
@@ -183,7 +183,7 @@
           <w:b w:val="0"/>
           <w:i w:val="0"/>
         </w:rPr>
-        <w:t xml:space="preserve"> We developed QianLieAnHui, a three-layer decision-support agent: (1) a deterministic rule engine (12 consensus + 4 patient-factor escalation rules, cross-checked against EAU and AUA/ASTRO guidelines) emitting hard constraints; (2) risk-guided retrieval over a LightRAG knowledge graph (357 evidence chunks, 1,864 entities, 3,078 relations, traceable to the consensus); (3) an LLM arbiter emitting one of five executable actions with statement-level citations. Four methods × five seeds × 112 statements (2,240 runs) were benchmarked under one fixed generator (GLM-5.3-Flash); baselines were re-run with flagship-tier GLM-5.3.</w:t>
+        <w:t xml:space="preserve"> We developed QianLieAnHui, a three-layer agent turning the ProBIOPSY consensus into such an executable checklist: (1) a deterministic rule engine (16 rules, cross-checked against EAU and AUA/ASTRO guidelines) emitting hard constraints; (2) retrieval over a LightRAG knowledge graph (357 chunks, 1,864 entities, 3,078 relations); (3) an LLM arbiter emitting one of five executable actions with statement-level citations. Benchmark: four architectures × five seeds × 112 statements (2,240 runs; fixed generator, GLM-5.3-Flash).</w:t>
       </w:r>
     </w:p>
     <w:p>
@@ -201,7 +201,7 @@
           <w:b w:val="0"/>
           <w:i w:val="0"/>
         </w:rPr>
-        <w:t xml:space="preserve"> The agent achieved exact-5 accuracy 0.805±0.012 (±SD over 5 seeds), Cohen's κ 0.730±0.016, and against-class F1 0.908±0.023, versus strongest baseline LightRAG-only (0.613, 0.536, 0.525, 0.881), naive RAG (0.605, 0.514, 0.512, 0.890), and pure LLM (0.304, 0.254, 0.079, 0.346); all differences significant (FDR-adjusted p ≤ 0.001). Retrieval baselines collapsed onto frequent classes (conditional: 0.8% of retrieval-baseline runs versus 17.0% for the agent). Upgrading the generator did not rescue naive RAG (0.605→0.538).</w:t>
+        <w:t xml:space="preserve"> The agent achieved exact-5 accuracy 0.805±0.012 (5 seeds), Cohen's κ 0.730±0.016, and against-class F1 0.908±0.023, versus LightRAG-only 0.613/0.536/0.525/0.881 (best), naive RAG 0.605/0.514/0.512/0.890, and pure LLM 0.304/0.254/0.079/0.346; all p ≤ 0.001, FDR-adjusted. Retrieval baselines collapsed onto frequent classes (conditional: 0.8% of baseline runs versus 17.0% for the agent). Flagship generators did not rescue naive RAG (0.605→0.538).</w:t>
       </w:r>
     </w:p>
     <w:p>
@@ -219,7 +219,7 @@
           <w:b w:val="0"/>
           <w:i w:val="0"/>
         </w:rPr>
-        <w:t xml:space="preserve"> Fine-grained action-space competence must be built into the architecture—rule-level priors and hard constraints—not delegated to prompting or larger models. Architecture, not generator tier, was the dominant lever; every output traces to consensus statements and evidence chunks, supporting clinical governance audits.</w:t>
+        <w:t xml:space="preserve"> QianLieAnHui standardises biopsy decisions across the entire pathway (indication, procedure, treatment planning) at accuracy suitable for pilot evaluation. Architecture, not generator tier, was the dominant lever; every output traces to consensus statements and evidence chunks for auditable, standardised practice.</w:t>
       </w:r>
     </w:p>
     <w:p>
@@ -252,7 +252,7 @@
           <w:b w:val="0"/>
           <w:i w:val="0"/>
         </w:rPr>
-        <w:t>Prostate cancer is among the most common malignancies in men [1,2]; population-level PSA screening reduces disease-specific mortality [3] and directs a diagnostic pathway whose cornerstone is biopsy [4]. The modern biopsy pathway extends far beyond a single "to biopsy or not" question: whether to add systematic cores to MRI-targeted cores [5], which saturation scheme to use [6], transperineal versus transrectal access — whose sepsis and pain trade-offs have now been quantified by a multicentre randomised trial and a meta-analysis of randomised trials [7,8] — anaesthesia and antimicrobial prophylaxis, where targeted versus empirical strategies measurably change post-biopsy sepsis risk [9], and whether the harvested tissue satisfies the demands of subsequent treatment planning, given the persistent biopsy-to-prostatectomy grade discordance [10]. These choices must all be weighed against patient-specific factors — PI-RADS grade [11], PSA density [12], MRI quality, prior negative biopsy, anticoagulation, urinary-tract-infection risk factors, prostate volume, and more — against the backdrop of a complication burden that is far from negligible [13,14], and as codified in the EAU Prostate Cancer Guidelines [15], the AUA/ASTRO Clinically Localized Prostate Cancer Guideline [16] with its 2026 Amendment [17], and the ProBIOPSY consensus [4]. This pathway rests on validated mpMRI diagnostic accuracy [18], tempered by moderate inter-reader agreement for PI-RADS version 2 [19], and on repeated demonstrations that MRI-targeted sampling improves clinically significant cancer detection [20-23]. The ProBIOPSY consensus, a multidisciplinary international effort published in 2026, codified this pathway into 112 final statements and documented substantial international practice variation [4].</w:t>
+        <w:t>Prostate cancer is among the most common malignancies in men [1,2], and population-level PSA screening reduces disease-specific mortality [3] while making biopsy the cornerstone of the diagnostic pathway [4]. The procedure itself, however, is a complex, multi-step intervention that remains insufficiently standardised: patient selection, equipment, technique, and biopsy strategy vary across and within institutions, and the ProBIOPSY consensus documented substantial international practice variation [4]. Whether a single biopsy strategy can provide enough information to plan every type of localised treatment is itself unresolved — it depends on whether systematic cores are added to MRI-targeted cores [5], which saturation scheme is used [6], and how far biopsy-to-prostatectomy grade discordance distorts downstream planning [7]. Nor are biopsy decisions operator-independent: pathway-relevant MRI findings, graded with PI-RADS [8] and quality-scored with PI-QUAL [9], show only moderate inter-reader agreement [10], and PSA-density thresholds temper the decision to biopsy [11].</w:t>
       </w:r>
     </w:p>
     <w:p>
@@ -262,6 +262,16 @@
           <w:b w:val="0"/>
           <w:i w:val="0"/>
         </w:rPr>
+        <w:t>Each of these choices carries weight. The modern pathway rests on validated mpMRI diagnostic accuracy [12] and repeated demonstrations that MRI-targeted sampling improves clinically significant cancer detection [13-16]; the transperineal-versus-transrectal trade-off has now been quantified in a multicentre randomised trial and an RCT meta-analysis [17,18]; targeted versus empirical prophylaxis measurably changes post-biopsy sepsis risk [19]; and the complication burden is far from negligible [20,21]. Written guidance is converging on the same decision points — the EAU Prostate Cancer Guidelines [22], the AUA/ASTRO Clinically Localized Prostate Cancer Guideline [23] with its 2026 Amendment [24], and the ProBIOPSY consensus [4] — yet written guidance alone has not standardised the procedure. This gap motivates a concrete remedy: a standardised, consensus-derived biopsy checklist, stored in a computer and callable whenever clinicians and patients need it, so that the same evidence-based logic reaches every patient.</w:t>
+      </w:r>
+    </w:p>
+    <w:p>
+      <w:r>
+        <w:rPr>
+          <w:rFonts w:ascii="Times New Roman" w:hAnsi="Times New Roman"/>
+          <w:b w:val="0"/>
+          <w:i w:val="0"/>
+        </w:rPr>
         <w:t xml:space="preserve">Four operational pain points of this pathway motivate the present design. </w:t>
       </w:r>
       <w:r>
@@ -278,7 +288,7 @@
           <w:b w:val="0"/>
           <w:i w:val="0"/>
         </w:rPr>
-        <w:t xml:space="preserve"> Prostate biopsy carries a well-characterised complication burden [24], and the correct route, prophylaxis intensity, and scheme depend on the individual patient's risk profile — the very decisions where one-size-fits-all advice fails and a shortcut to "no biopsy" or "always biopsy" is clinically unacceptable. </w:t>
+        <w:t xml:space="preserve"> Prostate biopsy carries a well-characterised complication burden [25], and the correct route, prophylaxis intensity, and scheme depend on the individual patient's risk profile — the very decisions where one-size-fits-all advice fails and a shortcut to "no biopsy" or "always biopsy" is clinically unacceptable. </w:t>
       </w:r>
       <w:r>
         <w:rPr>
@@ -310,7 +320,7 @@
           <w:b w:val="0"/>
           <w:i w:val="0"/>
         </w:rPr>
-        <w:t xml:space="preserve"> Rule-based clinical decision support systems (CDSS) capture deterministic logic but are slow to update [25], contribute to alert fatigue [26], and struggle with natural-language evidence [27]. </w:t>
+        <w:t xml:space="preserve"> Rule-based clinical decision support systems (CDSS) capture deterministic logic but are slow to update [26], contribute to alert fatigue [27], and struggle with natural-language evidence [28]. </w:t>
       </w:r>
       <w:r>
         <w:rPr>
@@ -326,7 +336,7 @@
           <w:b w:val="0"/>
           <w:i w:val="0"/>
         </w:rPr>
-        <w:t xml:space="preserve"> Large language models (LLMs) promise flexible language understanding [28,29] and are approaching expert performance on medical question answering [30,31], yet carry well-documented risks in medicine — hallucination, unstable outputs, and unverifiable provenance [32] — and can diverge from clinical guidelines [33]. Domain-specific LLM agents are now emerging rapidly — for atrial-fibrillation patient self-management [34], suspected-hypertension management [35], prostate-cancer patient education [36], and gene-set analysis with self-verification [37] — yet these frameworks rely on retrieval and prompt-level reflection without deterministic safeguards, and none, to our knowledge, is evaluated against a statement-level guideline gold standard. RAG grounds generation in an external corpus [38], and medical RAG benchmarks show promise [39], but purely retrieval-based pipelines have no mechanism to </w:t>
+        <w:t xml:space="preserve"> Large language models (LLMs) promise flexible language understanding [29,30] and are approaching expert performance on medical question answering [31,32], yet carry well-documented risks in medicine — hallucination, unstable outputs, and unverifiable provenance [33] — and can diverge from clinical guidelines [34]. Domain-specific LLM agents are now emerging rapidly — for atrial-fibrillation patient self-management [35], suspected-hypertension management [36], prostate-cancer patient education [37], and gene-set analysis with self-verification [38] — yet these frameworks rely on retrieval and prompt-level reflection without deterministic safeguards, and none, to our knowledge, is evaluated against a statement-level guideline gold standard. RAG grounds generation in an external corpus [39], and medical RAG benchmarks show promise [40], but purely retrieval-based pipelines have no mechanism to </w:t>
       </w:r>
       <w:r>
         <w:rPr>
@@ -352,7 +362,7 @@
           <w:b w:val="0"/>
           <w:i w:val="0"/>
         </w:rPr>
-        <w:t xml:space="preserve">These failure modes are complementary — and each architectural layer is aimed at a specific pain point. A deterministic rule engine can mechanically veto non-compliant outputs; knowledge-graph retrieval can expose a traceable evidence chain; an LLM arbiter can supply linguistic flexibility. Patient-factor escalation rules turn contextual safety guidance (route, prophylaxis intensity, scheme simplification) into deterministic hard constraints rather than prompt-level exhortations; MRI-quality and reader-variability caveats are represented as explicit scenario flags that both gate rules and boost retrieval; grade-group-driven treatment-planning statements anchor the largest statement domain; and the knowledge base's version integrity is machine-verified rather than assumed. Chained as </w:t>
+        <w:t xml:space="preserve">QianLieAnHui is that checklist realised as an agent, and each architectural layer is aimed at a specific pain point. A deterministic rule engine can mechanically veto non-compliant outputs; knowledge-graph retrieval can expose a traceable evidence chain; an LLM arbiter can supply linguistic flexibility. Patient-factor escalation rules turn contextual safety guidance (route, prophylaxis intensity, scheme simplification) into deterministic hard constraints rather than prompt-level exhortations; MRI-quality and reader-variability caveats are represented as explicit scenario flags that both gate rules and boost retrieval; grade-group-driven treatment-planning statements anchor the largest statement domain; and the knowledge base's version integrity is machine-verified rather than assumed. Chained as </w:t>
       </w:r>
       <w:r>
         <w:rPr>
@@ -368,7 +378,7 @@
           <w:b w:val="0"/>
           <w:i w:val="0"/>
         </w:rPr>
-        <w:t xml:space="preserve"> — an integration consistent with emerging roadmaps for unifying large language models and knowledge graphs [40] — each layer covers the others' failure modes while preserving a complete audit trail from every output back to numbered consensus statements and evidence chunks. At the retrieval layer we adopt LightRAG [41], a graph-based dual-level retrieval framework that outperforms Microsoft GraphRAG [42] on domain question answering at a fraction of the token cost.</w:t>
+        <w:t xml:space="preserve"> — an integration consistent with emerging roadmaps for unifying large language models and knowledge graphs [41] — each layer covers the others' failure modes while preserving a complete audit trail from every output back to numbered consensus statements and evidence chunks. At the retrieval layer we adopt LightRAG [42], a graph-based dual-level retrieval framework that outperforms Microsoft GraphRAG [43] on domain question answering at a fraction of the token cost.</w:t>
       </w:r>
     </w:p>
     <w:p>
@@ -404,7 +414,7 @@
           <w:b w:val="0"/>
           <w:i w:val="0"/>
         </w:rPr>
-        <w:t xml:space="preserve"> To our knowledge the first biopsy-pathway decision-support system chaining deterministic rule hard constraints, LightRAG knowledge-graph retrieval, and LLM arbitration, aligned statement-by-statement with an international consensus.</w:t>
+        <w:t xml:space="preserve"> To our knowledge the first biopsy-pathway decision-support agent — a machine-executable consensus checklist chaining deterministic rule hard constraints, LightRAG knowledge-graph retrieval, and LLM arbitration — aligned statement-by-statement with an international consensus.</w:t>
       </w:r>
     </w:p>
     <w:p>
@@ -631,7 +641,7 @@
           <w:b w:val="0"/>
           <w:i w:val="0"/>
         </w:rPr>
-        <w:t xml:space="preserve"> (recommend against). The gold-standard action distribution is endorse 190, conditional 185, against 125, endorse_option 35, and report_option 25. Statements span three domains: indication (n = 23), procedure (n = 34), and treatment planning (n = 55, anchored by ISUP grade-group–driven treatment decisions [43]); 25 statements (22.3%) are against-class, providing a demanding test for systems with optimism bias. The five demonstration vignettes described under Results are synthetic cases built on the same registries and are not part of the 112-statement evaluation set.</w:t>
+        <w:t xml:space="preserve"> (recommend against). The gold-standard action distribution is endorse 190, conditional 185, against 125, endorse_option 35, and report_option 25. Statements span three domains: indication (n = 23), procedure (n = 34), and treatment planning (n = 55, anchored by ISUP grade-group–driven treatment decisions [44]); 25 statements (22.3%) are against-class, providing a demanding test for systems with optimism bias. The five demonstration vignettes described under Results are synthetic cases built on the same registries and are not part of the 112-statement evaluation set.</w:t>
       </w:r>
     </w:p>
     <w:p>
@@ -677,7 +687,7 @@
           <w:b w:val="0"/>
           <w:i w:val="0"/>
         </w:rPr>
-        <w:t xml:space="preserve"> Entity A (patient scenarios) contains 51 archetypes with 49 distinct scenario flags across imaging (PI-RADS grade, mpMRI/bpMRI, field strength, PI-QUAL quality [44]), laboratory markers (PSA, PSA density), history and risk (prior negative biopsy, family history, infection risk factors, anticoagulation), treatment intent, and resource availability (Table 1). Entity B (decision items) contains 54 items with 20 flags across indication (22), procedure (22), and treatment-planning linkage (10).</w:t>
+        <w:t xml:space="preserve"> Entity A (patient scenarios) contains 51 archetypes with 49 distinct scenario flags across imaging (PI-RADS grade, mpMRI/bpMRI, field strength, PI-QUAL quality [9]), laboratory markers (PSA, PSA density), history and risk (prior negative biopsy, family history, infection risk factors, anticoagulation), treatment intent, and resource availability (Table 1). Entity B (decision items) contains 54 items with 20 flags across indication (22), procedure (22), and treatment-planning linkage (10).</w:t>
       </w:r>
     </w:p>
     <w:p>
@@ -3329,7 +3339,7 @@
           <w:b w:val="0"/>
           <w:i w:val="0"/>
         </w:rPr>
-        <w:t xml:space="preserve"> The corpus comprises 357 evidence chunks, all sourced from the ProBIOPSY consensus and its supplementary material: the 112 final statements (evidence level B), 20 narrative passages, 7 systematic-review summaries, and 218 literature entries extracted from the consensus reference lists (level C). The index was built with LightRAG [41] (lightrag-hku 1.5.7); entity and relation extraction used GLM-5.3-Flash, and the vector index used doubao-embedding-vision-251215 (dimension 2,048). The final index contains 1,864 entities and 3,078 relations (~100 MB). The full system performs risk-guided retrieval: rule matches and active decision items drive entity-boosted hybrid queries (vector + graph structure), executed in context-only mode (retrieving entities, relations, and chunks without letting LightRAG generate the answer itself). Graph context is concatenated with lexical evidence (BM25-style scoring with boosts for active decision items and scenario flags) and passed to the arbiter.</w:t>
+        <w:t xml:space="preserve"> The corpus comprises 357 evidence chunks, all sourced from the ProBIOPSY consensus and its supplementary material: the 112 final statements (evidence level B), 20 narrative passages, 7 systematic-review summaries, and 218 literature entries extracted from the consensus reference lists (level C). The index was built with LightRAG [42] (lightrag-hku 1.5.7); entity and relation extraction used GLM-5.3-Flash, and the vector index used doubao-embedding-vision-251215 (dimension 2,048). The final index contains 1,864 entities and 3,078 relations (~100 MB). The full system performs risk-guided retrieval: rule matches and active decision items drive entity-boosted hybrid queries (vector + graph structure), executed in context-only mode (retrieving entities, relations, and chunks without letting LightRAG generate the answer itself). Graph context is concatenated with lexical evidence (BM25-style scoring with boosts for active decision items and scenario flags) and passed to the arbiter.</w:t>
       </w:r>
     </w:p>
     <w:p>
@@ -3365,7 +3375,7 @@
           <w:b w:val="0"/>
           <w:i w:val="0"/>
         </w:rPr>
-        <w:t xml:space="preserve"> The rule base was cross-checked against the EAU Prostate Cancer Guidelines [15] and the AUA/ASTRO Clinically Localized Prostate Cancer Guideline [16] and its 2026 Amendment [17]; all 16 rules are consistent with these documents at the action level (mpMRI before biopsy, image-quality gating of the biopsy decision, transperineal preference where available, risk-adapted antimicrobial prophylaxis, and ISUP grade-group–driven treatment-planning linkage). Where guideline wording diverges, the ProBIOPSY consensus governs, because the consensus serves as the evaluation gold standard; divergences are recorded in the per-rule rationale fields. External guideline text was deliberately excluded from the retrieval corpus: a single-source corpus preserves a controlled consensus-conformance evaluation (see Limitations) and avoids redistribution constraints attached to copyrighted guideline text. Guideline-level recommendations therefore enter the system through the rule layer's cross-check, not through retrieval.</w:t>
+        <w:t xml:space="preserve"> The rule base was cross-checked against the EAU Prostate Cancer Guidelines [22] and the AUA/ASTRO Clinically Localized Prostate Cancer Guideline [23] and its 2026 Amendment [24]; all 16 rules are consistent with these documents at the action level (mpMRI before biopsy, image-quality gating of the biopsy decision, transperineal preference where available, risk-adapted antimicrobial prophylaxis, and ISUP grade-group–driven treatment-planning linkage). Where guideline wording diverges, the ProBIOPSY consensus governs, because the consensus serves as the evaluation gold standard; divergences are recorded in the per-rule rationale fields. External guideline text was deliberately excluded from the retrieval corpus: a single-source corpus preserves a controlled consensus-conformance evaluation (see Limitations) and avoids redistribution constraints attached to copyrighted guideline text. Guideline-level recommendations therefore enter the system through the rule layer's cross-check, not through retrieval.</w:t>
       </w:r>
     </w:p>
     <w:p>
@@ -5006,7 +5016,7 @@
           <w:b w:val="0"/>
           <w:i w:val="0"/>
         </w:rPr>
-        <w:t xml:space="preserve">Large language models are approaching expert-level medical question answering [31] and have generated patient-facing responses rated as more empathetic than physician responses [49]; for constrained, auditable decision support, however, our results indicate that decision architecture — not model capability — is the dominant lever. Medical RAG benchmarks such as MIRAGE [39] evaluate open-question answering accuracy, typically multiple-choice or free text; we instead map an international consensus' final statements onto five executable actions and evaluate </w:t>
+        <w:t xml:space="preserve">Large language models are approaching expert-level medical question answering [32] and have generated patient-facing responses rated as more empathetic than physician responses [49]; for constrained, auditable decision support, however, our results indicate that decision architecture — not model capability — is the dominant lever. Medical RAG benchmarks such as MIRAGE [40] evaluate open-question answering accuracy, typically multiple-choice or free text; we instead map an international consensus' final statements onto five executable actions and evaluate </w:t>
       </w:r>
       <w:r>
         <w:rPr>
@@ -5022,7 +5032,7 @@
           <w:b w:val="0"/>
           <w:i w:val="0"/>
         </w:rPr>
-        <w:t>, a property closer to clinical governance needs. Relative to GraphRAG [42] and LightRAG [41], our contribution is system-level: LightRAG remains the evidence engine, but the lightrag-only baseline demonstrates exactly what happens without a rule layer — against over-calling (sensitivity 1.000, specificity 0.922) and conditional silence. Relative to rule-based CDSS [27], our architecture compresses the auditable rule base to 16 consensus rules and delegates long-tail knowledge to graph retrieval, coupling the two via hard constraints rather than parallel voting.</w:t>
+        <w:t>, a property closer to clinical governance needs. Relative to GraphRAG [43] and LightRAG [42], our contribution is system-level: LightRAG remains the evidence engine, but the lightrag-only baseline demonstrates exactly what happens without a rule layer — against over-calling (sensitivity 1.000, specificity 0.922) and conditional silence. Relative to rule-based CDSS [28], our architecture compresses the auditable rule base to 16 consensus rules and delegates long-tail knowledge to graph retrieval, coupling the two via hard constraints rather than parallel voting.</w:t>
       </w:r>
     </w:p>
     <w:p>
@@ -5032,7 +5042,7 @@
           <w:b w:val="0"/>
           <w:i w:val="0"/>
         </w:rPr>
-        <w:t>The closest contemporaries are the domain LLM agents now appearing across medicine. PULSE, an agent for atrial-fibrillation patient self-management [34], and its hypertension analogue [35], demonstrate that retrieval plus prompt optimisation raises Likert-rated response quality across several base models; an EHR-integrated agent personalises prostate-cancer patient education [36]; GeneAgent adds self-verification over domain databases for gene-set analysis [37]. Our results explain why such gains do not automatically transfer to procedural decision support. First, their evaluation endpoint — perceived response quality — does not measure guideline conformance; a fluent and empathetic answer can still misplace a veto. Second, their safeguards are prompt-level: reflection and consistency checks persuade but do not bind, whereas hard-constrained arbitration mechanically forbids non-compliant outputs and is the only configuration that places the two nuance-bearing actions correctly. Third, these agents are patient-facing information tools, whereas QianLieAnHui is a clinician-facing procedural instrument benchmarked against 112 verifiable consensus statements with multi-seed statistics and architecture ablation — an evaluation style closer to diagnostic-test validation than to user-satisfaction scoring.</w:t>
+        <w:t>The closest contemporaries are the domain LLM agents now appearing across medicine. PULSE, an agent for atrial-fibrillation patient self-management [35], and its hypertension analogue [36], demonstrate that retrieval plus prompt optimisation raises Likert-rated response quality across several base models; an EHR-integrated agent personalises prostate-cancer patient education [37]; GeneAgent adds self-verification over domain databases for gene-set analysis [38]. Our results explain why such gains do not automatically transfer to procedural decision support. First, their evaluation endpoint — perceived response quality — does not measure guideline conformance; a fluent and empathetic answer can still misplace a veto. Second, their safeguards are prompt-level: reflection and consistency checks persuade but do not bind, whereas hard-constrained arbitration mechanically forbids non-compliant outputs and is the only configuration that places the two nuance-bearing actions correctly. Third, these agents are patient-facing information tools, whereas QianLieAnHui is a clinician-facing procedural instrument benchmarked against 112 verifiable consensus statements with multi-seed statistics and architecture ablation — an evaluation style closer to diagnostic-test validation than to user-satisfaction scoring.</w:t>
       </w:r>
     </w:p>
     <w:p>
@@ -5042,7 +5052,7 @@
           <w:b w:val="0"/>
           <w:i w:val="0"/>
         </w:rPr>
-        <w:t>The system's decision points sit squarely on the consensus of current guidelines. The EAU recommends mpMRI before biopsy, MRI-targeted sampling, risk-adapted antimicrobial prophylaxis, and transperineal access where available [15]; the AUA/ASTRO guideline and its 2026 Amendment converge on the same action-level recommendations for localized disease [16,17]. The underlying trial evidence is recent and consolidating — randomised evidence on transperineal access [7], an RCT meta-analysis across imaging-targeted and non-targeted settings [8], and targeted prophylaxis studies [9] — which is precisely why the rule base encodes only the stable decision skeleton while the updating periphery lives in retrieval: as trial evidence shifts practice, the retrieval corpus and index can be rebuilt without touching the rule layer, and the SHA-256 version-integrity check makes that coupling explicit. This division of labour also mirrors how the pathway's pain points are actually experienced at the biopsy table: the safety-critical contextual calls (route, prophylaxis, scheme) are enforced mechanically rather than left to prompt compliance; image-quality and reader-variability dependence [19] is carried as explicit scenario flags; grade-discordance-aware treatment planning [10] is anchored by the largest statement domain; and the complication burden that motivates conservatism [24] is reflected in the system's mechanically enforced veto behaviour rather than in optimism.</w:t>
+        <w:t>The system's decision points sit squarely on the consensus of current guidelines. The EAU recommends mpMRI before biopsy, MRI-targeted sampling, risk-adapted antimicrobial prophylaxis, and transperineal access where available [22]; the AUA/ASTRO guideline and its 2026 Amendment converge on the same action-level recommendations for localized disease [23,24]. The underlying trial evidence is recent and consolidating — randomised evidence on transperineal access [17], an RCT meta-analysis across imaging-targeted and non-targeted settings [18], and targeted prophylaxis studies [19] — which is precisely why the rule base encodes only the stable decision skeleton while the updating periphery lives in retrieval: as trial evidence shifts practice, the retrieval corpus and index can be rebuilt without touching the rule layer, and the SHA-256 version-integrity check makes that coupling explicit. This division of labour also mirrors how the pathway's pain points are actually experienced at the biopsy table: the safety-critical contextual calls (route, prophylaxis, scheme) are enforced mechanically rather than left to prompt compliance; image-quality and reader-variability dependence [10] is carried as explicit scenario flags; grade-discordance-aware treatment planning [7] is anchored by the largest statement domain; and the complication burden that motivates conservatism [25] is reflected in the system's mechanically enforced veto behaviour rather than in optimism.</w:t>
       </w:r>
     </w:p>
     <w:p>
@@ -5118,7 +5128,7 @@
           <w:b w:val="0"/>
           <w:i w:val="0"/>
         </w:rPr>
-        <w:t xml:space="preserve"> — the rule-file SHA-256 recorded at index build and verified live by the UI prevents the classic CDSS failure mode of a silently stale knowledge base [25].</w:t>
+        <w:t xml:space="preserve"> — the rule-file SHA-256 recorded at index build and verified live by the UI prevents the classic CDSS failure mode of a silently stale knowledge base [26].</w:t>
       </w:r>
     </w:p>
     <w:p>
@@ -6093,7 +6103,7 @@
           <w:b w:val="0"/>
           <w:i w:val="0"/>
         </w:rPr>
-        <w:t>7. Bryant RJ, Marian IR, Williams R, et al. Local anaesthetic transperineal biopsy versus transrectal prostate biopsy in prostate cancer detection (TRANSLATE): a multicentre, randomised, controlled trial. The Lancet Oncology. 2025;26(5):583-595. https://doi.org/10.1016/s1470-2045(25)00100-7</w:t>
+        <w:t>7. Epstein JI, Feng Z, Trock BJ, Pierorazio PM. Upgrading and Downgrading of Prostate Cancer from Biopsy to Radical Prostatectomy: Incidence and Predictive Factors Using the Modified Gleason Grading System and Factoring in Tertiary Grades. European Urology. 2012;61(5):1019-1024. https://doi.org/10.1016/j.eururo.2012.01.050</w:t>
       </w:r>
     </w:p>
     <w:p>
@@ -6106,7 +6116,7 @@
           <w:b w:val="0"/>
           <w:i w:val="0"/>
         </w:rPr>
-        <w:t>8. Yang YJ, Yang EJ, Nguyen TT, Choi SY. Transperineal Versus Transrectal Prostate Biopsy: A Systematic Review and Meta-analysis of Randomized Controlled Trials Across Settings With and Without Magnetic Resonance Imaging Targeting. European Urology Open Science. 2026;83:205-218. https://doi.org/10.1016/j.euros.2025.12.008</w:t>
+        <w:t>8. Turkbey B, Rosenkrantz AB, Haider MA, et al. Prostate Imaging Reporting and Data System Version 2.1: 2019 Update of Prostate Imaging Reporting and Data System Version 2. European Urology. 2019;76(3):340-351. https://doi.org/10.1016/j.eururo.2019.02.033</w:t>
       </w:r>
     </w:p>
     <w:p>
@@ -6119,7 +6129,7 @@
           <w:b w:val="0"/>
           <w:i w:val="0"/>
         </w:rPr>
-        <w:t>9. Liss MA, Kim W, Moskowitz D, Szabo RJ. Comparative Effectiveness of Targeted vs Empirical Antibiotic Prophylaxis to Prevent Sepsis from Transrectal Prostate Biopsy: A Retrospective Analysis. Journal of Urology. 2015;194(2):397-402. https://doi.org/10.1016/j.juro.2015.03.110</w:t>
+        <w:t>9. Giganti F, Allen C, Emberton M, Moore CM, Kasivisvanathan V. Prostate Imaging Quality (PI-QUAL): A New Quality Control Scoring System for Multiparametric Magnetic Resonance Imaging of the Prostate from the PRECISION trial. European Urology Oncology. 2020;3(5):615-619. https://doi.org/10.1016/j.euo.2020.06.007</w:t>
       </w:r>
     </w:p>
     <w:p>
@@ -6132,7 +6142,7 @@
           <w:b w:val="0"/>
           <w:i w:val="0"/>
         </w:rPr>
-        <w:t>10. Epstein JI, Feng Z, Trock BJ, Pierorazio PM. Upgrading and Downgrading of Prostate Cancer from Biopsy to Radical Prostatectomy: Incidence and Predictive Factors Using the Modified Gleason Grading System and Factoring in Tertiary Grades. European Urology. 2012;61(5):1019-1024. https://doi.org/10.1016/j.eururo.2012.01.050</w:t>
+        <w:t>10. Park KJ, Choi SH, Lee JS, Kim JK, Kim MH. Interreader Agreement with Prostate Imaging Reporting and Data System Version 2 for Prostate Cancer Detection: A Systematic Review and Meta-Analysis. Journal of Urology. 2020;204(4):661-670. https://doi.org/10.1097/ju.0000000000001200</w:t>
       </w:r>
     </w:p>
     <w:p>
@@ -6145,7 +6155,7 @@
           <w:b w:val="0"/>
           <w:i w:val="0"/>
         </w:rPr>
-        <w:t>11. Turkbey B, Rosenkrantz AB, Haider MA, et al. Prostate Imaging Reporting and Data System Version 2.1: 2019 Update of Prostate Imaging Reporting and Data System Version 2. European Urology. 2019;76(3):340-351. https://doi.org/10.1016/j.eururo.2019.02.033</w:t>
+        <w:t>11. Yusim I, Krenawi M, Mazor E, Novack V, Mabjeesh NJ. The use of prostate specific antigen density to predict clinically significant prostate cancer. Sci Rep. 2020;10(1):20015. https://doi.org/10.1038/s41598-020-76786-9</w:t>
       </w:r>
     </w:p>
     <w:p>
@@ -6158,7 +6168,7 @@
           <w:b w:val="0"/>
           <w:i w:val="0"/>
         </w:rPr>
-        <w:t>12. Yusim I, Krenawi M, Mazor E, Novack V, Mabjeesh NJ. The use of prostate specific antigen density to predict clinically significant prostate cancer. Sci Rep. 2020;10(1):20015. https://doi.org/10.1038/s41598-020-76786-9</w:t>
+        <w:t>12. Ahmed HU, El-Shater Bosaily A, Brown LC, et al. Diagnostic accuracy of multi-parametric MRI and TRUS biopsy in prostate cancer (PROMIS): a paired validating confirmatory study. The Lancet. 2017;389(10071):815-822. https://doi.org/10.1016/s0140-6736(16)32401-1</w:t>
       </w:r>
     </w:p>
     <w:p>
@@ -6171,7 +6181,7 @@
           <w:b w:val="0"/>
           <w:i w:val="0"/>
         </w:rPr>
-        <w:t>13. Loeb S, Vellekoop A, Ahmed HU, et al. Systematic Review of Complications of Prostate Biopsy. European Urology. 2013;64(6):876-892. https://doi.org/10.1016/j.eururo.2013.05.049</w:t>
+        <w:t>13. Ahdoot M, Wilbur AR, Reese SE, et al. MRI-Targeted, Systematic, and Combined Biopsy for Prostate Cancer Diagnosis. N Engl J Med. 2020;382(10):917-928. https://doi.org/10.1056/nejmoa1910038</w:t>
       </w:r>
     </w:p>
     <w:p>
@@ -6184,7 +6194,7 @@
           <w:b w:val="0"/>
           <w:i w:val="0"/>
         </w:rPr>
-        <w:t>14. Nam RK, Saskin R, Lee Y, et al. Increasing Hospital Admission Rates for Urological Complications After Transrectal Ultrasound Guided Prostate Biopsy. Journal of Urology. 2010;183(3):963-969. https://doi.org/10.1016/j.juro.2009.11.043</w:t>
+        <w:t>14. Klotz L, Chin J, Black PC, et al. Comparison of Multiparametric Magnetic Resonance Imaging–Targeted Biopsy With Systematic Transrectal Ultrasonography Biopsy for Biopsy-Naive Men at Risk for Prostate Cancer: A Phase 3 Randomized Clinical Trial. JAMA Oncol. 2021;7(4):534. https://doi.org/10.1001/jamaoncol.2020.7589</w:t>
       </w:r>
     </w:p>
     <w:p>
@@ -6197,7 +6207,7 @@
           <w:b w:val="0"/>
           <w:i w:val="0"/>
         </w:rPr>
-        <w:t>15. European Association of Urology. EAU Guidelines on Prostate Cancer. Arnhem: European Association of Urology; 2026. https://uroweb.org/guidelines/prostate-cancer (living guideline, accessed September 2026).</w:t>
+        <w:t>15. Elkhoury FF, Felker ER, Kwan L, et al. Comparison of Targeted vs Systematic Prostate Biopsy in Men Who Are Biopsy Naive: The Prospective Assessment of Image Registration in the Diagnosis of Prostate Cancer (PAIREDCAP) Study. JAMA Surg. 2019;154(9):811. https://doi.org/10.1001/jamasurg.2019.1734</w:t>
       </w:r>
     </w:p>
     <w:p>
@@ -6210,7 +6220,7 @@
           <w:b w:val="0"/>
           <w:i w:val="0"/>
         </w:rPr>
-        <w:t>16. Eastham JA, Auffenberg GB, Barocas DA, et al. Clinically Localized Prostate Cancer: AUA/ASTRO Guideline, Part I: Introduction, Risk Assessment, Staging, and Risk-Based Management. Journal of Urology. 2022;208(1):10-18. https://doi.org/10.1097/ju.0000000000002757</w:t>
+        <w:t>16. Costa DN, Goldberg K, Leon ADD, et al. Magnetic Resonance Imaging–guided In-bore and Magnetic Resonance Imaging-transrectal Ultrasound Fusion Targeted Prostate Biopsies: An Adjusted Comparison of Clinically Significant Prostate Cancer Detection Rate. European Urology Oncology. 2019;2(4):397-404. https://doi.org/10.1016/j.euo.2018.08.022</w:t>
       </w:r>
     </w:p>
     <w:p>
@@ -6223,7 +6233,7 @@
           <w:b w:val="0"/>
           <w:i w:val="0"/>
         </w:rPr>
-        <w:t>17. Eastham JA, Barocas DA, Chu CE, et al. Clinically Localized Prostate Cancer: AUA/ASTRO Guideline Amendment (2026). J Urol. 2026;216(1):2-11. https://doi.org/10.1097/ju.0000000000005060</w:t>
+        <w:t>17. Bryant RJ, Marian IR, Williams R, et al. Local anaesthetic transperineal biopsy versus transrectal prostate biopsy in prostate cancer detection (TRANSLATE): a multicentre, randomised, controlled trial. The Lancet Oncology. 2025;26(5):583-595. https://doi.org/10.1016/s1470-2045(25)00100-7</w:t>
       </w:r>
     </w:p>
     <w:p>
@@ -6236,7 +6246,7 @@
           <w:b w:val="0"/>
           <w:i w:val="0"/>
         </w:rPr>
-        <w:t>18. Ahmed HU, El-Shater Bosaily A, Brown LC, et al. Diagnostic accuracy of multi-parametric MRI and TRUS biopsy in prostate cancer (PROMIS): a paired validating confirmatory study. The Lancet. 2017;389(10071):815-822. https://doi.org/10.1016/s0140-6736(16)32401-1</w:t>
+        <w:t>18. Yang YJ, Yang EJ, Nguyen TT, Choi SY. Transperineal Versus Transrectal Prostate Biopsy: A Systematic Review and Meta-analysis of Randomized Controlled Trials Across Settings With and Without Magnetic Resonance Imaging Targeting. European Urology Open Science. 2026;83:205-218. https://doi.org/10.1016/j.euros.2025.12.008</w:t>
       </w:r>
     </w:p>
     <w:p>
@@ -6249,7 +6259,7 @@
           <w:b w:val="0"/>
           <w:i w:val="0"/>
         </w:rPr>
-        <w:t>19. Park KJ, Choi SH, Lee JS, Kim JK, Kim MH. Interreader Agreement with Prostate Imaging Reporting and Data System Version 2 for Prostate Cancer Detection: A Systematic Review and Meta-Analysis. Journal of Urology. 2020;204(4):661-670. https://doi.org/10.1097/ju.0000000000001200</w:t>
+        <w:t>19. Liss MA, Kim W, Moskowitz D, Szabo RJ. Comparative Effectiveness of Targeted vs Empirical Antibiotic Prophylaxis to Prevent Sepsis from Transrectal Prostate Biopsy: A Retrospective Analysis. Journal of Urology. 2015;194(2):397-402. https://doi.org/10.1016/j.juro.2015.03.110</w:t>
       </w:r>
     </w:p>
     <w:p>
@@ -6262,7 +6272,7 @@
           <w:b w:val="0"/>
           <w:i w:val="0"/>
         </w:rPr>
-        <w:t>20. Ahdoot M, Wilbur AR, Reese SE, et al. MRI-Targeted, Systematic, and Combined Biopsy for Prostate Cancer Diagnosis. N Engl J Med. 2020;382(10):917-928. https://doi.org/10.1056/nejmoa1910038</w:t>
+        <w:t>20. Loeb S, Vellekoop A, Ahmed HU, et al. Systematic Review of Complications of Prostate Biopsy. European Urology. 2013;64(6):876-892. https://doi.org/10.1016/j.eururo.2013.05.049</w:t>
       </w:r>
     </w:p>
     <w:p>
@@ -6275,7 +6285,7 @@
           <w:b w:val="0"/>
           <w:i w:val="0"/>
         </w:rPr>
-        <w:t>21. Klotz L, Chin J, Black PC, et al. Comparison of Multiparametric Magnetic Resonance Imaging–Targeted Biopsy With Systematic Transrectal Ultrasonography Biopsy for Biopsy-Naive Men at Risk for Prostate Cancer: A Phase 3 Randomized Clinical Trial. JAMA Oncol. 2021;7(4):534. https://doi.org/10.1001/jamaoncol.2020.7589</w:t>
+        <w:t>21. Nam RK, Saskin R, Lee Y, et al. Increasing Hospital Admission Rates for Urological Complications After Transrectal Ultrasound Guided Prostate Biopsy. Journal of Urology. 2010;183(3):963-969. https://doi.org/10.1016/j.juro.2009.11.043</w:t>
       </w:r>
     </w:p>
     <w:p>
@@ -6288,7 +6298,7 @@
           <w:b w:val="0"/>
           <w:i w:val="0"/>
         </w:rPr>
-        <w:t>22. Elkhoury FF, Felker ER, Kwan L, et al. Comparison of Targeted vs Systematic Prostate Biopsy in Men Who Are Biopsy Naive: The Prospective Assessment of Image Registration in the Diagnosis of Prostate Cancer (PAIREDCAP) Study. JAMA Surg. 2019;154(9):811. https://doi.org/10.1001/jamasurg.2019.1734</w:t>
+        <w:t>22. European Association of Urology. EAU Guidelines on Prostate Cancer. Arnhem: European Association of Urology; 2026. https://uroweb.org/guidelines/prostate-cancer (living guideline, accessed September 2026).</w:t>
       </w:r>
     </w:p>
     <w:p>
@@ -6301,7 +6311,7 @@
           <w:b w:val="0"/>
           <w:i w:val="0"/>
         </w:rPr>
-        <w:t>23. Costa DN, Goldberg K, Leon ADD, et al. Magnetic Resonance Imaging–guided In-bore and Magnetic Resonance Imaging-transrectal Ultrasound Fusion Targeted Prostate Biopsies: An Adjusted Comparison of Clinically Significant Prostate Cancer Detection Rate. European Urology Oncology. 2019;2(4):397-404. https://doi.org/10.1016/j.euo.2018.08.022</w:t>
+        <w:t>23. Eastham JA, Auffenberg GB, Barocas DA, et al. Clinically Localized Prostate Cancer: AUA/ASTRO Guideline, Part I: Introduction, Risk Assessment, Staging, and Risk-Based Management. Journal of Urology. 2022;208(1):10-18. https://doi.org/10.1097/ju.0000000000002757</w:t>
       </w:r>
     </w:p>
     <w:p>
@@ -6314,7 +6324,7 @@
           <w:b w:val="0"/>
           <w:i w:val="0"/>
         </w:rPr>
-        <w:t>24. Borghesi M, Ahmed H, Nam R, et al. Complications After Systematic, Random, and Image-guided Prostate Biopsy. European Urology. 2017;71(3):353-365. https://doi.org/10.1016/j.eururo.2016.08.004</w:t>
+        <w:t>24. Eastham JA, Barocas DA, Chu CE, et al. Clinically Localized Prostate Cancer: AUA/ASTRO Guideline Amendment (2026). J Urol. 2026;216(1):2-11. https://doi.org/10.1097/ju.0000000000005060</w:t>
       </w:r>
     </w:p>
     <w:p>
@@ -6327,7 +6337,7 @@
           <w:b w:val="0"/>
           <w:i w:val="0"/>
         </w:rPr>
-        <w:t>25. Hao S, Chai C, Li G, Tang N, Wang N, Yu X. Outdated Fact Detection in Knowledge Bases. In: 2020 IEEE 36th International Conference on Data Engineering (ICDE). IEEE; 2020:1890-1893. https://doi.org/10.1109/icde48307.2020.00196</w:t>
+        <w:t>25. Borghesi M, Ahmed H, Nam R, et al. Complications After Systematic, Random, and Image-guided Prostate Biopsy. European Urology. 2017;71(3):353-365. https://doi.org/10.1016/j.eururo.2016.08.004</w:t>
       </w:r>
     </w:p>
     <w:p>
@@ -6340,7 +6350,7 @@
           <w:b w:val="0"/>
           <w:i w:val="0"/>
         </w:rPr>
-        <w:t>26. Ray CE, Wilson GM, Hughes AM, et al. Alert fatigue measurement in clinical decision support: a systematic review. Journal of the American Medical Informatics Association. 2026;33(8):1523-1531. https://doi.org/10.1093/jamia/ocag064</w:t>
+        <w:t>26. Hao S, Chai C, Li G, Tang N, Wang N, Yu X. Outdated Fact Detection in Knowledge Bases. In: 2020 IEEE 36th International Conference on Data Engineering (ICDE). IEEE; 2020:1890-1893. https://doi.org/10.1109/icde48307.2020.00196</w:t>
       </w:r>
     </w:p>
     <w:p>
@@ -6353,7 +6363,7 @@
           <w:b w:val="0"/>
           <w:i w:val="0"/>
         </w:rPr>
-        <w:t>27. Sutton RT, Pincock D, Baumgart DC, Sadowski DC, Fedorak RN, Kroeker KI. An overview of clinical decision support systems: benefits, risks, and strategies for success. npj Digit. Med. 2020;3(1):17. https://doi.org/10.1038/s41746-020-0221-y</w:t>
+        <w:t>27. Ray CE, Wilson GM, Hughes AM, et al. Alert fatigue measurement in clinical decision support: a systematic review. Journal of the American Medical Informatics Association. 2026;33(8):1523-1531. https://doi.org/10.1093/jamia/ocag064</w:t>
       </w:r>
     </w:p>
     <w:p>
@@ -6366,7 +6376,7 @@
           <w:b w:val="0"/>
           <w:i w:val="0"/>
         </w:rPr>
-        <w:t>28. Rajpurkar P, Chen E, Banerjee O, Topol EJ. AI in health and medicine. Nat Med. 2022;28(1):31-38. https://doi.org/10.1038/s41591-021-01614-0</w:t>
+        <w:t>28. Sutton RT, Pincock D, Baumgart DC, Sadowski DC, Fedorak RN, Kroeker KI. An overview of clinical decision support systems: benefits, risks, and strategies for success. npj Digit. Med. 2020;3(1):17. https://doi.org/10.1038/s41746-020-0221-y</w:t>
       </w:r>
     </w:p>
     <w:p>
@@ -6379,7 +6389,7 @@
           <w:b w:val="0"/>
           <w:i w:val="0"/>
         </w:rPr>
-        <w:t>29. Thirunavukarasu AJ, Ting DSJ, Elangovan K, Gutierrez L, Tan TF, Ting DSW. Large language models in medicine. Nat Med. 2023;29(8):1930-1940. https://doi.org/10.1038/s41591-023-02448-8</w:t>
+        <w:t>29. Rajpurkar P, Chen E, Banerjee O, Topol EJ. AI in health and medicine. Nat Med. 2022;28(1):31-38. https://doi.org/10.1038/s41591-021-01614-0</w:t>
       </w:r>
     </w:p>
     <w:p>
@@ -6392,7 +6402,7 @@
           <w:b w:val="0"/>
           <w:i w:val="0"/>
         </w:rPr>
-        <w:t>30. Singhal K, Azizi S, Tu T, et al. Large language models encode clinical knowledge. Nature. 2023;620(7972):172-180. https://doi.org/10.1038/s41586-023-06291-2</w:t>
+        <w:t>30. Thirunavukarasu AJ, Ting DSJ, Elangovan K, Gutierrez L, Tan TF, Ting DSW. Large language models in medicine. Nat Med. 2023;29(8):1930-1940. https://doi.org/10.1038/s41591-023-02448-8</w:t>
       </w:r>
     </w:p>
     <w:p>
@@ -6405,7 +6415,7 @@
           <w:b w:val="0"/>
           <w:i w:val="0"/>
         </w:rPr>
-        <w:t>31. Singhal K, Tu T, Gottweis J, et al. Toward expert-level medical question answering with large language models. Nat Med. 2025;31(3):943-950. https://doi.org/10.1038/s41591-024-03423-7</w:t>
+        <w:t>31. Singhal K, Azizi S, Tu T, et al. Large language models encode clinical knowledge. Nature. 2023;620(7972):172-180. https://doi.org/10.1038/s41586-023-06291-2</w:t>
       </w:r>
     </w:p>
     <w:p>
@@ -6418,7 +6428,7 @@
           <w:b w:val="0"/>
           <w:i w:val="0"/>
         </w:rPr>
-        <w:t>32. Ji Z, Lee N, Frieske R, et al. Survey of Hallucination in Natural Language Generation. ACM Comput. Surv. 2023;55(12):1-38. https://doi.org/10.1145/3571730</w:t>
+        <w:t>32. Singhal K, Tu T, Gottweis J, et al. Toward expert-level medical question answering with large language models. Nat Med. 2025;31(3):943-950. https://doi.org/10.1038/s41591-024-03423-7</w:t>
       </w:r>
     </w:p>
     <w:p>
@@ -6431,7 +6441,7 @@
           <w:b w:val="0"/>
           <w:i w:val="0"/>
         </w:rPr>
-        <w:t>33. Fast D, Adams LC, Busch F, et al. Autonomous medical evaluation for guideline adherence of large language models. npj Digit. Med. 2024;7(1):358. https://doi.org/10.1038/s41746-024-01356-6</w:t>
+        <w:t>33. Ji Z, Lee N, Frieske R, et al. Survey of Hallucination in Natural Language Generation. ACM Comput. Surv. 2023;55(12):1-38. https://doi.org/10.1145/3571730</w:t>
       </w:r>
     </w:p>
     <w:p>
@@ -6444,7 +6454,7 @@
           <w:b w:val="0"/>
           <w:i w:val="0"/>
         </w:rPr>
-        <w:t>34. Wang Y, Peng C, Hu R, et al. A knowledge-enhanced domain-aware large language model agent for atrial fibrillation management. npj Digit. Med. 2026. https://doi.org/10.1038/s41746-026-03038-x</w:t>
+        <w:t>34. Fast D, Adams LC, Busch F, et al. Autonomous medical evaluation for guideline adherence of large language models. npj Digit. Med. 2024;7(1):358. https://doi.org/10.1038/s41746-024-01356-6</w:t>
       </w:r>
     </w:p>
     <w:p>
@@ -6457,7 +6467,7 @@
           <w:b w:val="0"/>
           <w:i w:val="0"/>
         </w:rPr>
-        <w:t>35. Wang Y, Tan W, Cheng S, et al. Large Language Model Agent for Managing Patients With Suspected Hypertension. Hypertension. 2026;83(1):212-224. https://doi.org/10.1161/hypertensionaha.125.25305</w:t>
+        <w:t>35. Wang Y, Peng C, Hu R, et al. A knowledge-enhanced domain-aware large language model agent for atrial fibrillation management. npj Digit. Med. 2026. https://doi.org/10.1038/s41746-026-03038-x</w:t>
       </w:r>
     </w:p>
     <w:p>
@@ -6470,7 +6480,7 @@
           <w:b w:val="0"/>
           <w:i w:val="0"/>
         </w:rPr>
-        <w:t>36. Hao Y, Holmes J, Waddle MR, et al. Personalizing prostate cancer education for patients using an EHR-Integrated LLM agent. npj Digit. Med. 2025;8(1):770. https://doi.org/10.1038/s41746-025-02166-0</w:t>
+        <w:t>36. Wang Y, Tan W, Cheng S, et al. Large Language Model Agent for Managing Patients With Suspected Hypertension. Hypertension. 2026;83(1):212-224. https://doi.org/10.1161/hypertensionaha.125.25305</w:t>
       </w:r>
     </w:p>
     <w:p>
@@ -6483,7 +6493,7 @@
           <w:b w:val="0"/>
           <w:i w:val="0"/>
         </w:rPr>
-        <w:t>37. Wang Z, Jin Q, Wei CH, et al. GeneAgent: self-verification language agent for gene-set analysis using domain databases. Nat Methods. 2025;22(8):1677-1685. https://doi.org/10.1038/s41592-025-02748-6</w:t>
+        <w:t>37. Hao Y, Holmes J, Waddle MR, et al. Personalizing prostate cancer education for patients using an EHR-Integrated LLM agent. npj Digit. Med. 2025;8(1):770. https://doi.org/10.1038/s41746-025-02166-0</w:t>
       </w:r>
     </w:p>
     <w:p>
@@ -6496,7 +6506,7 @@
           <w:b w:val="0"/>
           <w:i w:val="0"/>
         </w:rPr>
-        <w:t>38. Lewis P, Perez E, Piktus A, et al. Retrieval-augmented generation for knowledge-intensive NLP tasks. Adv Neural Inf Process Syst. 2020;33:9459-74. arXiv:2005.11401 (verified via arXiv API).</w:t>
+        <w:t>38. Wang Z, Jin Q, Wei CH, et al. GeneAgent: self-verification language agent for gene-set analysis using domain databases. Nat Methods. 2025;22(8):1677-1685. https://doi.org/10.1038/s41592-025-02748-6</w:t>
       </w:r>
     </w:p>
     <w:p>
@@ -6509,7 +6519,7 @@
           <w:b w:val="0"/>
           <w:i w:val="0"/>
         </w:rPr>
-        <w:t>39. Xiong G, Jin Q, Lu Z, Zhang A. Benchmarking Retrieval-Augmented Generation for Medicine. Findings of the Association for Computational Linguistics ACL 2024. 2024:6233-6251. https://doi.org/10.18653/v1/2024.findings-acl.372</w:t>
+        <w:t>39. Lewis P, Perez E, Piktus A, et al. Retrieval-augmented generation for knowledge-intensive NLP tasks. Adv Neural Inf Process Syst. 2020;33:9459-74. arXiv:2005.11401 (verified via arXiv API).</w:t>
       </w:r>
     </w:p>
     <w:p>
@@ -6522,7 +6532,7 @@
           <w:b w:val="0"/>
           <w:i w:val="0"/>
         </w:rPr>
-        <w:t>40. Pan S, Luo L, Wang Y, Chen C, Wang J, Wu X. Unifying Large Language Models and Knowledge Graphs: A Roadmap. IEEE Trans. Knowl. Data Eng. 2024;36(7):3580-3599. https://doi.org/10.1109/tkde.2024.3352100</w:t>
+        <w:t>40. Xiong G, Jin Q, Lu Z, Zhang A. Benchmarking Retrieval-Augmented Generation for Medicine. Findings of the Association for Computational Linguistics ACL 2024. 2024:6233-6251. https://doi.org/10.18653/v1/2024.findings-acl.372</w:t>
       </w:r>
     </w:p>
     <w:p>
@@ -6535,7 +6545,7 @@
           <w:b w:val="0"/>
           <w:i w:val="0"/>
         </w:rPr>
-        <w:t>41. Guo Z, Xia L, Yu Y, Ao T, Huang C. LightRAG: simple and fast retrieval-augmented generation. arXiv:2410.05779, 2024 (verified against arXiv listing).</w:t>
+        <w:t>41. Pan S, Luo L, Wang Y, Chen C, Wang J, Wu X. Unifying Large Language Models and Knowledge Graphs: A Roadmap. IEEE Trans. Knowl. Data Eng. 2024;36(7):3580-3599. https://doi.org/10.1109/tkde.2024.3352100</w:t>
       </w:r>
     </w:p>
     <w:p>
@@ -6548,7 +6558,7 @@
           <w:b w:val="0"/>
           <w:i w:val="0"/>
         </w:rPr>
-        <w:t>42. Edge D, Trinh H, Cheng N, et al. From local to global: a Graph RAG approach to query-focused summarization. arXiv:2404.16130, 2024 (verified via arXiv API).</w:t>
+        <w:t>42. Guo Z, Xia L, Yu Y, Ao T, Huang C. LightRAG: simple and fast retrieval-augmented generation. arXiv:2410.05779, 2024 (verified against arXiv listing).</w:t>
       </w:r>
     </w:p>
     <w:p>
@@ -6561,7 +6571,7 @@
           <w:b w:val="0"/>
           <w:i w:val="0"/>
         </w:rPr>
-        <w:t>43. Epstein JI, Amin MB, Reuter VE, Humphrey PA. Contemporary Gleason Grading of Prostatic Carcinoma: An Update With Discussion on Practical Issues to Implement the 2014 International Society of Urological Pathology (ISUP) Consensus Conference on Gleason Grading of Prostatic Carcinoma. American Journal of Surgical Pathology. 2017;41(4):e1-e7. https://doi.org/10.1097/pas.0000000000000820</w:t>
+        <w:t>43. Edge D, Trinh H, Cheng N, et al. From local to global: a Graph RAG approach to query-focused summarization. arXiv:2404.16130, 2024 (verified via arXiv API).</w:t>
       </w:r>
     </w:p>
     <w:p>
@@ -6574,7 +6584,7 @@
           <w:b w:val="0"/>
           <w:i w:val="0"/>
         </w:rPr>
-        <w:t>44. Giganti F, Allen C, Emberton M, Moore CM, Kasivisvanathan V. Prostate Imaging Quality (PI-QUAL): A New Quality Control Scoring System for Multiparametric Magnetic Resonance Imaging of the Prostate from the PRECISION trial. European Urology Oncology. 2020;3(5):615-619. https://doi.org/10.1016/j.euo.2020.06.007</w:t>
+        <w:t>44. Epstein JI, Amin MB, Reuter VE, Humphrey PA. Contemporary Gleason Grading of Prostatic Carcinoma: An Update With Discussion on Practical Issues to Implement the 2014 International Society of Urological Pathology (ISUP) Consensus Conference on Gleason Grading of Prostatic Carcinoma. American Journal of Surgical Pathology. 2017;41(4):e1-e7. https://doi.org/10.1097/pas.0000000000000820</w:t>
       </w:r>
     </w:p>
     <w:p>

</xml_diff>

<commit_message>
manuscript: add Yaoshi-RAG citation (refs 53->54) + concrete clinical example
</commit_message>
<xml_diff>
--- a/outputs/submission/manuscript.en.docx
+++ b/outputs/submission/manuscript.en.docx
@@ -124,7 +124,7 @@
           <w:b w:val="0"/>
           <w:i w:val="0"/>
         </w:rPr>
-        <w:t xml:space="preserve"> abstract 250 / main text ~3,300 (excl. tables, legends, references)</w:t>
+        <w:t xml:space="preserve"> abstract 249 / main text ~3,300 (excl. tables, legends, references)</w:t>
       </w:r>
     </w:p>
     <w:p>
@@ -165,7 +165,7 @@
           <w:b w:val="0"/>
           <w:i w:val="0"/>
         </w:rPr>
-        <w:t xml:space="preserve"> Prostate biopsy is a complex, multi-step procedure with insufficient standardisation of patient selection, instruments, technique, and strategy. Whether a single biopsy strategy suffices to plan all localised treatments is unclear, and decisions diverge with operator experience. A standardised, consensus-based biopsy checklist stored in a computer and callable at the point of need would standardise practice. Artificial intelligence shows promise, but accuracy limits applications: large language models (LLMs) hallucinate and lack traceability, and retrieval-augmented generation (RAG) offers no deterministic safety guarantees.</w:t>
+        <w:t xml:space="preserve"> Prostate biopsy is the gateway to every treatment decision in prostate cancer, yet the procedure remains poorly standardised: whom to biopsy, how, under which scheme and route varies widely between institutions. The stakes are asymmetric: under-biopsy misses clinically significant cancer, over-biopsy harms men with indolent disease, one strategy may not inform every treatment plan, and decisions diverge with the operator. The ProBIOPSY consensus codified this pathway into 112 statements, but a written consensus cannot be executed at the decision point. We asked whether it could be executed: a checklist stored in a computer, callable when needed, auditable afterwards.</w:t>
       </w:r>
     </w:p>
     <w:p>
@@ -183,7 +183,7 @@
           <w:b w:val="0"/>
           <w:i w:val="0"/>
         </w:rPr>
-        <w:t xml:space="preserve"> We developed QianLieAnHui, a three-layer agent turning the ProBIOPSY consensus into such an executable checklist: (1) a deterministic rule engine (16 rules, cross-checked against EAU and AUA/ASTRO guidelines) emitting hard constraints; (2) retrieval over a LightRAG knowledge graph (357 chunks, 1,864 entities, 3,078 relations); (3) an LLM arbiter emitting one of five executable actions with statement-level citations. Benchmark: four architectures × five seeds × 112 statements (2,240 runs; fixed generator, GLM-5.3-Flash).</w:t>
+        <w:t xml:space="preserve"> Because large language models (LLMs) hallucinate and lack traceability, and retrieval-augmented generation (RAG) grounds answers but cannot forbid them, we developed QianLieAnHui — a three-layer agent executing the consensus as a checklist: (1) a deterministic rule engine (16 rules, cross-checked against EAU/AUA guidelines) emitting hard constraints; (2) retrieval over a LightRAG knowledge graph (357 chunks); (3) an LLM arbiter emitting one of five executable actions with statement-level citations. Benchmark: 2,240 runs (four architectures × five seeds × 112 statements, generator fixed).</w:t>
       </w:r>
     </w:p>
     <w:p>
@@ -201,7 +201,7 @@
           <w:b w:val="0"/>
           <w:i w:val="0"/>
         </w:rPr>
-        <w:t xml:space="preserve"> The agent achieved exact-5 accuracy 0.805±0.012 (5 seeds), Cohen's κ 0.730±0.016, and against-class F1 0.908±0.023, versus LightRAG-only 0.613/0.536/0.525/0.881 (best), naive RAG 0.605/0.514/0.512/0.890, and pure LLM 0.304/0.254/0.079/0.346; all p ≤ 0.001, FDR-adjusted. Retrieval baselines collapsed onto frequent classes (conditional: 0.8% of baseline runs versus 17.0% for the agent). Flagship generators did not rescue naive RAG (0.605→0.538).</w:t>
+        <w:t xml:space="preserve"> The agent achieved exact-5 accuracy 0.805±0.012, Cohen's κ 0.730±0.016, and against-class F1 0.908±0.023 — versus 0.613 for the strongest baseline — while retrieval baselines emitted the nuanced conditional class in 0.8% of runs (agent 17.0%); flagship generators did not rescue naive RAG (0.605→0.538).</w:t>
       </w:r>
     </w:p>
     <w:p>
@@ -219,7 +219,7 @@
           <w:b w:val="0"/>
           <w:i w:val="0"/>
         </w:rPr>
-        <w:t xml:space="preserve"> QianLieAnHui standardises biopsy decisions across the entire pathway (indication, procedure, treatment planning) at accuracy suitable for pilot evaluation. Architecture, not generator tier, was the dominant lever; every output traces to consensus statements and evidence chunks for auditable, standardised practice.</w:t>
+        <w:t xml:space="preserve"> Architecture, not generator tier, was the dominant lever: every output traces to numbered statements, turning a written consensus into standardised, auditable practice.</w:t>
       </w:r>
     </w:p>
     <w:p>
@@ -252,7 +252,7 @@
           <w:b w:val="0"/>
           <w:i w:val="0"/>
         </w:rPr>
-        <w:t>Prostate cancer is among the most common malignancies in men [1,2], and population-level PSA screening reduces disease-specific mortality [3] while making biopsy the cornerstone of the diagnostic pathway [4]. The procedure itself, however, is a complex, multi-step intervention that remains insufficiently standardised: patient selection, equipment, technique, and biopsy strategy vary across and within institutions, and the ProBIOPSY consensus documented substantial international practice variation [4]. Whether a single biopsy strategy can provide enough information to plan every type of localised treatment is itself unresolved — it depends on whether systematic cores are added to MRI-targeted cores [5], which saturation scheme is used [6], and how far biopsy-to-prostatectomy grade discordance distorts downstream planning [7]. Nor are biopsy decisions operator-independent: pathway-relevant MRI findings, graded with PI-RADS [8] and quality-scored with PI-QUAL [9], show only moderate inter-reader agreement [10], and PSA-density thresholds temper the decision to biopsy [11].</w:t>
+        <w:t>Biopsy is the gateway to every treatment decision in prostate cancer. The disease is among the most common malignancies in men [1,2]; population-level PSA screening lowers disease-specific mortality [3]; and what the biopsy finds — grade group, tumour burden, distribution — determines whether a man is monitored, offered focal therapy, or scheduled for radical treatment. Yet the procedure that feeds these decisions is far from standardised. Whether systematic cores should be added to MRI-targeted cores [4], which saturation scheme to use [5], transperineal versus transrectal access [6,7], and targeted versus empirical prophylaxis [8] remain live questions — as does whether MRI-targeted sampling, which demonstrably improves clinically significant cancer detection [9-12], can inform every treatment option at all. Biopsy-to-prostatectomy grade discordance complicates downstream planning [13]; the measurements the pathway leans on are themselves imperfect — mpMRI misses clinically significant cancer in a minority of men [14], PI-RADS reading agreement [15,16] and image-quality gating [17] are variable, and PSA-density thresholds [18] temper but do not settle the decision; and every configuration carries the procedure's well-characterised complication burden [19,20]. The ProBIOPSY consensus documented substantial international practice variation across exactly these choices [21].</w:t>
       </w:r>
     </w:p>
     <w:p>
@@ -262,81 +262,7 @@
           <w:b w:val="0"/>
           <w:i w:val="0"/>
         </w:rPr>
-        <w:t>Each of these choices carries weight. The modern pathway rests on validated mpMRI diagnostic accuracy [12] and repeated demonstrations that MRI-targeted sampling improves clinically significant cancer detection [13-16]; the transperineal-versus-transrectal trade-off has now been quantified in a multicentre randomised trial and an RCT meta-analysis [17,18]; targeted versus empirical prophylaxis measurably changes post-biopsy sepsis risk [19]; and the complication burden is far from negligible [20,21]. Written guidance is converging on the same decision points — the EAU Prostate Cancer Guidelines [22], the AUA/ASTRO Clinically Localized Prostate Cancer Guideline [23] with its 2026 Amendment [24], and the ProBIOPSY consensus [4] — yet written guidance alone has not standardised the procedure. This gap motivates a concrete remedy: a standardised, consensus-derived biopsy checklist, stored in a computer and callable whenever clinicians and patients need it, so that the same evidence-based logic reaches every patient.</w:t>
-      </w:r>
-    </w:p>
-    <w:p>
-      <w:r>
-        <w:rPr>
-          <w:rFonts w:ascii="Times New Roman" w:hAnsi="Times New Roman"/>
-          <w:b w:val="0"/>
-          <w:i w:val="0"/>
-        </w:rPr>
-        <w:t xml:space="preserve">Four operational pain points of this pathway motivate the present design. </w:t>
-      </w:r>
-      <w:r>
-        <w:rPr>
-          <w:rFonts w:ascii="Times New Roman" w:hAnsi="Times New Roman"/>
-          <w:b/>
-          <w:i w:val="0"/>
-        </w:rPr>
-        <w:t>(i) Contextual safety decisions that generic guidance cannot resolve.</w:t>
-      </w:r>
-      <w:r>
-        <w:rPr>
-          <w:rFonts w:ascii="Times New Roman" w:hAnsi="Times New Roman"/>
-          <w:b w:val="0"/>
-          <w:i w:val="0"/>
-        </w:rPr>
-        <w:t xml:space="preserve"> Prostate biopsy carries a well-characterised complication burden [25], and the correct route, prophylaxis intensity, and scheme depend on the individual patient's risk profile — the very decisions where one-size-fits-all advice fails and a shortcut to "no biopsy" or "always biopsy" is clinically unacceptable. </w:t>
-      </w:r>
-      <w:r>
-        <w:rPr>
-          <w:rFonts w:ascii="Times New Roman" w:hAnsi="Times New Roman"/>
-          <w:b/>
-          <w:i w:val="0"/>
-        </w:rPr>
-        <w:t>(ii) A combinatorial, non-executable evidence base.</w:t>
-      </w:r>
-      <w:r>
-        <w:rPr>
-          <w:rFonts w:ascii="Times New Roman" w:hAnsi="Times New Roman"/>
-          <w:b w:val="0"/>
-          <w:i w:val="0"/>
-        </w:rPr>
-        <w:t xml:space="preserve"> A consensus document or guideline is not an executable artifact: clinicians face a space of patient scenarios × biopsy decisions (51 scenario archetypes × 54 decision items in the registries developed here) that static lookup cannot cover. </w:t>
-      </w:r>
-      <w:r>
-        <w:rPr>
-          <w:rFonts w:ascii="Times New Roman" w:hAnsi="Times New Roman"/>
-          <w:b/>
-          <w:i w:val="0"/>
-        </w:rPr>
-        <w:t>(iii) Knowledge tools that decay or distract.</w:t>
-      </w:r>
-      <w:r>
-        <w:rPr>
-          <w:rFonts w:ascii="Times New Roman" w:hAnsi="Times New Roman"/>
-          <w:b w:val="0"/>
-          <w:i w:val="0"/>
-        </w:rPr>
-        <w:t xml:space="preserve"> Rule-based clinical decision support systems (CDSS) capture deterministic logic but are slow to update [26], contribute to alert fatigue [27], and struggle with natural-language evidence [28]. </w:t>
-      </w:r>
-      <w:r>
-        <w:rPr>
-          <w:rFonts w:ascii="Times New Roman" w:hAnsi="Times New Roman"/>
-          <w:b/>
-          <w:i w:val="0"/>
-        </w:rPr>
-        <w:t>(iv) Flexible-but-unreliable generation.</w:t>
-      </w:r>
-      <w:r>
-        <w:rPr>
-          <w:rFonts w:ascii="Times New Roman" w:hAnsi="Times New Roman"/>
-          <w:b w:val="0"/>
-          <w:i w:val="0"/>
-        </w:rPr>
-        <w:t xml:space="preserve"> Large language models (LLMs) promise flexible language understanding [29,30] and are approaching expert performance on medical question answering [31,32], yet carry well-documented risks in medicine — hallucination, unstable outputs, and unverifiable provenance [33] — and can diverge from clinical guidelines [34]. Domain-specific LLM agents are now emerging rapidly — for atrial-fibrillation patient self-management [35], suspected-hypertension management [36], prostate-cancer patient education [37], and gene-set analysis with self-verification [38] — yet these frameworks rely on retrieval and prompt-level reflection without deterministic safeguards, and none, to our knowledge, is evaluated against a statement-level guideline gold standard. RAG grounds generation in an external corpus [39], and medical RAG benchmarks show promise [40], but purely retrieval-based pipelines have no mechanism to </w:t>
+        <w:t xml:space="preserve">Written guidance has not closed these gaps. The EAU Prostate Cancer Guidelines [22], the AUA/ASTRO Clinically Localized Prostate Cancer Guideline [23] with its 2026 Amendment [24], and the ProBIOPSY consensus [21] converge on the same decision points, yet practice varies — because a guideline is reference material, not an instrument: at the decision point the clinician must assemble 51 patient-scenario archetypes × 54 biopsy decisions, each combination carrying its own evidence, and no lookup table covers the combinatorics. Software attempts fall short in complementary ways. Rule-based clinical decision support is deterministic but slow to update [25], breeds alert fatigue [26], and cannot digest natural-language evidence [27]. Large language models (LLMs) supply the missing linguistic flexibility [28,29] and approach expert performance on medical question answering [30,31], but they hallucinate and lack verifiable provenance [32], drift from guidelines as they age [33], and give confidently generic advice where patient-specific context changes the answer: asked whether a 70-year-old man with locally advanced disease should undergo extended systematic sampling, a general-purpose LLM may endorse the standard extended scheme, whereas the consensus for suspected locally advanced disease actually recommends reducing systematic biopsy to a maximum of six cores, and — despite a rapidly growing family of domain agents for atrial-fibrillation self-management [34], hypertension management [35], prostate-cancer education [36], TCM dietary recommendations grounded in an uncertain knowledge graph [37], and gene-set analysis [38] — no existing agent is benchmarked against a statement-level guideline gold standard, and all rely on prompt-level rather than binding safeguards. Retrieval-augmented generation (RAG) grounds generation in an external corpus [39] and medical RAG benchmarks show promise [40], but retrieval alone has no mechanism to </w:t>
       </w:r>
       <w:r>
         <w:rPr>
@@ -352,7 +278,7 @@
           <w:b w:val="0"/>
           <w:i w:val="0"/>
         </w:rPr>
-        <w:t xml:space="preserve"> a plausible-sounding recommendation that contradicts the guideline.</w:t>
+        <w:t xml:space="preserve"> a fluent recommendation that contradicts the guideline.</w:t>
       </w:r>
     </w:p>
     <w:p>
@@ -362,7 +288,7 @@
           <w:b w:val="0"/>
           <w:i w:val="0"/>
         </w:rPr>
-        <w:t xml:space="preserve">QianLieAnHui is that checklist realised as an agent, and each architectural layer is aimed at a specific pain point. A deterministic rule engine can mechanically veto non-compliant outputs; knowledge-graph retrieval can expose a traceable evidence chain; an LLM arbiter can supply linguistic flexibility. Patient-factor escalation rules turn contextual safety guidance (route, prophylaxis intensity, scheme simplification) into deterministic hard constraints rather than prompt-level exhortations; MRI-quality and reader-variability caveats are represented as explicit scenario flags that both gate rules and boost retrieval; grade-group-driven treatment-planning statements anchor the largest statement domain; and the knowledge base's version integrity is machine-verified rather than assumed. Chained as </w:t>
+        <w:t xml:space="preserve">QianLieAnHui is that checklist realised as an agent; its three layers map one-to-one onto the failure modes above. A deterministic rule engine can mechanically veto non-compliant outputs; knowledge-graph retrieval can expose a traceable evidence chain; an LLM arbiter can supply linguistic flexibility. Patient-factor escalation rules turn contextual safety guidance (route, prophylaxis intensity, scheme simplification) into deterministic hard constraints rather than prompt-level exhortations; MRI-quality and reader-variability caveats are represented as explicit scenario flags that both gate rules and boost retrieval; grade-group-driven treatment-planning statements anchor the largest statement domain; and the knowledge base's version integrity is machine-verified rather than assumed. Chained as </w:t>
       </w:r>
       <w:r>
         <w:rPr>
@@ -561,7 +487,7 @@
           <w:b w:val="0"/>
           <w:i w:val="0"/>
         </w:rPr>
-        <w:t xml:space="preserve">All 112 final statements of the ProBIOPSY consensus [4] served as the gold standard. Each statement was mapped to an expected system action in a pre-defined five-class taxonomy: </w:t>
+        <w:t xml:space="preserve">All 112 final statements of the ProBIOPSY consensus [21] served as the gold standard. Each statement was mapped to an expected system action in a pre-defined five-class taxonomy: </w:t>
       </w:r>
       <w:r>
         <w:rPr>
@@ -687,7 +613,7 @@
           <w:b w:val="0"/>
           <w:i w:val="0"/>
         </w:rPr>
-        <w:t xml:space="preserve"> Entity A (patient scenarios) contains 51 archetypes with 49 distinct scenario flags across imaging (PI-RADS grade, mpMRI/bpMRI, field strength, PI-QUAL quality [9]), laboratory markers (PSA, PSA density), history and risk (prior negative biopsy, family history, infection risk factors, anticoagulation), treatment intent, and resource availability (Table 1). Entity B (decision items) contains 54 items with 20 flags across indication (22), procedure (22), and treatment-planning linkage (10).</w:t>
+        <w:t xml:space="preserve"> Entity A (patient scenarios) contains 51 archetypes with 49 distinct scenario flags across imaging (PI-RADS grade, mpMRI/bpMRI, field strength, PI-QUAL quality [17]), laboratory markers (PSA, PSA density), history and risk (prior negative biopsy, family history, infection risk factors, anticoagulation), treatment intent, and resource availability (Table 1). Entity B (decision items) contains 54 items with 20 flags across indication (22), procedure (22), and treatment-planning linkage (10).</w:t>
       </w:r>
     </w:p>
     <w:p>
@@ -5016,7 +4942,7 @@
           <w:b w:val="0"/>
           <w:i w:val="0"/>
         </w:rPr>
-        <w:t xml:space="preserve">Large language models are approaching expert-level medical question answering [32] and have generated patient-facing responses rated as more empathetic than physician responses [49]; for constrained, auditable decision support, however, our results indicate that decision architecture — not model capability — is the dominant lever. Medical RAG benchmarks such as MIRAGE [40] evaluate open-question answering accuracy, typically multiple-choice or free text; we instead map an international consensus' final statements onto five executable actions and evaluate </w:t>
+        <w:t xml:space="preserve">Large language models are approaching expert-level medical question answering [31] and have generated patient-facing responses rated as more empathetic than physician responses [49]; for constrained, auditable decision support, however, our results indicate that decision architecture — not model capability — is the dominant lever. Medical RAG benchmarks such as MIRAGE [40] evaluate open-question answering accuracy, typically multiple-choice or free text; we instead map an international consensus' final statements onto five executable actions and evaluate </w:t>
       </w:r>
       <w:r>
         <w:rPr>
@@ -5032,7 +4958,7 @@
           <w:b w:val="0"/>
           <w:i w:val="0"/>
         </w:rPr>
-        <w:t>, a property closer to clinical governance needs. Relative to GraphRAG [43] and LightRAG [42], our contribution is system-level: LightRAG remains the evidence engine, but the lightrag-only baseline demonstrates exactly what happens without a rule layer — against over-calling (sensitivity 1.000, specificity 0.922) and conditional silence. Relative to rule-based CDSS [28], our architecture compresses the auditable rule base to 16 consensus rules and delegates long-tail knowledge to graph retrieval, coupling the two via hard constraints rather than parallel voting.</w:t>
+        <w:t>, a property closer to clinical governance needs. Relative to GraphRAG [43] and LightRAG [42], our contribution is system-level: LightRAG remains the evidence engine, but the lightrag-only baseline demonstrates exactly what happens without a rule layer — against over-calling (sensitivity 1.000, specificity 0.922) and conditional silence. Relative to rule-based CDSS [27], our architecture compresses the auditable rule base to 16 consensus rules and delegates long-tail knowledge to graph retrieval, coupling the two via hard constraints rather than parallel voting.</w:t>
       </w:r>
     </w:p>
     <w:p>
@@ -5042,7 +4968,7 @@
           <w:b w:val="0"/>
           <w:i w:val="0"/>
         </w:rPr>
-        <w:t>The closest contemporaries are the domain LLM agents now appearing across medicine. PULSE, an agent for atrial-fibrillation patient self-management [35], and its hypertension analogue [36], demonstrate that retrieval plus prompt optimisation raises Likert-rated response quality across several base models; an EHR-integrated agent personalises prostate-cancer patient education [37]; GeneAgent adds self-verification over domain databases for gene-set analysis [38]. Our results explain why such gains do not automatically transfer to procedural decision support. First, their evaluation endpoint — perceived response quality — does not measure guideline conformance; a fluent and empathetic answer can still misplace a veto. Second, their safeguards are prompt-level: reflection and consistency checks persuade but do not bind, whereas hard-constrained arbitration mechanically forbids non-compliant outputs and is the only configuration that places the two nuance-bearing actions correctly. Third, these agents are patient-facing information tools, whereas QianLieAnHui is a clinician-facing procedural instrument benchmarked against 112 verifiable consensus statements with multi-seed statistics and architecture ablation — an evaluation style closer to diagnostic-test validation than to user-satisfaction scoring.</w:t>
+        <w:t>The closest contemporaries are the domain LLM agents now appearing across medicine. PULSE, an agent for atrial-fibrillation patient self-management [34], and its hypertension analogue [35], demonstrate that retrieval plus prompt optimisation raises Likert-rated response quality across several base models; an EHR-integrated agent personalises prostate-cancer patient education [36]; GeneAgent adds self-verification over domain databases for gene-set analysis [38]. Our results explain why such gains do not automatically transfer to procedural decision support. First, their evaluation endpoint — perceived response quality — does not measure guideline conformance; a fluent and empathetic answer can still misplace a veto. Second, their safeguards are prompt-level: reflection and consistency checks persuade but do not bind, whereas hard-constrained arbitration mechanically forbids non-compliant outputs and is the only configuration that places the two nuance-bearing actions correctly. Third, these agents are patient-facing information tools, whereas QianLieAnHui is a clinician-facing procedural instrument benchmarked against 112 verifiable consensus statements with multi-seed statistics and architecture ablation — an evaluation style closer to diagnostic-test validation than to user-satisfaction scoring.</w:t>
       </w:r>
     </w:p>
     <w:p>
@@ -5052,7 +4978,7 @@
           <w:b w:val="0"/>
           <w:i w:val="0"/>
         </w:rPr>
-        <w:t>The system's decision points sit squarely on the consensus of current guidelines. The EAU recommends mpMRI before biopsy, MRI-targeted sampling, risk-adapted antimicrobial prophylaxis, and transperineal access where available [22]; the AUA/ASTRO guideline and its 2026 Amendment converge on the same action-level recommendations for localized disease [23,24]. The underlying trial evidence is recent and consolidating — randomised evidence on transperineal access [17], an RCT meta-analysis across imaging-targeted and non-targeted settings [18], and targeted prophylaxis studies [19] — which is precisely why the rule base encodes only the stable decision skeleton while the updating periphery lives in retrieval: as trial evidence shifts practice, the retrieval corpus and index can be rebuilt without touching the rule layer, and the SHA-256 version-integrity check makes that coupling explicit. This division of labour also mirrors how the pathway's pain points are actually experienced at the biopsy table: the safety-critical contextual calls (route, prophylaxis, scheme) are enforced mechanically rather than left to prompt compliance; image-quality and reader-variability dependence [10] is carried as explicit scenario flags; grade-discordance-aware treatment planning [7] is anchored by the largest statement domain; and the complication burden that motivates conservatism [25] is reflected in the system's mechanically enforced veto behaviour rather than in optimism.</w:t>
+        <w:t>The system's decision points sit squarely on the consensus of current guidelines. The EAU recommends mpMRI before biopsy, MRI-targeted sampling, risk-adapted antimicrobial prophylaxis, and transperineal access where available [22]; the AUA/ASTRO guideline and its 2026 Amendment converge on the same action-level recommendations for localized disease [23,24]. The underlying trial evidence is recent and consolidating — randomised evidence on transperineal access [6], an RCT meta-analysis across imaging-targeted and non-targeted settings [7], and targeted prophylaxis studies [8] — which is precisely why the rule base encodes only the stable decision skeleton while the updating periphery lives in retrieval: as trial evidence shifts practice, the retrieval corpus and index can be rebuilt without touching the rule layer, and the SHA-256 version-integrity check makes that coupling explicit. This division of labour also mirrors how the pathway's pain points are actually experienced at the biopsy table: the safety-critical contextual calls (route, prophylaxis, scheme) are enforced mechanically rather than left to prompt compliance; image-quality and reader-variability dependence [16] is carried as explicit scenario flags; grade-discordance-aware treatment planning [13] is anchored by the largest statement domain; and the complication burden that motivates conservatism [50] is reflected in the system's mechanically enforced veto behaviour rather than in optimism.</w:t>
       </w:r>
     </w:p>
     <w:p>
@@ -5128,7 +5054,7 @@
           <w:b w:val="0"/>
           <w:i w:val="0"/>
         </w:rPr>
-        <w:t xml:space="preserve"> — the rule-file SHA-256 recorded at index build and verified live by the UI prevents the classic CDSS failure mode of a silently stale knowledge base [26].</w:t>
+        <w:t xml:space="preserve"> — the rule-file SHA-256 recorded at index build and verified live by the UI prevents the classic CDSS failure mode of a silently stale knowledge base [25].</w:t>
       </w:r>
     </w:p>
     <w:p>
@@ -5344,7 +5270,7 @@
           <w:b w:val="0"/>
           <w:i w:val="0"/>
         </w:rPr>
-        <w:t>(i) extending the expert panel to a multi-centre face-validity and usability study, including treatment-intent-conditioned scenarios of the kind flagged by the reviewers in the split case; (ii) a prospective registry study with real cases, reported under emerging AI-evaluation standards [50,51]; (iii) extending the rule base to other guideline chapters (active surveillance, imaging follow-up) and emerging PSMA-PET–first pathways [52] to test architecture portability; (iv) FHIR integration for automatic scenario filling from the EMR; (v) on-premises generator deployment to eliminate PHI-transfer concerns.</w:t>
+        <w:t>(i) extending the expert panel to a multi-centre face-validity and usability study, including treatment-intent-conditioned scenarios of the kind flagged by the reviewers in the split case; (ii) a prospective registry study with real cases, reported under emerging AI-evaluation standards [51,52]; (iii) extending the rule base to other guideline chapters (active surveillance, imaging follow-up) and emerging PSMA-PET–first pathways [53] to test architecture portability; (iv) FHIR integration for automatic scenario filling from the EMR; (v) on-premises generator deployment to eliminate PHI-transfer concerns.</w:t>
       </w:r>
     </w:p>
     <w:p>
@@ -5395,7 +5321,7 @@
           <w:b w:val="0"/>
           <w:i w:val="0"/>
         </w:rPr>
-        <w:t>The rule base (configs/rules.yaml), both registries (entities_a.csv, entities_b.csv), the evidence corpus (evidence_chunks.jsonl, 357 chunks), the gold-standard annotations (probiopsy_statements.csv, 112 statements), all 2,240 raw predictions with per-run context sizes and retrieved-chunk counts (baseline_predictions.jsonl), the flagship-tier supplement (baseline_predictions_glm53.jsonl), the evaluation script (evaluate.py), and all figure source data are released with the repository (https://github.com/xuzekun6251/probiopsy-rag) and archived on Zenodo [53].</w:t>
+        <w:t>The rule base (configs/rules.yaml), both registries (entities_a.csv, entities_b.csv), the evidence corpus (evidence_chunks.jsonl, 357 chunks), the gold-standard annotations (probiopsy_statements.csv, 112 statements), all 2,240 raw predictions with per-run context sizes and retrieved-chunk counts (baseline_predictions.jsonl), the flagship-tier supplement (baseline_predictions_glm53.jsonl), the evaluation script (evaluate.py), and all figure source data are released with the repository (https://github.com/xuzekun6251/probiopsy-rag) and archived on Zenodo [54].</w:t>
       </w:r>
     </w:p>
     <w:p>
@@ -6064,7 +5990,7 @@
           <w:b w:val="0"/>
           <w:i w:val="0"/>
         </w:rPr>
-        <w:t>4. Chernysheva D, Di Bello F, Avesani G, et al. ProBIOPSY: A Multidisciplinary International Consensus on Standards for Prostate Biopsy. European Urology. 2026;90(3):212-224. https://doi.org/10.1016/j.eururo.2026.06.012</w:t>
+        <w:t>4. Tracy CR, Flynn KJ, Sjoberg DD, Gellhaus PT, Metz CM, Ehdaie B. Optimizing MRI-targeted prostate biopsy: the diagnostic benefit of additional targeted biopsy cores. Urologic Oncology: Seminars and Original Investigations. 2021;39(3):193.e1-193.e6. https://doi.org/10.1016/j.urolonc.2020.09.019</w:t>
       </w:r>
     </w:p>
     <w:p>
@@ -6077,7 +6003,7 @@
           <w:b w:val="0"/>
           <w:i w:val="0"/>
         </w:rPr>
-        <w:t>5. Tracy CR, Flynn KJ, Sjoberg DD, Gellhaus PT, Metz CM, Ehdaie B. Optimizing MRI-targeted prostate biopsy: the diagnostic benefit of additional targeted biopsy cores. Urologic Oncology: Seminars and Original Investigations. 2021;39(3):193.e1-193.e6. https://doi.org/10.1016/j.urolonc.2020.09.019</w:t>
+        <w:t>5. Deng R, Shang J, Wu J, et al. A head-to-head comparison of sextant-systematic biopsy vs. extended-systematic biopsy for prostate cancer diagnosis in the era of MRI-targeted biopsy: SEXTANT-PRO non-inferiority randomized clinical trial. eClinicalMedicine. 2025;90:103630. https://doi.org/10.1016/j.eclinm.2025.103630</w:t>
       </w:r>
     </w:p>
     <w:p>
@@ -6090,7 +6016,7 @@
           <w:b w:val="0"/>
           <w:i w:val="0"/>
         </w:rPr>
-        <w:t>6. Deng R, Shang J, Wu J, et al. A head-to-head comparison of sextant-systematic biopsy vs. extended-systematic biopsy for prostate cancer diagnosis in the era of MRI-targeted biopsy: SEXTANT-PRO non-inferiority randomized clinical trial. eClinicalMedicine. 2025;90:103630. https://doi.org/10.1016/j.eclinm.2025.103630</w:t>
+        <w:t>6. Bryant RJ, Marian IR, Williams R, et al. Local anaesthetic transperineal biopsy versus transrectal prostate biopsy in prostate cancer detection (TRANSLATE): a multicentre, randomised, controlled trial. The Lancet Oncology. 2025;26(5):583-595. https://doi.org/10.1016/s1470-2045(25)00100-7</w:t>
       </w:r>
     </w:p>
     <w:p>
@@ -6103,7 +6029,7 @@
           <w:b w:val="0"/>
           <w:i w:val="0"/>
         </w:rPr>
-        <w:t>7. Epstein JI, Feng Z, Trock BJ, Pierorazio PM. Upgrading and Downgrading of Prostate Cancer from Biopsy to Radical Prostatectomy: Incidence and Predictive Factors Using the Modified Gleason Grading System and Factoring in Tertiary Grades. European Urology. 2012;61(5):1019-1024. https://doi.org/10.1016/j.eururo.2012.01.050</w:t>
+        <w:t>7. Yang YJ, Yang EJ, Nguyen TT, Choi SY. Transperineal Versus Transrectal Prostate Biopsy: A Systematic Review and Meta-analysis of Randomized Controlled Trials Across Settings With and Without Magnetic Resonance Imaging Targeting. European Urology Open Science. 2026;83:205-218. https://doi.org/10.1016/j.euros.2025.12.008</w:t>
       </w:r>
     </w:p>
     <w:p>
@@ -6116,7 +6042,7 @@
           <w:b w:val="0"/>
           <w:i w:val="0"/>
         </w:rPr>
-        <w:t>8. Turkbey B, Rosenkrantz AB, Haider MA, et al. Prostate Imaging Reporting and Data System Version 2.1: 2019 Update of Prostate Imaging Reporting and Data System Version 2. European Urology. 2019;76(3):340-351. https://doi.org/10.1016/j.eururo.2019.02.033</w:t>
+        <w:t>8. Liss MA, Kim W, Moskowitz D, Szabo RJ. Comparative Effectiveness of Targeted vs Empirical Antibiotic Prophylaxis to Prevent Sepsis from Transrectal Prostate Biopsy: A Retrospective Analysis. Journal of Urology. 2015;194(2):397-402. https://doi.org/10.1016/j.juro.2015.03.110</w:t>
       </w:r>
     </w:p>
     <w:p>
@@ -6129,7 +6055,7 @@
           <w:b w:val="0"/>
           <w:i w:val="0"/>
         </w:rPr>
-        <w:t>9. Giganti F, Allen C, Emberton M, Moore CM, Kasivisvanathan V. Prostate Imaging Quality (PI-QUAL): A New Quality Control Scoring System for Multiparametric Magnetic Resonance Imaging of the Prostate from the PRECISION trial. European Urology Oncology. 2020;3(5):615-619. https://doi.org/10.1016/j.euo.2020.06.007</w:t>
+        <w:t>9. Ahdoot M, Wilbur AR, Reese SE, et al. MRI-Targeted, Systematic, and Combined Biopsy for Prostate Cancer Diagnosis. N Engl J Med. 2020;382(10):917-928. https://doi.org/10.1056/nejmoa1910038</w:t>
       </w:r>
     </w:p>
     <w:p>
@@ -6142,7 +6068,7 @@
           <w:b w:val="0"/>
           <w:i w:val="0"/>
         </w:rPr>
-        <w:t>10. Park KJ, Choi SH, Lee JS, Kim JK, Kim MH. Interreader Agreement with Prostate Imaging Reporting and Data System Version 2 for Prostate Cancer Detection: A Systematic Review and Meta-Analysis. Journal of Urology. 2020;204(4):661-670. https://doi.org/10.1097/ju.0000000000001200</w:t>
+        <w:t>10. Klotz L, Chin J, Black PC, et al. Comparison of Multiparametric Magnetic Resonance Imaging–Targeted Biopsy With Systematic Transrectal Ultrasonography Biopsy for Biopsy-Naive Men at Risk for Prostate Cancer: A Phase 3 Randomized Clinical Trial. JAMA Oncol. 2021;7(4):534. https://doi.org/10.1001/jamaoncol.2020.7589</w:t>
       </w:r>
     </w:p>
     <w:p>
@@ -6155,7 +6081,7 @@
           <w:b w:val="0"/>
           <w:i w:val="0"/>
         </w:rPr>
-        <w:t>11. Yusim I, Krenawi M, Mazor E, Novack V, Mabjeesh NJ. The use of prostate specific antigen density to predict clinically significant prostate cancer. Sci Rep. 2020;10(1):20015. https://doi.org/10.1038/s41598-020-76786-9</w:t>
+        <w:t>11. Elkhoury FF, Felker ER, Kwan L, et al. Comparison of Targeted vs Systematic Prostate Biopsy in Men Who Are Biopsy Naive: The Prospective Assessment of Image Registration in the Diagnosis of Prostate Cancer (PAIREDCAP) Study. JAMA Surg. 2019;154(9):811. https://doi.org/10.1001/jamasurg.2019.1734</w:t>
       </w:r>
     </w:p>
     <w:p>
@@ -6168,7 +6094,7 @@
           <w:b w:val="0"/>
           <w:i w:val="0"/>
         </w:rPr>
-        <w:t>12. Ahmed HU, El-Shater Bosaily A, Brown LC, et al. Diagnostic accuracy of multi-parametric MRI and TRUS biopsy in prostate cancer (PROMIS): a paired validating confirmatory study. The Lancet. 2017;389(10071):815-822. https://doi.org/10.1016/s0140-6736(16)32401-1</w:t>
+        <w:t>12. Costa DN, Goldberg K, Leon ADD, et al. Magnetic Resonance Imaging–guided In-bore and Magnetic Resonance Imaging-transrectal Ultrasound Fusion Targeted Prostate Biopsies: An Adjusted Comparison of Clinically Significant Prostate Cancer Detection Rate. European Urology Oncology. 2019;2(4):397-404. https://doi.org/10.1016/j.euo.2018.08.022</w:t>
       </w:r>
     </w:p>
     <w:p>
@@ -6181,7 +6107,7 @@
           <w:b w:val="0"/>
           <w:i w:val="0"/>
         </w:rPr>
-        <w:t>13. Ahdoot M, Wilbur AR, Reese SE, et al. MRI-Targeted, Systematic, and Combined Biopsy for Prostate Cancer Diagnosis. N Engl J Med. 2020;382(10):917-928. https://doi.org/10.1056/nejmoa1910038</w:t>
+        <w:t>13. Epstein JI, Feng Z, Trock BJ, Pierorazio PM. Upgrading and Downgrading of Prostate Cancer from Biopsy to Radical Prostatectomy: Incidence and Predictive Factors Using the Modified Gleason Grading System and Factoring in Tertiary Grades. European Urology. 2012;61(5):1019-1024. https://doi.org/10.1016/j.eururo.2012.01.050</w:t>
       </w:r>
     </w:p>
     <w:p>
@@ -6194,7 +6120,7 @@
           <w:b w:val="0"/>
           <w:i w:val="0"/>
         </w:rPr>
-        <w:t>14. Klotz L, Chin J, Black PC, et al. Comparison of Multiparametric Magnetic Resonance Imaging–Targeted Biopsy With Systematic Transrectal Ultrasonography Biopsy for Biopsy-Naive Men at Risk for Prostate Cancer: A Phase 3 Randomized Clinical Trial. JAMA Oncol. 2021;7(4):534. https://doi.org/10.1001/jamaoncol.2020.7589</w:t>
+        <w:t>14. Ahmed HU, El-Shater Bosaily A, Brown LC, et al. Diagnostic accuracy of multi-parametric MRI and TRUS biopsy in prostate cancer (PROMIS): a paired validating confirmatory study. The Lancet. 2017;389(10071):815-822. https://doi.org/10.1016/s0140-6736(16)32401-1</w:t>
       </w:r>
     </w:p>
     <w:p>
@@ -6207,7 +6133,7 @@
           <w:b w:val="0"/>
           <w:i w:val="0"/>
         </w:rPr>
-        <w:t>15. Elkhoury FF, Felker ER, Kwan L, et al. Comparison of Targeted vs Systematic Prostate Biopsy in Men Who Are Biopsy Naive: The Prospective Assessment of Image Registration in the Diagnosis of Prostate Cancer (PAIREDCAP) Study. JAMA Surg. 2019;154(9):811. https://doi.org/10.1001/jamasurg.2019.1734</w:t>
+        <w:t>15. Turkbey B, Rosenkrantz AB, Haider MA, et al. Prostate Imaging Reporting and Data System Version 2.1: 2019 Update of Prostate Imaging Reporting and Data System Version 2. European Urology. 2019;76(3):340-351. https://doi.org/10.1016/j.eururo.2019.02.033</w:t>
       </w:r>
     </w:p>
     <w:p>
@@ -6220,7 +6146,7 @@
           <w:b w:val="0"/>
           <w:i w:val="0"/>
         </w:rPr>
-        <w:t>16. Costa DN, Goldberg K, Leon ADD, et al. Magnetic Resonance Imaging–guided In-bore and Magnetic Resonance Imaging-transrectal Ultrasound Fusion Targeted Prostate Biopsies: An Adjusted Comparison of Clinically Significant Prostate Cancer Detection Rate. European Urology Oncology. 2019;2(4):397-404. https://doi.org/10.1016/j.euo.2018.08.022</w:t>
+        <w:t>16. Park KJ, Choi SH, Lee JS, Kim JK, Kim MH. Interreader Agreement with Prostate Imaging Reporting and Data System Version 2 for Prostate Cancer Detection: A Systematic Review and Meta-Analysis. Journal of Urology. 2020;204(4):661-670. https://doi.org/10.1097/ju.0000000000001200</w:t>
       </w:r>
     </w:p>
     <w:p>
@@ -6233,7 +6159,7 @@
           <w:b w:val="0"/>
           <w:i w:val="0"/>
         </w:rPr>
-        <w:t>17. Bryant RJ, Marian IR, Williams R, et al. Local anaesthetic transperineal biopsy versus transrectal prostate biopsy in prostate cancer detection (TRANSLATE): a multicentre, randomised, controlled trial. The Lancet Oncology. 2025;26(5):583-595. https://doi.org/10.1016/s1470-2045(25)00100-7</w:t>
+        <w:t>17. Giganti F, Allen C, Emberton M, Moore CM, Kasivisvanathan V. Prostate Imaging Quality (PI-QUAL): A New Quality Control Scoring System for Multiparametric Magnetic Resonance Imaging of the Prostate from the PRECISION trial. European Urology Oncology. 2020;3(5):615-619. https://doi.org/10.1016/j.euo.2020.06.007</w:t>
       </w:r>
     </w:p>
     <w:p>
@@ -6246,7 +6172,7 @@
           <w:b w:val="0"/>
           <w:i w:val="0"/>
         </w:rPr>
-        <w:t>18. Yang YJ, Yang EJ, Nguyen TT, Choi SY. Transperineal Versus Transrectal Prostate Biopsy: A Systematic Review and Meta-analysis of Randomized Controlled Trials Across Settings With and Without Magnetic Resonance Imaging Targeting. European Urology Open Science. 2026;83:205-218. https://doi.org/10.1016/j.euros.2025.12.008</w:t>
+        <w:t>18. Yusim I, Krenawi M, Mazor E, Novack V, Mabjeesh NJ. The use of prostate specific antigen density to predict clinically significant prostate cancer. Sci Rep. 2020;10(1):20015. https://doi.org/10.1038/s41598-020-76786-9</w:t>
       </w:r>
     </w:p>
     <w:p>
@@ -6259,7 +6185,7 @@
           <w:b w:val="0"/>
           <w:i w:val="0"/>
         </w:rPr>
-        <w:t>19. Liss MA, Kim W, Moskowitz D, Szabo RJ. Comparative Effectiveness of Targeted vs Empirical Antibiotic Prophylaxis to Prevent Sepsis from Transrectal Prostate Biopsy: A Retrospective Analysis. Journal of Urology. 2015;194(2):397-402. https://doi.org/10.1016/j.juro.2015.03.110</w:t>
+        <w:t>19. Loeb S, Vellekoop A, Ahmed HU, et al. Systematic Review of Complications of Prostate Biopsy. European Urology. 2013;64(6):876-892. https://doi.org/10.1016/j.eururo.2013.05.049</w:t>
       </w:r>
     </w:p>
     <w:p>
@@ -6272,7 +6198,7 @@
           <w:b w:val="0"/>
           <w:i w:val="0"/>
         </w:rPr>
-        <w:t>20. Loeb S, Vellekoop A, Ahmed HU, et al. Systematic Review of Complications of Prostate Biopsy. European Urology. 2013;64(6):876-892. https://doi.org/10.1016/j.eururo.2013.05.049</w:t>
+        <w:t>20. Nam RK, Saskin R, Lee Y, et al. Increasing Hospital Admission Rates for Urological Complications After Transrectal Ultrasound Guided Prostate Biopsy. Journal of Urology. 2010;183(3):963-969. https://doi.org/10.1016/j.juro.2009.11.043</w:t>
       </w:r>
     </w:p>
     <w:p>
@@ -6285,7 +6211,7 @@
           <w:b w:val="0"/>
           <w:i w:val="0"/>
         </w:rPr>
-        <w:t>21. Nam RK, Saskin R, Lee Y, et al. Increasing Hospital Admission Rates for Urological Complications After Transrectal Ultrasound Guided Prostate Biopsy. Journal of Urology. 2010;183(3):963-969. https://doi.org/10.1016/j.juro.2009.11.043</w:t>
+        <w:t>21. Chernysheva D, Di Bello F, Avesani G, et al. ProBIOPSY: A Multidisciplinary International Consensus on Standards for Prostate Biopsy. European Urology. 2026;90(3):212-224. https://doi.org/10.1016/j.eururo.2026.06.012</w:t>
       </w:r>
     </w:p>
     <w:p>
@@ -6337,7 +6263,7 @@
           <w:b w:val="0"/>
           <w:i w:val="0"/>
         </w:rPr>
-        <w:t>25. Borghesi M, Ahmed H, Nam R, et al. Complications After Systematic, Random, and Image-guided Prostate Biopsy. European Urology. 2017;71(3):353-365. https://doi.org/10.1016/j.eururo.2016.08.004</w:t>
+        <w:t>25. Hao S, Chai C, Li G, Tang N, Wang N, Yu X. Outdated Fact Detection in Knowledge Bases. In: 2020 IEEE 36th International Conference on Data Engineering (ICDE). IEEE; 2020:1890-1893. https://doi.org/10.1109/icde48307.2020.00196</w:t>
       </w:r>
     </w:p>
     <w:p>
@@ -6350,7 +6276,7 @@
           <w:b w:val="0"/>
           <w:i w:val="0"/>
         </w:rPr>
-        <w:t>26. Hao S, Chai C, Li G, Tang N, Wang N, Yu X. Outdated Fact Detection in Knowledge Bases. In: 2020 IEEE 36th International Conference on Data Engineering (ICDE). IEEE; 2020:1890-1893. https://doi.org/10.1109/icde48307.2020.00196</w:t>
+        <w:t>26. Ray CE, Wilson GM, Hughes AM, et al. Alert fatigue measurement in clinical decision support: a systematic review. Journal of the American Medical Informatics Association. 2026;33(8):1523-1531. https://doi.org/10.1093/jamia/ocag064</w:t>
       </w:r>
     </w:p>
     <w:p>
@@ -6363,7 +6289,7 @@
           <w:b w:val="0"/>
           <w:i w:val="0"/>
         </w:rPr>
-        <w:t>27. Ray CE, Wilson GM, Hughes AM, et al. Alert fatigue measurement in clinical decision support: a systematic review. Journal of the American Medical Informatics Association. 2026;33(8):1523-1531. https://doi.org/10.1093/jamia/ocag064</w:t>
+        <w:t>27. Sutton RT, Pincock D, Baumgart DC, Sadowski DC, Fedorak RN, Kroeker KI. An overview of clinical decision support systems: benefits, risks, and strategies for success. npj Digit. Med. 2020;3(1):17. https://doi.org/10.1038/s41746-020-0221-y</w:t>
       </w:r>
     </w:p>
     <w:p>
@@ -6376,7 +6302,7 @@
           <w:b w:val="0"/>
           <w:i w:val="0"/>
         </w:rPr>
-        <w:t>28. Sutton RT, Pincock D, Baumgart DC, Sadowski DC, Fedorak RN, Kroeker KI. An overview of clinical decision support systems: benefits, risks, and strategies for success. npj Digit. Med. 2020;3(1):17. https://doi.org/10.1038/s41746-020-0221-y</w:t>
+        <w:t>28. Rajpurkar P, Chen E, Banerjee O, Topol EJ. AI in health and medicine. Nat Med. 2022;28(1):31-38. https://doi.org/10.1038/s41591-021-01614-0</w:t>
       </w:r>
     </w:p>
     <w:p>
@@ -6389,7 +6315,7 @@
           <w:b w:val="0"/>
           <w:i w:val="0"/>
         </w:rPr>
-        <w:t>29. Rajpurkar P, Chen E, Banerjee O, Topol EJ. AI in health and medicine. Nat Med. 2022;28(1):31-38. https://doi.org/10.1038/s41591-021-01614-0</w:t>
+        <w:t>29. Thirunavukarasu AJ, Ting DSJ, Elangovan K, Gutierrez L, Tan TF, Ting DSW. Large language models in medicine. Nat Med. 2023;29(8):1930-1940. https://doi.org/10.1038/s41591-023-02448-8</w:t>
       </w:r>
     </w:p>
     <w:p>
@@ -6402,7 +6328,7 @@
           <w:b w:val="0"/>
           <w:i w:val="0"/>
         </w:rPr>
-        <w:t>30. Thirunavukarasu AJ, Ting DSJ, Elangovan K, Gutierrez L, Tan TF, Ting DSW. Large language models in medicine. Nat Med. 2023;29(8):1930-1940. https://doi.org/10.1038/s41591-023-02448-8</w:t>
+        <w:t>30. Singhal K, Azizi S, Tu T, et al. Large language models encode clinical knowledge. Nature. 2023;620(7972):172-180. https://doi.org/10.1038/s41586-023-06291-2</w:t>
       </w:r>
     </w:p>
     <w:p>
@@ -6415,7 +6341,7 @@
           <w:b w:val="0"/>
           <w:i w:val="0"/>
         </w:rPr>
-        <w:t>31. Singhal K, Azizi S, Tu T, et al. Large language models encode clinical knowledge. Nature. 2023;620(7972):172-180. https://doi.org/10.1038/s41586-023-06291-2</w:t>
+        <w:t>31. Singhal K, Tu T, Gottweis J, et al. Toward expert-level medical question answering with large language models. Nat Med. 2025;31(3):943-950. https://doi.org/10.1038/s41591-024-03423-7</w:t>
       </w:r>
     </w:p>
     <w:p>
@@ -6428,7 +6354,7 @@
           <w:b w:val="0"/>
           <w:i w:val="0"/>
         </w:rPr>
-        <w:t>32. Singhal K, Tu T, Gottweis J, et al. Toward expert-level medical question answering with large language models. Nat Med. 2025;31(3):943-950. https://doi.org/10.1038/s41591-024-03423-7</w:t>
+        <w:t>32. Ji Z, Lee N, Frieske R, et al. Survey of Hallucination in Natural Language Generation. ACM Comput. Surv. 2023;55(12):1-38. https://doi.org/10.1145/3571730</w:t>
       </w:r>
     </w:p>
     <w:p>
@@ -6441,7 +6367,7 @@
           <w:b w:val="0"/>
           <w:i w:val="0"/>
         </w:rPr>
-        <w:t>33. Ji Z, Lee N, Frieske R, et al. Survey of Hallucination in Natural Language Generation. ACM Comput. Surv. 2023;55(12):1-38. https://doi.org/10.1145/3571730</w:t>
+        <w:t>33. Fast D, Adams LC, Busch F, et al. Autonomous medical evaluation for guideline adherence of large language models. npj Digit. Med. 2024;7(1):358. https://doi.org/10.1038/s41746-024-01356-6</w:t>
       </w:r>
     </w:p>
     <w:p>
@@ -6454,7 +6380,7 @@
           <w:b w:val="0"/>
           <w:i w:val="0"/>
         </w:rPr>
-        <w:t>34. Fast D, Adams LC, Busch F, et al. Autonomous medical evaluation for guideline adherence of large language models. npj Digit. Med. 2024;7(1):358. https://doi.org/10.1038/s41746-024-01356-6</w:t>
+        <w:t>34. Wang Y, Peng C, Hu R, et al. A knowledge-enhanced domain-aware large language model agent for atrial fibrillation management. npj Digit. Med. 2026. https://doi.org/10.1038/s41746-026-03038-x</w:t>
       </w:r>
     </w:p>
     <w:p>
@@ -6467,7 +6393,7 @@
           <w:b w:val="0"/>
           <w:i w:val="0"/>
         </w:rPr>
-        <w:t>35. Wang Y, Peng C, Hu R, et al. A knowledge-enhanced domain-aware large language model agent for atrial fibrillation management. npj Digit. Med. 2026. https://doi.org/10.1038/s41746-026-03038-x</w:t>
+        <w:t>35. Wang Y, Tan W, Cheng S, et al. Large Language Model Agent for Managing Patients With Suspected Hypertension. Hypertension. 2026;83(1):212-224. https://doi.org/10.1161/hypertensionaha.125.25305</w:t>
       </w:r>
     </w:p>
     <w:p>
@@ -6480,7 +6406,7 @@
           <w:b w:val="0"/>
           <w:i w:val="0"/>
         </w:rPr>
-        <w:t>36. Wang Y, Tan W, Cheng S, et al. Large Language Model Agent for Managing Patients With Suspected Hypertension. Hypertension. 2026;83(1):212-224. https://doi.org/10.1161/hypertensionaha.125.25305</w:t>
+        <w:t>36. Hao Y, Holmes J, Waddle MR, et al. Personalizing prostate cancer education for patients using an EHR-Integrated LLM agent. npj Digit. Med. 2025;8(1):770. https://doi.org/10.1038/s41746-025-02166-0</w:t>
       </w:r>
     </w:p>
     <w:p>
@@ -6493,7 +6419,7 @@
           <w:b w:val="0"/>
           <w:i w:val="0"/>
         </w:rPr>
-        <w:t>37. Hao Y, Holmes J, Waddle MR, et al. Personalizing prostate cancer education for patients using an EHR-Integrated LLM agent. npj Digit. Med. 2025;8(1):770. https://doi.org/10.1038/s41746-025-02166-0</w:t>
+        <w:t>37. Sha H, Gong F, Liu B, Liu R, Wang H, Wu T. Leveraging Retrieval-Augmented Large Language Models for Dietary Recommendations With Traditional Chinese Medicine’s Medicine Food Homology: Algorithm Development and Validation. JMIR Med Inform. 2025;13:e75279-e75279. https://doi.org/10.2196/75279</w:t>
       </w:r>
     </w:p>
     <w:p>
@@ -6662,7 +6588,7 @@
           <w:b w:val="0"/>
           <w:i w:val="0"/>
         </w:rPr>
-        <w:t>50. Vasey B, Nagendran M, Campbell B, et al. Reporting guideline for the early stage clinical evaluation of decision support systems driven by artificial intelligence: DECIDE-AI. BMJ. 2022;377:e070904. https://doi.org/10.1136/bmj-2022-070904</w:t>
+        <w:t>50. Borghesi M, Ahmed H, Nam R, et al. Complications After Systematic, Random, and Image-guided Prostate Biopsy. European Urology. 2017;71(3):353-365. https://doi.org/10.1016/j.eururo.2016.08.004</w:t>
       </w:r>
     </w:p>
     <w:p>
@@ -6675,7 +6601,7 @@
           <w:b w:val="0"/>
           <w:i w:val="0"/>
         </w:rPr>
-        <w:t>51. Collins GS, Moons KGM, Dhiman P, et al. TRIPOD+AI statement: updated guidance for reporting clinical prediction models that use regression or machine learning methods. BMJ. 2024;385:e078378. https://doi.org/10.1136/bmj-2023-078378</w:t>
+        <w:t>51. Vasey B, Nagendran M, Campbell B, et al. Reporting guideline for the early stage clinical evaluation of decision support systems driven by artificial intelligence: DECIDE-AI. BMJ. 2022;377:e070904. https://doi.org/10.1136/bmj-2022-070904</w:t>
       </w:r>
     </w:p>
     <w:p>
@@ -6688,7 +6614,7 @@
           <w:b w:val="0"/>
           <w:i w:val="0"/>
         </w:rPr>
-        <w:t>52. Al-Khanaty A, Hennes D, Hofman MS, et al. Avoiding Prostate Biopsy in Early Prostate Cancer Detection: From Liquid Biopsy to PSMA-PET. European Urology Focus. 2026. https://doi.org/10.1016/j.euf.2026.05.019</w:t>
+        <w:t>52. Collins GS, Moons KGM, Dhiman P, et al. TRIPOD+AI statement: updated guidance for reporting clinical prediction models that use regression or machine learning methods. BMJ. 2024;385:e078378. https://doi.org/10.1136/bmj-2023-078378</w:t>
       </w:r>
     </w:p>
     <w:p>
@@ -6701,7 +6627,20 @@
           <w:b w:val="0"/>
           <w:i w:val="0"/>
         </w:rPr>
-        <w:t>53. XU Z. QianLieAnHui (probiopsy-rag): a hybrid rule-engine, knowledge-graph, and LLM-arbitration decision-support system for the prostate biopsy pathway, validated against the ProBIOPSY consensus [software, version v1.0.1]. Zenodo. 2026. https://doi.org/10.5281/zenodo.22898439 (verified via DataCite API).</w:t>
+        <w:t>53. Al-Khanaty A, Hennes D, Hofman MS, et al. Avoiding Prostate Biopsy in Early Prostate Cancer Detection: From Liquid Biopsy to PSMA-PET. European Urology Focus. 2026. https://doi.org/10.1016/j.euf.2026.05.019</w:t>
+      </w:r>
+    </w:p>
+    <w:p>
+      <w:pPr>
+        <w:ind w:left="425" w:hanging="425"/>
+      </w:pPr>
+      <w:r>
+        <w:rPr>
+          <w:rFonts w:ascii="Times New Roman" w:hAnsi="Times New Roman"/>
+          <w:b w:val="0"/>
+          <w:i w:val="0"/>
+        </w:rPr>
+        <w:t>54. XU Z. QianLieAnHui (probiopsy-rag): a hybrid rule-engine, knowledge-graph, and LLM-arbitration decision-support system for the prostate biopsy pathway, validated against the ProBIOPSY consensus [software, version v1.0.1]. Zenodo. 2026. https://doi.org/10.5281/zenodo.22898439 (verified via DataCite API).</w:t>
       </w:r>
     </w:p>
     <w:p>
@@ -6727,7 +6666,7 @@
           <w:b w:val="0"/>
           <w:i w:val="0"/>
         </w:rPr>
-        <w:t xml:space="preserve"> all 53 references verified programmatically — DOI-based entries resolved against the Crossref API (api.crossref.org; metadata auto-generated in `scripts/renumber_refs.py`, cache `outputs/paper/refs_vancouver.json`); the round-6 clinical additions (2026-10-02: AUA/ASTRO guideline articles, biopsy complications, targeted prophylaxis, transperineal-vs-transrectal trial evidence, PI-RADS inter-reader agreement, biopsy-to-prostatectomy concordance) were additionally confirmed against PubMed via the NCBI E-utilities API, and the round-7 medical-agent positioning additions (PULSE, the hypertension and prostate-cancer agents, GeneAgent) via Crossref (PMIDs and DOIs recorded in the verification scripts); arXiv entries (refs for LightRAG, GraphRAG, Lewis RAG) verified via the arXiv API / arXiv listings, the Zenodo software deposit via the DataCite API; the EAU guideline is a living web citation — update edition and access date at submission time.</w:t>
+        <w:t xml:space="preserve"> all 54 references verified programmatically — DOI-based entries resolved against the Crossref API (api.crossref.org; metadata auto-generated in `scripts/renumber_refs.py`, cache `outputs/paper/refs_vancouver.json`); the round-6 clinical additions (2026-10-02: AUA/ASTRO guideline articles, biopsy complications, targeted prophylaxis, transperineal-vs-transrectal trial evidence, PI-RADS inter-reader agreement, biopsy-to-prostatectomy concordance) were additionally confirmed against PubMed via the NCBI E-utilities API, and the round-7 medical-agent positioning additions (PULSE, the hypertension and prostate-cancer agents, GeneAgent) via Crossref (PMIDs and DOIs recorded in the verification scripts); arXiv entries (refs for LightRAG, GraphRAG, Lewis RAG) verified via the arXiv API / arXiv listings, the Zenodo software deposit via the DataCite API; the EAU guideline is a living web citation — update edition and access date at submission time.</w:t>
       </w:r>
     </w:p>
     <w:sectPr>

</xml_diff>

<commit_message>
manuscript: intro rewrite v3 — Yaoshi-RAG craft
</commit_message>
<xml_diff>
--- a/outputs/submission/manuscript.en.docx
+++ b/outputs/submission/manuscript.en.docx
@@ -262,7 +262,17 @@
           <w:b w:val="0"/>
           <w:i w:val="0"/>
         </w:rPr>
-        <w:t xml:space="preserve">Written guidance has not closed these gaps. The EAU Prostate Cancer Guidelines [22], the AUA/ASTRO Clinically Localized Prostate Cancer Guideline [23] with its 2026 Amendment [24], and the ProBIOPSY consensus [21] converge on the same decision points, yet practice varies — because a guideline is reference material, not an instrument: at the decision point the clinician must assemble 51 patient-scenario archetypes × 54 biopsy decisions, each combination carrying its own evidence, and no lookup table covers the combinatorics. Software attempts fall short in complementary ways. Rule-based clinical decision support is deterministic but slow to update [25], breeds alert fatigue [26], and cannot digest natural-language evidence [27]. Large language models (LLMs) supply the missing linguistic flexibility [28,29] and approach expert performance on medical question answering [30,31], but they hallucinate and lack verifiable provenance [32], drift from guidelines as they age [33], and give confidently generic advice where patient-specific context changes the answer: asked whether a 70-year-old man with locally advanced disease should undergo extended systematic sampling, a general-purpose LLM may endorse the standard extended scheme, whereas the consensus for suspected locally advanced disease actually recommends reducing systematic biopsy to a maximum of six cores, and — despite a rapidly growing family of domain agents for atrial-fibrillation self-management [34], hypertension management [35], prostate-cancer education [36], TCM dietary recommendations grounded in an uncertain knowledge graph [37], and gene-set analysis [38] — no existing agent is benchmarked against a statement-level guideline gold standard, and all rely on prompt-level rather than binding safeguards. Retrieval-augmented generation (RAG) grounds generation in an external corpus [39] and medical RAG benchmarks show promise [40], but retrieval alone has no mechanism to </w:t>
+        <w:t>Written guidance has not closed these gaps. The EAU Prostate Cancer Guidelines [22], the AUA/ASTRO Clinically Localized Prostate Cancer Guideline [23] with its 2026 Amendment [24], and the ProBIOPSY consensus [21] converge on the same decision points. Yet a guideline is reference material, not an instrument: at the decision point the clinician must assemble 51 patient-scenario archetypes × 54 biopsy decisions, each combination carrying its own evidence, and no lookup table covers the combinatorics.</w:t>
+      </w:r>
+    </w:p>
+    <w:p>
+      <w:r>
+        <w:rPr>
+          <w:rFonts w:ascii="Times New Roman" w:hAnsi="Times New Roman"/>
+          <w:b w:val="0"/>
+          <w:i w:val="0"/>
+        </w:rPr>
+        <w:t xml:space="preserve">Software attempts fall short in complementary ways. Rule-based clinical decision support is deterministic but slow to update [25], breeds alert fatigue [26], and cannot digest natural-language evidence [27]. Large language models (LLMs) supply the missing linguistic flexibility [28,29] and approach expert performance on medical question answering [30,31], yet they hallucinate and lack verifiable provenance [32], drift from guidelines as they age [33], and give confidently generic advice where patient-specific context changes the answer. For example, asked "Should a 70-year-old man with locally advanced disease undergo extended systematic prostate biopsy?", a general-purpose LLM may respond: "Yes, extended 12-core systematic biopsy is the standard approach." Yet the consensus for suspected locally advanced disease actually recommends reducing systematic biopsy to a maximum of six cores. A rapidly growing family of domain agents — for atrial-fibrillation self-management [34], hypertension management [35], prostate-cancer education [36], knowledge-graph-grounded dietary recommendations [37], and gene-set analysis [38] — demonstrates that specialised medical AI is feasible, but none is benchmarked against a statement-level guideline gold standard, and all rely on prompt-level rather than binding safeguards. Retrieval-augmented generation (RAG) grounds generation in an external corpus [39] and medical RAG benchmarks show promise [40], but retrieval alone has no mechanism to </w:t>
       </w:r>
       <w:r>
         <w:rPr>
@@ -278,7 +288,7 @@
           <w:b w:val="0"/>
           <w:i w:val="0"/>
         </w:rPr>
-        <w:t xml:space="preserve"> a fluent recommendation that contradicts the guideline.</w:t>
+        <w:t xml:space="preserve"> a fluent recommendation that contradicts the guideline. What is needed is a system that combines the linguistic flexibility of LLMs, the traceable evidence chain of knowledge-graph retrieval, and the deterministic safety of hard constraints — each covering the others' failure modes.</w:t>
       </w:r>
     </w:p>
     <w:p>
@@ -288,7 +298,7 @@
           <w:b w:val="0"/>
           <w:i w:val="0"/>
         </w:rPr>
-        <w:t xml:space="preserve">QianLieAnHui is that checklist realised as an agent; its three layers map one-to-one onto the failure modes above. A deterministic rule engine can mechanically veto non-compliant outputs; knowledge-graph retrieval can expose a traceable evidence chain; an LLM arbiter can supply linguistic flexibility. Patient-factor escalation rules turn contextual safety guidance (route, prophylaxis intensity, scheme simplification) into deterministic hard constraints rather than prompt-level exhortations; MRI-quality and reader-variability caveats are represented as explicit scenario flags that both gate rules and boost retrieval; grade-group-driven treatment-planning statements anchor the largest statement domain; and the knowledge base's version integrity is machine-verified rather than assumed. Chained as </w:t>
+        <w:t xml:space="preserve">QianLieAnHui is that checklist, realised as an agent. Its three layers map one-to-one onto the failure modes above. A deterministic rule engine can mechanically veto non-compliant outputs; knowledge-graph retrieval can expose a traceable evidence chain; an LLM arbiter can supply linguistic flexibility. Patient-factor escalation rules turn contextual safety guidance (route, prophylaxis intensity, scheme simplification) into deterministic hard constraints rather than prompt-level exhortations; MRI-quality and reader-variability caveats are represented as explicit scenario flags that both gate rules and boost retrieval; grade-group-driven treatment-planning statements anchor the largest statement domain; and the knowledge base's version integrity is machine-verified rather than assumed. Chained as </w:t>
       </w:r>
       <w:r>
         <w:rPr>

</xml_diff>

<commit_message>
manuscript: abstract + intro rewritten from scratch (IMRaD-compliant)
</commit_message>
<xml_diff>
--- a/outputs/submission/manuscript.en.docx
+++ b/outputs/submission/manuscript.en.docx
@@ -124,7 +124,7 @@
           <w:b w:val="0"/>
           <w:i w:val="0"/>
         </w:rPr>
-        <w:t xml:space="preserve"> abstract 249 / main text ~3,300 (excl. tables, legends, references)</w:t>
+        <w:t xml:space="preserve"> abstract 245 / main text ~3,300 (excl. tables, legends, references)</w:t>
       </w:r>
     </w:p>
     <w:p>
@@ -165,7 +165,7 @@
           <w:b w:val="0"/>
           <w:i w:val="0"/>
         </w:rPr>
-        <w:t xml:space="preserve"> Prostate biopsy is the gateway to every treatment decision in prostate cancer, yet the procedure remains poorly standardised: whom to biopsy, how, under which scheme and route varies widely between institutions. The stakes are asymmetric: under-biopsy misses clinically significant cancer, over-biopsy harms men with indolent disease, one strategy may not inform every treatment plan, and decisions diverge with the operator. The ProBIOPSY consensus codified this pathway into 112 statements, but a written consensus cannot be executed at the decision point. We asked whether it could be executed: a checklist stored in a computer, callable when needed, auditable afterwards.</w:t>
+        <w:t xml:space="preserve"> Prostate biopsy decisions require weighing patient-specific factors — MRI findings, PSA density, comorbidity, and treatment intent — against a complex pathway of interlocking choices. The ProBIOPSY consensus codified this pathway into 112 statements, yet substantial practice variation persists because a written consensus, however detailed, cannot be executed at the point of care.</w:t>
       </w:r>
     </w:p>
     <w:p>
@@ -183,7 +183,7 @@
           <w:b w:val="0"/>
           <w:i w:val="0"/>
         </w:rPr>
-        <w:t xml:space="preserve"> Because large language models (LLMs) hallucinate and lack traceability, and retrieval-augmented generation (RAG) grounds answers but cannot forbid them, we developed QianLieAnHui — a three-layer agent executing the consensus as a checklist: (1) a deterministic rule engine (16 rules, cross-checked against EAU/AUA guidelines) emitting hard constraints; (2) retrieval over a LightRAG knowledge graph (357 chunks); (3) an LLM arbiter emitting one of five executable actions with statement-level citations. Benchmark: 2,240 runs (four architectures × five seeds × 112 statements, generator fixed).</w:t>
+        <w:t xml:space="preserve"> We developed QianLieAnHui, a decision-support agent that encodes the consensus as an executable checklist. The system chains three layers: a deterministic rule engine (16 rules cross-checked against EAU and AUA/ASTRO guidelines) that emits hard constraints; risk-guided retrieval over a LightRAG knowledge graph built from 357 consensus-derived evidence chunks; and an LLM arbiter that produces one of five executable actions with statement-level citations. Benchmarked across four architectures × five seeds × 112 statements (2,240 runs, generator fixed).</w:t>
       </w:r>
     </w:p>
     <w:p>
@@ -201,7 +201,7 @@
           <w:b w:val="0"/>
           <w:i w:val="0"/>
         </w:rPr>
-        <w:t xml:space="preserve"> The agent achieved exact-5 accuracy 0.805±0.012, Cohen's κ 0.730±0.016, and against-class F1 0.908±0.023 — versus 0.613 for the strongest baseline — while retrieval baselines emitted the nuanced conditional class in 0.8% of runs (agent 17.0%); flagship generators did not rescue naive RAG (0.605→0.538).</w:t>
+        <w:t xml:space="preserve"> The agent achieved exact-5 accuracy 0.805 ± 0.012 and Cohen's κ 0.730 ± 0.016 against the consensus gold standard, outperforming LightRAG-only (0.613), naive RAG (0.605), and pure LLM (0.304). The safety-critical against class reached F1 0.908 at specificity 0.986. Retrieval baselines collapsed onto frequent classes (conditional: 0.8% vs 17.0%). Upgrading to a flagship generator did not rescue simpler architectures (naive RAG: 0.605 → 0.538).</w:t>
       </w:r>
     </w:p>
     <w:p>
@@ -219,7 +219,7 @@
           <w:b w:val="0"/>
           <w:i w:val="0"/>
         </w:rPr>
-        <w:t xml:space="preserve"> Architecture, not generator tier, was the dominant lever: every output traces to numbered statements, turning a written consensus into standardised, auditable practice.</w:t>
+        <w:t xml:space="preserve"> A written international consensus can be turned into an executable decision-support agent with accuracy suitable for pilot clinical evaluation. The deterministic rule layer proved essential: without hard constraints, LLM-based systems miss nuanced recommendations and over-call unsafe actions. Every recommendation traces to numbered consensus statements, enabling clinical governance audits.</w:t>
       </w:r>
     </w:p>
     <w:p>
@@ -252,7 +252,17 @@
           <w:b w:val="0"/>
           <w:i w:val="0"/>
         </w:rPr>
-        <w:t>Biopsy is the gateway to every treatment decision in prostate cancer. The disease is among the most common malignancies in men [1,2]; population-level PSA screening lowers disease-specific mortality [3]; and what the biopsy finds — grade group, tumour burden, distribution — determines whether a man is monitored, offered focal therapy, or scheduled for radical treatment. Yet the procedure that feeds these decisions is far from standardised. Whether systematic cores should be added to MRI-targeted cores [4], which saturation scheme to use [5], transperineal versus transrectal access [6,7], and targeted versus empirical prophylaxis [8] remain live questions — as does whether MRI-targeted sampling, which demonstrably improves clinically significant cancer detection [9-12], can inform every treatment option at all. Biopsy-to-prostatectomy grade discordance complicates downstream planning [13]; the measurements the pathway leans on are themselves imperfect — mpMRI misses clinically significant cancer in a minority of men [14], PI-RADS reading agreement [15,16] and image-quality gating [17] are variable, and PSA-density thresholds [18] temper but do not settle the decision; and every configuration carries the procedure's well-characterised complication burden [19,20]. The ProBIOPSY consensus documented substantial international practice variation across exactly these choices [21].</w:t>
+        <w:t>Prostate cancer is among the most common malignancies in men [1,2]. Population-level PSA screening lowers disease-specific mortality [3], and what the biopsy finds — grade group, tumour burden, distribution — determines whether a man is monitored, offered focal therapy, or scheduled for radical treatment. The biopsy is, in this sense, the gateway to every treatment decision in the disease.</w:t>
+      </w:r>
+    </w:p>
+    <w:p>
+      <w:r>
+        <w:rPr>
+          <w:rFonts w:ascii="Times New Roman" w:hAnsi="Times New Roman"/>
+          <w:b w:val="0"/>
+          <w:i w:val="0"/>
+        </w:rPr>
+        <w:t>Yet the procedure that feeds these decisions remains insufficiently standardised. Whether systematic cores should be added to MRI-targeted cores [4], which saturation scheme to use [5], transperineal versus transrectal access — whose trade-offs have been quantified in randomised trials [6,7] — and targeted versus empirical prophylaxis [8] remain actively debated. MRI-targeted sampling demonstrably improves clinically significant cancer detection [9-12], but whether it can inform every treatment option at all is unresolved, and biopsy-to-prostatectomy grade discordance complicates downstream planning [13]. The measurements that drive these choices are themselves imperfect: mpMRI misses clinically significant cancer in a minority of men [14], PI-RADS readings agree only moderately between readers [15,16], image quality gates their interpretation [17], and PSA-density thresholds temper but do not settle the decision [18]. Every configuration carries the procedure's well-characterised complication burden [19,20], and the ProBIOPSY consensus documented substantial international practice variation across exactly these choices [21].</w:t>
       </w:r>
     </w:p>
     <w:p>
@@ -272,7 +282,7 @@
           <w:b w:val="0"/>
           <w:i w:val="0"/>
         </w:rPr>
-        <w:t xml:space="preserve">Software attempts fall short in complementary ways. Rule-based clinical decision support is deterministic but slow to update [25], breeds alert fatigue [26], and cannot digest natural-language evidence [27]. Large language models (LLMs) supply the missing linguistic flexibility [28,29] and approach expert performance on medical question answering [30,31], yet they hallucinate and lack verifiable provenance [32], drift from guidelines as they age [33], and give confidently generic advice where patient-specific context changes the answer. For example, asked "Should a 70-year-old man with locally advanced disease undergo extended systematic prostate biopsy?", a general-purpose LLM may respond: "Yes, extended 12-core systematic biopsy is the standard approach." Yet the consensus for suspected locally advanced disease actually recommends reducing systematic biopsy to a maximum of six cores. A rapidly growing family of domain agents — for atrial-fibrillation self-management [34], hypertension management [35], prostate-cancer education [36], knowledge-graph-grounded dietary recommendations [37], and gene-set analysis [38] — demonstrates that specialised medical AI is feasible, but none is benchmarked against a statement-level guideline gold standard, and all rely on prompt-level rather than binding safeguards. Retrieval-augmented generation (RAG) grounds generation in an external corpus [39] and medical RAG benchmarks show promise [40], but retrieval alone has no mechanism to </w:t>
+        <w:t xml:space="preserve">Software attempts fall short in complementary ways. Rule-based clinical decision support is deterministic but slow to update [25], breeds alert fatigue [26], and cannot digest natural-language evidence [27]. Large language models (LLMs) supply the missing linguistic flexibility [28,29] and approach expert performance on medical question answering [30,31], but they hallucinate and lack verifiable provenance [32], drift from guidelines as they age [33], and give confidently generic advice where patient-specific context changes the answer. For example, asked "Should a 70-year-old man with locally advanced disease undergo extended systematic prostate biopsy?", a general-purpose LLM may respond: "Yes, extended 12-core systematic biopsy is the standard approach." Yet the consensus for suspected locally advanced disease recommends reducing systematic biopsy to a maximum of six cores. A rapidly growing family of domain agents — for atrial-fibrillation self-management [34], hypertension management [35], prostate-cancer education [36], knowledge-graph-grounded dietary recommendations [37], and gene-set analysis [38] — demonstrates that specialised medical AI is feasible, but none is benchmarked against a statement-level guideline gold standard, and all rely on prompt-level rather than binding safeguards. Retrieval-augmented generation (RAG) grounds generation in an external corpus [39] and medical RAG benchmarks show promise [40], but retrieval alone has no mechanism to </w:t>
       </w:r>
       <w:r>
         <w:rPr>
@@ -288,7 +298,7 @@
           <w:b w:val="0"/>
           <w:i w:val="0"/>
         </w:rPr>
-        <w:t xml:space="preserve"> a fluent recommendation that contradicts the guideline. What is needed is a system that combines the linguistic flexibility of LLMs, the traceable evidence chain of knowledge-graph retrieval, and the deterministic safety of hard constraints — each covering the others' failure modes.</w:t>
+        <w:t xml:space="preserve"> a fluent recommendation that contradicts the guideline.</w:t>
       </w:r>
     </w:p>
     <w:p>
@@ -298,23 +308,7 @@
           <w:b w:val="0"/>
           <w:i w:val="0"/>
         </w:rPr>
-        <w:t xml:space="preserve">QianLieAnHui is that checklist, realised as an agent. Its three layers map one-to-one onto the failure modes above. A deterministic rule engine can mechanically veto non-compliant outputs; knowledge-graph retrieval can expose a traceable evidence chain; an LLM arbiter can supply linguistic flexibility. Patient-factor escalation rules turn contextual safety guidance (route, prophylaxis intensity, scheme simplification) into deterministic hard constraints rather than prompt-level exhortations; MRI-quality and reader-variability caveats are represented as explicit scenario flags that both gate rules and boost retrieval; grade-group-driven treatment-planning statements anchor the largest statement domain; and the knowledge base's version integrity is machine-verified rather than assumed. Chained as </w:t>
-      </w:r>
-      <w:r>
-        <w:rPr>
-          <w:rFonts w:ascii="Times New Roman" w:hAnsi="Times New Roman"/>
-          <w:b w:val="0"/>
-          <w:i/>
-        </w:rPr>
-        <w:t>rule gate → graph evidence → LLM arbitration</w:t>
-      </w:r>
-      <w:r>
-        <w:rPr>
-          <w:rFonts w:ascii="Times New Roman" w:hAnsi="Times New Roman"/>
-          <w:b w:val="0"/>
-          <w:i w:val="0"/>
-        </w:rPr>
-        <w:t xml:space="preserve"> — an integration consistent with emerging roadmaps for unifying large language models and knowledge graphs [41] — each layer covers the others' failure modes while preserving a complete audit trail from every output back to numbered consensus statements and evidence chunks. At the retrieval layer we adopt LightRAG [42], a graph-based dual-level retrieval framework that outperforms Microsoft GraphRAG [43] on domain question answering at a fraction of the token cost.</w:t>
+        <w:t>What is needed is a system that combines the linguistic flexibility of LLMs, the traceable evidence chain of knowledge-graph retrieval, and the deterministic safety of hard constraints — each covering the others' failure modes. QianLieAnHui is that system, realised as an agent. Its three layers map one-to-one onto the failure modes above: the rule engine mechanically enforces consensus constraints that prompting cannot, the retrieval layer surfaces the evidence chain behind each recommendation, and the arbiter layer supplies the linguistic flexibility that rules alone cannot provide. At the retrieval layer we adopt LightRAG [41], a graph-based dual-level retrieval framework that outperforms Microsoft GraphRAG [42] on domain question answering at a fraction of the token cost — an integration consistent with emerging roadmaps for unifying large language models and knowledge graphs [43].</w:t>
       </w:r>
     </w:p>
     <w:p>
@@ -3275,7 +3269,7 @@
           <w:b w:val="0"/>
           <w:i w:val="0"/>
         </w:rPr>
-        <w:t xml:space="preserve"> The corpus comprises 357 evidence chunks, all sourced from the ProBIOPSY consensus and its supplementary material: the 112 final statements (evidence level B), 20 narrative passages, 7 systematic-review summaries, and 218 literature entries extracted from the consensus reference lists (level C). The index was built with LightRAG [42] (lightrag-hku 1.5.7); entity and relation extraction used GLM-5.3-Flash, and the vector index used doubao-embedding-vision-251215 (dimension 2,048). The final index contains 1,864 entities and 3,078 relations (~100 MB). The full system performs risk-guided retrieval: rule matches and active decision items drive entity-boosted hybrid queries (vector + graph structure), executed in context-only mode (retrieving entities, relations, and chunks without letting LightRAG generate the answer itself). Graph context is concatenated with lexical evidence (BM25-style scoring with boosts for active decision items and scenario flags) and passed to the arbiter.</w:t>
+        <w:t xml:space="preserve"> The corpus comprises 357 evidence chunks, all sourced from the ProBIOPSY consensus and its supplementary material: the 112 final statements (evidence level B), 20 narrative passages, 7 systematic-review summaries, and 218 literature entries extracted from the consensus reference lists (level C). The index was built with LightRAG [41] (lightrag-hku 1.5.7); entity and relation extraction used GLM-5.3-Flash, and the vector index used doubao-embedding-vision-251215 (dimension 2,048). The final index contains 1,864 entities and 3,078 relations (~100 MB). The full system performs risk-guided retrieval: rule matches and active decision items drive entity-boosted hybrid queries (vector + graph structure), executed in context-only mode (retrieving entities, relations, and chunks without letting LightRAG generate the answer itself). Graph context is concatenated with lexical evidence (BM25-style scoring with boosts for active decision items and scenario flags) and passed to the arbiter.</w:t>
       </w:r>
     </w:p>
     <w:p>
@@ -4968,7 +4962,7 @@
           <w:b w:val="0"/>
           <w:i w:val="0"/>
         </w:rPr>
-        <w:t>, a property closer to clinical governance needs. Relative to GraphRAG [43] and LightRAG [42], our contribution is system-level: LightRAG remains the evidence engine, but the lightrag-only baseline demonstrates exactly what happens without a rule layer — against over-calling (sensitivity 1.000, specificity 0.922) and conditional silence. Relative to rule-based CDSS [27], our architecture compresses the auditable rule base to 16 consensus rules and delegates long-tail knowledge to graph retrieval, coupling the two via hard constraints rather than parallel voting.</w:t>
+        <w:t>, a property closer to clinical governance needs. Relative to GraphRAG [42] and LightRAG [41], our contribution is system-level: LightRAG remains the evidence engine, but the lightrag-only baseline demonstrates exactly what happens without a rule layer — against over-calling (sensitivity 1.000, specificity 0.922) and conditional silence. Relative to rule-based CDSS [27], our architecture compresses the auditable rule base to 16 consensus rules and delegates long-tail knowledge to graph retrieval, coupling the two via hard constraints rather than parallel voting.</w:t>
       </w:r>
     </w:p>
     <w:p>
@@ -6481,7 +6475,7 @@
           <w:b w:val="0"/>
           <w:i w:val="0"/>
         </w:rPr>
-        <w:t>41. Pan S, Luo L, Wang Y, Chen C, Wang J, Wu X. Unifying Large Language Models and Knowledge Graphs: A Roadmap. IEEE Trans. Knowl. Data Eng. 2024;36(7):3580-3599. https://doi.org/10.1109/tkde.2024.3352100</w:t>
+        <w:t>41. Guo Z, Xia L, Yu Y, Ao T, Huang C. LightRAG: simple and fast retrieval-augmented generation. arXiv:2410.05779, 2024 (verified against arXiv listing).</w:t>
       </w:r>
     </w:p>
     <w:p>
@@ -6494,7 +6488,7 @@
           <w:b w:val="0"/>
           <w:i w:val="0"/>
         </w:rPr>
-        <w:t>42. Guo Z, Xia L, Yu Y, Ao T, Huang C. LightRAG: simple and fast retrieval-augmented generation. arXiv:2410.05779, 2024 (verified against arXiv listing).</w:t>
+        <w:t>42. Edge D, Trinh H, Cheng N, et al. From local to global: a Graph RAG approach to query-focused summarization. arXiv:2404.16130, 2024 (verified via arXiv API).</w:t>
       </w:r>
     </w:p>
     <w:p>
@@ -6507,7 +6501,7 @@
           <w:b w:val="0"/>
           <w:i w:val="0"/>
         </w:rPr>
-        <w:t>43. Edge D, Trinh H, Cheng N, et al. From local to global: a Graph RAG approach to query-focused summarization. arXiv:2404.16130, 2024 (verified via arXiv API).</w:t>
+        <w:t>43. Pan S, Luo L, Wang Y, Chen C, Wang J, Wu X. Unifying Large Language Models and Knowledge Graphs: A Roadmap. IEEE Trans. Knowl. Data Eng. 2024;36(7):3580-3599. https://doi.org/10.1109/tkde.2024.3352100</w:t>
       </w:r>
     </w:p>
     <w:p>

</xml_diff>

<commit_message>
manuscript: introduction polished — paragraph split, transitions, quoted example
</commit_message>
<xml_diff>
--- a/outputs/submission/manuscript.en.docx
+++ b/outputs/submission/manuscript.en.docx
@@ -252,7 +252,7 @@
           <w:b w:val="0"/>
           <w:i w:val="0"/>
         </w:rPr>
-        <w:t>Prostate cancer is among the most common malignancies in men [1,2]. Population-level PSA screening lowers disease-specific mortality [3], and what the biopsy finds — grade group, tumour burden, distribution — determines whether a man is monitored, offered focal therapy, or scheduled for radical treatment. The biopsy is, in this sense, the gateway to every treatment decision in the disease.</w:t>
+        <w:t>Prostate cancer is among the most common malignancies in men [1,2]. Population-level PSA screening lowers disease-specific mortality [3], and what the biopsy finds — grade group, tumour burden, distribution — determines whether a man is monitored, offered focal therapy, or scheduled for radical treatment. The biopsy is, in this sense, the gateway to every treatment decision in prostate cancer.</w:t>
       </w:r>
     </w:p>
     <w:p>
@@ -262,7 +262,7 @@
           <w:b w:val="0"/>
           <w:i w:val="0"/>
         </w:rPr>
-        <w:t>Yet the procedure that feeds these decisions remains insufficiently standardised. Whether systematic cores should be added to MRI-targeted cores [4], which saturation scheme to use [5], transperineal versus transrectal access — whose trade-offs have been quantified in randomised trials [6,7] — and targeted versus empirical prophylaxis [8] remain actively debated. MRI-targeted sampling demonstrably improves clinically significant cancer detection [9-12], but whether it can inform every treatment option at all is unresolved, and biopsy-to-prostatectomy grade discordance complicates downstream planning [13]. The measurements that drive these choices are themselves imperfect: mpMRI misses clinically significant cancer in a minority of men [14], PI-RADS readings agree only moderately between readers [15,16], image quality gates their interpretation [17], and PSA-density thresholds temper but do not settle the decision [18]. Every configuration carries the procedure's well-characterised complication burden [19,20], and the ProBIOPSY consensus documented substantial international practice variation across exactly these choices [21].</w:t>
+        <w:t>Yet the procedure that feeds these decisions remains insufficiently standardised. Whether systematic cores should be added to MRI-targeted cores [4], which saturation scheme to use [5], transperineal versus transrectal access — whose trade-offs have been quantified in randomised trials [6,7] — and targeted versus empirical prophylaxis [8] remain actively debated. MRI-targeted sampling demonstrably improves clinically significant cancer detection [9-12], but whether it can inform every treatment option at all is unresolved, and biopsy-to-prostatectomy grade discordance complicates downstream planning [13].</w:t>
       </w:r>
     </w:p>
     <w:p>
@@ -272,7 +272,7 @@
           <w:b w:val="0"/>
           <w:i w:val="0"/>
         </w:rPr>
-        <w:t>Written guidance has not closed these gaps. The EAU Prostate Cancer Guidelines [22], the AUA/ASTRO Clinically Localized Prostate Cancer Guideline [23] with its 2026 Amendment [24], and the ProBIOPSY consensus [21] converge on the same decision points. Yet a guideline is reference material, not an instrument: at the decision point the clinician must assemble 51 patient-scenario archetypes × 54 biopsy decisions, each combination carrying its own evidence, and no lookup table covers the combinatorics.</w:t>
+        <w:t>Compounding this uncertainty, the measurements that drive these choices are themselves imperfect. mpMRI misses clinically significant cancer in a minority of men [14]; PI-RADS readings agree only moderately between readers [15,16], and image quality gates their interpretation [17]; PSA-density thresholds temper but do not settle the decision [18]. Every configuration carries the procedure's well-characterised complication burden [19,20], and the ProBIOPSY consensus documented substantial international practice variation across exactly these choices [21].</w:t>
       </w:r>
     </w:p>
     <w:p>
@@ -282,7 +282,37 @@
           <w:b w:val="0"/>
           <w:i w:val="0"/>
         </w:rPr>
-        <w:t xml:space="preserve">Software attempts fall short in complementary ways. Rule-based clinical decision support is deterministic but slow to update [25], breeds alert fatigue [26], and cannot digest natural-language evidence [27]. Large language models (LLMs) supply the missing linguistic flexibility [28,29] and approach expert performance on medical question answering [30,31], but they hallucinate and lack verifiable provenance [32], drift from guidelines as they age [33], and give confidently generic advice where patient-specific context changes the answer. For example, asked "Should a 70-year-old man with locally advanced disease undergo extended systematic prostate biopsy?", a general-purpose LLM may respond: "Yes, extended 12-core systematic biopsy is the standard approach." Yet the consensus for suspected locally advanced disease recommends reducing systematic biopsy to a maximum of six cores. A rapidly growing family of domain agents — for atrial-fibrillation self-management [34], hypertension management [35], prostate-cancer education [36], knowledge-graph-grounded dietary recommendations [37], and gene-set analysis [38] — demonstrates that specialised medical AI is feasible, but none is benchmarked against a statement-level guideline gold standard, and all rely on prompt-level rather than binding safeguards. Retrieval-augmented generation (RAG) grounds generation in an external corpus [39] and medical RAG benchmarks show promise [40], but retrieval alone has no mechanism to </w:t>
+        <w:t>Written guidance has not closed these gaps. The EAU Prostate Cancer Guidelines [22], the AUA/ASTRO Clinically Localized Prostate Cancer Guideline [23] with its 2026 Amendment [24], and the ProBIOPSY consensus [21] converge on the same decision points. Yet a guideline is reference material, not an instrument: at the decision point the clinician must assemble 51 patient-scenario archetypes × 54 biopsy decisions, each combination carrying its own evidence, and no lookup table covers the combinatorics. Software is needed — but existing approaches fall short in complementary ways.</w:t>
+      </w:r>
+    </w:p>
+    <w:p>
+      <w:r>
+        <w:rPr>
+          <w:rFonts w:ascii="Times New Roman" w:hAnsi="Times New Roman"/>
+          <w:b w:val="0"/>
+          <w:i w:val="0"/>
+        </w:rPr>
+        <w:t>Rule-based clinical decision support is deterministic but slow to update [25], breeds alert fatigue [26], and cannot digest natural-language evidence [27]. Large language models (LLMs) supply the missing linguistic flexibility [28,29] and approach expert performance on medical question answering [30,31], but they hallucinate and lack verifiable provenance [32], drift from guidelines as they age [33], and give confidently generic advice where patient-specific context changes the answer.</w:t>
+      </w:r>
+    </w:p>
+    <w:p>
+      <w:r>
+        <w:rPr>
+          <w:rFonts w:ascii="Times New Roman" w:hAnsi="Times New Roman"/>
+          <w:b w:val="0"/>
+          <w:i w:val="0"/>
+        </w:rPr>
+        <w:t>For example, asked "Should a 70-year-old man with locally advanced disease undergo extended systematic prostate biopsy?", a general-purpose LLM may respond: "Yes, extended 12-core systematic biopsy is the standard approach." Yet the consensus for suspected locally advanced disease recommends reducing systematic biopsy to a maximum of six cores. The LLM's answer is not hallucinated — it is the right answer for the wrong patient.</w:t>
+      </w:r>
+    </w:p>
+    <w:p>
+      <w:r>
+        <w:rPr>
+          <w:rFonts w:ascii="Times New Roman" w:hAnsi="Times New Roman"/>
+          <w:b w:val="0"/>
+          <w:i w:val="0"/>
+        </w:rPr>
+        <w:t xml:space="preserve">A rapidly growing family of domain agents — for atrial-fibrillation self-management [34], hypertension management [35], prostate-cancer education [36], knowledge-graph-grounded dietary recommendations [37], and gene-set analysis [38] — demonstrates that specialised medical AI is feasible. But none is benchmarked against a statement-level guideline gold standard, and all rely on prompt-level rather than binding safeguards. Retrieval-augmented generation (RAG) grounds generation in an external corpus [39] and medical RAG benchmarks show promise [40], but retrieval alone has no mechanism to </w:t>
       </w:r>
       <w:r>
         <w:rPr>
@@ -308,7 +338,7 @@
           <w:b w:val="0"/>
           <w:i w:val="0"/>
         </w:rPr>
-        <w:t>What is needed is a system that combines the linguistic flexibility of LLMs, the traceable evidence chain of knowledge-graph retrieval, and the deterministic safety of hard constraints — each covering the others' failure modes. QianLieAnHui is that system, realised as an agent. Its three layers map one-to-one onto the failure modes above: the rule engine mechanically enforces consensus constraints that prompting cannot, the retrieval layer surfaces the evidence chain behind each recommendation, and the arbiter layer supplies the linguistic flexibility that rules alone cannot provide. At the retrieval layer we adopt LightRAG [41], a graph-based dual-level retrieval framework that outperforms Microsoft GraphRAG [42] on domain question answering at a fraction of the token cost — an integration consistent with emerging roadmaps for unifying large language models and knowledge graphs [43].</w:t>
+        <w:t>What is needed, therefore, is a system that combines the linguistic flexibility of LLMs, the traceable evidence chain of knowledge-graph retrieval, and the deterministic safety of hard constraints — each covering the others' failure modes. This integration is consistent with emerging roadmaps for unifying large language models and knowledge graphs [41]. QianLieAnHui is that system, realised as an agent. Its rule engine mechanically enforces consensus constraints that prompting cannot; its retrieval layer surfaces the evidence chain behind each recommendation; and its arbiter supplies the linguistic flexibility that rules alone cannot provide.</w:t>
       </w:r>
     </w:p>
     <w:p>
@@ -318,7 +348,7 @@
           <w:b w:val="0"/>
           <w:i w:val="0"/>
         </w:rPr>
-        <w:t>We developed and validated QianLieAnHui (前列安汇; "probiopsy-rag"), a hybrid decision-support system for the prostate biopsy pathway, and quantified each architectural layer's contribution with a multi-method, multi-seed benchmark against the 112 ProBIOPSY final statements. Our contributions are:</w:t>
+        <w:t>We developed and validated QianLieAnHui (前列安汇; "probiopsy-rag"), a decision-support agent for the prostate biopsy pathway, and quantified each architectural layer's contribution with a multi-method, multi-seed benchmark against the 112 ProBIOPSY final statements. Our contributions are:</w:t>
       </w:r>
     </w:p>
     <w:p>
@@ -571,7 +601,7 @@
           <w:b w:val="0"/>
           <w:i w:val="0"/>
         </w:rPr>
-        <w:t xml:space="preserve"> (recommend against). The gold-standard action distribution is endorse 190, conditional 185, against 125, endorse_option 35, and report_option 25. Statements span three domains: indication (n = 23), procedure (n = 34), and treatment planning (n = 55, anchored by ISUP grade-group–driven treatment decisions [44]); 25 statements (22.3%) are against-class, providing a demanding test for systems with optimism bias. The five demonstration vignettes described under Results are synthetic cases built on the same registries and are not part of the 112-statement evaluation set.</w:t>
+        <w:t xml:space="preserve"> (recommend against). The gold-standard action distribution is endorse 190, conditional 185, against 125, endorse_option 35, and report_option 25. Statements span three domains: indication (n = 23), procedure (n = 34), and treatment planning (n = 55, anchored by ISUP grade-group–driven treatment decisions [42]); 25 statements (22.3%) are against-class, providing a demanding test for systems with optimism bias. The five demonstration vignettes described under Results are synthetic cases built on the same registries and are not part of the 112-statement evaluation set.</w:t>
       </w:r>
     </w:p>
     <w:p>
@@ -3269,7 +3299,7 @@
           <w:b w:val="0"/>
           <w:i w:val="0"/>
         </w:rPr>
-        <w:t xml:space="preserve"> The corpus comprises 357 evidence chunks, all sourced from the ProBIOPSY consensus and its supplementary material: the 112 final statements (evidence level B), 20 narrative passages, 7 systematic-review summaries, and 218 literature entries extracted from the consensus reference lists (level C). The index was built with LightRAG [41] (lightrag-hku 1.5.7); entity and relation extraction used GLM-5.3-Flash, and the vector index used doubao-embedding-vision-251215 (dimension 2,048). The final index contains 1,864 entities and 3,078 relations (~100 MB). The full system performs risk-guided retrieval: rule matches and active decision items drive entity-boosted hybrid queries (vector + graph structure), executed in context-only mode (retrieving entities, relations, and chunks without letting LightRAG generate the answer itself). Graph context is concatenated with lexical evidence (BM25-style scoring with boosts for active decision items and scenario flags) and passed to the arbiter.</w:t>
+        <w:t xml:space="preserve"> The corpus comprises 357 evidence chunks, all sourced from the ProBIOPSY consensus and its supplementary material: the 112 final statements (evidence level B), 20 narrative passages, 7 systematic-review summaries, and 218 literature entries extracted from the consensus reference lists (level C). The index was built with LightRAG [43] (lightrag-hku 1.5.7); entity and relation extraction used GLM-5.3-Flash, and the vector index used doubao-embedding-vision-251215 (dimension 2,048). The final index contains 1,864 entities and 3,078 relations (~100 MB). The full system performs risk-guided retrieval: rule matches and active decision items drive entity-boosted hybrid queries (vector + graph structure), executed in context-only mode (retrieving entities, relations, and chunks without letting LightRAG generate the answer itself). Graph context is concatenated with lexical evidence (BM25-style scoring with boosts for active decision items and scenario flags) and passed to the arbiter.</w:t>
       </w:r>
     </w:p>
     <w:p>
@@ -3527,7 +3557,7 @@
           <w:b w:val="0"/>
           <w:i w:val="0"/>
         </w:rPr>
-        <w:t>Exact-5-class accuracy (primary), exact-3 accuracy (collapsing endorse_option→endorse and report_option→conditional, to expose majority-class inflation), five-class macro-F1, Cohen's κ [45] against the gold standard, and binary against-class sensitivity/specificity/F1. All metrics are reported as mean ± SD over the five seeds. Method differences were assessed with two-sided paired t-tests across seeds (full system vs each baseline; exact-5 and κ; six comparisons), with Benjamini–Hochberg false-discovery-rate correction [46]. Context characters per run were logged as an efficiency metric.</w:t>
+        <w:t>Exact-5-class accuracy (primary), exact-3 accuracy (collapsing endorse_option→endorse and report_option→conditional, to expose majority-class inflation), five-class macro-F1, Cohen's κ [44] against the gold standard, and binary against-class sensitivity/specificity/F1. All metrics are reported as mean ± SD over the five seeds. Method differences were assessed with two-sided paired t-tests across seeds (full system vs each baseline; exact-5 and κ; six comparisons), with Benjamini–Hochberg false-discovery-rate correction [45]. Context characters per run were logged as an efficiency metric.</w:t>
       </w:r>
     </w:p>
     <w:p>
@@ -4817,7 +4847,7 @@
           <w:b w:val="0"/>
           <w:i w:val="0"/>
         </w:rPr>
-        <w:t>Experts agreed with each other substantially: raw agreement 17/20 ratings, with per-case modal share 4/4 in three cases, 3/4 in one (case 2), and a 2:2 split in case 1 (Figure 3A). The overall Fleiss κ [47] of −0.09 reflects the known instability of κ under uneven category marginals at this sample size — the agreement paradox described by Feinstein and Cicchetti — rather than poor agreement [48]. The system matched the expert majority in all four cases with a decisive majority (Cohen κ = 1.000, n = 4; Figure 3B). In the split case — whether to add systematic biopsy to targeted plus perilesional biopsy — the two experts favouring conditional endorsement cited treatment-plan dependence (whole-gland versus focal therapy alters the value of added systematic cores), the same consideration the system's evidence chain raises (contralateral systematic yield 0.3–4% [EV0024]). All 80 Likert ratings of the system output were 5/5 (clarity, usefulness, recommendation, evidence; ceiling noted, Figure 3C). At this sample size, all agreement estimates are preliminary.</w:t>
+        <w:t>Experts agreed with each other substantially: raw agreement 17/20 ratings, with per-case modal share 4/4 in three cases, 3/4 in one (case 2), and a 2:2 split in case 1 (Figure 3A). The overall Fleiss κ [46] of −0.09 reflects the known instability of κ under uneven category marginals at this sample size — the agreement paradox described by Feinstein and Cicchetti — rather than poor agreement [47]. The system matched the expert majority in all four cases with a decisive majority (Cohen κ = 1.000, n = 4; Figure 3B). In the split case — whether to add systematic biopsy to targeted plus perilesional biopsy — the two experts favouring conditional endorsement cited treatment-plan dependence (whole-gland versus focal therapy alters the value of added systematic cores), the same consideration the system's evidence chain raises (contralateral systematic yield 0.3–4% [EV0024]). All 80 Likert ratings of the system output were 5/5 (clarity, usefulness, recommendation, evidence; ceiling noted, Figure 3C). At this sample size, all agreement estimates are preliminary.</w:t>
       </w:r>
     </w:p>
     <w:p>
@@ -4946,7 +4976,7 @@
           <w:b w:val="0"/>
           <w:i w:val="0"/>
         </w:rPr>
-        <w:t xml:space="preserve">Large language models are approaching expert-level medical question answering [31] and have generated patient-facing responses rated as more empathetic than physician responses [49]; for constrained, auditable decision support, however, our results indicate that decision architecture — not model capability — is the dominant lever. Medical RAG benchmarks such as MIRAGE [40] evaluate open-question answering accuracy, typically multiple-choice or free text; we instead map an international consensus' final statements onto five executable actions and evaluate </w:t>
+        <w:t xml:space="preserve">Large language models are approaching expert-level medical question answering [31] and have generated patient-facing responses rated as more empathetic than physician responses [48]; for constrained, auditable decision support, however, our results indicate that decision architecture — not model capability — is the dominant lever. Medical RAG benchmarks such as MIRAGE [40] evaluate open-question answering accuracy, typically multiple-choice or free text; we instead map an international consensus' final statements onto five executable actions and evaluate </w:t>
       </w:r>
       <w:r>
         <w:rPr>
@@ -4962,7 +4992,7 @@
           <w:b w:val="0"/>
           <w:i w:val="0"/>
         </w:rPr>
-        <w:t>, a property closer to clinical governance needs. Relative to GraphRAG [42] and LightRAG [41], our contribution is system-level: LightRAG remains the evidence engine, but the lightrag-only baseline demonstrates exactly what happens without a rule layer — against over-calling (sensitivity 1.000, specificity 0.922) and conditional silence. Relative to rule-based CDSS [27], our architecture compresses the auditable rule base to 16 consensus rules and delegates long-tail knowledge to graph retrieval, coupling the two via hard constraints rather than parallel voting.</w:t>
+        <w:t>, a property closer to clinical governance needs. Relative to GraphRAG [49] and LightRAG [43], our contribution is system-level: LightRAG remains the evidence engine, but the lightrag-only baseline demonstrates exactly what happens without a rule layer — against over-calling (sensitivity 1.000, specificity 0.922) and conditional silence. Relative to rule-based CDSS [27], our architecture compresses the auditable rule base to 16 consensus rules and delegates long-tail knowledge to graph retrieval, coupling the two via hard constraints rather than parallel voting.</w:t>
       </w:r>
     </w:p>
     <w:p>
@@ -5166,7 +5196,7 @@
           <w:b w:val="0"/>
           <w:i w:val="0"/>
         </w:rPr>
-        <w:t xml:space="preserve">: four experts rated five composite propositions; agreement statistics at this n are unstable (a negative Fleiss κ despite 17/20 raw agreement illustrates the artefact [48]), all Likert ratings hit the ceiling, and the panel was single-institution — the review therefore supports preliminary face validity only. Fourth, </w:t>
+        <w:t xml:space="preserve">: four experts rated five composite propositions; agreement statistics at this n are unstable (a negative Fleiss κ despite 17/20 raw agreement illustrates the artefact [47]), all Likert ratings hit the ceiling, and the panel was single-institution — the review therefore supports preliminary face validity only. Fourth, </w:t>
       </w:r>
       <w:r>
         <w:rPr>
@@ -6475,7 +6505,7 @@
           <w:b w:val="0"/>
           <w:i w:val="0"/>
         </w:rPr>
-        <w:t>41. Guo Z, Xia L, Yu Y, Ao T, Huang C. LightRAG: simple and fast retrieval-augmented generation. arXiv:2410.05779, 2024 (verified against arXiv listing).</w:t>
+        <w:t>41. Pan S, Luo L, Wang Y, Chen C, Wang J, Wu X. Unifying Large Language Models and Knowledge Graphs: A Roadmap. IEEE Trans. Knowl. Data Eng. 2024;36(7):3580-3599. https://doi.org/10.1109/tkde.2024.3352100</w:t>
       </w:r>
     </w:p>
     <w:p>
@@ -6488,7 +6518,7 @@
           <w:b w:val="0"/>
           <w:i w:val="0"/>
         </w:rPr>
-        <w:t>42. Edge D, Trinh H, Cheng N, et al. From local to global: a Graph RAG approach to query-focused summarization. arXiv:2404.16130, 2024 (verified via arXiv API).</w:t>
+        <w:t>42. Epstein JI, Amin MB, Reuter VE, Humphrey PA. Contemporary Gleason Grading of Prostatic Carcinoma: An Update With Discussion on Practical Issues to Implement the 2014 International Society of Urological Pathology (ISUP) Consensus Conference on Gleason Grading of Prostatic Carcinoma. American Journal of Surgical Pathology. 2017;41(4):e1-e7. https://doi.org/10.1097/pas.0000000000000820</w:t>
       </w:r>
     </w:p>
     <w:p>
@@ -6501,7 +6531,7 @@
           <w:b w:val="0"/>
           <w:i w:val="0"/>
         </w:rPr>
-        <w:t>43. Pan S, Luo L, Wang Y, Chen C, Wang J, Wu X. Unifying Large Language Models and Knowledge Graphs: A Roadmap. IEEE Trans. Knowl. Data Eng. 2024;36(7):3580-3599. https://doi.org/10.1109/tkde.2024.3352100</w:t>
+        <w:t>43. Guo Z, Xia L, Yu Y, Ao T, Huang C. LightRAG: simple and fast retrieval-augmented generation. arXiv:2410.05779, 2024 (verified against arXiv listing).</w:t>
       </w:r>
     </w:p>
     <w:p>
@@ -6514,7 +6544,7 @@
           <w:b w:val="0"/>
           <w:i w:val="0"/>
         </w:rPr>
-        <w:t>44. Epstein JI, Amin MB, Reuter VE, Humphrey PA. Contemporary Gleason Grading of Prostatic Carcinoma: An Update With Discussion on Practical Issues to Implement the 2014 International Society of Urological Pathology (ISUP) Consensus Conference on Gleason Grading of Prostatic Carcinoma. American Journal of Surgical Pathology. 2017;41(4):e1-e7. https://doi.org/10.1097/pas.0000000000000820</w:t>
+        <w:t>44. Cohen J. A Coefficient of Agreement for Nominal Scales. Educational and Psychological Measurement. 1960;20(1):37-46. https://doi.org/10.1177/001316446002000104</w:t>
       </w:r>
     </w:p>
     <w:p>
@@ -6527,7 +6557,7 @@
           <w:b w:val="0"/>
           <w:i w:val="0"/>
         </w:rPr>
-        <w:t>45. Cohen J. A Coefficient of Agreement for Nominal Scales. Educational and Psychological Measurement. 1960;20(1):37-46. https://doi.org/10.1177/001316446002000104</w:t>
+        <w:t>45. Benjamini Y, Hochberg Y. Controlling the False Discovery Rate: A Practical and Powerful Approach to Multiple Testing. Journal of the Royal Statistical Society Series B: Statistical Methodology. 1995;57(1):289-300. https://doi.org/10.1111/j.2517-6161.1995.tb02031.x</w:t>
       </w:r>
     </w:p>
     <w:p>
@@ -6540,7 +6570,7 @@
           <w:b w:val="0"/>
           <w:i w:val="0"/>
         </w:rPr>
-        <w:t>46. Benjamini Y, Hochberg Y. Controlling the False Discovery Rate: A Practical and Powerful Approach to Multiple Testing. Journal of the Royal Statistical Society Series B: Statistical Methodology. 1995;57(1):289-300. https://doi.org/10.1111/j.2517-6161.1995.tb02031.x</w:t>
+        <w:t>46. Fleiss JL. Measuring nominal scale agreement among many raters.. Psychological Bulletin. 1971;76(5):378-382. https://doi.org/10.1037/h0031619</w:t>
       </w:r>
     </w:p>
     <w:p>
@@ -6553,7 +6583,7 @@
           <w:b w:val="0"/>
           <w:i w:val="0"/>
         </w:rPr>
-        <w:t>47. Fleiss JL. Measuring nominal scale agreement among many raters.. Psychological Bulletin. 1971;76(5):378-382. https://doi.org/10.1037/h0031619</w:t>
+        <w:t>47. Feinstein AR, Cicchetti DV. High agreement but low Kappa: I. the problems of two paradoxes. Journal of Clinical Epidemiology. 1990;43(6):543-549. https://doi.org/10.1016/0895-4356(90)90158-l</w:t>
       </w:r>
     </w:p>
     <w:p>
@@ -6566,7 +6596,7 @@
           <w:b w:val="0"/>
           <w:i w:val="0"/>
         </w:rPr>
-        <w:t>48. Feinstein AR, Cicchetti DV. High agreement but low Kappa: I. the problems of two paradoxes. Journal of Clinical Epidemiology. 1990;43(6):543-549. https://doi.org/10.1016/0895-4356(90)90158-l</w:t>
+        <w:t>48. Ayers JW, Poliak A, Dredze M, et al. Comparing Physician and Artificial Intelligence Chatbot Responses to Patient Questions Posted to a Public Social Media Forum. JAMA Intern Med. 2023;183(6):589. https://doi.org/10.1001/jamainternmed.2023.1838</w:t>
       </w:r>
     </w:p>
     <w:p>
@@ -6579,7 +6609,7 @@
           <w:b w:val="0"/>
           <w:i w:val="0"/>
         </w:rPr>
-        <w:t>49. Ayers JW, Poliak A, Dredze M, et al. Comparing Physician and Artificial Intelligence Chatbot Responses to Patient Questions Posted to a Public Social Media Forum. JAMA Intern Med. 2023;183(6):589. https://doi.org/10.1001/jamainternmed.2023.1838</w:t>
+        <w:t>49. Edge D, Trinh H, Cheng N, et al. From local to global: a Graph RAG approach to query-focused summarization. arXiv:2404.16130, 2024 (verified via arXiv API).</w:t>
       </w:r>
     </w:p>
     <w:p>

</xml_diff>

<commit_message>
tables: Table 2 rationale sentences completed — rationale_short field in rules.yaml, no more 220-char truncation
</commit_message>
<xml_diff>
--- a/outputs/submission/manuscript.en.docx
+++ b/outputs/submission/manuscript.en.docx
@@ -1289,7 +1289,7 @@
                 <w:i w:val="0"/>
                 <w:sz w:val="18"/>
               </w:rPr>
-              <w:t>ProBIOPSY consensus: every prostate MRI must be checked against PI-QUAL v2 quality criteria before the biopsy pathway is decided (Q4a median 9, Q4b median 8 — consensus agree);</w:t>
+              <w:t>Every prostate MRI must be checked against PI-QUAL v2 quality criteria before the biopsy pathway is decided (Q4a median 9, Q4b median 8 — consensus agree); a quality-assured scan — 1.5T or 3T, biparametric without routine contrast-enhanced sequences — is acceptable (Q1, Q5-Q7 median 8), and MRI that fails quality standards must not gate the biopsy decision.</w:t>
             </w:r>
           </w:p>
         </w:tc>
@@ -1424,7 +1424,7 @@
                 <w:i w:val="0"/>
                 <w:sz w:val="18"/>
               </w:rPr>
-              <w:t>For an indeterminate lesion (PI-RADS 3), ProBIOPSY endorses PSAD as the primary gate to reduce unnecessary biopsies — for bpMRI (Q11 median 7) and even more strongly for mpMRI (Q14 median 8);</w:t>
+              <w:t>For an indeterminate lesion (PI-RADS 3), ProBIOPSY endorses PSAD as the primary gate to reduce unnecessary biopsies — for bpMRI (Q11 median 7) and even more strongly for mpMRI (Q14 median 8) — whereas PSMA PET and microultrasound remain conditional options rather than standard workup (Q18, Q21).</w:t>
             </w:r>
           </w:p>
         </w:tc>
@@ -1559,7 +1559,7 @@
                 <w:i w:val="0"/>
                 <w:sz w:val="18"/>
               </w:rPr>
-              <w:t>ProBIOPSY: when MRI is negative but clinical suspicion remains high (abnormal DRE, persistently elevated PSA, strong family history, Black ethnicity, prior negative biopsy), a 12-core systematic biopsy is still endorsed…</w:t>
+              <w:t>When MRI is negative but clinical suspicion remains high (abnormal DRE, persistently elevated PSA, strong family history, Black ethnicity, or prior negative biopsy), a 12-core systematic biopsy is still endorsed (Q25 median 7 — consensus agree; Q55a median 7) and PSMA PET may serve as an ancillary test (Q19 median 8 — consensus agree).</w:t>
             </w:r>
           </w:p>
         </w:tc>
@@ -1694,7 +1694,7 @@
                 <w:i w:val="0"/>
                 <w:sz w:val="18"/>
               </w:rPr>
-              <w:t>ProBIOPSY explicitly rejects PSMA PET/MRI as an upfront first-line biopsy-decision tool (Q17 median 2 — consensus disagree) and microultrasound as an upfront alternative to prostate MRI (Q20 median 2 — consensus disagree…</w:t>
+              <w:t>ProBIOPSY explicitly rejects PSMA PET/MRI as an upfront first-line biopsy-decision tool (Q17 median 2 — consensus disagree) and microultrasound as an upfront alternative to prostate MRI (Q20 median 2 — consensus disagree); both modalities have defined ancillary niches but must not replace quality-assured MRI at triage.</w:t>
             </w:r>
           </w:p>
         </w:tc>
@@ -2099,7 +2099,7 @@
                 <w:i w:val="0"/>
                 <w:sz w:val="18"/>
               </w:rPr>
-              <w:t>ProBIOPSY endorses the 12-core systematic template as the standard when systematic cores are indicated (Q52 median 8 — consensus agree) and rejects the classical 6-core sextant template (Q51 median 3), the Ginsburg 4-6 c…</w:t>
+              <w:t>ProBIOPSY endorses the 12-core systematic template as the standard when systematic cores are indicated (Q52 median 8 — consensus agree) and rejects the classical 6-core sextant template (Q51 median 3), the Ginsburg 4-6 core template (Q53 median 3) and saturation biopsy (Q54 median 2) — all by consensus disagree.</w:t>
             </w:r>
           </w:p>
         </w:tc>
@@ -2234,7 +2234,7 @@
                 <w:i w:val="0"/>
                 <w:sz w:val="18"/>
               </w:rPr>
-              <w:t>ProBIOPSY reached no consensus on a fixed targeted-core count: adapting the number of targeted cores to PI-RADS score was 'neither' (Q34 median 6), and the proposed minimum of 3 cores per target failed to reach consensus…</w:t>
+              <w:t>ProBIOPSY reached no consensus on a fixed targeted-core count: adapting the number of targeted cores to PI-RADS score was rated 'neither' (Q34 median 6) and the proposed minimum of 3 cores per target failed to reach consensus in both rounds (Q35, Q36), so the system reports core count as an open option rather than enforcing a fixed number.</w:t>
             </w:r>
           </w:p>
         </w:tc>
@@ -2369,7 +2369,7 @@
                 <w:i w:val="0"/>
                 <w:sz w:val="18"/>
               </w:rPr>
-              <w:t>ProBIOPSY adopts the term 'perilesional biopsy' for cores placed just outside the MRI lesion margin (Q37a — SOQ consensus), requires targeted cores to be placed within 10 mm of the lesion (Q38 — SOQ consensus), scales th…</w:t>
+              <w:t>ProBIOPSY adopts the term 'perilesional biopsy' for cores placed just outside the MRI lesion margin (Q37a — SOQ consensus), requires targeted cores to be placed within 10 mm of the lesion (Q38 — SOQ consensus) and scales the number of perilesional cores to lesion size (Q39 median 7 — consensus agree), with a maximum of 2 cores per large lesion (Q41 — SOQ consensus).</w:t>
             </w:r>
           </w:p>
         </w:tc>
@@ -2504,7 +2504,7 @@
                 <w:i w:val="0"/>
                 <w:sz w:val="18"/>
               </w:rPr>
-              <w:t>ProBIOPSY endorses targeted + perilesional biopsy without contralateral systematic cores for a unifocal lesion (Q43 median 7 — consensus agree) and for multifocal ipsilateral disease reaching bilateral tissue adequacy is…</w:t>
+              <w:t>For a unifocal lesion, ProBIOPSY endorses targeted + perilesional biopsy without contralateral systematic cores (Q43 median 7 — consensus agree) and bilateral targeted+perilesional schemes for multifocal bilateral disease (Q49 median 7 — consensus agree), while adding full systematic biopsy to a targeted+perilesional scheme is rejected (Q45 median 3 — consensus disagree).</w:t>
             </w:r>
           </w:p>
         </w:tc>
@@ -2774,7 +2774,7 @@
                 <w:i w:val="0"/>
                 <w:sz w:val="18"/>
               </w:rPr>
-              <w:t>ProBIOPSY links biopsy scheme to downstream treatment intent: for focal therapy, targeted+perilesional alone is deemed insufficient and contralateral systematic biopsy must be added (Q65 median 7 — consensus agree);</w:t>
+              <w:t>ProBIOPSY links biopsy scheme to downstream treatment intent: for focal therapy, targeted+perilesional alone is deemed insufficient and contralateral systematic biopsy must be added (Q65 median 7 — consensus agree), whereas nerve sparing, whole-gland radiotherapy, focal boost and ADT-duration planning are adequately served by targeted+perilesional schemes (Q67, Q70, Q79, Q85, Q88, Q91, Q94 median 7-8).</w:t>
             </w:r>
           </w:p>
         </w:tc>
@@ -2900,7 +2900,7 @@
                 <w:i w:val="0"/>
                 <w:sz w:val="18"/>
               </w:rPr>
-              <w:t>Infection risk factors (Q62 catalogue: immunosuppression, prior prostatitis, recent instrumentation, MRSA colonization, etc.) escalate the perioperative rule R11 — prefer the transperineal route and augmented prophylaxis…</w:t>
+              <w:t>Infection risk factors (Q62 catalogue: immunosuppression, prior prostatitis, recent instrumentation, MRSA colonization) escalate the perioperative rule R11 — prefer the transperineal route and augmented prophylaxis when transrectal access is unavoidable.</w:t>
             </w:r>
           </w:p>
         </w:tc>

</xml_diff>

<commit_message>
features: patient-facing education mode — curated fact base (10 entries), dual-mode chat UI, 3 real GLM consultations, manuscript Methods/Results/Discussion + Supplementary S7, 2 PubMed-verified refs
</commit_message>
<xml_diff>
--- a/outputs/submission/manuscript.en.docx
+++ b/outputs/submission/manuscript.en.docx
@@ -124,7 +124,7 @@
           <w:b w:val="0"/>
           <w:i w:val="0"/>
         </w:rPr>
-        <w:t xml:space="preserve"> abstract 245 / main text ~3,300 (excl. tables, legends, references)</w:t>
+        <w:t xml:space="preserve"> abstract 265 / main text ~4,100 (excl. tables, legends, references)</w:t>
       </w:r>
     </w:p>
     <w:p>
@@ -183,7 +183,7 @@
           <w:b w:val="0"/>
           <w:i w:val="0"/>
         </w:rPr>
-        <w:t xml:space="preserve"> We developed QianLieAnHui, a decision-support agent that encodes the consensus as an executable checklist. The system chains three layers: a deterministic rule engine (16 rules cross-checked against EAU and AUA/ASTRO guidelines) that emits hard constraints; risk-guided retrieval over a LightRAG knowledge graph built from 357 consensus-derived evidence chunks; and an LLM arbiter that produces one of five executable actions with statement-level citations. Benchmarked across four architectures × five seeds × 112 statements (2,240 runs, generator fixed).</w:t>
+        <w:t xml:space="preserve"> We developed QianLieAnHui, a decision-support agent that encodes the consensus as an executable checklist. The system chains three layers: a deterministic rule engine (16 rules cross-checked against EAU and AUA/ASTRO guidelines) that emits hard constraints; risk-guided retrieval over a LightRAG knowledge graph built from 357 consensus-derived evidence chunks; and an LLM arbiter that produces one of five executable actions with statement-level citations. A patient-facing education mode reuses the same frozen evidence base with a curated, source-traceable fact base for lay-language counselling. Benchmarked across four architectures × five seeds × 112 statements (2,240 runs, generator fixed).</w:t>
       </w:r>
     </w:p>
     <w:p>
@@ -453,6 +453,32 @@
           <w:i w:val="0"/>
         </w:rPr>
         <w:t xml:space="preserve"> Rules, registries, evidence corpus, all 2,240 raw predictions, and evaluation scripts are released; the index records the rule-file SHA-256 at build time so the app can verify index–rules version integrity.</w:t>
+      </w:r>
+    </w:p>
+    <w:p>
+      <w:r>
+        <w:rPr>
+          <w:rFonts w:ascii="Times New Roman" w:hAnsi="Times New Roman"/>
+          <w:b w:val="0"/>
+          <w:i w:val="0"/>
+        </w:rPr>
+        <w:t xml:space="preserve">5. </w:t>
+      </w:r>
+      <w:r>
+        <w:rPr>
+          <w:rFonts w:ascii="Times New Roman" w:hAnsi="Times New Roman"/>
+          <w:b/>
+          <w:i w:val="0"/>
+        </w:rPr>
+        <w:t>Patient-facing education.</w:t>
+      </w:r>
+      <w:r>
+        <w:rPr>
+          <w:rFonts w:ascii="Times New Roman" w:hAnsi="Times New Roman"/>
+          <w:b w:val="0"/>
+          <w:i w:val="0"/>
+        </w:rPr>
+        <w:t xml:space="preserve"> An education mode that serves patients and families from the same audited evidence chain — the frozen consensus corpus plus a curated, source-traceable fact base — answering in lay language the questions clinicians have no time for: what a benign report does and does not mean, HGPIN and ASAP, pain and anaesthesia, and post-biopsy warning signs.</w:t>
       </w:r>
     </w:p>
     <w:p>
@@ -3339,13 +3365,13 @@
       </w:r>
     </w:p>
     <w:p>
-      <w:pPr>
-        <w:pStyle w:val="Heading2"/>
-      </w:pPr>
-      <w:r>
-        <w:rPr>
+      <w:r>
+        <w:rPr>
+          <w:rFonts w:ascii="Times New Roman" w:hAnsi="Times New Roman"/>
           <w:b/>
-        </w:rPr>
+          <w:i w:val="0"/>
+        </w:rPr>
+        <w:t>Patient-facing education mode.</w:t>
       </w:r>
       <w:r>
         <w:rPr>
@@ -3353,95 +3379,7 @@
           <w:b w:val="0"/>
           <w:i w:val="0"/>
         </w:rPr>
-        <w:t>Baseline methods</w:t>
-      </w:r>
-    </w:p>
-    <w:p>
-      <w:r>
-        <w:rPr>
-          <w:rFonts w:ascii="Times New Roman" w:hAnsi="Times New Roman"/>
-          <w:b w:val="0"/>
-          <w:i w:val="0"/>
-        </w:rPr>
-        <w:t xml:space="preserve">1. </w:t>
-      </w:r>
-      <w:r>
-        <w:rPr>
-          <w:rFonts w:ascii="Times New Roman" w:hAnsi="Times New Roman"/>
-          <w:b/>
-          <w:i w:val="0"/>
-        </w:rPr>
-        <w:t>pure_llm</w:t>
-      </w:r>
-      <w:r>
-        <w:rPr>
-          <w:rFonts w:ascii="Times New Roman" w:hAnsi="Times New Roman"/>
-          <w:b w:val="0"/>
-          <w:i w:val="0"/>
-        </w:rPr>
-        <w:t xml:space="preserve"> — question answered directly by the LLM with no retrieval and no rules;</w:t>
-      </w:r>
-    </w:p>
-    <w:p>
-      <w:r>
-        <w:rPr>
-          <w:rFonts w:ascii="Times New Roman" w:hAnsi="Times New Roman"/>
-          <w:b w:val="0"/>
-          <w:i w:val="0"/>
-        </w:rPr>
-        <w:t xml:space="preserve">2. </w:t>
-      </w:r>
-      <w:r>
-        <w:rPr>
-          <w:rFonts w:ascii="Times New Roman" w:hAnsi="Times New Roman"/>
-          <w:b/>
-          <w:i w:val="0"/>
-        </w:rPr>
-        <w:t>naive_rag</w:t>
-      </w:r>
-      <w:r>
-        <w:rPr>
-          <w:rFonts w:ascii="Times New Roman" w:hAnsi="Times New Roman"/>
-          <w:b w:val="0"/>
-          <w:i w:val="0"/>
-        </w:rPr>
-        <w:t xml:space="preserve"> — BM25-style lexical retrieval of top-6 chunks (mean 3,644 characters) inserted into the prompt;</w:t>
-      </w:r>
-    </w:p>
-    <w:p>
-      <w:r>
-        <w:rPr>
-          <w:rFonts w:ascii="Times New Roman" w:hAnsi="Times New Roman"/>
-          <w:b w:val="0"/>
-          <w:i w:val="0"/>
-        </w:rPr>
-        <w:t xml:space="preserve">3. </w:t>
-      </w:r>
-      <w:r>
-        <w:rPr>
-          <w:rFonts w:ascii="Times New Roman" w:hAnsi="Times New Roman"/>
-          <w:b/>
-          <w:i w:val="0"/>
-        </w:rPr>
-        <w:t>lightrag-only</w:t>
-      </w:r>
-      <w:r>
-        <w:rPr>
-          <w:rFonts w:ascii="Times New Roman" w:hAnsi="Times New Roman"/>
-          <w:b w:val="0"/>
-          <w:i w:val="0"/>
-        </w:rPr>
-        <w:t xml:space="preserve"> — end-to-end LightRAG hybrid-mode question answering (mean 2,468 characters), with no rule guidance and no hard constraints.</w:t>
-      </w:r>
-    </w:p>
-    <w:p>
-      <w:r>
-        <w:rPr>
-          <w:rFonts w:ascii="Times New Roman" w:hAnsi="Times New Roman"/>
-          <w:b w:val="0"/>
-          <w:i w:val="0"/>
-        </w:rPr>
-        <w:t>The full system uses a mean of 7,640 characters (graph + lexical), substantially more than the RAG baselines but bounded by a hard context budget.</w:t>
+        <w:t xml:space="preserve"> The same frozen corpus and retrieval stack also support a patient-facing education mode. A complete biopsy pathway must counsel patients, not only clinicians: whether a benign report closes the matter, what HGPIN or ASAP means, and whether the procedure is tolerable are questions urologists field daily, yet clinician time for such conversations is limited and meeting patients' evolving informational needs is among the first casualties of stretched clinics [34]. The mode couples (i) retrieval, unchanged, over the frozen 357-chunk consensus corpus and knowledge graph; (ii) a curated patient-education fact base of ten entries — biopsy sampling logic, why a biopsy is advised, the meaning of a benign report, HGPIN, ASAP, pain and anaesthesia, preparation, post-biopsy warning signs, result interpretation, and shared decision-making — keyword-matched to the patient's question; and (iii) a generation prompt that instructs lay language, forbids invented statistics, requires an explicit safety-netting paragraph (when to seek urgent care), and ends by directing the patient to the treating clinician. Every fact entry carries a verifiable source: the consensus [21], the EAU and AUA/ASTRO guidelines [22,23], the TRANSLATE trial [6], the complication review [44], and peer-reviewed accounts of isolated HGPIN [45] and ASAP management [46]. The mode is exposed in the application UI alongside the clinician mode; it is not part of the 2,240-run benchmark and is demonstrated qualitatively in Results.</w:t>
       </w:r>
     </w:p>
     <w:p>
@@ -3459,7 +3397,7 @@
           <w:b w:val="0"/>
           <w:i w:val="0"/>
         </w:rPr>
-        <w:t>Benchmark protocol</w:t>
+        <w:t>Baseline methods</w:t>
       </w:r>
     </w:p>
     <w:p>
@@ -3469,7 +3407,7 @@
           <w:b w:val="0"/>
           <w:i w:val="0"/>
         </w:rPr>
-        <w:t xml:space="preserve">Four methods × five seeds (0–4; temperature 0.2) × 112 statements = </w:t>
+        <w:t xml:space="preserve">1. </w:t>
       </w:r>
       <w:r>
         <w:rPr>
@@ -3477,7 +3415,7 @@
           <w:b/>
           <w:i w:val="0"/>
         </w:rPr>
-        <w:t>2,240 runs</w:t>
+        <w:t>pure_llm</w:t>
       </w:r>
       <w:r>
         <w:rPr>
@@ -3485,7 +3423,17 @@
           <w:b w:val="0"/>
           <w:i w:val="0"/>
         </w:rPr>
-        <w:t xml:space="preserve">, resumable by (method, seed, statement_id) key. </w:t>
+        <w:t xml:space="preserve"> — question answered directly by the LLM with no retrieval and no rules;</w:t>
+      </w:r>
+    </w:p>
+    <w:p>
+      <w:r>
+        <w:rPr>
+          <w:rFonts w:ascii="Times New Roman" w:hAnsi="Times New Roman"/>
+          <w:b w:val="0"/>
+          <w:i w:val="0"/>
+        </w:rPr>
+        <w:t xml:space="preserve">2. </w:t>
       </w:r>
       <w:r>
         <w:rPr>
@@ -3493,7 +3441,7 @@
           <w:b/>
           <w:i w:val="0"/>
         </w:rPr>
-        <w:t>The generator was held fixed at GLM-5.3-Flash for all methods and seeds</w:t>
+        <w:t>naive_rag</w:t>
       </w:r>
       <w:r>
         <w:rPr>
@@ -3501,7 +3449,43 @@
           <w:b w:val="0"/>
           <w:i w:val="0"/>
         </w:rPr>
-        <w:t>, so that inter-method differences are attributable to retrieval and decision architecture (rules, retrieval strategy, hard constraints) rather than model capability; rate-limiting parameters were identical across methods. All 2,240 runs returned successfully with zero errors and zero degraded records. As a generator-robustness supplement, pure_llm and naive_rag were re-run in full with the flagship GLM-5.3 tier (5 seeds × 112 statements = 1,120 records).</w:t>
+        <w:t xml:space="preserve"> — BM25-style lexical retrieval of top-6 chunks (mean 3,644 characters) inserted into the prompt;</w:t>
+      </w:r>
+    </w:p>
+    <w:p>
+      <w:r>
+        <w:rPr>
+          <w:rFonts w:ascii="Times New Roman" w:hAnsi="Times New Roman"/>
+          <w:b w:val="0"/>
+          <w:i w:val="0"/>
+        </w:rPr>
+        <w:t xml:space="preserve">3. </w:t>
+      </w:r>
+      <w:r>
+        <w:rPr>
+          <w:rFonts w:ascii="Times New Roman" w:hAnsi="Times New Roman"/>
+          <w:b/>
+          <w:i w:val="0"/>
+        </w:rPr>
+        <w:t>lightrag-only</w:t>
+      </w:r>
+      <w:r>
+        <w:rPr>
+          <w:rFonts w:ascii="Times New Roman" w:hAnsi="Times New Roman"/>
+          <w:b w:val="0"/>
+          <w:i w:val="0"/>
+        </w:rPr>
+        <w:t xml:space="preserve"> — end-to-end LightRAG hybrid-mode question answering (mean 2,468 characters), with no rule guidance and no hard constraints.</w:t>
+      </w:r>
+    </w:p>
+    <w:p>
+      <w:r>
+        <w:rPr>
+          <w:rFonts w:ascii="Times New Roman" w:hAnsi="Times New Roman"/>
+          <w:b w:val="0"/>
+          <w:i w:val="0"/>
+        </w:rPr>
+        <w:t>The full system uses a mean of 7,640 characters (graph + lexical), substantially more than the RAG baselines but bounded by a hard context budget.</w:t>
       </w:r>
     </w:p>
     <w:p>
@@ -3519,7 +3503,7 @@
           <w:b w:val="0"/>
           <w:i w:val="0"/>
         </w:rPr>
-        <w:t>Expert blinded review</w:t>
+        <w:t>Benchmark protocol</w:t>
       </w:r>
     </w:p>
     <w:p>
@@ -3529,7 +3513,39 @@
           <w:b w:val="0"/>
           <w:i w:val="0"/>
         </w:rPr>
-        <w:t>The five demonstration cases were rated by an independent four-expert panel (two urological surgeons, one radiologist, one radiation oncologist; none involved in development). Each case was presented as a composite proposition assembled from declarative decision items. In a blinded first pass, experts selected their own five-class action for the composite proposition; the system verdict (action, confidence, rationale, citations) was then revealed, and experts rated four Likert dimensions (clarity, usefulness, recommendation agreement, evidence sufficiency; 1–5). Pre-registered analysis rules: expert majority = modal rating; 2:2 splits recorded as no-majority and excluded from the system-versus-majority Cohen κ; all agreement statistics interpreted as preliminary given the sample size. The questionnaire and verbatim expert comments are provided in Supplementary S6.</w:t>
+        <w:t xml:space="preserve">Four methods × five seeds (0–4; temperature 0.2) × 112 statements = </w:t>
+      </w:r>
+      <w:r>
+        <w:rPr>
+          <w:rFonts w:ascii="Times New Roman" w:hAnsi="Times New Roman"/>
+          <w:b/>
+          <w:i w:val="0"/>
+        </w:rPr>
+        <w:t>2,240 runs</w:t>
+      </w:r>
+      <w:r>
+        <w:rPr>
+          <w:rFonts w:ascii="Times New Roman" w:hAnsi="Times New Roman"/>
+          <w:b w:val="0"/>
+          <w:i w:val="0"/>
+        </w:rPr>
+        <w:t xml:space="preserve">, resumable by (method, seed, statement_id) key. </w:t>
+      </w:r>
+      <w:r>
+        <w:rPr>
+          <w:rFonts w:ascii="Times New Roman" w:hAnsi="Times New Roman"/>
+          <w:b/>
+          <w:i w:val="0"/>
+        </w:rPr>
+        <w:t>The generator was held fixed at GLM-5.3-Flash for all methods and seeds</w:t>
+      </w:r>
+      <w:r>
+        <w:rPr>
+          <w:rFonts w:ascii="Times New Roman" w:hAnsi="Times New Roman"/>
+          <w:b w:val="0"/>
+          <w:i w:val="0"/>
+        </w:rPr>
+        <w:t>, so that inter-method differences are attributable to retrieval and decision architecture (rules, retrieval strategy, hard constraints) rather than model capability; rate-limiting parameters were identical across methods. All 2,240 runs returned successfully with zero errors and zero degraded records. As a generator-robustness supplement, pure_llm and naive_rag were re-run in full with the flagship GLM-5.3 tier (5 seeds × 112 statements = 1,120 records).</w:t>
       </w:r>
     </w:p>
     <w:p>
@@ -3547,7 +3563,7 @@
           <w:b w:val="0"/>
           <w:i w:val="0"/>
         </w:rPr>
-        <w:t>Metrics</w:t>
+        <w:t>Expert blinded review</w:t>
       </w:r>
     </w:p>
     <w:p>
@@ -3557,7 +3573,35 @@
           <w:b w:val="0"/>
           <w:i w:val="0"/>
         </w:rPr>
-        <w:t>Exact-5-class accuracy (primary), exact-3 accuracy (collapsing endorse_option→endorse and report_option→conditional, to expose majority-class inflation), five-class macro-F1, Cohen's κ [44] against the gold standard, and binary against-class sensitivity/specificity/F1. All metrics are reported as mean ± SD over the five seeds. Method differences were assessed with two-sided paired t-tests across seeds (full system vs each baseline; exact-5 and κ; six comparisons), with Benjamini–Hochberg false-discovery-rate correction [45]. Context characters per run were logged as an efficiency metric.</w:t>
+        <w:t>The five demonstration cases were rated by an independent four-expert panel (two urological surgeons, one radiologist, one radiation oncologist; none involved in development). Each case was presented as a composite proposition assembled from declarative decision items. In a blinded first pass, experts selected their own five-class action for the composite proposition; the system verdict (action, confidence, rationale, citations) was then revealed, and experts rated four Likert dimensions (clarity, usefulness, recommendation agreement, evidence sufficiency; 1–5). Pre-registered analysis rules: expert majority = modal rating; 2:2 splits recorded as no-majority and excluded from the system-versus-majority Cohen κ; all agreement statistics interpreted as preliminary given the sample size. The questionnaire and verbatim expert comments are provided in Supplementary S6.</w:t>
+      </w:r>
+    </w:p>
+    <w:p>
+      <w:pPr>
+        <w:pStyle w:val="Heading2"/>
+      </w:pPr>
+      <w:r>
+        <w:rPr>
+          <w:b/>
+        </w:rPr>
+      </w:r>
+      <w:r>
+        <w:rPr>
+          <w:rFonts w:ascii="Times New Roman" w:hAnsi="Times New Roman"/>
+          <w:b w:val="0"/>
+          <w:i w:val="0"/>
+        </w:rPr>
+        <w:t>Metrics</w:t>
+      </w:r>
+    </w:p>
+    <w:p>
+      <w:r>
+        <w:rPr>
+          <w:rFonts w:ascii="Times New Roman" w:hAnsi="Times New Roman"/>
+          <w:b w:val="0"/>
+          <w:i w:val="0"/>
+        </w:rPr>
+        <w:t>Exact-5-class accuracy (primary), exact-3 accuracy (collapsing endorse_option→endorse and report_option→conditional, to expose majority-class inflation), five-class macro-F1, Cohen's κ [47] against the gold standard, and binary against-class sensitivity/specificity/F1. All metrics are reported as mean ± SD over the five seeds. Method differences were assessed with two-sided paired t-tests across seeds (full system vs each baseline; exact-5 and κ; six comparisons), with Benjamini–Hochberg false-discovery-rate correction [48]. Context characters per run were logged as an efficiency metric.</w:t>
       </w:r>
     </w:p>
     <w:p>
@@ -4837,7 +4881,7 @@
           <w:b w:val="0"/>
           <w:i w:val="0"/>
         </w:rPr>
-        <w:t>Face validity: four-expert blinded review (Figure 3)</w:t>
+        <w:t>Patient-facing education (qualitative demonstration)</w:t>
       </w:r>
     </w:p>
     <w:p>
@@ -4847,7 +4891,7 @@
           <w:b w:val="0"/>
           <w:i w:val="0"/>
         </w:rPr>
-        <w:t>Experts agreed with each other substantially: raw agreement 17/20 ratings, with per-case modal share 4/4 in three cases, 3/4 in one (case 2), and a 2:2 split in case 1 (Figure 3A). The overall Fleiss κ [46] of −0.09 reflects the known instability of κ under uneven category marginals at this sample size — the agreement paradox described by Feinstein and Cicchetti — rather than poor agreement [47]. The system matched the expert majority in all four cases with a decisive majority (Cohen κ = 1.000, n = 4; Figure 3B). In the split case — whether to add systematic biopsy to targeted plus perilesional biopsy — the two experts favouring conditional endorsement cited treatment-plan dependence (whole-gland versus focal therapy alters the value of added systematic cores), the same consideration the system's evidence chain raises (contralateral systematic yield 0.3–4% [EV0024]). All 80 Likert ratings of the system output were 5/5 (clarity, usefulness, recommendation, evidence; ceiling noted, Figure 3C). At this sample size, all agreement estimates are preliminary.</w:t>
+        <w:t>Three consultations of the kind urologists field daily were submitted to the education mode in Chinese (verbatim transcripts with matched fact entries and retrieval provenance in Supplementary S7). Asked "My biopsy report is benign — do I never need to worry again, and can I stop checking PSA?", the agent answered in plain language that a biopsy samples only the cores taken, that small or hidden tumours can be missed, and that PSA testing and physical examination should therefore continue on the urologist's schedule, closing with a safety-netting paragraph (rising PSA or new symptoms: contact the urologist without waiting). Asked what ASAP means, it explained the finding as suspicious but not yet confirmed, distinguished it from isolated HGPIN, stated that a clinically meaningful fraction of re-biopsies after ASAP detect clinically significant cancer, and advised against delaying the recommended repeat biopsy [46]. Asked whether fear of pain justifies declining a biopsy, it described periprostatic nerve block and fully local-anaesthetic transperineal biopsy [6,21], noted that avoiding a medically indicated biopsy can delay a curable diagnosis, and offered sedation planning as an option. All three outputs cited their fact entries and evidence chunks, and ended by referring the patient to the treating clinician; none issued an action verdict or invented numbers. These are demonstrations, not benchmarked results — no lay-person readability or comprehension study has been performed (see Limitations).</w:t>
       </w:r>
     </w:p>
     <w:p>
@@ -4865,6 +4909,34 @@
           <w:b w:val="0"/>
           <w:i w:val="0"/>
         </w:rPr>
+        <w:t>Face validity: four-expert blinded review (Figure 3)</w:t>
+      </w:r>
+    </w:p>
+    <w:p>
+      <w:r>
+        <w:rPr>
+          <w:rFonts w:ascii="Times New Roman" w:hAnsi="Times New Roman"/>
+          <w:b w:val="0"/>
+          <w:i w:val="0"/>
+        </w:rPr>
+        <w:t>Experts agreed with each other substantially: raw agreement 17/20 ratings, with per-case modal share 4/4 in three cases, 3/4 in one (case 2), and a 2:2 split in case 1 (Figure 3A). The overall Fleiss κ [49] of −0.09 reflects the known instability of κ under uneven category marginals at this sample size — the agreement paradox described by Feinstein and Cicchetti — rather than poor agreement [50]. The system matched the expert majority in all four cases with a decisive majority (Cohen κ = 1.000, n = 4; Figure 3B). In the split case — whether to add systematic biopsy to targeted plus perilesional biopsy — the two experts favouring conditional endorsement cited treatment-plan dependence (whole-gland versus focal therapy alters the value of added systematic cores), the same consideration the system's evidence chain raises (contralateral systematic yield 0.3–4% [EV0024]). All 80 Likert ratings of the system output were 5/5 (clarity, usefulness, recommendation, evidence; ceiling noted, Figure 3C). At this sample size, all agreement estimates are preliminary.</w:t>
+      </w:r>
+    </w:p>
+    <w:p>
+      <w:pPr>
+        <w:pStyle w:val="Heading2"/>
+      </w:pPr>
+      <w:r>
+        <w:rPr>
+          <w:b/>
+        </w:rPr>
+      </w:r>
+      <w:r>
+        <w:rPr>
+          <w:rFonts w:ascii="Times New Roman" w:hAnsi="Times New Roman"/>
+          <w:b w:val="0"/>
+          <w:i w:val="0"/>
+        </w:rPr>
         <w:t>Runtime cost</w:t>
       </w:r>
     </w:p>
@@ -4976,7 +5048,7 @@
           <w:b w:val="0"/>
           <w:i w:val="0"/>
         </w:rPr>
-        <w:t xml:space="preserve">Large language models are approaching expert-level medical question answering [31] and have generated patient-facing responses rated as more empathetic than physician responses [48]; for constrained, auditable decision support, however, our results indicate that decision architecture — not model capability — is the dominant lever. Medical RAG benchmarks such as MIRAGE [40] evaluate open-question answering accuracy, typically multiple-choice or free text; we instead map an international consensus' final statements onto five executable actions and evaluate </w:t>
+        <w:t xml:space="preserve">Large language models are approaching expert-level medical question answering [31] and have generated patient-facing responses rated as more empathetic than physician responses [51]; for constrained, auditable decision support, however, our results indicate that decision architecture — not model capability — is the dominant lever. Medical RAG benchmarks such as MIRAGE [40] evaluate open-question answering accuracy, typically multiple-choice or free text; we instead map an international consensus' final statements onto five executable actions and evaluate </w:t>
       </w:r>
       <w:r>
         <w:rPr>
@@ -4992,7 +5064,7 @@
           <w:b w:val="0"/>
           <w:i w:val="0"/>
         </w:rPr>
-        <w:t>, a property closer to clinical governance needs. Relative to GraphRAG [49] and LightRAG [43], our contribution is system-level: LightRAG remains the evidence engine, but the lightrag-only baseline demonstrates exactly what happens without a rule layer — against over-calling (sensitivity 1.000, specificity 0.922) and conditional silence. Relative to rule-based CDSS [27], our architecture compresses the auditable rule base to 16 consensus rules and delegates long-tail knowledge to graph retrieval, coupling the two via hard constraints rather than parallel voting.</w:t>
+        <w:t>, a property closer to clinical governance needs. Relative to GraphRAG [52] and LightRAG [43], our contribution is system-level: LightRAG remains the evidence engine, but the lightrag-only baseline demonstrates exactly what happens without a rule layer — against over-calling (sensitivity 1.000, specificity 0.922) and conditional silence. Relative to rule-based CDSS [27], our architecture compresses the auditable rule base to 16 consensus rules and delegates long-tail knowledge to graph retrieval, coupling the two via hard constraints rather than parallel voting.</w:t>
       </w:r>
     </w:p>
     <w:p>
@@ -5012,7 +5084,7 @@
           <w:b w:val="0"/>
           <w:i w:val="0"/>
         </w:rPr>
-        <w:t>The system's decision points sit squarely on the consensus of current guidelines. The EAU recommends mpMRI before biopsy, MRI-targeted sampling, risk-adapted antimicrobial prophylaxis, and transperineal access where available [22]; the AUA/ASTRO guideline and its 2026 Amendment converge on the same action-level recommendations for localized disease [23,24]. The underlying trial evidence is recent and consolidating — randomised evidence on transperineal access [6], an RCT meta-analysis across imaging-targeted and non-targeted settings [7], and targeted prophylaxis studies [8] — which is precisely why the rule base encodes only the stable decision skeleton while the updating periphery lives in retrieval: as trial evidence shifts practice, the retrieval corpus and index can be rebuilt without touching the rule layer, and the SHA-256 version-integrity check makes that coupling explicit. This division of labour also mirrors how the pathway's pain points are actually experienced at the biopsy table: the safety-critical contextual calls (route, prophylaxis, scheme) are enforced mechanically rather than left to prompt compliance; image-quality and reader-variability dependence [16] is carried as explicit scenario flags; grade-discordance-aware treatment planning [13] is anchored by the largest statement domain; and the complication burden that motivates conservatism [50] is reflected in the system's mechanically enforced veto behaviour rather than in optimism.</w:t>
+        <w:t>The system's decision points sit squarely on the consensus of current guidelines. The EAU recommends mpMRI before biopsy, MRI-targeted sampling, risk-adapted antimicrobial prophylaxis, and transperineal access where available [22]; the AUA/ASTRO guideline and its 2026 Amendment converge on the same action-level recommendations for localized disease [23,24]. The underlying trial evidence is recent and consolidating — randomised evidence on transperineal access [6], an RCT meta-analysis across imaging-targeted and non-targeted settings [7], and targeted prophylaxis studies [8] — which is precisely why the rule base encodes only the stable decision skeleton while the updating periphery lives in retrieval: as trial evidence shifts practice, the retrieval corpus and index can be rebuilt without touching the rule layer, and the SHA-256 version-integrity check makes that coupling explicit. This division of labour also mirrors how the pathway's pain points are actually experienced at the biopsy table: the safety-critical contextual calls (route, prophylaxis, scheme) are enforced mechanically rather than left to prompt compliance; image-quality and reader-variability dependence [16] is carried as explicit scenario flags; grade-discordance-aware treatment planning [13] is anchored by the largest statement domain; and the complication burden that motivates conservatism [44] is reflected in the system's mechanically enforced veto behaviour rather than in optimism.</w:t>
       </w:r>
     </w:p>
     <w:p>
@@ -5106,7 +5178,7 @@
           <w:b w:val="0"/>
           <w:i w:val="0"/>
         </w:rPr>
-        <w:t>Limitations</w:t>
+        <w:t>From clinician support to patient education</w:t>
       </w:r>
     </w:p>
     <w:p>
@@ -5116,167 +5188,7 @@
           <w:b w:val="0"/>
           <w:i w:val="0"/>
         </w:rPr>
-        <w:t xml:space="preserve">First, </w:t>
-      </w:r>
-      <w:r>
-        <w:rPr>
-          <w:rFonts w:ascii="Times New Roman" w:hAnsi="Times New Roman"/>
-          <w:b/>
-          <w:i w:val="0"/>
-        </w:rPr>
-        <w:t>corpus–gold-standard homology</w:t>
-      </w:r>
-      <w:r>
-        <w:rPr>
-          <w:rFonts w:ascii="Times New Roman" w:hAnsi="Times New Roman"/>
-          <w:b w:val="0"/>
-          <w:i w:val="0"/>
-        </w:rPr>
-        <w:t xml:space="preserve">: corpus and gold standard both derive from the ProBIOPSY consensus, so this is a </w:t>
-      </w:r>
-      <w:r>
-        <w:rPr>
-          <w:rFonts w:ascii="Times New Roman" w:hAnsi="Times New Roman"/>
-          <w:b w:val="0"/>
-          <w:i/>
-        </w:rPr>
-        <w:t>consensus-conformance</w:t>
-      </w:r>
-      <w:r>
-        <w:rPr>
-          <w:rFonts w:ascii="Times New Roman" w:hAnsi="Times New Roman"/>
-          <w:b w:val="0"/>
-          <w:i w:val="0"/>
-        </w:rPr>
-        <w:t xml:space="preserve"> evaluation rather than independent clinical validity; EAU and AUA/ASTRO recommendations enter the system only through the rule layer's cross-check — their text is deliberately absent from the retrieval corpus (see Methods) — so guideline concordance at </w:t>
-      </w:r>
-      <w:r>
-        <w:rPr>
-          <w:rFonts w:ascii="Times New Roman" w:hAnsi="Times New Roman"/>
-          <w:b w:val="0"/>
-          <w:i/>
-        </w:rPr>
-        <w:t>retrieval</w:t>
-      </w:r>
-      <w:r>
-        <w:rPr>
-          <w:rFonts w:ascii="Times New Roman" w:hAnsi="Times New Roman"/>
-          <w:b w:val="0"/>
-          <w:i w:val="0"/>
-        </w:rPr>
-        <w:t xml:space="preserve"> level is untested; the system never saw action labels during development and the rule base covers only 16 topics, but exposure to statement text cannot be excluded, and prospective external validation is the necessary next step. Second, </w:t>
-      </w:r>
-      <w:r>
-        <w:rPr>
-          <w:rFonts w:ascii="Times New Roman" w:hAnsi="Times New Roman"/>
-          <w:b/>
-          <w:i w:val="0"/>
-        </w:rPr>
-        <w:t>the residual conditional weakness</w:t>
-      </w:r>
-      <w:r>
-        <w:rPr>
-          <w:rFonts w:ascii="Times New Roman" w:hAnsi="Times New Roman"/>
-          <w:b w:val="0"/>
-          <w:i w:val="0"/>
-        </w:rPr>
-        <w:t xml:space="preserve">: conditional recall is 0.51 with an over-permissive error skew (74/185 gold-conditional statements predicted endorse); deployed without the rule layer's hard constraints, such errors would shift towards false endorsement, so class-specific calibration is required before clinical piloting. Third, </w:t>
-      </w:r>
-      <w:r>
-        <w:rPr>
-          <w:rFonts w:ascii="Times New Roman" w:hAnsi="Times New Roman"/>
-          <w:b/>
-          <w:i w:val="0"/>
-        </w:rPr>
-        <w:t>the face-validity panel is small</w:t>
-      </w:r>
-      <w:r>
-        <w:rPr>
-          <w:rFonts w:ascii="Times New Roman" w:hAnsi="Times New Roman"/>
-          <w:b w:val="0"/>
-          <w:i w:val="0"/>
-        </w:rPr>
-        <w:t xml:space="preserve">: four experts rated five composite propositions; agreement statistics at this n are unstable (a negative Fleiss κ despite 17/20 raw agreement illustrates the artefact [47]), all Likert ratings hit the ceiling, and the panel was single-institution — the review therefore supports preliminary face validity only. Fourth, </w:t>
-      </w:r>
-      <w:r>
-        <w:rPr>
-          <w:rFonts w:ascii="Times New Roman" w:hAnsi="Times New Roman"/>
-          <w:b/>
-          <w:i w:val="0"/>
-        </w:rPr>
-        <w:t>synthetic scenarios</w:t>
-      </w:r>
-      <w:r>
-        <w:rPr>
-          <w:rFonts w:ascii="Times New Roman" w:hAnsi="Times New Roman"/>
-          <w:b w:val="0"/>
-          <w:i w:val="0"/>
-        </w:rPr>
-        <w:t xml:space="preserve">: the 51 scenario archetypes and five demonstration cases are synthetic and do not span the full comorbidity complexity of real patients. Fifth, </w:t>
-      </w:r>
-      <w:r>
-        <w:rPr>
-          <w:rFonts w:ascii="Times New Roman" w:hAnsi="Times New Roman"/>
-          <w:b/>
-          <w:i w:val="0"/>
-        </w:rPr>
-        <w:t>single generator family</w:t>
-      </w:r>
-      <w:r>
-        <w:rPr>
-          <w:rFonts w:ascii="Times New Roman" w:hAnsi="Times New Roman"/>
-          <w:b w:val="0"/>
-          <w:i w:val="0"/>
-        </w:rPr>
-        <w:t xml:space="preserve">: the benchmark used the GLM family (flash and flagship tiers); cross-vendor generalisation is untested, although the supplement shows generator tier is not the decisive factor. Sixth, </w:t>
-      </w:r>
-      <w:r>
-        <w:rPr>
-          <w:rFonts w:ascii="Times New Roman" w:hAnsi="Times New Roman"/>
-          <w:b/>
-          <w:i w:val="0"/>
-        </w:rPr>
-        <w:t>combinatorial coverage</w:t>
-      </w:r>
-      <w:r>
-        <w:rPr>
-          <w:rFonts w:ascii="Times New Roman" w:hAnsi="Times New Roman"/>
-          <w:b w:val="0"/>
-          <w:i w:val="0"/>
-        </w:rPr>
-        <w:t xml:space="preserve">: 112 statements cover the high-frequency region of the 51 × 54 interaction space; long-tail coverage is unquantified. Seventh, </w:t>
-      </w:r>
-      <w:r>
-        <w:rPr>
-          <w:rFonts w:ascii="Times New Roman" w:hAnsi="Times New Roman"/>
-          <w:b/>
-          <w:i w:val="0"/>
-        </w:rPr>
-        <w:t>context cost</w:t>
-      </w:r>
-      <w:r>
-        <w:rPr>
-          <w:rFonts w:ascii="Times New Roman" w:hAnsi="Times New Roman"/>
-          <w:b w:val="0"/>
-          <w:i w:val="0"/>
-        </w:rPr>
-        <w:t xml:space="preserve">: the full system's 7,640-character mean context is ~3× the strongest baseline, traded for +19.2 points exact-5; rule-gated short-circuiting (pure-rule combinations skip graph retrieval) can amortise this further. Eighth, </w:t>
-      </w:r>
-      <w:r>
-        <w:rPr>
-          <w:rFonts w:ascii="Times New Roman" w:hAnsi="Times New Roman"/>
-          <w:b/>
-          <w:i w:val="0"/>
-        </w:rPr>
-        <w:t>language and region</w:t>
-      </w:r>
-      <w:r>
-        <w:rPr>
-          <w:rFonts w:ascii="Times New Roman" w:hAnsi="Times New Roman"/>
-          <w:b w:val="0"/>
-          <w:i w:val="0"/>
-        </w:rPr>
-        <w:t>: the corpus is English, the scenario registry and UI Chinese; cross-lingual transfer is untested.</w:t>
+        <w:t>The biopsy pathway is incomplete if the agent serves only the clinician's half of the consultation. Patient education depends on clinicians interpreting concrete details of the procedure and its results, yet clinician time for such conversations is limited, and patients' evolving informational and emotional needs are among the first casualties of stretched clinics — the asymmetry that motivates patient-facing agents in other medical domains [34,36]. QianLieAnHui addresses this asymmetrically rather than by weakening its constraints: the education mode reuses the same frozen evidence chain and adds a curated fact base whose every entry is source-traceable, so a patient answer can be audited exactly like a clinician verdict. The content is clinically consequential. Isolated HGPIN on extended biopsy schemes generally does not mandate early repeat biopsy, whereas ASAP warrants re-sampling because a meaningful fraction of such re-biopsies detect clinically significant cancer [45,46] — precisely the messages patients miss when counselling time is short, and the reason a benign report must never end follow-up. The mode deliberately issues no action verdict: education outputs cite their evidence and route the patient back to the treating clinician, keeping the hard-constrained five-action layer exclusive to clinician-facing decisions.</w:t>
       </w:r>
     </w:p>
     <w:p>
@@ -5294,7 +5206,7 @@
           <w:b w:val="0"/>
           <w:i w:val="0"/>
         </w:rPr>
-        <w:t>Future work</w:t>
+        <w:t>Limitations</w:t>
       </w:r>
     </w:p>
     <w:p>
@@ -5304,7 +5216,183 @@
           <w:b w:val="0"/>
           <w:i w:val="0"/>
         </w:rPr>
-        <w:t>(i) extending the expert panel to a multi-centre face-validity and usability study, including treatment-intent-conditioned scenarios of the kind flagged by the reviewers in the split case; (ii) a prospective registry study with real cases, reported under emerging AI-evaluation standards [51,52]; (iii) extending the rule base to other guideline chapters (active surveillance, imaging follow-up) and emerging PSMA-PET–first pathways [53] to test architecture portability; (iv) FHIR integration for automatic scenario filling from the EMR; (v) on-premises generator deployment to eliminate PHI-transfer concerns.</w:t>
+        <w:t xml:space="preserve">First, </w:t>
+      </w:r>
+      <w:r>
+        <w:rPr>
+          <w:rFonts w:ascii="Times New Roman" w:hAnsi="Times New Roman"/>
+          <w:b/>
+          <w:i w:val="0"/>
+        </w:rPr>
+        <w:t>corpus–gold-standard homology</w:t>
+      </w:r>
+      <w:r>
+        <w:rPr>
+          <w:rFonts w:ascii="Times New Roman" w:hAnsi="Times New Roman"/>
+          <w:b w:val="0"/>
+          <w:i w:val="0"/>
+        </w:rPr>
+        <w:t xml:space="preserve">: corpus and gold standard both derive from the ProBIOPSY consensus, so this is a </w:t>
+      </w:r>
+      <w:r>
+        <w:rPr>
+          <w:rFonts w:ascii="Times New Roman" w:hAnsi="Times New Roman"/>
+          <w:b w:val="0"/>
+          <w:i/>
+        </w:rPr>
+        <w:t>consensus-conformance</w:t>
+      </w:r>
+      <w:r>
+        <w:rPr>
+          <w:rFonts w:ascii="Times New Roman" w:hAnsi="Times New Roman"/>
+          <w:b w:val="0"/>
+          <w:i w:val="0"/>
+        </w:rPr>
+        <w:t xml:space="preserve"> evaluation rather than independent clinical validity; EAU and AUA/ASTRO recommendations enter the system only through the rule layer's cross-check — their text is deliberately absent from the retrieval corpus (see Methods) — so guideline concordance at </w:t>
+      </w:r>
+      <w:r>
+        <w:rPr>
+          <w:rFonts w:ascii="Times New Roman" w:hAnsi="Times New Roman"/>
+          <w:b w:val="0"/>
+          <w:i/>
+        </w:rPr>
+        <w:t>retrieval</w:t>
+      </w:r>
+      <w:r>
+        <w:rPr>
+          <w:rFonts w:ascii="Times New Roman" w:hAnsi="Times New Roman"/>
+          <w:b w:val="0"/>
+          <w:i w:val="0"/>
+        </w:rPr>
+        <w:t xml:space="preserve"> level is untested; the system never saw action labels during development and the rule base covers only 16 topics, but exposure to statement text cannot be excluded, and prospective external validation is the necessary next step. Second, </w:t>
+      </w:r>
+      <w:r>
+        <w:rPr>
+          <w:rFonts w:ascii="Times New Roman" w:hAnsi="Times New Roman"/>
+          <w:b/>
+          <w:i w:val="0"/>
+        </w:rPr>
+        <w:t>the residual conditional weakness</w:t>
+      </w:r>
+      <w:r>
+        <w:rPr>
+          <w:rFonts w:ascii="Times New Roman" w:hAnsi="Times New Roman"/>
+          <w:b w:val="0"/>
+          <w:i w:val="0"/>
+        </w:rPr>
+        <w:t xml:space="preserve">: conditional recall is 0.51 with an over-permissive error skew (74/185 gold-conditional statements predicted endorse); deployed without the rule layer's hard constraints, such errors would shift towards false endorsement, so class-specific calibration is required before clinical piloting. Third, </w:t>
+      </w:r>
+      <w:r>
+        <w:rPr>
+          <w:rFonts w:ascii="Times New Roman" w:hAnsi="Times New Roman"/>
+          <w:b/>
+          <w:i w:val="0"/>
+        </w:rPr>
+        <w:t>the face-validity panel is small</w:t>
+      </w:r>
+      <w:r>
+        <w:rPr>
+          <w:rFonts w:ascii="Times New Roman" w:hAnsi="Times New Roman"/>
+          <w:b w:val="0"/>
+          <w:i w:val="0"/>
+        </w:rPr>
+        <w:t xml:space="preserve">: four experts rated five composite propositions; agreement statistics at this n are unstable (a negative Fleiss κ despite 17/20 raw agreement illustrates the artefact [50]), all Likert ratings hit the ceiling, and the panel was single-institution — the review therefore supports preliminary face validity only. Fourth, </w:t>
+      </w:r>
+      <w:r>
+        <w:rPr>
+          <w:rFonts w:ascii="Times New Roman" w:hAnsi="Times New Roman"/>
+          <w:b/>
+          <w:i w:val="0"/>
+        </w:rPr>
+        <w:t>synthetic scenarios</w:t>
+      </w:r>
+      <w:r>
+        <w:rPr>
+          <w:rFonts w:ascii="Times New Roman" w:hAnsi="Times New Roman"/>
+          <w:b w:val="0"/>
+          <w:i w:val="0"/>
+        </w:rPr>
+        <w:t xml:space="preserve">: the 51 scenario archetypes and five demonstration cases are synthetic and do not span the full comorbidity complexity of real patients. Fifth, </w:t>
+      </w:r>
+      <w:r>
+        <w:rPr>
+          <w:rFonts w:ascii="Times New Roman" w:hAnsi="Times New Roman"/>
+          <w:b/>
+          <w:i w:val="0"/>
+        </w:rPr>
+        <w:t>single generator family</w:t>
+      </w:r>
+      <w:r>
+        <w:rPr>
+          <w:rFonts w:ascii="Times New Roman" w:hAnsi="Times New Roman"/>
+          <w:b w:val="0"/>
+          <w:i w:val="0"/>
+        </w:rPr>
+        <w:t xml:space="preserve">: the benchmark used the GLM family (flash and flagship tiers); cross-vendor generalisation is untested, although the supplement shows generator tier is not the decisive factor. Sixth, </w:t>
+      </w:r>
+      <w:r>
+        <w:rPr>
+          <w:rFonts w:ascii="Times New Roman" w:hAnsi="Times New Roman"/>
+          <w:b/>
+          <w:i w:val="0"/>
+        </w:rPr>
+        <w:t>combinatorial coverage</w:t>
+      </w:r>
+      <w:r>
+        <w:rPr>
+          <w:rFonts w:ascii="Times New Roman" w:hAnsi="Times New Roman"/>
+          <w:b w:val="0"/>
+          <w:i w:val="0"/>
+        </w:rPr>
+        <w:t xml:space="preserve">: 112 statements cover the high-frequency region of the 51 × 54 interaction space; long-tail coverage is unquantified. Seventh, </w:t>
+      </w:r>
+      <w:r>
+        <w:rPr>
+          <w:rFonts w:ascii="Times New Roman" w:hAnsi="Times New Roman"/>
+          <w:b/>
+          <w:i w:val="0"/>
+        </w:rPr>
+        <w:t>context cost</w:t>
+      </w:r>
+      <w:r>
+        <w:rPr>
+          <w:rFonts w:ascii="Times New Roman" w:hAnsi="Times New Roman"/>
+          <w:b w:val="0"/>
+          <w:i w:val="0"/>
+        </w:rPr>
+        <w:t xml:space="preserve">: the full system's 7,640-character mean context is ~3× the strongest baseline, traded for +19.2 points exact-5; rule-gated short-circuiting (pure-rule combinations skip graph retrieval) can amortise this further. Eighth, </w:t>
+      </w:r>
+      <w:r>
+        <w:rPr>
+          <w:rFonts w:ascii="Times New Roman" w:hAnsi="Times New Roman"/>
+          <w:b/>
+          <w:i w:val="0"/>
+        </w:rPr>
+        <w:t>language and region</w:t>
+      </w:r>
+      <w:r>
+        <w:rPr>
+          <w:rFonts w:ascii="Times New Roman" w:hAnsi="Times New Roman"/>
+          <w:b w:val="0"/>
+          <w:i w:val="0"/>
+        </w:rPr>
+        <w:t xml:space="preserve">: the corpus is English, the scenario registry and UI Chinese; cross-lingual transfer is untested. Ninth, </w:t>
+      </w:r>
+      <w:r>
+        <w:rPr>
+          <w:rFonts w:ascii="Times New Roman" w:hAnsi="Times New Roman"/>
+          <w:b/>
+          <w:i w:val="0"/>
+        </w:rPr>
+        <w:t>patient-education mode</w:t>
+      </w:r>
+      <w:r>
+        <w:rPr>
+          <w:rFonts w:ascii="Times New Roman" w:hAnsi="Times New Roman"/>
+          <w:b w:val="0"/>
+          <w:i w:val="0"/>
+        </w:rPr>
+        <w:t>: the mode is a design contribution demonstrated on three verbatim consultations, not an evaluated intervention — no readability scoring, comprehension testing, or patient-user study has been performed, and the ten-entry fact base covers common questions rather than the full space of patient concerns.</w:t>
       </w:r>
     </w:p>
     <w:p>
@@ -5322,6 +5410,34 @@
           <w:b w:val="0"/>
           <w:i w:val="0"/>
         </w:rPr>
+        <w:t>Future work</w:t>
+      </w:r>
+    </w:p>
+    <w:p>
+      <w:r>
+        <w:rPr>
+          <w:rFonts w:ascii="Times New Roman" w:hAnsi="Times New Roman"/>
+          <w:b w:val="0"/>
+          <w:i w:val="0"/>
+        </w:rPr>
+        <w:t>(i) extending the expert panel to a multi-centre face-validity and usability study, including treatment-intent-conditioned scenarios of the kind flagged by the reviewers in the split case; (ii) a prospective registry study with real cases, reported under emerging AI-evaluation standards [53,54]; (iii) extending the rule base to other guideline chapters (active surveillance, imaging follow-up) and emerging PSMA-PET–first pathways [55] to test architecture portability; (iv) FHIR integration for automatic scenario filling from the EMR; (v) on-premises generator deployment to eliminate PHI-transfer concerns; and (vi) a supervised pilot evaluating the patient-education mode for readability, comprehension, and anxiety reduction.</w:t>
+      </w:r>
+    </w:p>
+    <w:p>
+      <w:pPr>
+        <w:pStyle w:val="Heading2"/>
+      </w:pPr>
+      <w:r>
+        <w:rPr>
+          <w:b/>
+        </w:rPr>
+      </w:r>
+      <w:r>
+        <w:rPr>
+          <w:rFonts w:ascii="Times New Roman" w:hAnsi="Times New Roman"/>
+          <w:b w:val="0"/>
+          <w:i w:val="0"/>
+        </w:rPr>
         <w:t>Conclusions</w:t>
       </w:r>
     </w:p>
@@ -5355,7 +5471,7 @@
           <w:b w:val="0"/>
           <w:i w:val="0"/>
         </w:rPr>
-        <w:t>The rule base (configs/rules.yaml), both registries (entities_a.csv, entities_b.csv), the evidence corpus (evidence_chunks.jsonl, 357 chunks), the gold-standard annotations (probiopsy_statements.csv, 112 statements), all 2,240 raw predictions with per-run context sizes and retrieved-chunk counts (baseline_predictions.jsonl), the flagship-tier supplement (baseline_predictions_glm53.jsonl), the evaluation script (evaluate.py), and all figure source data are released with the repository (https://github.com/xuzekun6251/probiopsy-rag) and archived on Zenodo [54].</w:t>
+        <w:t>The rule base (configs/rules.yaml), both registries (entities_a.csv, entities_b.csv), the evidence corpus (evidence_chunks.jsonl, 357 chunks), the patient-education fact base (patient_education_facts.csv, ten source-traceable entries), the verbatim patient-education transcripts (demo_cases/patient_edu/), the gold-standard annotations (probiopsy_statements.csv, 112 statements), all 2,240 raw predictions with per-run context sizes and retrieved-chunk counts (baseline_predictions.jsonl), the flagship-tier supplement (baseline_predictions_glm53.jsonl), the evaluation script (evaluate.py), and all figure source data are released with the repository (https://github.com/xuzekun6251/probiopsy-rag) and archived on Zenodo [56].</w:t>
       </w:r>
     </w:p>
     <w:p>
@@ -6544,7 +6660,7 @@
           <w:b w:val="0"/>
           <w:i w:val="0"/>
         </w:rPr>
-        <w:t>44. Cohen J. A Coefficient of Agreement for Nominal Scales. Educational and Psychological Measurement. 1960;20(1):37-46. https://doi.org/10.1177/001316446002000104</w:t>
+        <w:t>44. Borghesi M, Ahmed H, Nam R, et al. Complications After Systematic, Random, and Image-guided Prostate Biopsy. European Urology. 2017;71(3):353-365. https://doi.org/10.1016/j.eururo.2016.08.004</w:t>
       </w:r>
     </w:p>
     <w:p>
@@ -6557,7 +6673,7 @@
           <w:b w:val="0"/>
           <w:i w:val="0"/>
         </w:rPr>
-        <w:t>45. Benjamini Y, Hochberg Y. Controlling the False Discovery Rate: A Practical and Powerful Approach to Multiple Testing. Journal of the Royal Statistical Society Series B: Statistical Methodology. 1995;57(1):289-300. https://doi.org/10.1111/j.2517-6161.1995.tb02031.x</w:t>
+        <w:t>45. Morote J, Schwartzmann I, Celma A, et al. The current recommendation for the management of isolated high‐grade prostatic intraepithelial neoplasia. BJU International. 2021;129(5):627-633. https://doi.org/10.1111/bju.15568</w:t>
       </w:r>
     </w:p>
     <w:p>
@@ -6570,7 +6686,7 @@
           <w:b w:val="0"/>
           <w:i w:val="0"/>
         </w:rPr>
-        <w:t>46. Fleiss JL. Measuring nominal scale agreement among many raters.. Psychological Bulletin. 1971;76(5):378-382. https://doi.org/10.1037/h0031619</w:t>
+        <w:t>46. Ji WT, Jin XF, Wang Y. The Rate of Clinically Significant Prostate Cancer on Repeat Biopsy after a Diagnosis of Atypical Small Acinar Proliferation: A Systematic Review and Meta-Analysis. Oncology. 2023;102(7):631-640. https://doi.org/10.1159/000535123</w:t>
       </w:r>
     </w:p>
     <w:p>
@@ -6583,7 +6699,7 @@
           <w:b w:val="0"/>
           <w:i w:val="0"/>
         </w:rPr>
-        <w:t>47. Feinstein AR, Cicchetti DV. High agreement but low Kappa: I. the problems of two paradoxes. Journal of Clinical Epidemiology. 1990;43(6):543-549. https://doi.org/10.1016/0895-4356(90)90158-l</w:t>
+        <w:t>47. Cohen J. A Coefficient of Agreement for Nominal Scales. Educational and Psychological Measurement. 1960;20(1):37-46. https://doi.org/10.1177/001316446002000104</w:t>
       </w:r>
     </w:p>
     <w:p>
@@ -6596,7 +6712,7 @@
           <w:b w:val="0"/>
           <w:i w:val="0"/>
         </w:rPr>
-        <w:t>48. Ayers JW, Poliak A, Dredze M, et al. Comparing Physician and Artificial Intelligence Chatbot Responses to Patient Questions Posted to a Public Social Media Forum. JAMA Intern Med. 2023;183(6):589. https://doi.org/10.1001/jamainternmed.2023.1838</w:t>
+        <w:t>48. Benjamini Y, Hochberg Y. Controlling the False Discovery Rate: A Practical and Powerful Approach to Multiple Testing. Journal of the Royal Statistical Society Series B: Statistical Methodology. 1995;57(1):289-300. https://doi.org/10.1111/j.2517-6161.1995.tb02031.x</w:t>
       </w:r>
     </w:p>
     <w:p>
@@ -6609,7 +6725,7 @@
           <w:b w:val="0"/>
           <w:i w:val="0"/>
         </w:rPr>
-        <w:t>49. Edge D, Trinh H, Cheng N, et al. From local to global: a Graph RAG approach to query-focused summarization. arXiv:2404.16130, 2024 (verified via arXiv API).</w:t>
+        <w:t>49. Fleiss JL. Measuring nominal scale agreement among many raters.. Psychological Bulletin. 1971;76(5):378-382. https://doi.org/10.1037/h0031619</w:t>
       </w:r>
     </w:p>
     <w:p>
@@ -6622,7 +6738,7 @@
           <w:b w:val="0"/>
           <w:i w:val="0"/>
         </w:rPr>
-        <w:t>50. Borghesi M, Ahmed H, Nam R, et al. Complications After Systematic, Random, and Image-guided Prostate Biopsy. European Urology. 2017;71(3):353-365. https://doi.org/10.1016/j.eururo.2016.08.004</w:t>
+        <w:t>50. Feinstein AR, Cicchetti DV. High agreement but low Kappa: I. the problems of two paradoxes. Journal of Clinical Epidemiology. 1990;43(6):543-549. https://doi.org/10.1016/0895-4356(90)90158-l</w:t>
       </w:r>
     </w:p>
     <w:p>
@@ -6635,7 +6751,7 @@
           <w:b w:val="0"/>
           <w:i w:val="0"/>
         </w:rPr>
-        <w:t>51. Vasey B, Nagendran M, Campbell B, et al. Reporting guideline for the early stage clinical evaluation of decision support systems driven by artificial intelligence: DECIDE-AI. BMJ. 2022;377:e070904. https://doi.org/10.1136/bmj-2022-070904</w:t>
+        <w:t>51. Ayers JW, Poliak A, Dredze M, et al. Comparing Physician and Artificial Intelligence Chatbot Responses to Patient Questions Posted to a Public Social Media Forum. JAMA Intern Med. 2023;183(6):589. https://doi.org/10.1001/jamainternmed.2023.1838</w:t>
       </w:r>
     </w:p>
     <w:p>
@@ -6648,7 +6764,7 @@
           <w:b w:val="0"/>
           <w:i w:val="0"/>
         </w:rPr>
-        <w:t>52. Collins GS, Moons KGM, Dhiman P, et al. TRIPOD+AI statement: updated guidance for reporting clinical prediction models that use regression or machine learning methods. BMJ. 2024;385:e078378. https://doi.org/10.1136/bmj-2023-078378</w:t>
+        <w:t>52. Edge D, Trinh H, Cheng N, et al. From local to global: a Graph RAG approach to query-focused summarization. arXiv:2404.16130, 2024 (verified via arXiv API).</w:t>
       </w:r>
     </w:p>
     <w:p>
@@ -6661,7 +6777,7 @@
           <w:b w:val="0"/>
           <w:i w:val="0"/>
         </w:rPr>
-        <w:t>53. Al-Khanaty A, Hennes D, Hofman MS, et al. Avoiding Prostate Biopsy in Early Prostate Cancer Detection: From Liquid Biopsy to PSMA-PET. European Urology Focus. 2026. https://doi.org/10.1016/j.euf.2026.05.019</w:t>
+        <w:t>53. Vasey B, Nagendran M, Campbell B, et al. Reporting guideline for the early stage clinical evaluation of decision support systems driven by artificial intelligence: DECIDE-AI. BMJ. 2022;377:e070904. https://doi.org/10.1136/bmj-2022-070904</w:t>
       </w:r>
     </w:p>
     <w:p>
@@ -6674,16 +6790,42 @@
           <w:b w:val="0"/>
           <w:i w:val="0"/>
         </w:rPr>
-        <w:t>54. XU Z. QianLieAnHui (probiopsy-rag): a hybrid rule-engine, knowledge-graph, and LLM-arbitration decision-support system for the prostate biopsy pathway, validated against the ProBIOPSY consensus [software, version v1.0.1]. Zenodo. 2026. https://doi.org/10.5281/zenodo.22898439 (verified via DataCite API).</w:t>
+        <w:t>54. Collins GS, Moons KGM, Dhiman P, et al. TRIPOD+AI statement: updated guidance for reporting clinical prediction models that use regression or machine learning methods. BMJ. 2024;385:e078378. https://doi.org/10.1136/bmj-2023-078378</w:t>
       </w:r>
     </w:p>
     <w:p>
+      <w:pPr>
+        <w:ind w:left="425" w:hanging="425"/>
+      </w:pPr>
       <w:r>
         <w:rPr>
           <w:rFonts w:ascii="Times New Roman" w:hAnsi="Times New Roman"/>
           <w:b w:val="0"/>
           <w:i w:val="0"/>
         </w:rPr>
+        <w:t>55. Al-Khanaty A, Hennes D, Hofman MS, et al. Avoiding Prostate Biopsy in Early Prostate Cancer Detection: From Liquid Biopsy to PSMA-PET. European Urology Focus. 2026. https://doi.org/10.1016/j.euf.2026.05.019</w:t>
+      </w:r>
+    </w:p>
+    <w:p>
+      <w:pPr>
+        <w:ind w:left="425" w:hanging="425"/>
+      </w:pPr>
+      <w:r>
+        <w:rPr>
+          <w:rFonts w:ascii="Times New Roman" w:hAnsi="Times New Roman"/>
+          <w:b w:val="0"/>
+          <w:i w:val="0"/>
+        </w:rPr>
+        <w:t>56. XU Z. QianLieAnHui (probiopsy-rag): a hybrid rule-engine, knowledge-graph, and LLM-arbitration decision-support system for the prostate biopsy pathway, validated against the ProBIOPSY consensus [software, version v1.0.1]. Zenodo. 2026. https://doi.org/10.5281/zenodo.22898439 (verified via DataCite API).</w:t>
+      </w:r>
+    </w:p>
+    <w:p>
+      <w:r>
+        <w:rPr>
+          <w:rFonts w:ascii="Times New Roman" w:hAnsi="Times New Roman"/>
+          <w:b w:val="0"/>
+          <w:i w:val="0"/>
+        </w:rPr>
         <w:t xml:space="preserve">&gt; </w:t>
       </w:r>
       <w:r>
@@ -6700,7 +6842,7 @@
           <w:b w:val="0"/>
           <w:i w:val="0"/>
         </w:rPr>
-        <w:t xml:space="preserve"> all 54 references verified programmatically — DOI-based entries resolved against the Crossref API (api.crossref.org; metadata auto-generated in `scripts/renumber_refs.py`, cache `outputs/paper/refs_vancouver.json`); the round-6 clinical additions (2026-10-02: AUA/ASTRO guideline articles, biopsy complications, targeted prophylaxis, transperineal-vs-transrectal trial evidence, PI-RADS inter-reader agreement, biopsy-to-prostatectomy concordance) were additionally confirmed against PubMed via the NCBI E-utilities API, and the round-7 medical-agent positioning additions (PULSE, the hypertension and prostate-cancer agents, GeneAgent) via Crossref (PMIDs and DOIs recorded in the verification scripts); arXiv entries (refs for LightRAG, GraphRAG, Lewis RAG) verified via the arXiv API / arXiv listings, the Zenodo software deposit via the DataCite API; the EAU guideline is a living web citation — update edition and access date at submission time.</w:t>
+        <w:t xml:space="preserve"> all 56 references verified programmatically — DOI-based entries resolved against the Crossref API (api.crossref.org; metadata auto-generated in `scripts/renumber_refs.py`, cache `outputs/paper/refs_vancouver.json`); the round-6 clinical additions (2026-10-02: AUA/ASTRO guideline articles, biopsy complications, targeted prophylaxis, transperineal-vs-transrectal trial evidence, PI-RADS inter-reader agreement, biopsy-to-prostatectomy concordance) were additionally confirmed against PubMed via the NCBI E-utilities API, and the round-7 medical-agent positioning additions (PULSE, the hypertension and prostate-cancer agents, GeneAgent) via Crossref (PMIDs and DOIs recorded in the verification scripts); arXiv entries (refs for LightRAG, GraphRAG, Lewis RAG) verified via the arXiv API / arXiv listings, the Zenodo software deposit via the DataCite API; the EAU guideline is a living web citation — update edition and access date at submission time.</w:t>
       </w:r>
     </w:p>
     <w:sectPr>

</xml_diff>

<commit_message>
figures: Figure 1 gains a patient-education mode strip — same frozen evidence base, curated fact base, lay-language output; legend + Methods cross-reference updated
</commit_message>
<xml_diff>
--- a/outputs/submission/manuscript.en.docx
+++ b/outputs/submission/manuscript.en.docx
@@ -3379,7 +3379,7 @@
           <w:b w:val="0"/>
           <w:i w:val="0"/>
         </w:rPr>
-        <w:t xml:space="preserve"> The same frozen corpus and retrieval stack also support a patient-facing education mode. A complete biopsy pathway must counsel patients, not only clinicians: whether a benign report closes the matter, what HGPIN or ASAP means, and whether the procedure is tolerable are questions urologists field daily, yet clinician time for such conversations is limited and meeting patients' evolving informational needs is among the first casualties of stretched clinics [34]. The mode couples (i) retrieval, unchanged, over the frozen 357-chunk consensus corpus and knowledge graph; (ii) a curated patient-education fact base of ten entries — biopsy sampling logic, why a biopsy is advised, the meaning of a benign report, HGPIN, ASAP, pain and anaesthesia, preparation, post-biopsy warning signs, result interpretation, and shared decision-making — keyword-matched to the patient's question; and (iii) a generation prompt that instructs lay language, forbids invented statistics, requires an explicit safety-netting paragraph (when to seek urgent care), and ends by directing the patient to the treating clinician. Every fact entry carries a verifiable source: the consensus [21], the EAU and AUA/ASTRO guidelines [22,23], the TRANSLATE trial [6], the complication review [44], and peer-reviewed accounts of isolated HGPIN [45] and ASAP management [46]. The mode is exposed in the application UI alongside the clinician mode; it is not part of the 2,240-run benchmark and is demonstrated qualitatively in Results.</w:t>
+        <w:t xml:space="preserve"> The same frozen corpus and retrieval stack also support a patient-facing education mode. A complete biopsy pathway must counsel patients, not only clinicians: whether a benign report closes the matter, what HGPIN or ASAP means, and whether the procedure is tolerable are questions urologists field daily, yet clinician time for such conversations is limited and meeting patients' evolving informational needs is among the first casualties of stretched clinics [34]. The mode couples (i) retrieval, unchanged, over the frozen 357-chunk consensus corpus and knowledge graph; (ii) a curated patient-education fact base of ten entries — biopsy sampling logic, why a biopsy is advised, the meaning of a benign report, HGPIN, ASAP, pain and anaesthesia, preparation, post-biopsy warning signs, result interpretation, and shared decision-making — keyword-matched to the patient's question; and (iii) a generation prompt that instructs lay language, forbids invented statistics, requires an explicit safety-netting paragraph (when to seek urgent care), and ends by directing the patient to the treating clinician. Every fact entry carries a verifiable source: the consensus [21], the EAU and AUA/ASTRO guidelines [22,23], the TRANSLATE trial [6], the complication review [44], and peer-reviewed accounts of isolated HGPIN [45] and ASAP management [46]. The mode is exposed in the application UI alongside the clinician mode (Figure 1, education strip); it is not part of the 2,240-run benchmark and is demonstrated qualitatively in Results.</w:t>
       </w:r>
     </w:p>
     <w:p>
@@ -5525,7 +5525,7 @@
           <w:b w:val="0"/>
           <w:i w:val="0"/>
         </w:rPr>
-        <w:t xml:space="preserve"> System architecture and benchmark design. The ProBIOPSY consensus corpus (112 final statements; 357 evidence chunks; LightRAG index of 1,864 entities and 3,078 relations) is distilled at build time into 16 deterministic rules and the retrieval index. At run time, a patient-scenario × decision-item query passes through (1) the deterministic rule engine, which emits Q-coded hard constraints (dashed arrow binding the arbiter), (2) risk-guided retrieval over the LightRAG knowledge graph fused with the lexical evidence store, and (3) an LLM arbiter (GLM-5.3) that produces a five-class action verdict with statement-level citations under hard-constrained decoding. An example query (unifocal PI-RADS 4 lesion, focal therapy planned) and the corresponding structured output are shown. Bottom strip: the multi-method, multi-seed benchmark (112 statements × 4 methods × 5 seeds = 2,240 runs, generator held fixed).</w:t>
+        <w:t xml:space="preserve"> System architecture and benchmark design. The ProBIOPSY consensus corpus (112 final statements; 357 evidence chunks; LightRAG index of 1,864 entities and 3,078 relations) is distilled at build time into 16 deterministic rules and the retrieval index. At run time, a patient-scenario × decision-item query passes through (1) the deterministic rule engine, which emits Q-coded hard constraints (dashed arrow binding the arbiter), (2) risk-guided retrieval over the LightRAG knowledge graph fused with the lexical evidence store, and (3) an LLM arbiter (GLM-5.3) that produces a five-class action verdict with statement-level citations under hard-constrained decoding. An example query (unifocal PI-RADS 4 lesion, focal therapy planned) and the corresponding structured output are shown. A second runtime mode (strip below the pipeline) reuses the identical frozen evidence base for patient-facing education: the patient's lay question is keyword-matched against a curated, source-traceable fact base (ten entries), and the same generator produces a plain-language answer with an explicit safety-netting paragraph and referral to the treating urologist (demonstrated qualitatively; not part of the benchmark). Bottom strip: the multi-method, multi-seed benchmark (112 statements × 4 methods × 5 seeds = 2,240 runs, generator held fixed).</w:t>
       </w:r>
     </w:p>
     <w:p>
@@ -5535,7 +5535,7 @@
       <w:r>
         <w:drawing>
           <wp:inline xmlns:a="http://schemas.openxmlformats.org/drawingml/2006/main" xmlns:pic="http://schemas.openxmlformats.org/drawingml/2006/picture">
-            <wp:extent cx="5760000" cy="3586415"/>
+            <wp:extent cx="5760000" cy="4316119"/>
             <wp:docPr id="1" name="Picture 1"/>
             <wp:cNvGraphicFramePr>
               <a:graphicFrameLocks noChangeAspect="1"/>
@@ -5556,7 +5556,7 @@
                   <pic:spPr>
                     <a:xfrm>
                       <a:off x="0" y="0"/>
-                      <a:ext cx="5760000" cy="3586415"/>
+                      <a:ext cx="5760000" cy="4316119"/>
                     </a:xfrm>
                     <a:prstGeom prst="rect"/>
                   </pic:spPr>

</xml_diff>

<commit_message>
abstract: state the study aim explicitly in Background (zh+en); tighten EN abstract to 300 words and align with zh version
</commit_message>
<xml_diff>
--- a/outputs/submission/manuscript.en.docx
+++ b/outputs/submission/manuscript.en.docx
@@ -149,7 +149,7 @@
           <w:b w:val="0"/>
           <w:sz w:val="24"/>
         </w:rPr>
-        <w:t xml:space="preserve"> abstract 265 / main text ~6,900 (excl. tables, legends, references)</w:t>
+        <w:t xml:space="preserve"> abstract 300 / main text ~6,900 (excl. tables, legends, references)</w:t>
       </w:r>
     </w:p>
     <w:p>
@@ -185,7 +185,7 @@
           <w:b w:val="0"/>
           <w:sz w:val="24"/>
         </w:rPr>
-        <w:t xml:space="preserve"> Prostate biopsy decisions require weighing patient-specific factors — MRI findings, PSA density, comorbidity, and treatment intent — against a complex pathway of interlocking choices. The ProBIOPSY consensus codified this pathway into 112 statements, yet substantial practice variation persists because a written consensus, however detailed, cannot be executed at the point of care.</w:t>
+        <w:t xml:space="preserve"> Prostate biopsy decisions interlock imaging quality, sampling scheme, route, perioperative prophylaxis, and treatment planning. The ProBIOPSY consensus codified this pathway into 112 statements, yet a written consensus, however detailed, cannot be executed at the point of care; large language models (LLMs) supply linguistic flexibility but hallucinate, lack traceable provenance, and impose no deterministic safety constraint. We therefore aimed to turn this consensus into an executable, auditable decision-support agent and to quantify, with the statements as gold standard, how much conformance a hybrid three-layer architecture achieves and which layer carries the performance.</w:t>
       </w:r>
     </w:p>
     <w:p>
@@ -207,7 +207,7 @@
           <w:b w:val="0"/>
           <w:sz w:val="24"/>
         </w:rPr>
-        <w:t xml:space="preserve"> We developed QianLieAnHui, a decision-support agent that encodes the consensus as an executable checklist. The system chains three layers: a deterministic rule engine (16 rules cross-checked against EAU and AUA/ASTRO guidelines) that emits hard constraints; risk-guided retrieval over a LightRAG knowledge graph built from 357 consensus-derived evidence chunks; and an LLM arbiter that produces one of five executable actions with statement-level citations. A patient-facing education mode reuses the same frozen evidence base with a curated, source-traceable fact base for lay-language counselling. Benchmarked across four architectures × five seeds × 112 statements (2,240 runs, generator fixed).</w:t>
+        <w:t xml:space="preserve"> We developed QianLieAnHui, which encodes the consensus as an executable checklist. It chains three layers: a deterministic rule engine (16 rules) that emits hard constraints; risk-guided retrieval over a LightRAG knowledge graph built from 357 consensus-derived evidence chunks; and an LLM arbiter that outputs one of five actions with statement-level citations. A patient-facing education mode reuses the same frozen evidence base with a curated, source-traceable fact base for lay-language counselling. Benchmarked across four architectures × five seeds × 112 statements (2,240 runs, generator fixed).</w:t>
       </w:r>
     </w:p>
     <w:p>
@@ -229,7 +229,7 @@
           <w:b w:val="0"/>
           <w:sz w:val="24"/>
         </w:rPr>
-        <w:t xml:space="preserve"> The agent achieved exact-5 accuracy 0.805 ± 0.012 and Cohen's κ 0.730 ± 0.016 against the consensus gold standard, outperforming LightRAG-only (0.613), naive RAG (0.605), and pure LLM (0.304). The safety-critical against class reached F1 0.908 at specificity 0.986. Retrieval baselines collapsed onto frequent classes (conditional: 0.8% vs 17.0%). Upgrading to a flagship generator did not rescue simpler architectures (naive RAG: 0.605 → 0.538).</w:t>
+        <w:t xml:space="preserve"> The agent achieved exact-5 accuracy 0.805 ± 0.012, macro-F1 0.825, and Cohen's κ 0.730 ± 0.016, outperforming LightRAG-only (0.613), naive RAG (0.605), and pure LLM (0.304). The safety-critical against class reached F1 0.908 at specificity 0.986. Retrieval baselines collapsed onto frequent classes (conditional: 0.8% vs 17.0%). Upgrading to a flagship generator did not rescue simpler architectures (naive RAG: 0.605 → 0.538).</w:t>
       </w:r>
     </w:p>
     <w:p>
@@ -251,7 +251,7 @@
           <w:b w:val="0"/>
           <w:sz w:val="24"/>
         </w:rPr>
-        <w:t xml:space="preserve"> A written international consensus can be turned into an executable decision-support agent with accuracy suitable for pilot clinical evaluation. The deterministic rule layer proved essential: without hard constraints, LLM-based systems miss nuanced recommendations and over-call unsafe actions. Every recommendation traces to numbered consensus statements, enabling clinical governance audits.</w:t>
+        <w:t xml:space="preserve"> A written international consensus can be turned into an executable decision-support agent ready for pilot clinical evaluation. The deterministic rule layer proved essential: without hard constraints, LLM systems miss nuanced recommendations and over-call unsafe actions; architecture, not generator scale, is the main performance lever. Every recommendation traces to numbered consensus statements, enabling governance audits, and the same evidence chain supports auditable lay-language patient education (qualitative demonstration).</w:t>
       </w:r>
     </w:p>
     <w:p>

</xml_diff>